<commit_message>
75%: 17.04.2026 thesis backup
</commit_message>
<xml_diff>
--- a/Deniss Grabovskis 231RDB217.docx
+++ b/Deniss Grabovskis 231RDB217.docx
@@ -4781,7 +4781,7 @@
             <w:fldChar w:fldCharType="begin"/>
           </w:r>
           <w:r>
-            <w:instrText xml:space="preserve"> CITATION SBS2023RetailSalesForecasting \l 2057 </w:instrText>
+            <w:instrText xml:space="preserve">CITATION SBS2023RetailSalesForecasting \l 2057 </w:instrText>
           </w:r>
           <w:r>
             <w:fldChar w:fldCharType="separate"/>
@@ -4790,7 +4790,7 @@
             <w:rPr>
               <w:noProof/>
             </w:rPr>
-            <w:t>(B S &amp; Suresh, 2023)</w:t>
+            <w:t>(Suresh &amp; Suresh, 2023)</w:t>
           </w:r>
           <w:r>
             <w:fldChar w:fldCharType="end"/>
@@ -5156,7 +5156,7 @@
             <w:fldChar w:fldCharType="begin"/>
           </w:r>
           <w:r>
-            <w:instrText xml:space="preserve"> CITATION SBS2023RetailSalesForecasting \l 2057 </w:instrText>
+            <w:instrText xml:space="preserve">CITATION SBS2023RetailSalesForecasting \l 2057 </w:instrText>
           </w:r>
           <w:r>
             <w:fldChar w:fldCharType="separate"/>
@@ -5165,7 +5165,7 @@
             <w:rPr>
               <w:noProof/>
             </w:rPr>
-            <w:t>(B S &amp; Suresh, 2023)</w:t>
+            <w:t>(Suresh &amp; Suresh, 2023)</w:t>
           </w:r>
           <w:r>
             <w:fldChar w:fldCharType="end"/>
@@ -12467,6 +12467,7 @@
         <w:pStyle w:val="Teksts"/>
         <w:tabs>
           <w:tab w:val="center" w:pos="4395"/>
+          <w:tab w:val="left" w:pos="7688"/>
           <w:tab w:val="right" w:pos="8222"/>
         </w:tabs>
         <w:jc w:val="left"/>
@@ -12582,6 +12583,12 @@
         <w:tab/>
       </w:r>
       <w:r>
+        <w:rPr>
+          <w:lang w:val="en-GB"/>
+        </w:rPr>
+        <w:tab/>
+      </w:r>
+      <w:r>
         <w:t>(</w:t>
       </w:r>
       <w:r>
@@ -14544,18 +14551,12 @@
       <w:pPr>
         <w:pStyle w:val="Teksts"/>
       </w:pPr>
+      <w:commentRangeStart w:id="123"/>
       <w:r>
         <w:t>V</w:t>
       </w:r>
       <w:r>
-        <w:t>ienvirziena neironu tīklu</w:t>
-      </w:r>
-      <w:r>
-        <w:t xml:space="preserve"> (</w:t>
-      </w:r>
-      <w:commentRangeStart w:id="123"/>
-      <w:r>
-        <w:t>feedforward neural network</w:t>
+        <w:t xml:space="preserve">ienvirziena </w:t>
       </w:r>
       <w:commentRangeEnd w:id="123"/>
       <w:r>
@@ -14567,6 +14568,25 @@
         <w:commentReference w:id="123"/>
       </w:r>
       <w:r>
+        <w:t>neironu tīklu</w:t>
+      </w:r>
+      <w:r>
+        <w:t xml:space="preserve"> (</w:t>
+      </w:r>
+      <w:commentRangeStart w:id="124"/>
+      <w:r>
+        <w:t>feedforward neural network</w:t>
+      </w:r>
+      <w:commentRangeEnd w:id="124"/>
+      <w:r>
+        <w:rPr>
+          <w:rStyle w:val="CommentReference"/>
+          <w:sz w:val="24"/>
+          <w:szCs w:val="24"/>
+        </w:rPr>
+        <w:commentReference w:id="124"/>
+      </w:r>
+      <w:r>
         <w:t>)</w:t>
       </w:r>
       <w:r>
@@ -14593,13 +14613,263 @@
         <w:t>ŷ</w:t>
       </w:r>
       <w:r>
-        <w:t>, un to parasti izmanto regresijas un funkciju aproksimācijas uzdevumos (Minnett et al., 2011). Šādos modeļos izeja tiek veidota kā slēpto vienību afīna kombinācija ar nelineārām aktivācijas funkcijām, piemēram, hiperbolisko tangensu, kas ļauj modelēt sarežģītas nelineāras attiecības starp ieejām un izejām (Minnett et al., 2011).</w:t>
-      </w:r>
+        <w:t>, un to parasti izmanto regresijas un funkciju aproksimācijas uzdevumos</w:t>
+      </w:r>
+      <w:r>
+        <w:t xml:space="preserve"> </w:t>
+      </w:r>
+      <w:sdt>
+        <w:sdtPr>
+          <w:id w:val="1915656300"/>
+          <w:citation/>
+        </w:sdtPr>
+        <w:sdtContent>
+          <w:r>
+            <w:fldChar w:fldCharType="begin"/>
+          </w:r>
+          <w:r>
+            <w:instrText xml:space="preserve"> CITATION Min11 \l 1062 </w:instrText>
+          </w:r>
+          <w:r>
+            <w:fldChar w:fldCharType="separate"/>
+          </w:r>
+          <w:r>
+            <w:rPr>
+              <w:noProof/>
+            </w:rPr>
+            <w:t>(Minnett, Smith, Lennon, &amp; Hecht-Nielsen, 2011)</w:t>
+          </w:r>
+          <w:r>
+            <w:fldChar w:fldCharType="end"/>
+          </w:r>
+        </w:sdtContent>
+      </w:sdt>
+      <w:r>
+        <w:t xml:space="preserve">. Šādos modeļos izeja tiek veidota kā slēpto vienību </w:t>
+      </w:r>
+      <w:r>
+        <w:rPr>
+          <w:i/>
+          <w:iCs/>
+        </w:rPr>
+        <w:t>afīna</w:t>
+      </w:r>
+      <w:r>
+        <w:t xml:space="preserve"> kombinācija ar nelineārām aktivācijas funkcijām, piemēram, hiperbolisko tangensu, kas ļauj modelēt sarežģītas nelineāras attiecības starp ieejām un izejām</w:t>
+      </w:r>
+      <w:sdt>
+        <w:sdtPr>
+          <w:id w:val="-698314397"/>
+          <w:citation/>
+        </w:sdtPr>
+        <w:sdtContent>
+          <w:r>
+            <w:fldChar w:fldCharType="begin"/>
+          </w:r>
+          <w:r>
+            <w:instrText xml:space="preserve"> CITATION Min11 \l 1062 </w:instrText>
+          </w:r>
+          <w:r>
+            <w:fldChar w:fldCharType="separate"/>
+          </w:r>
+          <w:r>
+            <w:rPr>
+              <w:noProof/>
+            </w:rPr>
+            <w:t xml:space="preserve"> (Minnett, Smith, Lennon, &amp; Hecht-Nielsen, 2011)</w:t>
+          </w:r>
+          <w:r>
+            <w:fldChar w:fldCharType="end"/>
+          </w:r>
+        </w:sdtContent>
+      </w:sdt>
+      <w:r>
+        <w:t>.</w:t>
+      </w:r>
+    </w:p>
+    <w:p>
+      <w:pPr>
+        <w:pStyle w:val="Teksts"/>
+      </w:pPr>
+      <w:commentRangeStart w:id="125"/>
+      <w:r>
+        <w:lastRenderedPageBreak/>
+        <w:t xml:space="preserve">Mākslīgs neirons pilnībā savienotā slānī aprēķina savu ieeju svērto summu ar pievienotu nobīdes terminu, kam seko nelineāras aktivācijas funkcijas pielietošana. Šo darbību var izteikt kā </w:t>
+      </w:r>
+      <w:sdt>
+        <w:sdtPr>
+          <w:id w:val="-2112343551"/>
+          <w:citation/>
+        </w:sdtPr>
+        <w:sdtContent>
+          <w:r>
+            <w:fldChar w:fldCharType="begin"/>
+          </w:r>
+          <w:r>
+            <w:instrText xml:space="preserve"> CITATION Chi92 \l 1062 </w:instrText>
+          </w:r>
+          <w:r>
+            <w:fldChar w:fldCharType="separate"/>
+          </w:r>
+          <w:r>
+            <w:rPr>
+              <w:noProof/>
+            </w:rPr>
+            <w:t>(Chiang &amp; Fu, 1992)</w:t>
+          </w:r>
+          <w:r>
+            <w:fldChar w:fldCharType="end"/>
+          </w:r>
+        </w:sdtContent>
+      </w:sdt>
+      <w:r>
+        <w:t>:</w:t>
+      </w:r>
+      <w:commentRangeEnd w:id="125"/>
+      <w:r>
+        <w:rPr>
+          <w:rStyle w:val="CommentReference"/>
+          <w:sz w:val="24"/>
+          <w:szCs w:val="24"/>
+        </w:rPr>
+        <w:commentReference w:id="125"/>
+      </w:r>
+    </w:p>
+    <w:p>
+      <w:pPr>
+        <w:pStyle w:val="Teksts"/>
+      </w:pPr>
+    </w:p>
+    <w:p>
+      <w:pPr>
+        <w:pStyle w:val="Teksts"/>
+        <w:tabs>
+          <w:tab w:val="center" w:pos="4253"/>
+          <w:tab w:val="right" w:pos="8222"/>
+        </w:tabs>
+        <w:jc w:val="right"/>
+      </w:pPr>
       <w:r>
         <w:tab/>
       </w:r>
+      <m:oMath>
+        <m:r>
+          <w:rPr>
+            <w:rFonts w:ascii="Cambria Math" w:hAnsi="Cambria Math"/>
+          </w:rPr>
+          <m:t>z=</m:t>
+        </m:r>
+        <m:sSup>
+          <m:sSupPr>
+            <m:ctrlPr>
+              <w:rPr>
+                <w:rFonts w:ascii="Cambria Math" w:hAnsi="Cambria Math"/>
+                <w:i/>
+              </w:rPr>
+            </m:ctrlPr>
+          </m:sSupPr>
+          <m:e>
+            <m:r>
+              <w:rPr>
+                <w:rFonts w:ascii="Cambria Math" w:hAnsi="Cambria Math"/>
+              </w:rPr>
+              <m:t>w</m:t>
+            </m:r>
+          </m:e>
+          <m:sup>
+            <m:r>
+              <m:rPr>
+                <m:sty m:val="p"/>
+              </m:rPr>
+              <w:rPr>
+                <w:rFonts w:ascii="Cambria Math" w:hAnsi="Cambria Math"/>
+              </w:rPr>
+              <m:t>⊤</m:t>
+            </m:r>
+          </m:sup>
+        </m:sSup>
+        <m:r>
+          <w:rPr>
+            <w:rFonts w:ascii="Cambria Math" w:hAnsi="Cambria Math"/>
+          </w:rPr>
+          <m:t>x+b un a=</m:t>
+        </m:r>
+        <m:r>
+          <m:rPr>
+            <m:sty m:val="p"/>
+          </m:rPr>
+          <w:rPr>
+            <w:rFonts w:ascii="Cambria Math" w:hAnsi="Cambria Math"/>
+          </w:rPr>
+          <m:t>φ</m:t>
+        </m:r>
+        <m:d>
+          <m:dPr>
+            <m:ctrlPr>
+              <w:rPr>
+                <w:rFonts w:ascii="Cambria Math" w:hAnsi="Cambria Math"/>
+                <w:i/>
+              </w:rPr>
+            </m:ctrlPr>
+          </m:dPr>
+          <m:e>
+            <m:r>
+              <w:rPr>
+                <w:rFonts w:ascii="Cambria Math" w:hAnsi="Cambria Math"/>
+              </w:rPr>
+              <m:t>z</m:t>
+            </m:r>
+          </m:e>
+        </m:d>
+      </m:oMath>
+      <w:r>
+        <w:t>,</w:t>
+      </w:r>
       <w:r>
         <w:tab/>
+        <w:t>(</w:t>
+      </w:r>
+      <w:r>
+        <w:fldChar w:fldCharType="begin"/>
+      </w:r>
+      <w:r>
+        <w:instrText xml:space="preserve"> STYLEREF  \s 1-līm-numurēts-virsraksts </w:instrText>
+      </w:r>
+      <w:r>
+        <w:fldChar w:fldCharType="separate"/>
+      </w:r>
+      <w:r>
+        <w:rPr>
+          <w:noProof/>
+        </w:rPr>
+        <w:t>5</w:t>
+      </w:r>
+      <w:r>
+        <w:fldChar w:fldCharType="end"/>
+      </w:r>
+      <w:r>
+        <w:t>.</w:t>
+      </w:r>
+      <w:r>
+        <w:fldChar w:fldCharType="begin"/>
+      </w:r>
+      <w:r>
+        <w:instrText xml:space="preserve"> SEQ Vienādojums \* ARABIC \s 1 </w:instrText>
+      </w:r>
+      <w:r>
+        <w:fldChar w:fldCharType="separate"/>
+      </w:r>
+      <w:r>
+        <w:rPr>
+          <w:noProof/>
+        </w:rPr>
+        <w:t>4</w:t>
+      </w:r>
+      <w:r>
+        <w:fldChar w:fldCharType="end"/>
+      </w:r>
+      <w:r>
+        <w:t>)</w:t>
       </w:r>
     </w:p>
     <w:p>
@@ -14609,10 +14879,3273 @@
     </w:p>
     <w:p>
       <w:pPr>
+        <w:pStyle w:val="Teksts"/>
+        <w:tabs>
+          <w:tab w:val="left" w:pos="1276"/>
+        </w:tabs>
+      </w:pPr>
+      <w:r>
+        <w:t>kur</w:t>
+      </w:r>
+      <w:r>
+        <w:tab/>
+      </w:r>
+      <m:oMath>
+        <m:r>
+          <w:rPr>
+            <w:rFonts w:ascii="Cambria Math" w:hAnsi="Cambria Math"/>
+          </w:rPr>
+          <m:t>x</m:t>
+        </m:r>
+      </m:oMath>
+      <w:r>
+        <w:t xml:space="preserve"> ir ieejas vektors,</w:t>
+      </w:r>
+    </w:p>
+    <w:p>
+      <w:pPr>
+        <w:pStyle w:val="Teksts"/>
+        <w:tabs>
+          <w:tab w:val="left" w:pos="1276"/>
+        </w:tabs>
+      </w:pPr>
+      <w:r>
+        <w:tab/>
+      </w:r>
+      <m:oMath>
+        <m:r>
+          <w:rPr>
+            <w:rFonts w:ascii="Cambria Math" w:hAnsi="Cambria Math"/>
+          </w:rPr>
+          <m:t>w</m:t>
+        </m:r>
+      </m:oMath>
+      <w:r>
+        <w:t xml:space="preserve"> ir svaru vektors,</w:t>
+      </w:r>
+    </w:p>
+    <w:p>
+      <w:pPr>
+        <w:pStyle w:val="Teksts"/>
+        <w:tabs>
+          <w:tab w:val="left" w:pos="1276"/>
+        </w:tabs>
+      </w:pPr>
+      <w:r>
+        <w:tab/>
+      </w:r>
+      <m:oMath>
+        <m:r>
+          <w:rPr>
+            <w:rFonts w:ascii="Cambria Math" w:hAnsi="Cambria Math"/>
+          </w:rPr>
+          <m:t>b</m:t>
+        </m:r>
+      </m:oMath>
+      <w:r>
+        <w:t xml:space="preserve"> ir nobīde,</w:t>
+      </w:r>
+    </w:p>
+    <w:p>
+      <w:pPr>
+        <w:pStyle w:val="Teksts"/>
+        <w:tabs>
+          <w:tab w:val="left" w:pos="1276"/>
+        </w:tabs>
+      </w:pPr>
+      <w:r>
+        <w:rPr>
+          <w:iCs/>
+        </w:rPr>
+        <w:tab/>
+      </w:r>
+      <m:oMath>
+        <m:r>
+          <w:rPr>
+            <w:rFonts w:ascii="Cambria Math" w:hAnsi="Cambria Math"/>
+          </w:rPr>
+          <m:t>φ</m:t>
+        </m:r>
+        <m:d>
+          <m:dPr>
+            <m:ctrlPr>
+              <w:rPr>
+                <w:rFonts w:ascii="Cambria Math" w:hAnsi="Cambria Math"/>
+                <w:i/>
+              </w:rPr>
+            </m:ctrlPr>
+          </m:dPr>
+          <m:e>
+            <m:r>
+              <w:rPr>
+                <w:rFonts w:ascii="Cambria Math" w:hAnsi="Cambria Math"/>
+              </w:rPr>
+              <m:t>z</m:t>
+            </m:r>
+          </m:e>
+        </m:d>
+      </m:oMath>
+      <w:r>
+        <w:t xml:space="preserve"> ir aktivācijas funkcija.</w:t>
+      </w:r>
+    </w:p>
+    <w:p>
+      <w:pPr>
+        <w:pStyle w:val="Teksts"/>
+      </w:pPr>
+    </w:p>
+    <w:p>
+      <w:pPr>
+        <w:pStyle w:val="Teksts"/>
+      </w:pPr>
+      <w:commentRangeStart w:id="126"/>
+      <w:r>
+        <w:t>Slānim</w:t>
+      </w:r>
+      <w:commentRangeEnd w:id="126"/>
+      <w:r>
+        <w:rPr>
+          <w:rStyle w:val="CommentReference"/>
+          <w:sz w:val="24"/>
+          <w:szCs w:val="24"/>
+        </w:rPr>
+        <w:commentReference w:id="126"/>
+      </w:r>
+      <w:r>
+        <w:t xml:space="preserve">, kas sastāv no vairākiem neironiem, šo aprēķinu </w:t>
+      </w:r>
+      <w:r>
+        <w:t>raksta</w:t>
+      </w:r>
+      <w:r>
+        <w:t xml:space="preserve"> matricas formā</w:t>
+      </w:r>
+      <w:r>
+        <w:t xml:space="preserve">. </w:t>
+      </w:r>
+      <w:commentRangeStart w:id="127"/>
+      <w:r>
+        <w:t xml:space="preserve">Daudzslāņu </w:t>
+      </w:r>
+      <w:commentRangeEnd w:id="127"/>
+      <w:r>
+        <w:rPr>
+          <w:rStyle w:val="CommentReference"/>
+          <w:sz w:val="24"/>
+          <w:szCs w:val="24"/>
+        </w:rPr>
+        <w:commentReference w:id="127"/>
+      </w:r>
+      <w:r>
+        <w:t xml:space="preserve">perceptronos neironi ir organizēti ieejas, slēptajā un izejas slāņos, un tīkls mācās, pielāgojot svarus, lai samazinātu kļūdu starp prognozēto un vēlamo izejas vērtību </w:t>
+      </w:r>
+      <w:sdt>
+        <w:sdtPr>
+          <w:id w:val="-1128084899"/>
+          <w:citation/>
+        </w:sdtPr>
+        <w:sdtContent>
+          <w:r>
+            <w:fldChar w:fldCharType="begin"/>
+          </w:r>
+          <w:r>
+            <w:instrText xml:space="preserve"> CITATION Ram19 \l 1062 </w:instrText>
+          </w:r>
+          <w:r>
+            <w:fldChar w:fldCharType="separate"/>
+          </w:r>
+          <w:r>
+            <w:rPr>
+              <w:noProof/>
+            </w:rPr>
+            <w:t>(Ramchoun, Idrissi, Ghanou, &amp; Ettaouil, 2019)</w:t>
+          </w:r>
+          <w:r>
+            <w:fldChar w:fldCharType="end"/>
+          </w:r>
+        </w:sdtContent>
+      </w:sdt>
+      <w:r>
+        <w:t>. Regresijas uzdevumiem izejas slānis tiek definēts kā pēdējās slēptā</w:t>
+      </w:r>
+      <w:r>
+        <w:t xml:space="preserve">s izejas </w:t>
+      </w:r>
+      <w:r>
+        <w:t xml:space="preserve">lineāra transformācija, kas ģenerē nepārtrauktas vērtības prognozes </w:t>
+      </w:r>
+      <w:sdt>
+        <w:sdtPr>
+          <w:id w:val="-1685428644"/>
+          <w:citation/>
+        </w:sdtPr>
+        <w:sdtContent>
+          <w:r>
+            <w:fldChar w:fldCharType="begin"/>
+          </w:r>
+          <w:r>
+            <w:instrText xml:space="preserve"> CITATION Chi92 \l 1062 </w:instrText>
+          </w:r>
+          <w:r>
+            <w:fldChar w:fldCharType="separate"/>
+          </w:r>
+          <w:r>
+            <w:rPr>
+              <w:noProof/>
+            </w:rPr>
+            <w:t>(Chiang &amp; Fu, 1992)</w:t>
+          </w:r>
+          <w:r>
+            <w:fldChar w:fldCharType="end"/>
+          </w:r>
+        </w:sdtContent>
+      </w:sdt>
+      <w:r>
+        <w:t xml:space="preserve">. Šajā gadījumā prognozēto izeju var uzrakstīt kā </w:t>
+      </w:r>
+      <w:r>
+        <w:t>5.5</w:t>
+      </w:r>
+      <w:r>
+        <w:t xml:space="preserve">. formulu, kur tīkla parametri ir optimizēti, lai samazinātu neatbilstību starp </w:t>
+      </w:r>
+      <m:oMath>
+        <m:acc>
+          <m:accPr>
+            <m:ctrlPr>
+              <w:rPr>
+                <w:rFonts w:ascii="Cambria Math" w:hAnsi="Cambria Math"/>
+              </w:rPr>
+            </m:ctrlPr>
+          </m:accPr>
+          <m:e>
+            <m:r>
+              <w:rPr>
+                <w:rFonts w:ascii="Cambria Math" w:hAnsi="Cambria Math"/>
+              </w:rPr>
+              <m:t>y</m:t>
+            </m:r>
+          </m:e>
+        </m:acc>
+      </m:oMath>
+      <w:r>
+        <w:t xml:space="preserve"> un patieso mērķi </w:t>
+      </w:r>
+      <w:r>
+        <w:rPr>
+          <w:i/>
+          <w:iCs/>
+        </w:rPr>
+        <w:t>y</w:t>
+      </w:r>
+      <w:r>
+        <w:t xml:space="preserve"> </w:t>
+      </w:r>
+      <w:sdt>
+        <w:sdtPr>
+          <w:id w:val="1623037505"/>
+          <w:citation/>
+        </w:sdtPr>
+        <w:sdtContent>
+          <w:r>
+            <w:fldChar w:fldCharType="begin"/>
+          </w:r>
+          <w:r>
+            <w:instrText xml:space="preserve"> CITATION Ram19 \l 1062 </w:instrText>
+          </w:r>
+          <w:r>
+            <w:fldChar w:fldCharType="separate"/>
+          </w:r>
+          <w:r>
+            <w:rPr>
+              <w:noProof/>
+            </w:rPr>
+            <w:t>(Ramchoun, Idrissi, Ghanou, &amp; Ettaouil, 2019)</w:t>
+          </w:r>
+          <w:r>
+            <w:fldChar w:fldCharType="end"/>
+          </w:r>
+        </w:sdtContent>
+      </w:sdt>
+    </w:p>
+    <w:p>
+      <w:pPr>
+        <w:pStyle w:val="Teksts"/>
+        <w:tabs>
+          <w:tab w:val="center" w:pos="4395"/>
+          <w:tab w:val="right" w:pos="8222"/>
+        </w:tabs>
+        <w:ind w:firstLine="0"/>
+      </w:pPr>
+      <w:r>
+        <w:tab/>
+      </w:r>
+      <m:oMath>
+        <m:acc>
+          <m:accPr>
+            <m:ctrlPr>
+              <w:rPr>
+                <w:rFonts w:ascii="Cambria Math" w:hAnsi="Cambria Math"/>
+              </w:rPr>
+            </m:ctrlPr>
+          </m:accPr>
+          <m:e>
+            <m:r>
+              <m:rPr>
+                <m:sty m:val="p"/>
+              </m:rPr>
+              <w:rPr>
+                <w:rFonts w:ascii="Cambria Math" w:hAnsi="Cambria Math"/>
+              </w:rPr>
+              <m:t>y</m:t>
+            </m:r>
+          </m:e>
+        </m:acc>
+        <m:r>
+          <m:rPr>
+            <m:sty m:val="p"/>
+          </m:rPr>
+          <w:rPr>
+            <w:rFonts w:ascii="Cambria Math" w:hAnsi="Cambria Math"/>
+          </w:rPr>
+          <m:t>=</m:t>
+        </m:r>
+        <m:sSub>
+          <m:sSubPr>
+            <m:ctrlPr>
+              <w:rPr>
+                <w:rFonts w:ascii="Cambria Math" w:hAnsi="Cambria Math"/>
+              </w:rPr>
+            </m:ctrlPr>
+          </m:sSubPr>
+          <m:e>
+            <m:r>
+              <m:rPr>
+                <m:sty m:val="p"/>
+              </m:rPr>
+              <w:rPr>
+                <w:rFonts w:ascii="Cambria Math" w:hAnsi="Cambria Math"/>
+              </w:rPr>
+              <m:t>W</m:t>
+            </m:r>
+          </m:e>
+          <m:sub>
+            <m:r>
+              <m:rPr>
+                <m:nor/>
+              </m:rPr>
+              <w:rPr>
+                <w:rFonts w:ascii="Cambria Math" w:hAnsi="Cambria Math"/>
+              </w:rPr>
+              <m:t>out</m:t>
+            </m:r>
+          </m:sub>
+        </m:sSub>
+        <m:r>
+          <m:rPr>
+            <m:sty m:val="p"/>
+          </m:rPr>
+          <w:rPr>
+            <w:rFonts w:ascii="Cambria Math" w:hAnsi="Cambria Math"/>
+          </w:rPr>
+          <m:t>h+</m:t>
+        </m:r>
+        <m:sSub>
+          <m:sSubPr>
+            <m:ctrlPr>
+              <w:rPr>
+                <w:rFonts w:ascii="Cambria Math" w:hAnsi="Cambria Math"/>
+              </w:rPr>
+            </m:ctrlPr>
+          </m:sSubPr>
+          <m:e>
+            <m:r>
+              <m:rPr>
+                <m:sty m:val="p"/>
+              </m:rPr>
+              <w:rPr>
+                <w:rFonts w:ascii="Cambria Math" w:hAnsi="Cambria Math"/>
+              </w:rPr>
+              <m:t>b</m:t>
+            </m:r>
+          </m:e>
+          <m:sub>
+            <m:r>
+              <m:rPr>
+                <m:nor/>
+              </m:rPr>
+              <w:rPr>
+                <w:rFonts w:ascii="Cambria Math" w:hAnsi="Cambria Math"/>
+              </w:rPr>
+              <m:t>out</m:t>
+            </m:r>
+          </m:sub>
+        </m:sSub>
+      </m:oMath>
+      <w:r>
+        <w:tab/>
+      </w:r>
+      <w:r>
+        <w:t xml:space="preserve"> (</w:t>
+      </w:r>
+      <w:r>
+        <w:fldChar w:fldCharType="begin"/>
+      </w:r>
+      <w:r>
+        <w:instrText xml:space="preserve"> STYLEREF  \s 1-līm-numurēts-virsraksts </w:instrText>
+      </w:r>
+      <w:r>
+        <w:fldChar w:fldCharType="separate"/>
+      </w:r>
+      <w:r>
+        <w:rPr>
+          <w:noProof/>
+        </w:rPr>
+        <w:t>5</w:t>
+      </w:r>
+      <w:r>
+        <w:fldChar w:fldCharType="end"/>
+      </w:r>
+      <w:r>
+        <w:t>.</w:t>
+      </w:r>
+      <w:r>
+        <w:fldChar w:fldCharType="begin"/>
+      </w:r>
+      <w:r>
+        <w:instrText xml:space="preserve"> SEQ Vienādojums \* ARABIC \s 1 </w:instrText>
+      </w:r>
+      <w:r>
+        <w:fldChar w:fldCharType="separate"/>
+      </w:r>
+      <w:r>
+        <w:rPr>
+          <w:noProof/>
+        </w:rPr>
+        <w:t>5</w:t>
+      </w:r>
+      <w:r>
+        <w:fldChar w:fldCharType="end"/>
+      </w:r>
+      <w:r>
+        <w:t>)</w:t>
+      </w:r>
+    </w:p>
+    <w:p>
+      <w:pPr>
+        <w:pStyle w:val="3-lm-virsraksts"/>
+      </w:pPr>
+      <w:r>
+        <w:t>Aktivizācijas funkcijas</w:t>
+      </w:r>
+    </w:p>
+    <w:p>
+      <w:pPr>
+        <w:pStyle w:val="Teksts"/>
+      </w:pPr>
+      <w:r>
+        <w:t>Aktivācijas funkcija piešķir tīkliem nelinearitāti, lai uztvertu sarežģīt</w:t>
+      </w:r>
+      <w:r>
+        <w:t>a</w:t>
+      </w:r>
+      <w:r>
+        <w:t>s</w:t>
+      </w:r>
+      <w:r>
+        <w:t xml:space="preserve"> </w:t>
+      </w:r>
+      <w:r>
+        <w:t>atkarības dat</w:t>
+      </w:r>
+      <w:r>
+        <w:t>os</w:t>
+      </w:r>
+      <w:r>
+        <w:t>, savukārt tradicionālajiem lineārajiem modeļiem ir ierobežotas aproksimācijas iespējas</w:t>
+      </w:r>
+      <w:sdt>
+        <w:sdtPr>
+          <w:id w:val="35317983"/>
+          <w:citation/>
+        </w:sdtPr>
+        <w:sdtContent>
+          <w:r>
+            <w:fldChar w:fldCharType="begin"/>
+          </w:r>
+          <w:r>
+            <w:instrText xml:space="preserve"> CITATION Zha03 \l 2057 </w:instrText>
+          </w:r>
+          <w:r>
+            <w:fldChar w:fldCharType="separate"/>
+          </w:r>
+          <w:r>
+            <w:rPr>
+              <w:noProof/>
+            </w:rPr>
+            <w:t xml:space="preserve"> (Zhang, 2003)</w:t>
+          </w:r>
+          <w:r>
+            <w:fldChar w:fldCharType="end"/>
+          </w:r>
+        </w:sdtContent>
+      </w:sdt>
+      <w:r>
+        <w:t>:</w:t>
+      </w:r>
+    </w:p>
+    <w:p>
+      <w:pPr>
+        <w:pStyle w:val="Uzsk-aizzmes"/>
+      </w:pPr>
+      <w:r>
+        <w:t xml:space="preserve">Sigmoīds: </w:t>
+      </w:r>
+      <m:oMath>
+        <m:r>
+          <w:rPr>
+            <w:rFonts w:ascii="Cambria Math" w:hAnsi="Cambria Math"/>
+          </w:rPr>
+          <m:t>σ</m:t>
+        </m:r>
+        <m:d>
+          <m:dPr>
+            <m:ctrlPr>
+              <w:rPr>
+                <w:rFonts w:ascii="Cambria Math" w:hAnsi="Cambria Math"/>
+                <w:i/>
+              </w:rPr>
+            </m:ctrlPr>
+          </m:dPr>
+          <m:e>
+            <m:r>
+              <w:rPr>
+                <w:rFonts w:ascii="Cambria Math" w:hAnsi="Cambria Math"/>
+              </w:rPr>
+              <m:t>z</m:t>
+            </m:r>
+          </m:e>
+        </m:d>
+        <m:r>
+          <w:rPr>
+            <w:rFonts w:ascii="Cambria Math" w:hAnsi="Cambria Math"/>
+          </w:rPr>
+          <m:t>=</m:t>
+        </m:r>
+        <m:f>
+          <m:fPr>
+            <m:ctrlPr>
+              <w:rPr>
+                <w:rFonts w:ascii="Cambria Math" w:hAnsi="Cambria Math"/>
+              </w:rPr>
+            </m:ctrlPr>
+          </m:fPr>
+          <m:num>
+            <m:r>
+              <w:rPr>
+                <w:rFonts w:ascii="Cambria Math" w:hAnsi="Cambria Math"/>
+              </w:rPr>
+              <m:t>1</m:t>
+            </m:r>
+            <m:ctrlPr>
+              <w:rPr>
+                <w:rFonts w:ascii="Cambria Math" w:hAnsi="Cambria Math"/>
+                <w:i/>
+              </w:rPr>
+            </m:ctrlPr>
+          </m:num>
+          <m:den>
+            <m:r>
+              <w:rPr>
+                <w:rFonts w:ascii="Cambria Math" w:hAnsi="Cambria Math"/>
+              </w:rPr>
+              <m:t>1+</m:t>
+            </m:r>
+            <m:sSup>
+              <m:sSupPr>
+                <m:ctrlPr>
+                  <w:rPr>
+                    <w:rFonts w:ascii="Cambria Math" w:hAnsi="Cambria Math"/>
+                    <w:i/>
+                  </w:rPr>
+                </m:ctrlPr>
+              </m:sSupPr>
+              <m:e>
+                <m:r>
+                  <w:rPr>
+                    <w:rFonts w:ascii="Cambria Math" w:hAnsi="Cambria Math"/>
+                  </w:rPr>
+                  <m:t>e</m:t>
+                </m:r>
+              </m:e>
+              <m:sup>
+                <m:r>
+                  <w:rPr>
+                    <w:rFonts w:ascii="Cambria Math" w:hAnsi="Cambria Math"/>
+                  </w:rPr>
+                  <m:t>-z</m:t>
+                </m:r>
+              </m:sup>
+            </m:sSup>
+            <m:ctrlPr>
+              <w:rPr>
+                <w:rFonts w:ascii="Cambria Math" w:hAnsi="Cambria Math"/>
+                <w:i/>
+              </w:rPr>
+            </m:ctrlPr>
+          </m:den>
+        </m:f>
+      </m:oMath>
+      <w:r>
+        <w:t xml:space="preserve"> </w:t>
+      </w:r>
+      <w:r>
+        <w:t>— sākotnēji bija populārs, to raksturoja gradienta vājināšanās</w:t>
+      </w:r>
+      <w:r>
+        <w:t xml:space="preserve"> </w:t>
+      </w:r>
+      <w:sdt>
+        <w:sdtPr>
+          <w:id w:val="213705159"/>
+          <w:citation/>
+        </w:sdtPr>
+        <w:sdtContent>
+          <w:r>
+            <w:fldChar w:fldCharType="begin"/>
+          </w:r>
+          <w:r>
+            <w:instrText xml:space="preserve"> CITATION Filali2022SupplyChainLSTM \l 2057 </w:instrText>
+          </w:r>
+          <w:r>
+            <w:fldChar w:fldCharType="separate"/>
+          </w:r>
+          <w:r>
+            <w:rPr>
+              <w:noProof/>
+            </w:rPr>
+            <w:t>(Filali, et al., 2022)</w:t>
+          </w:r>
+          <w:r>
+            <w:fldChar w:fldCharType="end"/>
+          </w:r>
+        </w:sdtContent>
+      </w:sdt>
+      <w:r>
+        <w:t xml:space="preserve">. </w:t>
+      </w:r>
+    </w:p>
+    <w:p>
+      <w:pPr>
+        <w:pStyle w:val="Uzsk-aizzmes"/>
+      </w:pPr>
+      <w:r>
+        <w:t>tanh:</w:t>
+      </w:r>
+      <w:r>
+        <w:t xml:space="preserve"> </w:t>
+      </w:r>
+      <m:oMath>
+        <m:func>
+          <m:funcPr>
+            <m:ctrlPr>
+              <w:rPr>
+                <w:rFonts w:ascii="Cambria Math" w:hAnsi="Cambria Math"/>
+              </w:rPr>
+            </m:ctrlPr>
+          </m:funcPr>
+          <m:fName>
+            <m:r>
+              <m:rPr>
+                <m:sty m:val="p"/>
+              </m:rPr>
+              <w:rPr>
+                <w:rFonts w:ascii="Cambria Math" w:hAnsi="Cambria Math"/>
+              </w:rPr>
+              <m:t>tanh</m:t>
+            </m:r>
+            <m:ctrlPr>
+              <w:rPr>
+                <w:rFonts w:ascii="Cambria Math" w:hAnsi="Cambria Math"/>
+                <w:i/>
+              </w:rPr>
+            </m:ctrlPr>
+          </m:fName>
+          <m:e>
+            <m:d>
+              <m:dPr>
+                <m:ctrlPr>
+                  <w:rPr>
+                    <w:rFonts w:ascii="Cambria Math" w:hAnsi="Cambria Math"/>
+                    <w:i/>
+                  </w:rPr>
+                </m:ctrlPr>
+              </m:dPr>
+              <m:e>
+                <m:r>
+                  <w:rPr>
+                    <w:rFonts w:ascii="Cambria Math" w:hAnsi="Cambria Math"/>
+                  </w:rPr>
+                  <m:t>z</m:t>
+                </m:r>
+              </m:e>
+            </m:d>
+          </m:e>
+        </m:func>
+      </m:oMath>
+      <w:r>
+        <w:t xml:space="preserve"> </w:t>
+      </w:r>
+      <w:r>
+        <w:t>ir hiperboliskā pieskares funkcija, ko bieži izmanto slēptajos slāņos</w:t>
+      </w:r>
+      <w:r>
+        <w:t xml:space="preserve"> </w:t>
+      </w:r>
+      <w:sdt>
+        <w:sdtPr>
+          <w:id w:val="1492905443"/>
+          <w:citation/>
+        </w:sdtPr>
+        <w:sdtContent>
+          <w:r>
+            <w:fldChar w:fldCharType="begin"/>
+          </w:r>
+          <w:r>
+            <w:instrText xml:space="preserve"> CITATION Min11 \l 2057 </w:instrText>
+          </w:r>
+          <w:r>
+            <w:fldChar w:fldCharType="separate"/>
+          </w:r>
+          <w:r>
+            <w:rPr>
+              <w:noProof/>
+            </w:rPr>
+            <w:t>(Minnett, Smith, Lennon, &amp; Hecht-Nielsen, 2011)</w:t>
+          </w:r>
+          <w:r>
+            <w:fldChar w:fldCharType="end"/>
+          </w:r>
+        </w:sdtContent>
+      </w:sdt>
+      <w:r>
+        <w:t xml:space="preserve">. </w:t>
+      </w:r>
+    </w:p>
+    <w:p>
+      <w:pPr>
+        <w:pStyle w:val="Uzsk-aizzmes"/>
+      </w:pPr>
+      <w:r>
+        <w:t>ReLU:</w:t>
+      </w:r>
+      <w:r>
+        <w:t xml:space="preserve"> </w:t>
+      </w:r>
+      <m:oMath>
+        <m:func>
+          <m:funcPr>
+            <m:ctrlPr>
+              <w:rPr>
+                <w:rFonts w:ascii="Cambria Math" w:hAnsi="Cambria Math"/>
+              </w:rPr>
+            </m:ctrlPr>
+          </m:funcPr>
+          <m:fName>
+            <m:r>
+              <m:rPr>
+                <m:sty m:val="p"/>
+              </m:rPr>
+              <w:rPr>
+                <w:rFonts w:ascii="Cambria Math" w:hAnsi="Cambria Math"/>
+              </w:rPr>
+              <m:t>max</m:t>
+            </m:r>
+            <m:ctrlPr>
+              <w:rPr>
+                <w:rFonts w:ascii="Cambria Math" w:hAnsi="Cambria Math"/>
+                <w:i/>
+              </w:rPr>
+            </m:ctrlPr>
+          </m:fName>
+          <m:e>
+            <m:d>
+              <m:dPr>
+                <m:ctrlPr>
+                  <w:rPr>
+                    <w:rFonts w:ascii="Cambria Math" w:hAnsi="Cambria Math"/>
+                    <w:i/>
+                  </w:rPr>
+                </m:ctrlPr>
+              </m:dPr>
+              <m:e>
+                <m:r>
+                  <w:rPr>
+                    <w:rFonts w:ascii="Cambria Math" w:hAnsi="Cambria Math"/>
+                  </w:rPr>
+                  <m:t>0,z</m:t>
+                </m:r>
+              </m:e>
+            </m:d>
+          </m:e>
+        </m:func>
+      </m:oMath>
+      <w:r>
+        <w:t xml:space="preserve"> ir vienkārša aktivizācijas funkcija, ko bieži izmanto dziļu tīklu ātrai apmācībai</w:t>
+      </w:r>
+      <w:sdt>
+        <w:sdtPr>
+          <w:id w:val="-678195628"/>
+          <w:citation/>
+        </w:sdtPr>
+        <w:sdtContent>
+          <w:r>
+            <w:fldChar w:fldCharType="begin"/>
+          </w:r>
+          <w:r>
+            <w:instrText xml:space="preserve"> CITATION Sirisha2022ProfitPrediction \l 1062 </w:instrText>
+          </w:r>
+          <w:r>
+            <w:fldChar w:fldCharType="separate"/>
+          </w:r>
+          <w:r>
+            <w:rPr>
+              <w:noProof/>
+            </w:rPr>
+            <w:t xml:space="preserve"> (Sirisha, Belavagi, &amp; Attigeri, 2022)</w:t>
+          </w:r>
+          <w:r>
+            <w:fldChar w:fldCharType="end"/>
+          </w:r>
+        </w:sdtContent>
+      </w:sdt>
+      <w:r>
+        <w:t>.</w:t>
+      </w:r>
+    </w:p>
+    <w:p>
+      <w:pPr>
+        <w:pStyle w:val="Teksts"/>
+        <w:rPr>
+          <w:lang w:val="ru-RU"/>
+        </w:rPr>
+      </w:pPr>
+      <w:r>
+        <w:t xml:space="preserve">Rekurentās arhitektūrās (tostarp LSTM) nelinearitātes ir sastopamas šūnā (izmantojot sigmoīdu un (tanh)), bet regresijas izejā parasti tiek izmantota arī lineāra </w:t>
+      </w:r>
+      <w:r>
+        <w:lastRenderedPageBreak/>
+        <w:t>(pilnībā savienota vai blīva) transformācija</w:t>
+      </w:r>
+      <w:r>
+        <w:t xml:space="preserve"> </w:t>
+      </w:r>
+      <w:sdt>
+        <w:sdtPr>
+          <w:id w:val="-555778953"/>
+          <w:citation/>
+        </w:sdtPr>
+        <w:sdtContent>
+          <w:r>
+            <w:fldChar w:fldCharType="begin"/>
+          </w:r>
+          <w:r>
+            <w:instrText xml:space="preserve">CITATION SBS2023RetailSalesForecasting \l 1062 </w:instrText>
+          </w:r>
+          <w:r>
+            <w:fldChar w:fldCharType="separate"/>
+          </w:r>
+          <w:r>
+            <w:rPr>
+              <w:noProof/>
+            </w:rPr>
+            <w:t>(Suresh &amp; Suresh, 2023)</w:t>
+          </w:r>
+          <w:r>
+            <w:fldChar w:fldCharType="end"/>
+          </w:r>
+        </w:sdtContent>
+      </w:sdt>
+      <w:r>
+        <w:t xml:space="preserve"> </w:t>
+      </w:r>
+      <w:sdt>
+        <w:sdtPr>
+          <w:id w:val="530148263"/>
+          <w:citation/>
+        </w:sdtPr>
+        <w:sdtContent>
+          <w:r>
+            <w:fldChar w:fldCharType="begin"/>
+          </w:r>
+          <w:r>
+            <w:instrText xml:space="preserve"> CITATION Sirisha2022ProfitPrediction \l 1062 </w:instrText>
+          </w:r>
+          <w:r>
+            <w:fldChar w:fldCharType="separate"/>
+          </w:r>
+          <w:r>
+            <w:rPr>
+              <w:noProof/>
+            </w:rPr>
+            <w:t xml:space="preserve"> (Sirisha, Belavagi, &amp; Attigeri, 2022)</w:t>
+          </w:r>
+          <w:r>
+            <w:fldChar w:fldCharType="end"/>
+          </w:r>
+        </w:sdtContent>
+      </w:sdt>
+      <w:r>
+        <w:t>.</w:t>
+      </w:r>
+    </w:p>
+    <w:p>
+      <w:pPr>
+        <w:pStyle w:val="3-lm-virsraksts"/>
+        <w:rPr>
+          <w:lang w:val="ru-RU"/>
+        </w:rPr>
+      </w:pPr>
+      <w:r>
+        <w:rPr>
+          <w:lang w:val="ru-RU"/>
+        </w:rPr>
+        <w:t>Tīkla apmācība</w:t>
+      </w:r>
+    </w:p>
+    <w:p>
+      <w:pPr>
+        <w:pStyle w:val="Teksts"/>
+      </w:pPr>
+      <w:r>
+        <w:t xml:space="preserve">Tīkls tiek apmācīts, minimizējot zaudējumu funkciju, kas apraksta neatbilstību starp prognozēm un faktisko vērtību. </w:t>
+      </w:r>
+      <w:r>
+        <w:rPr>
+          <w:i/>
+          <w:iCs/>
+        </w:rPr>
+        <w:t>N</w:t>
+      </w:r>
+      <w:r>
+        <w:t xml:space="preserve"> paraugiem funkciju var uzrakstīt šādi:</w:t>
+      </w:r>
+    </w:p>
+    <w:p>
+      <w:pPr>
+        <w:pStyle w:val="Teksts"/>
+        <w:tabs>
+          <w:tab w:val="center" w:pos="4395"/>
+          <w:tab w:val="right" w:pos="8222"/>
+        </w:tabs>
+        <w:ind w:firstLine="0"/>
+      </w:pPr>
+      <w:r>
+        <w:tab/>
+      </w:r>
+      <m:oMath>
+        <m:r>
+          <m:rPr>
+            <m:scr m:val="script"/>
+            <m:sty m:val="p"/>
+          </m:rPr>
+          <w:rPr>
+            <w:rFonts w:ascii="Cambria Math" w:hAnsi="Cambria Math"/>
+          </w:rPr>
+          <m:t>L=</m:t>
+        </m:r>
+        <m:f>
+          <m:fPr>
+            <m:ctrlPr>
+              <w:rPr>
+                <w:rFonts w:ascii="Cambria Math" w:hAnsi="Cambria Math"/>
+              </w:rPr>
+            </m:ctrlPr>
+          </m:fPr>
+          <m:num>
+            <m:r>
+              <m:rPr>
+                <m:sty m:val="p"/>
+              </m:rPr>
+              <w:rPr>
+                <w:rFonts w:ascii="Cambria Math" w:hAnsi="Cambria Math"/>
+              </w:rPr>
+              <m:t>1</m:t>
+            </m:r>
+          </m:num>
+          <m:den>
+            <m:r>
+              <w:rPr>
+                <w:rFonts w:ascii="Cambria Math" w:hAnsi="Cambria Math"/>
+              </w:rPr>
+              <m:t>N</m:t>
+            </m:r>
+          </m:den>
+        </m:f>
+        <m:nary>
+          <m:naryPr>
+            <m:chr m:val="∑"/>
+            <m:ctrlPr>
+              <w:rPr>
+                <w:rFonts w:ascii="Cambria Math" w:hAnsi="Cambria Math"/>
+              </w:rPr>
+            </m:ctrlPr>
+          </m:naryPr>
+          <m:sub>
+            <m:r>
+              <w:rPr>
+                <w:rFonts w:ascii="Cambria Math" w:hAnsi="Cambria Math"/>
+              </w:rPr>
+              <m:t>i</m:t>
+            </m:r>
+            <m:r>
+              <m:rPr>
+                <m:sty m:val="p"/>
+              </m:rPr>
+              <w:rPr>
+                <w:rFonts w:ascii="Cambria Math" w:hAnsi="Cambria Math"/>
+              </w:rPr>
+              <m:t>=1</m:t>
+            </m:r>
+          </m:sub>
+          <m:sup>
+            <m:r>
+              <w:rPr>
+                <w:rFonts w:ascii="Cambria Math" w:hAnsi="Cambria Math"/>
+              </w:rPr>
+              <m:t>N</m:t>
+            </m:r>
+          </m:sup>
+          <m:e>
+            <m:r>
+              <w:rPr>
+                <w:rFonts w:ascii="Cambria Math" w:hAnsi="Cambria Math"/>
+              </w:rPr>
+              <m:t>L</m:t>
+            </m:r>
+            <m:d>
+              <m:dPr>
+                <m:ctrlPr>
+                  <w:rPr>
+                    <w:rFonts w:ascii="Cambria Math" w:hAnsi="Cambria Math"/>
+                  </w:rPr>
+                </m:ctrlPr>
+              </m:dPr>
+              <m:e>
+                <m:sSub>
+                  <m:sSubPr>
+                    <m:ctrlPr>
+                      <w:rPr>
+                        <w:rFonts w:ascii="Cambria Math" w:hAnsi="Cambria Math"/>
+                      </w:rPr>
+                    </m:ctrlPr>
+                  </m:sSubPr>
+                  <m:e>
+                    <m:r>
+                      <w:rPr>
+                        <w:rFonts w:ascii="Cambria Math" w:hAnsi="Cambria Math"/>
+                      </w:rPr>
+                      <m:t>x</m:t>
+                    </m:r>
+                  </m:e>
+                  <m:sub>
+                    <m:r>
+                      <w:rPr>
+                        <w:rFonts w:ascii="Cambria Math" w:hAnsi="Cambria Math"/>
+                      </w:rPr>
+                      <m:t>i</m:t>
+                    </m:r>
+                  </m:sub>
+                </m:sSub>
+                <m:r>
+                  <m:rPr>
+                    <m:sty m:val="p"/>
+                  </m:rPr>
+                  <w:rPr>
+                    <w:rFonts w:ascii="Cambria Math" w:hAnsi="Cambria Math"/>
+                  </w:rPr>
+                  <m:t>,θ</m:t>
+                </m:r>
+              </m:e>
+            </m:d>
+          </m:e>
+        </m:nary>
+        <m:r>
+          <m:rPr>
+            <m:sty m:val="p"/>
+          </m:rPr>
+          <w:rPr>
+            <w:rFonts w:ascii="Cambria Math" w:hAnsi="Cambria Math"/>
+          </w:rPr>
+          <m:t>,</m:t>
+        </m:r>
+      </m:oMath>
+      <w:r>
+        <w:tab/>
+      </w:r>
+      <w:r>
+        <w:t xml:space="preserve"> (</w:t>
+      </w:r>
+      <w:r>
+        <w:fldChar w:fldCharType="begin"/>
+      </w:r>
+      <w:r>
+        <w:instrText xml:space="preserve"> STYLEREF  \s 1-līm-numurēts-virsraksts </w:instrText>
+      </w:r>
+      <w:r>
+        <w:fldChar w:fldCharType="separate"/>
+      </w:r>
+      <w:r>
+        <w:rPr>
+          <w:noProof/>
+        </w:rPr>
+        <w:t>5</w:t>
+      </w:r>
+      <w:r>
+        <w:fldChar w:fldCharType="end"/>
+      </w:r>
+      <w:r>
+        <w:t>.</w:t>
+      </w:r>
+      <w:r>
+        <w:fldChar w:fldCharType="begin"/>
+      </w:r>
+      <w:r>
+        <w:instrText xml:space="preserve"> SEQ Vienādojums \* ARABIC \s 1 </w:instrText>
+      </w:r>
+      <w:r>
+        <w:fldChar w:fldCharType="separate"/>
+      </w:r>
+      <w:r>
+        <w:rPr>
+          <w:noProof/>
+        </w:rPr>
+        <w:t>6</w:t>
+      </w:r>
+      <w:r>
+        <w:fldChar w:fldCharType="end"/>
+      </w:r>
+      <w:r>
+        <w:t>)</w:t>
+      </w:r>
+    </w:p>
+    <w:p>
+      <w:pPr>
+        <w:pStyle w:val="Teksts"/>
+      </w:pPr>
+      <w:r>
+        <w:t xml:space="preserve">kur </w:t>
+      </w:r>
+      <m:oMath>
+        <m:r>
+          <w:rPr>
+            <w:rFonts w:ascii="Cambria Math" w:hAnsi="Cambria Math"/>
+          </w:rPr>
+          <m:t>θ</m:t>
+        </m:r>
+      </m:oMath>
+      <w:r>
+        <w:t xml:space="preserve"> ir tīkla parametri. </w:t>
+      </w:r>
+    </w:p>
+    <w:p>
+      <w:pPr>
+        <w:pStyle w:val="Teksts"/>
+      </w:pPr>
+      <w:r>
+        <w:t>Šīs funkcijas gradienti tiek aprēķināti apmācības laikā un izmantoti svaru atjaunināšanai. Neironu tīklos to parasti panāk ar atpakaļizplatīšanas</w:t>
+      </w:r>
+      <w:r>
+        <w:t xml:space="preserve"> (</w:t>
+      </w:r>
+      <w:r>
+        <w:rPr>
+          <w:i/>
+          <w:iCs/>
+        </w:rPr>
+        <w:t>backprop</w:t>
+      </w:r>
+      <w:r>
+        <w:rPr>
+          <w:i/>
+          <w:iCs/>
+        </w:rPr>
+        <w:t>a</w:t>
+      </w:r>
+      <w:r>
+        <w:rPr>
+          <w:i/>
+          <w:iCs/>
+        </w:rPr>
+        <w:t>gation</w:t>
+      </w:r>
+      <w:r>
+        <w:t>)</w:t>
+      </w:r>
+      <w:r>
+        <w:t xml:space="preserve"> algoritmu, kas aprēķina zaudējumu funkcijas gradientus no tīkla svariem</w:t>
+      </w:r>
+      <w:r>
+        <w:t xml:space="preserve"> </w:t>
+      </w:r>
+      <w:sdt>
+        <w:sdtPr>
+          <w:id w:val="-297299779"/>
+          <w:citation/>
+        </w:sdtPr>
+        <w:sdtContent>
+          <w:r>
+            <w:fldChar w:fldCharType="begin"/>
+          </w:r>
+          <w:r>
+            <w:instrText xml:space="preserve"> CITATION JiC24 \l 1062 </w:instrText>
+          </w:r>
+          <w:r>
+            <w:fldChar w:fldCharType="separate"/>
+          </w:r>
+          <w:r>
+            <w:rPr>
+              <w:noProof/>
+            </w:rPr>
+            <w:t>(Ji, 2024)</w:t>
+          </w:r>
+          <w:r>
+            <w:fldChar w:fldCharType="end"/>
+          </w:r>
+        </w:sdtContent>
+      </w:sdt>
+      <w:sdt>
+        <w:sdtPr>
+          <w:id w:val="1465230448"/>
+          <w:citation/>
+        </w:sdtPr>
+        <w:sdtContent>
+          <w:r>
+            <w:fldChar w:fldCharType="begin"/>
+          </w:r>
+          <w:r>
+            <w:instrText xml:space="preserve"> CITATION Min11 \l 1062 </w:instrText>
+          </w:r>
+          <w:r>
+            <w:fldChar w:fldCharType="separate"/>
+          </w:r>
+          <w:r>
+            <w:rPr>
+              <w:noProof/>
+            </w:rPr>
+            <w:t xml:space="preserve"> (Minnett, Smith, Lennon, &amp; Hecht-Nielsen, 2011)</w:t>
+          </w:r>
+          <w:r>
+            <w:fldChar w:fldCharType="end"/>
+          </w:r>
+        </w:sdtContent>
+      </w:sdt>
+      <w:r>
+        <w:t>.</w:t>
+      </w:r>
+    </w:p>
+    <w:p>
+      <w:pPr>
+        <w:pStyle w:val="Teksts"/>
+      </w:pPr>
+      <w:r>
+        <w:t>Regresijas problēmās kā zaudējumu funkcija bieži tiek izmantota vidējā kvadrātiskā kļūda (MSE). Piemēram, to var uzrakstīt šādi</w:t>
+      </w:r>
+      <w:r>
+        <w:t xml:space="preserve"> </w:t>
+      </w:r>
+      <w:sdt>
+        <w:sdtPr>
+          <w:id w:val="-2056005193"/>
+          <w:citation/>
+        </w:sdtPr>
+        <w:sdtContent>
+          <w:r>
+            <w:fldChar w:fldCharType="begin"/>
+          </w:r>
+          <w:r>
+            <w:instrText xml:space="preserve"> CITATION Min11 \l 1062 </w:instrText>
+          </w:r>
+          <w:r>
+            <w:fldChar w:fldCharType="separate"/>
+          </w:r>
+          <w:r>
+            <w:rPr>
+              <w:noProof/>
+            </w:rPr>
+            <w:t>(Minnett, Smith, Lennon, &amp; Hecht-Nielsen, 2011)</w:t>
+          </w:r>
+          <w:r>
+            <w:fldChar w:fldCharType="end"/>
+          </w:r>
+        </w:sdtContent>
+      </w:sdt>
+      <w:r>
+        <w:t>:</w:t>
+      </w:r>
+    </w:p>
+    <w:p>
+      <w:pPr>
+        <w:pStyle w:val="Teksts"/>
+        <w:tabs>
+          <w:tab w:val="center" w:pos="4395"/>
+          <w:tab w:val="right" w:pos="8222"/>
+        </w:tabs>
+        <w:ind w:firstLine="0"/>
+      </w:pPr>
+      <w:r>
+        <w:tab/>
+      </w:r>
+      <m:oMath>
+        <m:r>
+          <m:rPr>
+            <m:sty m:val="p"/>
+          </m:rPr>
+          <w:rPr>
+            <w:rFonts w:ascii="Cambria Math" w:hAnsi="Cambria Math"/>
+          </w:rPr>
+          <m:t>ε</m:t>
+        </m:r>
+        <m:d>
+          <m:dPr>
+            <m:ctrlPr>
+              <w:rPr>
+                <w:rFonts w:ascii="Cambria Math" w:hAnsi="Cambria Math"/>
+              </w:rPr>
+            </m:ctrlPr>
+          </m:dPr>
+          <m:e>
+            <m:r>
+              <w:rPr>
+                <w:rFonts w:ascii="Cambria Math" w:hAnsi="Cambria Math"/>
+              </w:rPr>
+              <m:t>u</m:t>
+            </m:r>
+            <m:r>
+              <m:rPr>
+                <m:sty m:val="p"/>
+              </m:rPr>
+              <w:rPr>
+                <w:rFonts w:ascii="Cambria Math" w:hAnsi="Cambria Math"/>
+              </w:rPr>
+              <m:t>,</m:t>
+            </m:r>
+            <m:r>
+              <w:rPr>
+                <w:rFonts w:ascii="Cambria Math" w:hAnsi="Cambria Math"/>
+              </w:rPr>
+              <m:t>v</m:t>
+            </m:r>
+          </m:e>
+        </m:d>
+        <m:r>
+          <m:rPr>
+            <m:sty m:val="p"/>
+          </m:rPr>
+          <w:rPr>
+            <w:rFonts w:ascii="Cambria Math" w:hAnsi="Cambria Math"/>
+          </w:rPr>
+          <m:t>=</m:t>
+        </m:r>
+        <m:f>
+          <m:fPr>
+            <m:ctrlPr>
+              <w:rPr>
+                <w:rFonts w:ascii="Cambria Math" w:hAnsi="Cambria Math"/>
+              </w:rPr>
+            </m:ctrlPr>
+          </m:fPr>
+          <m:num>
+            <m:r>
+              <m:rPr>
+                <m:sty m:val="p"/>
+              </m:rPr>
+              <w:rPr>
+                <w:rFonts w:ascii="Cambria Math" w:hAnsi="Cambria Math"/>
+              </w:rPr>
+              <m:t>1</m:t>
+            </m:r>
+          </m:num>
+          <m:den>
+            <m:r>
+              <w:rPr>
+                <w:rFonts w:ascii="Cambria Math" w:hAnsi="Cambria Math"/>
+              </w:rPr>
+              <m:t>T</m:t>
+            </m:r>
+          </m:den>
+        </m:f>
+        <m:nary>
+          <m:naryPr>
+            <m:chr m:val="∑"/>
+            <m:ctrlPr>
+              <w:rPr>
+                <w:rFonts w:ascii="Cambria Math" w:hAnsi="Cambria Math"/>
+              </w:rPr>
+            </m:ctrlPr>
+          </m:naryPr>
+          <m:sub>
+            <m:r>
+              <w:rPr>
+                <w:rFonts w:ascii="Cambria Math" w:hAnsi="Cambria Math"/>
+              </w:rPr>
+              <m:t>t</m:t>
+            </m:r>
+            <m:r>
+              <m:rPr>
+                <m:sty m:val="p"/>
+              </m:rPr>
+              <w:rPr>
+                <w:rFonts w:ascii="Cambria Math" w:hAnsi="Cambria Math"/>
+              </w:rPr>
+              <m:t>=1</m:t>
+            </m:r>
+          </m:sub>
+          <m:sup>
+            <m:r>
+              <w:rPr>
+                <w:rFonts w:ascii="Cambria Math" w:hAnsi="Cambria Math"/>
+              </w:rPr>
+              <m:t>T</m:t>
+            </m:r>
+          </m:sup>
+          <m:e>
+            <m:sSup>
+              <m:sSupPr>
+                <m:ctrlPr>
+                  <w:rPr>
+                    <w:rFonts w:ascii="Cambria Math" w:hAnsi="Cambria Math"/>
+                  </w:rPr>
+                </m:ctrlPr>
+              </m:sSupPr>
+              <m:e>
+                <m:d>
+                  <m:dPr>
+                    <m:ctrlPr>
+                      <w:rPr>
+                        <w:rFonts w:ascii="Cambria Math" w:hAnsi="Cambria Math"/>
+                      </w:rPr>
+                    </m:ctrlPr>
+                  </m:dPr>
+                  <m:e>
+                    <m:sSub>
+                      <m:sSubPr>
+                        <m:ctrlPr>
+                          <w:rPr>
+                            <w:rFonts w:ascii="Cambria Math" w:hAnsi="Cambria Math"/>
+                          </w:rPr>
+                        </m:ctrlPr>
+                      </m:sSubPr>
+                      <m:e>
+                        <m:r>
+                          <w:rPr>
+                            <w:rFonts w:ascii="Cambria Math" w:hAnsi="Cambria Math"/>
+                          </w:rPr>
+                          <m:t>y</m:t>
+                        </m:r>
+                      </m:e>
+                      <m:sub>
+                        <m:r>
+                          <w:rPr>
+                            <w:rFonts w:ascii="Cambria Math" w:hAnsi="Cambria Math"/>
+                          </w:rPr>
+                          <m:t>t</m:t>
+                        </m:r>
+                      </m:sub>
+                    </m:sSub>
+                    <m:r>
+                      <m:rPr>
+                        <m:sty m:val="p"/>
+                      </m:rPr>
+                      <w:rPr>
+                        <w:rFonts w:ascii="Cambria Math" w:hAnsi="Cambria Math"/>
+                      </w:rPr>
+                      <m:t>-</m:t>
+                    </m:r>
+                    <m:acc>
+                      <m:accPr>
+                        <m:ctrlPr>
+                          <w:rPr>
+                            <w:rFonts w:ascii="Cambria Math" w:hAnsi="Cambria Math"/>
+                          </w:rPr>
+                        </m:ctrlPr>
+                      </m:accPr>
+                      <m:e>
+                        <m:sSub>
+                          <m:sSubPr>
+                            <m:ctrlPr>
+                              <w:rPr>
+                                <w:rFonts w:ascii="Cambria Math" w:hAnsi="Cambria Math"/>
+                              </w:rPr>
+                            </m:ctrlPr>
+                          </m:sSubPr>
+                          <m:e>
+                            <m:r>
+                              <w:rPr>
+                                <w:rFonts w:ascii="Cambria Math" w:hAnsi="Cambria Math"/>
+                              </w:rPr>
+                              <m:t>y</m:t>
+                            </m:r>
+                          </m:e>
+                          <m:sub>
+                            <m:r>
+                              <w:rPr>
+                                <w:rFonts w:ascii="Cambria Math" w:hAnsi="Cambria Math"/>
+                              </w:rPr>
+                              <m:t>t</m:t>
+                            </m:r>
+                          </m:sub>
+                        </m:sSub>
+                      </m:e>
+                    </m:acc>
+                  </m:e>
+                </m:d>
+              </m:e>
+              <m:sup>
+                <m:r>
+                  <m:rPr>
+                    <m:sty m:val="p"/>
+                  </m:rPr>
+                  <w:rPr>
+                    <w:rFonts w:ascii="Cambria Math" w:hAnsi="Cambria Math"/>
+                  </w:rPr>
+                  <m:t>2</m:t>
+                </m:r>
+              </m:sup>
+            </m:sSup>
+          </m:e>
+        </m:nary>
+        <m:r>
+          <m:rPr>
+            <m:sty m:val="p"/>
+          </m:rPr>
+          <w:rPr>
+            <w:rFonts w:ascii="Cambria Math" w:hAnsi="Cambria Math"/>
+          </w:rPr>
+          <m:t>,</m:t>
+        </m:r>
+      </m:oMath>
+      <w:r>
+        <w:tab/>
+      </w:r>
+      <w:r>
+        <w:t xml:space="preserve"> (</w:t>
+      </w:r>
+      <w:r>
+        <w:fldChar w:fldCharType="begin"/>
+      </w:r>
+      <w:r>
+        <w:instrText xml:space="preserve"> STYLEREF  \s 1-līm-numurēts-virsraksts </w:instrText>
+      </w:r>
+      <w:r>
+        <w:fldChar w:fldCharType="separate"/>
+      </w:r>
+      <w:r>
+        <w:rPr>
+          <w:noProof/>
+        </w:rPr>
+        <w:t>5</w:t>
+      </w:r>
+      <w:r>
+        <w:fldChar w:fldCharType="end"/>
+      </w:r>
+      <w:r>
+        <w:t>.</w:t>
+      </w:r>
+      <w:r>
+        <w:fldChar w:fldCharType="begin"/>
+      </w:r>
+      <w:r>
+        <w:instrText xml:space="preserve"> SEQ Vienādojums \* ARABIC \s 1 </w:instrText>
+      </w:r>
+      <w:r>
+        <w:fldChar w:fldCharType="separate"/>
+      </w:r>
+      <w:r>
+        <w:rPr>
+          <w:noProof/>
+        </w:rPr>
+        <w:t>7</w:t>
+      </w:r>
+      <w:r>
+        <w:fldChar w:fldCharType="end"/>
+      </w:r>
+      <w:r>
+        <w:t>)</w:t>
+      </w:r>
+    </w:p>
+    <w:p>
+      <w:pPr>
+        <w:pStyle w:val="Teksts"/>
+        <w:tabs>
+          <w:tab w:val="left" w:pos="1418"/>
+        </w:tabs>
+      </w:pPr>
+      <w:r>
+        <w:t xml:space="preserve">kur </w:t>
+      </w:r>
+      <w:r>
+        <w:tab/>
+      </w:r>
+      <m:oMath>
+        <m:r>
+          <w:rPr>
+            <w:rFonts w:ascii="Cambria Math" w:hAnsi="Cambria Math"/>
+          </w:rPr>
+          <m:t>T</m:t>
+        </m:r>
+      </m:oMath>
+      <w:r>
+        <w:t xml:space="preserve"> ir apmācības piemēru skaits, </w:t>
+      </w:r>
+    </w:p>
+    <w:p>
+      <w:pPr>
+        <w:pStyle w:val="Teksts"/>
+        <w:tabs>
+          <w:tab w:val="left" w:pos="1418"/>
+        </w:tabs>
+      </w:pPr>
+      <w:r>
+        <w:tab/>
+      </w:r>
+      <m:oMath>
+        <m:sSub>
+          <m:sSubPr>
+            <m:ctrlPr>
+              <w:rPr>
+                <w:rFonts w:ascii="Cambria Math" w:hAnsi="Cambria Math"/>
+              </w:rPr>
+            </m:ctrlPr>
+          </m:sSubPr>
+          <m:e>
+            <m:r>
+              <w:rPr>
+                <w:rFonts w:ascii="Cambria Math" w:hAnsi="Cambria Math"/>
+              </w:rPr>
+              <m:t>y</m:t>
+            </m:r>
+          </m:e>
+          <m:sub>
+            <m:r>
+              <w:rPr>
+                <w:rFonts w:ascii="Cambria Math" w:hAnsi="Cambria Math"/>
+              </w:rPr>
+              <m:t>t</m:t>
+            </m:r>
+          </m:sub>
+        </m:sSub>
+      </m:oMath>
+      <w:r>
+        <w:t xml:space="preserve"> ir pareizā vērtība</w:t>
+      </w:r>
+      <w:r>
+        <w:t>,</w:t>
+      </w:r>
+    </w:p>
+    <w:p>
+      <w:pPr>
+        <w:pStyle w:val="Teksts"/>
+        <w:tabs>
+          <w:tab w:val="left" w:pos="1418"/>
+        </w:tabs>
+      </w:pPr>
+      <w:r>
+        <w:tab/>
+      </w:r>
+      <m:oMath>
+        <m:acc>
+          <m:accPr>
+            <m:ctrlPr>
+              <w:rPr>
+                <w:rFonts w:ascii="Cambria Math" w:hAnsi="Cambria Math"/>
+              </w:rPr>
+            </m:ctrlPr>
+          </m:accPr>
+          <m:e>
+            <m:sSub>
+              <m:sSubPr>
+                <m:ctrlPr>
+                  <w:rPr>
+                    <w:rFonts w:ascii="Cambria Math" w:hAnsi="Cambria Math"/>
+                  </w:rPr>
+                </m:ctrlPr>
+              </m:sSubPr>
+              <m:e>
+                <m:r>
+                  <w:rPr>
+                    <w:rFonts w:ascii="Cambria Math" w:hAnsi="Cambria Math"/>
+                  </w:rPr>
+                  <m:t>y</m:t>
+                </m:r>
+              </m:e>
+              <m:sub>
+                <m:r>
+                  <w:rPr>
+                    <w:rFonts w:ascii="Cambria Math" w:hAnsi="Cambria Math"/>
+                  </w:rPr>
+                  <m:t>t</m:t>
+                </m:r>
+              </m:sub>
+            </m:sSub>
+          </m:e>
+        </m:acc>
+      </m:oMath>
+      <w:r>
+        <w:t xml:space="preserve"> ir tīkla prognoze.</w:t>
+      </w:r>
+    </w:p>
+    <w:p>
+      <w:pPr>
+        <w:pStyle w:val="3-lm-virsraksts"/>
+      </w:pPr>
+      <w:r>
+        <w:t>Optimizācija: SGD un adaptīvie optimizētāji</w:t>
+      </w:r>
+    </w:p>
+    <w:p>
+      <w:pPr>
+        <w:pStyle w:val="Teksts"/>
+      </w:pPr>
+      <w:r>
+        <w:t xml:space="preserve">Pēc gradientu aprēķināšanas tīkla parametrus atjaunina optimizētājs, kas izmanto dažādas metodes. Piemēram, tās, kas balstītas uz stohastisko gradientu. Tos nosaka mācīšanās ātrums </w:t>
+      </w:r>
+      <w:sdt>
+        <w:sdtPr>
+          <w:id w:val="1904405384"/>
+          <w:citation/>
+        </w:sdtPr>
+        <w:sdtContent>
+          <w:r>
+            <w:fldChar w:fldCharType="begin"/>
+          </w:r>
+          <w:r>
+            <w:instrText xml:space="preserve"> CITATION JiC24 \l 1062 </w:instrText>
+          </w:r>
+          <w:r>
+            <w:fldChar w:fldCharType="separate"/>
+          </w:r>
+          <w:r>
+            <w:rPr>
+              <w:noProof/>
+            </w:rPr>
+            <w:t>(Ji, 2024)</w:t>
+          </w:r>
+          <w:r>
+            <w:fldChar w:fldCharType="end"/>
+          </w:r>
+        </w:sdtContent>
+      </w:sdt>
+      <w:r>
+        <w:t>.</w:t>
+      </w:r>
+    </w:p>
+    <w:p>
+      <w:pPr>
+        <w:pStyle w:val="Teksts"/>
+      </w:pPr>
+      <w:r>
+        <w:t>SGD (</w:t>
+      </w:r>
+      <w:r>
+        <w:rPr>
+          <w:i/>
+          <w:iCs/>
+        </w:rPr>
+        <w:t>stochastic gradient descent</w:t>
+      </w:r>
+      <w:r>
+        <w:t xml:space="preserve">) izmanto gradientus, kas aprēķināti nejauši izvēlētai mini partijai, nevis visam datu kopumam, lai atjauninātu svarus. Momentum-SGD izmanto inerciālos gradientus, lai izlīdzinātu svārstības. RMSprop izmanto eksponenciāli sarūkošu vidējo kvadrātisko gradientu. </w:t>
+      </w:r>
+      <w:r>
+        <w:t xml:space="preserve">Adam </w:t>
+      </w:r>
+      <w:r>
+        <w:t xml:space="preserve">apvieno impulsa un RMSprop ideju, izmantojot gradienta pirmā un otrā momenta aplēses </w:t>
+      </w:r>
+      <w:sdt>
+        <w:sdtPr>
+          <w:id w:val="-1548527382"/>
+          <w:citation/>
+        </w:sdtPr>
+        <w:sdtContent>
+          <w:r>
+            <w:fldChar w:fldCharType="begin"/>
+          </w:r>
+          <w:r>
+            <w:instrText xml:space="preserve"> CITATION JiC24 \l 1062 </w:instrText>
+          </w:r>
+          <w:r>
+            <w:fldChar w:fldCharType="separate"/>
+          </w:r>
+          <w:r>
+            <w:rPr>
+              <w:noProof/>
+            </w:rPr>
+            <w:t>(Ji, 2024)</w:t>
+          </w:r>
+          <w:r>
+            <w:fldChar w:fldCharType="end"/>
+          </w:r>
+        </w:sdtContent>
+      </w:sdt>
+      <w:r>
+        <w:t>.</w:t>
+      </w:r>
+    </w:p>
+    <w:p>
+      <w:pPr>
+        <w:pStyle w:val="Teksts"/>
+      </w:pPr>
+      <w:r>
+        <w:t>Eksperimentā izvēlētā konkrētā optimizētāja un zaudējumu funkcijas pamatojums ir apspriests tālāk ieviešanas sadaļā.</w:t>
+      </w:r>
+    </w:p>
+    <w:p>
+      <w:pPr>
+        <w:pStyle w:val="3-lm-virsraksts"/>
+        <w:rPr>
+          <w:lang w:val="ru-RU"/>
+        </w:rPr>
+      </w:pPr>
+      <w:r>
+        <w:lastRenderedPageBreak/>
+        <w:t>Iezīmju</w:t>
+      </w:r>
+      <w:r>
+        <w:t xml:space="preserve"> (</w:t>
+      </w:r>
+      <w:r>
+        <w:rPr>
+          <w:i/>
+          <w:iCs/>
+        </w:rPr>
+        <w:t>features</w:t>
+      </w:r>
+      <w:r>
+        <w:t>)</w:t>
+      </w:r>
+      <w:r>
+        <w:t xml:space="preserve"> standartizācija un normalizācija</w:t>
+      </w:r>
+    </w:p>
+    <w:p>
+      <w:pPr>
+        <w:pStyle w:val="Teksts"/>
+        <w:rPr>
+          <w:lang w:val="ru-RU"/>
+        </w:rPr>
+      </w:pPr>
+      <w:r>
+        <w:t>Pastāv divi līdzīgi jēdzieni</w:t>
+      </w:r>
+      <w:r>
+        <w:t xml:space="preserve"> </w:t>
+      </w:r>
+      <w:commentRangeStart w:id="128"/>
+      <w:sdt>
+        <w:sdtPr>
+          <w:id w:val="1445189478"/>
+          <w:citation/>
+        </w:sdtPr>
+        <w:sdtContent>
+          <w:r>
+            <w:fldChar w:fldCharType="begin"/>
+          </w:r>
+          <w:r>
+            <w:rPr>
+              <w:lang w:val="ru-RU"/>
+            </w:rPr>
+            <w:instrText xml:space="preserve"> </w:instrText>
+          </w:r>
+          <w:r>
+            <w:rPr>
+              <w:lang w:val="it-IT"/>
+            </w:rPr>
+            <w:instrText>CITATION</w:instrText>
+          </w:r>
+          <w:r>
+            <w:rPr>
+              <w:lang w:val="ru-RU"/>
+            </w:rPr>
+            <w:instrText xml:space="preserve"> </w:instrText>
+          </w:r>
+          <w:r>
+            <w:rPr>
+              <w:lang w:val="it-IT"/>
+            </w:rPr>
+            <w:instrText>Bor</w:instrText>
+          </w:r>
+          <w:r>
+            <w:rPr>
+              <w:lang w:val="ru-RU"/>
+            </w:rPr>
+            <w:instrText>25 \</w:instrText>
+          </w:r>
+          <w:r>
+            <w:rPr>
+              <w:lang w:val="it-IT"/>
+            </w:rPr>
+            <w:instrText>l</w:instrText>
+          </w:r>
+          <w:r>
+            <w:rPr>
+              <w:lang w:val="ru-RU"/>
+            </w:rPr>
+            <w:instrText xml:space="preserve"> 2057 </w:instrText>
+          </w:r>
+          <w:r>
+            <w:fldChar w:fldCharType="separate"/>
+          </w:r>
+          <w:r>
+            <w:rPr>
+              <w:noProof/>
+              <w:lang w:val="ru-RU"/>
+            </w:rPr>
+            <w:t>(</w:t>
+          </w:r>
+          <w:r>
+            <w:rPr>
+              <w:noProof/>
+              <w:lang w:val="it-IT"/>
+            </w:rPr>
+            <w:t>Borrohou</w:t>
+          </w:r>
+          <w:r>
+            <w:rPr>
+              <w:noProof/>
+              <w:lang w:val="ru-RU"/>
+            </w:rPr>
+            <w:t xml:space="preserve">, </w:t>
+          </w:r>
+          <w:r>
+            <w:rPr>
+              <w:noProof/>
+              <w:lang w:val="it-IT"/>
+            </w:rPr>
+            <w:t>Fissoune</w:t>
+          </w:r>
+          <w:r>
+            <w:rPr>
+              <w:noProof/>
+              <w:lang w:val="ru-RU"/>
+            </w:rPr>
+            <w:t xml:space="preserve">, &amp; </w:t>
+          </w:r>
+          <w:r>
+            <w:rPr>
+              <w:noProof/>
+              <w:lang w:val="it-IT"/>
+            </w:rPr>
+            <w:t>Badir</w:t>
+          </w:r>
+          <w:r>
+            <w:rPr>
+              <w:noProof/>
+              <w:lang w:val="ru-RU"/>
+            </w:rPr>
+            <w:t>, 2025)</w:t>
+          </w:r>
+          <w:r>
+            <w:fldChar w:fldCharType="end"/>
+          </w:r>
+        </w:sdtContent>
+      </w:sdt>
+      <w:commentRangeEnd w:id="128"/>
+      <w:r>
+        <w:rPr>
+          <w:rStyle w:val="CommentReference"/>
+          <w:sz w:val="24"/>
+          <w:szCs w:val="24"/>
+        </w:rPr>
+        <w:commentReference w:id="128"/>
+      </w:r>
+      <w:r>
+        <w:t xml:space="preserve"> </w:t>
+      </w:r>
+      <w:sdt>
+        <w:sdtPr>
+          <w:id w:val="1656331536"/>
+          <w:citation/>
+        </w:sdtPr>
+        <w:sdtContent>
+          <w:r>
+            <w:fldChar w:fldCharType="begin"/>
+          </w:r>
+          <w:r>
+            <w:instrText xml:space="preserve"> CITATION Elm25 \l 1062 </w:instrText>
+          </w:r>
+          <w:r>
+            <w:fldChar w:fldCharType="separate"/>
+          </w:r>
+          <w:r>
+            <w:rPr>
+              <w:noProof/>
+            </w:rPr>
+            <w:t>(Elmotawakkil, Enneya, Bhagat, Ouda, &amp; Kumar, 2025)</w:t>
+          </w:r>
+          <w:r>
+            <w:fldChar w:fldCharType="end"/>
+          </w:r>
+        </w:sdtContent>
+      </w:sdt>
+      <w:r>
+        <w:t>:</w:t>
+      </w:r>
+    </w:p>
+    <w:p>
+      <w:pPr>
+        <w:pStyle w:val="Uzsk-aizzmes"/>
+        <w:rPr>
+          <w:lang w:val="it-IT"/>
+        </w:rPr>
+      </w:pPr>
+      <w:r>
+        <w:t xml:space="preserve">Normalizācija un standartizācija ir skaitlisku </w:t>
+      </w:r>
+      <w:r>
+        <w:t>ie</w:t>
+      </w:r>
+      <w:r>
+        <w:t>zīmju mērogošana</w:t>
+      </w:r>
+      <w:r>
+        <w:t>s metodes</w:t>
+      </w:r>
+      <w:r>
+        <w:t>.</w:t>
+      </w:r>
+    </w:p>
+    <w:p>
+      <w:pPr>
+        <w:pStyle w:val="Uzsk-aizzmes"/>
+        <w:rPr>
+          <w:lang w:val="it-IT"/>
+        </w:rPr>
+      </w:pPr>
+      <w:r>
+        <w:t xml:space="preserve">Kategoriska </w:t>
+      </w:r>
+      <w:r>
+        <w:t>ie</w:t>
+      </w:r>
+      <w:r>
+        <w:t>zīmju kodēšana ir kategorisko mainīgo pārveidošana skaitliskā formā turpmākai izmantošanai modelī</w:t>
+      </w:r>
+      <w:r>
+        <w:t>.</w:t>
+      </w:r>
+    </w:p>
+    <w:p>
+      <w:pPr>
+        <w:pStyle w:val="Teksts"/>
+      </w:pPr>
+      <w:r>
+        <w:t xml:space="preserve">Abi soļi var atrasties vienā un tajā pašā </w:t>
+      </w:r>
+      <w:r>
+        <w:t>risinājumā</w:t>
+      </w:r>
+      <w:r>
+        <w:t>, taču tie risina dažādas problēmas.</w:t>
+      </w:r>
+      <w:r>
+        <w:t xml:space="preserve"> </w:t>
+      </w:r>
+      <w:r>
+        <w:t xml:space="preserve">Normalizācija bieži tiek saprasta kā </w:t>
+      </w:r>
+      <w:r>
+        <w:rPr>
+          <w:i/>
+          <w:iCs/>
+        </w:rPr>
+        <w:t>min-max</w:t>
+      </w:r>
+      <w:r>
+        <w:t xml:space="preserve"> mērogošana diapazonā [0,1]:</w:t>
+      </w:r>
+    </w:p>
+    <w:p>
+      <w:pPr>
+        <w:pStyle w:val="Teksts"/>
+        <w:tabs>
+          <w:tab w:val="center" w:pos="4395"/>
+          <w:tab w:val="right" w:pos="8222"/>
+        </w:tabs>
+        <w:ind w:firstLine="0"/>
+      </w:pPr>
+      <w:r>
+        <w:tab/>
+      </w:r>
+      <m:oMath>
+        <m:sSup>
+          <m:sSupPr>
+            <m:ctrlPr>
+              <w:rPr>
+                <w:rFonts w:ascii="Cambria Math" w:hAnsi="Cambria Math"/>
+              </w:rPr>
+            </m:ctrlPr>
+          </m:sSupPr>
+          <m:e>
+            <m:r>
+              <w:rPr>
+                <w:rFonts w:ascii="Cambria Math" w:hAnsi="Cambria Math"/>
+              </w:rPr>
+              <m:t>x</m:t>
+            </m:r>
+          </m:e>
+          <m:sup>
+            <m:r>
+              <m:rPr>
+                <m:sty m:val="p"/>
+              </m:rPr>
+              <w:rPr>
+                <w:rFonts w:ascii="Cambria Math" w:hAnsi="Cambria Math"/>
+              </w:rPr>
+              <m:t>'</m:t>
+            </m:r>
+          </m:sup>
+        </m:sSup>
+        <m:r>
+          <m:rPr>
+            <m:sty m:val="p"/>
+          </m:rPr>
+          <w:rPr>
+            <w:rFonts w:ascii="Cambria Math" w:hAnsi="Cambria Math"/>
+          </w:rPr>
+          <m:t>=</m:t>
+        </m:r>
+        <m:f>
+          <m:fPr>
+            <m:ctrlPr>
+              <w:rPr>
+                <w:rFonts w:ascii="Cambria Math" w:hAnsi="Cambria Math"/>
+              </w:rPr>
+            </m:ctrlPr>
+          </m:fPr>
+          <m:num>
+            <m:r>
+              <w:rPr>
+                <w:rFonts w:ascii="Cambria Math" w:hAnsi="Cambria Math"/>
+              </w:rPr>
+              <m:t>x</m:t>
+            </m:r>
+            <m:r>
+              <m:rPr>
+                <m:sty m:val="p"/>
+              </m:rPr>
+              <w:rPr>
+                <w:rFonts w:ascii="Cambria Math" w:hAnsi="Cambria Math"/>
+              </w:rPr>
+              <m:t>-</m:t>
+            </m:r>
+            <m:func>
+              <m:funcPr>
+                <m:ctrlPr>
+                  <w:rPr>
+                    <w:rFonts w:ascii="Cambria Math" w:hAnsi="Cambria Math"/>
+                  </w:rPr>
+                </m:ctrlPr>
+              </m:funcPr>
+              <m:fName>
+                <m:r>
+                  <m:rPr>
+                    <m:sty m:val="p"/>
+                  </m:rPr>
+                  <w:rPr>
+                    <w:rFonts w:ascii="Cambria Math" w:hAnsi="Cambria Math"/>
+                  </w:rPr>
+                  <m:t>min</m:t>
+                </m:r>
+              </m:fName>
+              <m:e>
+                <m:d>
+                  <m:dPr>
+                    <m:ctrlPr>
+                      <w:rPr>
+                        <w:rFonts w:ascii="Cambria Math" w:hAnsi="Cambria Math"/>
+                      </w:rPr>
+                    </m:ctrlPr>
+                  </m:dPr>
+                  <m:e>
+                    <m:r>
+                      <w:rPr>
+                        <w:rFonts w:ascii="Cambria Math" w:hAnsi="Cambria Math"/>
+                      </w:rPr>
+                      <m:t>x</m:t>
+                    </m:r>
+                  </m:e>
+                </m:d>
+              </m:e>
+            </m:func>
+          </m:num>
+          <m:den>
+            <m:func>
+              <m:funcPr>
+                <m:ctrlPr>
+                  <w:rPr>
+                    <w:rFonts w:ascii="Cambria Math" w:hAnsi="Cambria Math"/>
+                  </w:rPr>
+                </m:ctrlPr>
+              </m:funcPr>
+              <m:fName>
+                <m:r>
+                  <m:rPr>
+                    <m:sty m:val="p"/>
+                  </m:rPr>
+                  <w:rPr>
+                    <w:rFonts w:ascii="Cambria Math" w:hAnsi="Cambria Math"/>
+                  </w:rPr>
+                  <m:t>max</m:t>
+                </m:r>
+              </m:fName>
+              <m:e>
+                <m:d>
+                  <m:dPr>
+                    <m:ctrlPr>
+                      <w:rPr>
+                        <w:rFonts w:ascii="Cambria Math" w:hAnsi="Cambria Math"/>
+                      </w:rPr>
+                    </m:ctrlPr>
+                  </m:dPr>
+                  <m:e>
+                    <m:r>
+                      <w:rPr>
+                        <w:rFonts w:ascii="Cambria Math" w:hAnsi="Cambria Math"/>
+                      </w:rPr>
+                      <m:t>x</m:t>
+                    </m:r>
+                  </m:e>
+                </m:d>
+              </m:e>
+            </m:func>
+            <m:r>
+              <m:rPr>
+                <m:sty m:val="p"/>
+              </m:rPr>
+              <w:rPr>
+                <w:rFonts w:ascii="Cambria Math" w:hAnsi="Cambria Math"/>
+              </w:rPr>
+              <m:t>-</m:t>
+            </m:r>
+            <m:func>
+              <m:funcPr>
+                <m:ctrlPr>
+                  <w:rPr>
+                    <w:rFonts w:ascii="Cambria Math" w:hAnsi="Cambria Math"/>
+                  </w:rPr>
+                </m:ctrlPr>
+              </m:funcPr>
+              <m:fName>
+                <m:r>
+                  <m:rPr>
+                    <m:sty m:val="p"/>
+                  </m:rPr>
+                  <w:rPr>
+                    <w:rFonts w:ascii="Cambria Math" w:hAnsi="Cambria Math"/>
+                  </w:rPr>
+                  <m:t>min</m:t>
+                </m:r>
+              </m:fName>
+              <m:e>
+                <m:d>
+                  <m:dPr>
+                    <m:ctrlPr>
+                      <w:rPr>
+                        <w:rFonts w:ascii="Cambria Math" w:hAnsi="Cambria Math"/>
+                      </w:rPr>
+                    </m:ctrlPr>
+                  </m:dPr>
+                  <m:e>
+                    <m:r>
+                      <w:rPr>
+                        <w:rFonts w:ascii="Cambria Math" w:hAnsi="Cambria Math"/>
+                      </w:rPr>
+                      <m:t>x</m:t>
+                    </m:r>
+                  </m:e>
+                </m:d>
+              </m:e>
+            </m:func>
+          </m:den>
+        </m:f>
+      </m:oMath>
+      <w:r>
+        <w:tab/>
+      </w:r>
+      <w:r>
+        <w:t>(</w:t>
+      </w:r>
+      <w:r>
+        <w:fldChar w:fldCharType="begin"/>
+      </w:r>
+      <w:r>
+        <w:instrText xml:space="preserve"> STYLEREF  \s 1-līm-numurēts-virsraksts </w:instrText>
+      </w:r>
+      <w:r>
+        <w:fldChar w:fldCharType="separate"/>
+      </w:r>
+      <w:r>
+        <w:rPr>
+          <w:noProof/>
+        </w:rPr>
+        <w:t>5</w:t>
+      </w:r>
+      <w:r>
+        <w:fldChar w:fldCharType="end"/>
+      </w:r>
+      <w:r>
+        <w:t>.</w:t>
+      </w:r>
+      <w:r>
+        <w:fldChar w:fldCharType="begin"/>
+      </w:r>
+      <w:r>
+        <w:instrText xml:space="preserve"> SEQ Vienādojums \* ARABIC \s 1 </w:instrText>
+      </w:r>
+      <w:r>
+        <w:fldChar w:fldCharType="separate"/>
+      </w:r>
+      <w:r>
+        <w:rPr>
+          <w:noProof/>
+        </w:rPr>
+        <w:t>8</w:t>
+      </w:r>
+      <w:r>
+        <w:fldChar w:fldCharType="end"/>
+      </w:r>
+      <w:r>
+        <w:t>)</w:t>
+      </w:r>
+    </w:p>
+    <w:p>
+      <w:pPr>
+        <w:pStyle w:val="Teksts"/>
+      </w:pPr>
+      <w:r>
+        <w:t>Šo normalizācijas veidu izmanto, lai pazīmju vērtības novestu līdz kopējam mērogam</w:t>
+      </w:r>
+      <w:sdt>
+        <w:sdtPr>
+          <w:id w:val="-1461641142"/>
+          <w:citation/>
+        </w:sdtPr>
+        <w:sdtContent>
+          <w:r>
+            <w:fldChar w:fldCharType="begin"/>
+          </w:r>
+          <w:r>
+            <w:instrText xml:space="preserve"> CITATION Odu22 \l 1062 </w:instrText>
+          </w:r>
+          <w:r>
+            <w:fldChar w:fldCharType="separate"/>
+          </w:r>
+          <w:r>
+            <w:rPr>
+              <w:noProof/>
+            </w:rPr>
+            <w:t xml:space="preserve"> (Odukoya, u.c., 2022)</w:t>
+          </w:r>
+          <w:r>
+            <w:fldChar w:fldCharType="end"/>
+          </w:r>
+        </w:sdtContent>
+      </w:sdt>
+      <w:r>
+        <w:t xml:space="preserve"> </w:t>
+      </w:r>
+      <w:sdt>
+        <w:sdtPr>
+          <w:id w:val="-724142183"/>
+          <w:citation/>
+        </w:sdtPr>
+        <w:sdtContent>
+          <w:r>
+            <w:fldChar w:fldCharType="begin"/>
+          </w:r>
+          <w:r>
+            <w:instrText xml:space="preserve"> CITATION Bor25 \l 1062 </w:instrText>
+          </w:r>
+          <w:r>
+            <w:fldChar w:fldCharType="separate"/>
+          </w:r>
+          <w:r>
+            <w:rPr>
+              <w:noProof/>
+            </w:rPr>
+            <w:t>(Borrohou, Fissoune, &amp; Badir, 2025)</w:t>
+          </w:r>
+          <w:r>
+            <w:fldChar w:fldCharType="end"/>
+          </w:r>
+        </w:sdtContent>
+      </w:sdt>
+      <w:r>
+        <w:t>.</w:t>
+      </w:r>
+      <w:r>
+        <w:t xml:space="preserve"> </w:t>
+      </w:r>
+      <w:r>
+        <w:t xml:space="preserve">Normalizācija ir ērta, ja pazīmes ir jānovieto vienā diapazonā, bet min-max mērogošana ir jutīga pret novirzēm, jo ​​tā balstās uz novērotajiem pazīmes minimumiem un maksimumiem </w:t>
+      </w:r>
+      <w:sdt>
+        <w:sdtPr>
+          <w:id w:val="-1842143188"/>
+          <w:citation/>
+        </w:sdtPr>
+        <w:sdtContent>
+          <w:r>
+            <w:fldChar w:fldCharType="begin"/>
+          </w:r>
+          <w:r>
+            <w:instrText xml:space="preserve"> CITATION Raj25 \l 1062 </w:instrText>
+          </w:r>
+          <w:r>
+            <w:fldChar w:fldCharType="separate"/>
+          </w:r>
+          <w:r>
+            <w:rPr>
+              <w:noProof/>
+            </w:rPr>
+            <w:t>(Rajesh, Kuppuri, Peter, Reddy, &amp; Sonia, 2025)</w:t>
+          </w:r>
+          <w:r>
+            <w:fldChar w:fldCharType="end"/>
+          </w:r>
+        </w:sdtContent>
+      </w:sdt>
+      <w:r>
+        <w:t>.</w:t>
+      </w:r>
+    </w:p>
+    <w:p>
+      <w:pPr>
+        <w:pStyle w:val="Teksts"/>
+      </w:pPr>
+      <w:r>
+        <w:t>Standartizācija</w:t>
+      </w:r>
+      <w:r>
+        <w:t xml:space="preserve"> </w:t>
+      </w:r>
+      <w:r>
+        <w:t xml:space="preserve">samazina pazīmi līdz vidējam rādītājam </w:t>
+      </w:r>
+      <w:r>
+        <w:t>(</w:t>
+      </w:r>
+      <w:r>
+        <w:t>nullei</w:t>
+      </w:r>
+      <w:r>
+        <w:t>)</w:t>
+      </w:r>
+      <w:r>
+        <w:t xml:space="preserve"> un standartnovirzei </w:t>
+      </w:r>
+      <w:r>
+        <w:t>(</w:t>
+      </w:r>
+      <w:r>
+        <w:t>vienai</w:t>
+      </w:r>
+      <w:r>
+        <w:t>)</w:t>
+      </w:r>
+      <w:r>
+        <w:t xml:space="preserve"> </w:t>
+      </w:r>
+      <w:sdt>
+        <w:sdtPr>
+          <w:id w:val="974338651"/>
+          <w:citation/>
+        </w:sdtPr>
+        <w:sdtContent>
+          <w:r>
+            <w:fldChar w:fldCharType="begin"/>
+          </w:r>
+          <w:r>
+            <w:instrText xml:space="preserve"> CITATION Elm25 \l 1062 </w:instrText>
+          </w:r>
+          <w:r>
+            <w:fldChar w:fldCharType="separate"/>
+          </w:r>
+          <w:r>
+            <w:rPr>
+              <w:noProof/>
+            </w:rPr>
+            <w:t>(Elmotawakkil, Enneya, Bhagat, Ouda, &amp; Kumar, 2025)</w:t>
+          </w:r>
+          <w:r>
+            <w:fldChar w:fldCharType="end"/>
+          </w:r>
+        </w:sdtContent>
+      </w:sdt>
+      <w:r>
+        <w:t xml:space="preserve"> </w:t>
+      </w:r>
+      <w:sdt>
+        <w:sdtPr>
+          <w:id w:val="-1779787580"/>
+          <w:citation/>
+        </w:sdtPr>
+        <w:sdtContent>
+          <w:r>
+            <w:fldChar w:fldCharType="begin"/>
+          </w:r>
+          <w:r>
+            <w:instrText xml:space="preserve"> CITATION Raj25 \l 1062 </w:instrText>
+          </w:r>
+          <w:r>
+            <w:fldChar w:fldCharType="separate"/>
+          </w:r>
+          <w:r>
+            <w:rPr>
+              <w:noProof/>
+            </w:rPr>
+            <w:t>(Rajesh, Kuppuri, Peter, Reddy, &amp; Sonia, 2025)</w:t>
+          </w:r>
+          <w:r>
+            <w:fldChar w:fldCharType="end"/>
+          </w:r>
+        </w:sdtContent>
+      </w:sdt>
+      <w:r>
+        <w:t>:</w:t>
+      </w:r>
+    </w:p>
+    <w:p>
+      <w:pPr>
+        <w:pStyle w:val="Teksts"/>
+        <w:tabs>
+          <w:tab w:val="center" w:pos="4395"/>
+          <w:tab w:val="right" w:pos="8222"/>
+        </w:tabs>
+        <w:ind w:firstLine="0"/>
+      </w:pPr>
+      <w:r>
+        <w:tab/>
+      </w:r>
+      <m:oMath>
+        <m:sSup>
+          <m:sSupPr>
+            <m:ctrlPr>
+              <w:rPr>
+                <w:rFonts w:ascii="Cambria Math" w:hAnsi="Cambria Math"/>
+              </w:rPr>
+            </m:ctrlPr>
+          </m:sSupPr>
+          <m:e>
+            <m:r>
+              <w:rPr>
+                <w:rFonts w:ascii="Cambria Math" w:hAnsi="Cambria Math"/>
+              </w:rPr>
+              <m:t>x</m:t>
+            </m:r>
+          </m:e>
+          <m:sup>
+            <m:r>
+              <m:rPr>
+                <m:sty m:val="p"/>
+              </m:rPr>
+              <w:rPr>
+                <w:rFonts w:ascii="Cambria Math" w:hAnsi="Cambria Math"/>
+              </w:rPr>
+              <m:t>'</m:t>
+            </m:r>
+          </m:sup>
+        </m:sSup>
+        <m:r>
+          <m:rPr>
+            <m:sty m:val="p"/>
+          </m:rPr>
+          <w:rPr>
+            <w:rFonts w:ascii="Cambria Math" w:hAnsi="Cambria Math"/>
+          </w:rPr>
+          <m:t>=</m:t>
+        </m:r>
+        <m:f>
+          <m:fPr>
+            <m:ctrlPr>
+              <w:rPr>
+                <w:rFonts w:ascii="Cambria Math" w:hAnsi="Cambria Math"/>
+              </w:rPr>
+            </m:ctrlPr>
+          </m:fPr>
+          <m:num>
+            <m:r>
+              <w:rPr>
+                <w:rFonts w:ascii="Cambria Math" w:hAnsi="Cambria Math"/>
+              </w:rPr>
+              <m:t>x</m:t>
+            </m:r>
+            <m:r>
+              <m:rPr>
+                <m:sty m:val="p"/>
+              </m:rPr>
+              <w:rPr>
+                <w:rFonts w:ascii="Cambria Math" w:hAnsi="Cambria Math"/>
+              </w:rPr>
+              <m:t>-</m:t>
+            </m:r>
+            <m:r>
+              <m:rPr>
+                <m:sty m:val="p"/>
+              </m:rPr>
+              <w:rPr>
+                <w:rFonts w:ascii="Cambria Math" w:hAnsi="Cambria Math"/>
+              </w:rPr>
+              <m:t>μ</m:t>
+            </m:r>
+          </m:num>
+          <m:den>
+            <m:r>
+              <m:rPr>
+                <m:sty m:val="p"/>
+              </m:rPr>
+              <w:rPr>
+                <w:rFonts w:ascii="Cambria Math" w:hAnsi="Cambria Math"/>
+              </w:rPr>
+              <m:t>σ</m:t>
+            </m:r>
+          </m:den>
+        </m:f>
+        <m:r>
+          <m:rPr>
+            <m:sty m:val="p"/>
+          </m:rPr>
+          <w:rPr>
+            <w:rFonts w:ascii="Cambria Math" w:hAnsi="Cambria Math"/>
+          </w:rPr>
+          <m:t>,</m:t>
+        </m:r>
+      </m:oMath>
+      <w:r>
+        <w:t xml:space="preserve"> </w:t>
+      </w:r>
+      <w:r>
+        <w:tab/>
+        <w:t>(</w:t>
+      </w:r>
+      <w:r>
+        <w:fldChar w:fldCharType="begin"/>
+      </w:r>
+      <w:r>
+        <w:instrText xml:space="preserve"> STYLEREF  \s 1-līm-numurēts-virsraksts </w:instrText>
+      </w:r>
+      <w:r>
+        <w:fldChar w:fldCharType="separate"/>
+      </w:r>
+      <w:r>
+        <w:rPr>
+          <w:noProof/>
+        </w:rPr>
+        <w:t>5</w:t>
+      </w:r>
+      <w:r>
+        <w:fldChar w:fldCharType="end"/>
+      </w:r>
+      <w:r>
+        <w:t>.</w:t>
+      </w:r>
+      <w:r>
+        <w:fldChar w:fldCharType="begin"/>
+      </w:r>
+      <w:r>
+        <w:instrText xml:space="preserve"> SEQ Vienādojums \* ARABIC \s 1 </w:instrText>
+      </w:r>
+      <w:r>
+        <w:fldChar w:fldCharType="separate"/>
+      </w:r>
+      <w:r>
+        <w:rPr>
+          <w:noProof/>
+        </w:rPr>
+        <w:t>9</w:t>
+      </w:r>
+      <w:r>
+        <w:fldChar w:fldCharType="end"/>
+      </w:r>
+      <w:r>
+        <w:t>)</w:t>
+      </w:r>
+    </w:p>
+    <w:p>
+      <w:pPr>
+        <w:pStyle w:val="Teksts"/>
+        <w:tabs>
+          <w:tab w:val="left" w:pos="1134"/>
+        </w:tabs>
+      </w:pPr>
+      <w:r>
+        <w:t>k</w:t>
+      </w:r>
+      <w:r>
+        <w:t>ur</w:t>
+      </w:r>
+      <w:r>
+        <w:tab/>
+      </w:r>
+      <w:r>
+        <w:t xml:space="preserve"> </w:t>
+      </w:r>
+      <m:oMath>
+        <m:r>
+          <w:rPr>
+            <w:rFonts w:ascii="Cambria Math" w:hAnsi="Cambria Math"/>
+          </w:rPr>
+          <m:t>μ</m:t>
+        </m:r>
+      </m:oMath>
+      <w:r>
+        <w:t xml:space="preserve"> ir apmācības datu vidējais rādītājs</w:t>
+      </w:r>
+      <w:r>
+        <w:t xml:space="preserve">, </w:t>
+      </w:r>
+    </w:p>
+    <w:p>
+      <w:pPr>
+        <w:pStyle w:val="Teksts"/>
+        <w:tabs>
+          <w:tab w:val="left" w:pos="1134"/>
+        </w:tabs>
+      </w:pPr>
+      <w:r>
+        <w:rPr>
+          <w:iCs/>
+        </w:rPr>
+        <w:tab/>
+      </w:r>
+      <m:oMath>
+        <m:r>
+          <w:rPr>
+            <w:rFonts w:ascii="Cambria Math" w:hAnsi="Cambria Math"/>
+          </w:rPr>
+          <m:t>σ</m:t>
+        </m:r>
+      </m:oMath>
+      <w:r>
+        <w:t xml:space="preserve"> ir standartnovirze</w:t>
+      </w:r>
+      <w:r>
+        <w:t>.</w:t>
+      </w:r>
+    </w:p>
+    <w:p>
+      <w:pPr>
+        <w:pStyle w:val="Teksts"/>
+        <w:rPr>
+          <w:lang w:val="ru-RU"/>
+        </w:rPr>
+      </w:pPr>
+      <w:r>
+        <w:t xml:space="preserve">Standartnovirze </w:t>
+      </w:r>
+      <m:oMath>
+        <m:r>
+          <w:rPr>
+            <w:rFonts w:ascii="Cambria Math" w:hAnsi="Cambria Math"/>
+          </w:rPr>
+          <m:t>σ</m:t>
+        </m:r>
+      </m:oMath>
+      <w:r>
+        <w:t xml:space="preserve"> </w:t>
+      </w:r>
+      <w:r>
+        <w:t>parāda</w:t>
+      </w:r>
+      <w:r>
+        <w:t xml:space="preserve"> vērtību izkliedi ap vidējo vērtību: jo lielāka </w:t>
+      </w:r>
+      <m:oMath>
+        <m:r>
+          <w:rPr>
+            <w:rFonts w:ascii="Cambria Math" w:hAnsi="Cambria Math"/>
+          </w:rPr>
+          <m:t>σ</m:t>
+        </m:r>
+      </m:oMath>
+      <w:r>
+        <w:t>, jo mainīgāka ir pazīme</w:t>
+      </w:r>
+      <w:r>
+        <w:t xml:space="preserve"> </w:t>
+      </w:r>
+      <w:sdt>
+        <w:sdtPr>
+          <w:id w:val="1206444457"/>
+          <w:citation/>
+        </w:sdtPr>
+        <w:sdtContent>
+          <w:r>
+            <w:fldChar w:fldCharType="begin"/>
+          </w:r>
+          <w:r>
+            <w:instrText xml:space="preserve"> CITATION Hu2023ContrastiveLearning \l 1062 </w:instrText>
+          </w:r>
+          <w:r>
+            <w:fldChar w:fldCharType="separate"/>
+          </w:r>
+          <w:r>
+            <w:rPr>
+              <w:noProof/>
+            </w:rPr>
+            <w:t>(Hu, Hu, Li, &amp; Du, 2023)</w:t>
+          </w:r>
+          <w:r>
+            <w:fldChar w:fldCharType="end"/>
+          </w:r>
+        </w:sdtContent>
+      </w:sdt>
+      <w:r>
+        <w:t>.</w:t>
+      </w:r>
+      <w:r>
+        <w:t xml:space="preserve"> </w:t>
+      </w:r>
+      <w:r>
+        <w:t xml:space="preserve">Praktiski standartizācija padara </w:t>
+      </w:r>
+      <w:commentRangeStart w:id="129"/>
+      <w:r>
+        <w:t>ie</w:t>
+      </w:r>
+      <w:r>
+        <w:t xml:space="preserve">zīmju </w:t>
+      </w:r>
+      <w:commentRangeEnd w:id="129"/>
+      <w:r>
+        <w:rPr>
+          <w:rStyle w:val="CommentReference"/>
+          <w:sz w:val="24"/>
+          <w:szCs w:val="24"/>
+        </w:rPr>
+        <w:commentReference w:id="129"/>
+      </w:r>
+      <w:r>
+        <w:t xml:space="preserve">skalas salīdzināmas, palīdz nodrošināt, ka </w:t>
+      </w:r>
+      <w:r>
+        <w:t>ie</w:t>
+      </w:r>
+      <w:r>
+        <w:t xml:space="preserve">zīmes vienlīdzīgāk veicina modeli, un atvieglo optimizāciju ar gradientu metodēm </w:t>
+      </w:r>
+      <w:sdt>
+        <w:sdtPr>
+          <w:id w:val="1998683940"/>
+          <w:citation/>
+        </w:sdtPr>
+        <w:sdtContent>
+          <w:r>
+            <w:fldChar w:fldCharType="begin"/>
+          </w:r>
+          <w:r>
+            <w:instrText xml:space="preserve"> CITATION Dic20 \l 1062 </w:instrText>
+          </w:r>
+          <w:r>
+            <w:fldChar w:fldCharType="separate"/>
+          </w:r>
+          <w:r>
+            <w:rPr>
+              <w:noProof/>
+            </w:rPr>
+            <w:t>(Dick, Owen, &amp; Whigham, 2020)</w:t>
+          </w:r>
+          <w:r>
+            <w:fldChar w:fldCharType="end"/>
+          </w:r>
+        </w:sdtContent>
+      </w:sdt>
+      <w:r>
+        <w:t>.</w:t>
+      </w:r>
+    </w:p>
+    <w:p>
+      <w:pPr>
+        <w:pStyle w:val="3-lm-virsraksts"/>
+      </w:pPr>
+      <w:r>
+        <w:t>LSTM realizācija</w:t>
+      </w:r>
+    </w:p>
+    <w:p>
+      <w:pPr>
+        <w:pStyle w:val="Teksts"/>
+      </w:pPr>
+      <w:r>
+        <w:t>Realizācijas tika nolemts</w:t>
+      </w:r>
+      <w:r>
+        <w:t xml:space="preserve"> izmanto</w:t>
+      </w:r>
+      <w:r>
+        <w:t>t tieši</w:t>
+      </w:r>
+      <w:r>
+        <w:t xml:space="preserve"> standartizāciju. Standartizācijas funkcija aprēķina</w:t>
+      </w:r>
+      <w:r>
+        <w:t xml:space="preserve"> </w:t>
+      </w:r>
+      <m:oMath>
+        <m:r>
+          <w:rPr>
+            <w:rFonts w:ascii="Cambria Math" w:hAnsi="Cambria Math"/>
+          </w:rPr>
+          <m:t>μ</m:t>
+        </m:r>
+      </m:oMath>
+      <w:r>
+        <w:rPr>
+          <w:iCs/>
+        </w:rPr>
+        <w:t xml:space="preserve"> un </w:t>
+      </w:r>
+      <m:oMath>
+        <m:r>
+          <w:rPr>
+            <w:rFonts w:ascii="Cambria Math" w:hAnsi="Cambria Math"/>
+          </w:rPr>
+          <m:t>σ</m:t>
+        </m:r>
+      </m:oMath>
+      <w:r>
+        <w:t xml:space="preserve"> un atgriež pārveidoto vērtību</w:t>
+      </w:r>
+      <w:r>
+        <w:t xml:space="preserve"> </w:t>
+      </w:r>
+      <m:oMath>
+        <m:d>
+          <m:dPr>
+            <m:ctrlPr>
+              <w:rPr>
+                <w:rFonts w:ascii="Cambria Math" w:hAnsi="Cambria Math"/>
+                <w:i/>
+              </w:rPr>
+            </m:ctrlPr>
+          </m:dPr>
+          <m:e>
+            <m:r>
+              <w:rPr>
+                <w:rFonts w:ascii="Cambria Math" w:hAnsi="Cambria Math"/>
+              </w:rPr>
+              <m:t>x-</m:t>
+            </m:r>
+            <m:r>
+              <w:rPr>
+                <w:rFonts w:ascii="Cambria Math" w:hAnsi="Cambria Math"/>
+              </w:rPr>
+              <m:t>μ</m:t>
+            </m:r>
+          </m:e>
+        </m:d>
+        <m:r>
+          <m:rPr>
+            <m:lit/>
+          </m:rPr>
+          <w:rPr>
+            <w:rFonts w:ascii="Cambria Math" w:hAnsi="Cambria Math"/>
+          </w:rPr>
+          <m:t>/</m:t>
+        </m:r>
+        <m:r>
+          <w:rPr>
+            <w:rFonts w:ascii="Cambria Math" w:hAnsi="Cambria Math"/>
+          </w:rPr>
+          <m:t>σ</m:t>
+        </m:r>
+      </m:oMath>
+      <w:r>
+        <w:t xml:space="preserve">, kur </w:t>
+      </w:r>
+      <m:oMath>
+        <m:r>
+          <w:rPr>
+            <w:rFonts w:ascii="Cambria Math" w:hAnsi="Cambria Math"/>
+          </w:rPr>
+          <m:t>μ</m:t>
+        </m:r>
+      </m:oMath>
+      <w:r>
+        <w:rPr>
+          <w:iCs/>
+        </w:rPr>
+        <w:t xml:space="preserve"> un </w:t>
+      </w:r>
+      <m:oMath>
+        <m:r>
+          <w:rPr>
+            <w:rFonts w:ascii="Cambria Math" w:hAnsi="Cambria Math"/>
+          </w:rPr>
+          <m:t>σ</m:t>
+        </m:r>
+      </m:oMath>
+      <w:r>
+        <w:t xml:space="preserve"> tiek aprēķināti pa asīm (</w:t>
+      </w:r>
+      <w:r>
+        <w:rPr>
+          <w:i/>
+          <w:iCs/>
+        </w:rPr>
+        <w:t>samples, timesteps</w:t>
+      </w:r>
+      <w:r>
+        <w:t xml:space="preserve">) — tas ir, gan </w:t>
+      </w:r>
+      <w:r>
+        <w:rPr>
+          <w:i/>
+          <w:iCs/>
+        </w:rPr>
+        <w:t>samples</w:t>
+      </w:r>
+      <w:r>
+        <w:t xml:space="preserve"> (šī implementācijā – materiālu grupas)</w:t>
+      </w:r>
+      <w:r>
+        <w:t xml:space="preserve">, gan </w:t>
+      </w:r>
+      <w:r>
+        <w:rPr>
+          <w:i/>
+          <w:iCs/>
+        </w:rPr>
+        <w:t>timesteps</w:t>
+      </w:r>
+      <w:r>
+        <w:rPr>
+          <w:i/>
+          <w:iCs/>
+        </w:rPr>
+        <w:t xml:space="preserve"> </w:t>
+      </w:r>
+      <w:r>
+        <w:t xml:space="preserve">(šī implementācijā – periodi) </w:t>
+      </w:r>
+      <w:r>
+        <w:t xml:space="preserve">tiek "sakļauti", un pēc tam katrai </w:t>
+      </w:r>
+      <w:r>
+        <w:t>ie</w:t>
+      </w:r>
+      <w:r>
+        <w:t xml:space="preserve">zīmei tiek ņemta vidējā vērtība/standartnovirze. Tas atbilst laika rindas problēmai, kur viena </w:t>
+      </w:r>
+      <w:r>
+        <w:lastRenderedPageBreak/>
+        <w:t xml:space="preserve">un tā pati </w:t>
+      </w:r>
+      <w:r>
+        <w:t>ie</w:t>
+      </w:r>
+      <w:r>
+        <w:t>zīme rodas dažādos laika punktos.</w:t>
+      </w:r>
+      <w:r>
+        <w:t xml:space="preserve"> I</w:t>
+      </w:r>
+      <w:r>
+        <w:t>r nodrošināta arī dalīšanas ar nulli aizsardzība: ja standartnovirze ir nulle, tā tiek aizstāta ar 1</w:t>
+      </w:r>
+      <w:r>
+        <w:t>.</w:t>
+      </w:r>
+      <w:r>
+        <w:t>0.</w:t>
+      </w:r>
+    </w:p>
+    <w:p>
+      <w:pPr>
+        <w:pStyle w:val="Teksts"/>
+      </w:pPr>
+      <w:r>
+        <w:t xml:space="preserve">Ne tikai ievades </w:t>
+      </w:r>
+      <w:r>
+        <w:rPr>
+          <w:i/>
+          <w:iCs/>
+        </w:rPr>
+        <w:t>x</w:t>
+      </w:r>
+      <w:r>
+        <w:t xml:space="preserve">, bet arī mērķa mainīgais </w:t>
+      </w:r>
+      <w:r>
+        <w:rPr>
+          <w:i/>
+          <w:iCs/>
+        </w:rPr>
+        <w:t>y</w:t>
+      </w:r>
+      <w:r>
+        <w:t xml:space="preserve"> tiek standartizēti atsevišķi, pēc tam prognoze tiek atgriezta sākotnējā mērogā, izmantojot apgriezto transformāciju</w:t>
+      </w:r>
+      <w:r>
+        <w:t xml:space="preserve"> – </w:t>
+      </w:r>
+      <w:r>
+        <w:t>reizināšan</w:t>
+      </w:r>
+      <w:r>
+        <w:t xml:space="preserve">a </w:t>
+      </w:r>
+      <w:r>
+        <w:t xml:space="preserve">ar </w:t>
+      </w:r>
+      <m:oMath>
+        <m:r>
+          <w:rPr>
+            <w:rFonts w:ascii="Cambria Math" w:hAnsi="Cambria Math"/>
+          </w:rPr>
+          <m:t>μ</m:t>
+        </m:r>
+      </m:oMath>
+      <w:r>
+        <w:rPr>
+          <w:iCs/>
+        </w:rPr>
+        <w:t xml:space="preserve"> un </w:t>
+      </w:r>
+      <m:oMath>
+        <m:r>
+          <w:rPr>
+            <w:rFonts w:ascii="Cambria Math" w:hAnsi="Cambria Math"/>
+          </w:rPr>
+          <m:t>σ</m:t>
+        </m:r>
+      </m:oMath>
+      <w:r>
+        <w:t xml:space="preserve"> saskaitīšanu.</w:t>
+      </w:r>
+      <w:r>
+        <w:t xml:space="preserve"> </w:t>
+      </w:r>
+    </w:p>
+    <w:p>
+      <w:pPr>
+        <w:pStyle w:val="Teksts"/>
+      </w:pPr>
+      <w:r>
+        <w:t>Laika rindu literatūrā viena no sintētisko datu ģenerēšanas pieejām ietver trokšņa, piemēram, Gausa trokšņa, pievienošanu sākotnējam signālam, trokšņa skalu izvēloties, pamatojoties uz pazīmes/sērijas standartnovirzi (Hu et al., 2023). Šajā rakstā LSTM eksperimentā palielināšana netiek izmantota; iespējamos cauruļvada uzlabojumus, tostarp uzlabotu datu palielināšanu, var sīkāk apspriest 6. nodaļā (Hu et al., 2023).</w:t>
+      </w:r>
+    </w:p>
+    <w:p>
+      <w:pPr>
+        <w:pStyle w:val="Teksts"/>
+      </w:pPr>
+    </w:p>
+    <w:p>
+      <w:pPr>
+        <w:pStyle w:val="Teksts"/>
+      </w:pPr>
+    </w:p>
+    <w:p>
+      <w:pPr>
+        <w:pStyle w:val="Teksts"/>
+      </w:pPr>
+    </w:p>
+    <w:p>
+      <w:pPr>
+        <w:pStyle w:val="Teksts"/>
+        <w:tabs>
+          <w:tab w:val="left" w:pos="1134"/>
+        </w:tabs>
+      </w:pPr>
+    </w:p>
+    <w:p>
+      <w:pPr>
+        <w:pStyle w:val="Teksts"/>
+        <w:tabs>
+          <w:tab w:val="center" w:pos="4395"/>
+          <w:tab w:val="right" w:pos="8222"/>
+        </w:tabs>
+        <w:ind w:firstLine="0"/>
+      </w:pPr>
+    </w:p>
+    <w:p>
+      <w:pPr>
+        <w:pStyle w:val="Teksts"/>
+      </w:pPr>
+    </w:p>
+    <w:p>
+      <w:pPr>
+        <w:pStyle w:val="Teksts"/>
+      </w:pPr>
+    </w:p>
+    <w:p>
+      <w:pPr>
+        <w:pStyle w:val="Teksts"/>
+        <w:tabs>
+          <w:tab w:val="center" w:pos="4395"/>
+          <w:tab w:val="right" w:pos="8222"/>
+        </w:tabs>
+        <w:ind w:firstLine="0"/>
+      </w:pPr>
+    </w:p>
+    <w:p>
+      <w:pPr>
+        <w:pStyle w:val="Teksts"/>
+        <w:tabs>
+          <w:tab w:val="center" w:pos="4395"/>
+          <w:tab w:val="right" w:pos="8222"/>
+        </w:tabs>
+        <w:ind w:firstLine="0"/>
+      </w:pPr>
+    </w:p>
+    <w:p>
+      <w:pPr>
+        <w:pStyle w:val="Teksts"/>
+        <w:tabs>
+          <w:tab w:val="center" w:pos="4395"/>
+          <w:tab w:val="right" w:pos="8222"/>
+        </w:tabs>
+        <w:ind w:firstLine="0"/>
+      </w:pPr>
+    </w:p>
+    <w:p>
+      <w:pPr>
+        <w:pStyle w:val="Teksts"/>
+        <w:tabs>
+          <w:tab w:val="center" w:pos="4253"/>
+          <w:tab w:val="right" w:pos="8222"/>
+        </w:tabs>
+        <w:jc w:val="right"/>
+      </w:pPr>
+    </w:p>
+    <w:p>
+      <w:pPr>
+        <w:pStyle w:val="Teksts"/>
+        <w:tabs>
+          <w:tab w:val="center" w:pos="4253"/>
+          <w:tab w:val="right" w:pos="8222"/>
+        </w:tabs>
+        <w:jc w:val="right"/>
+      </w:pPr>
+    </w:p>
+    <w:p>
+      <w:pPr>
+        <w:pStyle w:val="Uzsk-aizzmes"/>
+        <w:numPr>
+          <w:ilvl w:val="0"/>
+          <w:numId w:val="0"/>
+        </w:numPr>
+        <w:ind w:left="567" w:hanging="283"/>
+      </w:pPr>
+    </w:p>
+    <w:p>
+      <w:pPr>
         <w:pStyle w:val="2-lm-virsraksts"/>
       </w:pPr>
       <w:r>
-        <w:lastRenderedPageBreak/>
         <w:t>Validācijas rezultāti vēsturiskajos mēnešos</w:t>
       </w:r>
     </w:p>
@@ -14636,12 +18169,12 @@
       <w:pPr>
         <w:pStyle w:val="1-lm-nenumurts-virsraksts"/>
       </w:pPr>
-      <w:bookmarkStart w:id="124" w:name="_Toc225535011"/>
+      <w:bookmarkStart w:id="130" w:name="_Toc225535011"/>
       <w:r>
         <w:lastRenderedPageBreak/>
         <w:t>Rezultāti un secinājumi</w:t>
       </w:r>
-      <w:bookmarkEnd w:id="124"/>
+      <w:bookmarkEnd w:id="130"/>
     </w:p>
     <w:p>
       <w:pPr>
@@ -14814,14 +18347,14 @@
       <w:pPr>
         <w:pStyle w:val="1-lm-nenumurts-virsraksts"/>
       </w:pPr>
-      <w:bookmarkStart w:id="125" w:name="_Toc88602609"/>
-      <w:bookmarkStart w:id="126" w:name="_Toc225535012"/>
+      <w:bookmarkStart w:id="131" w:name="_Toc88602609"/>
+      <w:bookmarkStart w:id="132" w:name="_Toc225535012"/>
       <w:r>
         <w:lastRenderedPageBreak/>
         <w:t>Izmantotie informācijas avoti</w:t>
       </w:r>
-      <w:bookmarkEnd w:id="125"/>
-      <w:bookmarkEnd w:id="126"/>
+      <w:bookmarkEnd w:id="131"/>
+      <w:bookmarkEnd w:id="132"/>
       <w:r>
         <w:fldChar w:fldCharType="begin"/>
       </w:r>
@@ -15378,13 +18911,13 @@
       <w:pPr>
         <w:pStyle w:val="Pielikumi-virsraksts"/>
       </w:pPr>
-      <w:bookmarkStart w:id="127" w:name="_Toc88602610"/>
-      <w:bookmarkStart w:id="128" w:name="_Toc225535013"/>
+      <w:bookmarkStart w:id="133" w:name="_Toc88602610"/>
+      <w:bookmarkStart w:id="134" w:name="_Toc225535013"/>
       <w:r>
         <w:t>Pielikumi</w:t>
       </w:r>
-      <w:bookmarkEnd w:id="127"/>
-      <w:bookmarkEnd w:id="128"/>
+      <w:bookmarkEnd w:id="133"/>
+      <w:bookmarkEnd w:id="134"/>
     </w:p>
     <w:p>
       <w:r>
@@ -22821,7 +26354,7 @@
       </w:pPr>
     </w:p>
   </w:comment>
-  <w:comment w:id="123" w:author="Deniss" w:date="2026-04-15T21:39:00Z" w:initials="D">
+  <w:comment w:id="123" w:author="Deniss" w:date="2026-04-15T21:45:00Z" w:initials="D">
     <w:p>
       <w:pPr>
         <w:pStyle w:val="CommentText"/>
@@ -22833,7 +26366,151 @@
         <w:annotationRef/>
       </w:r>
       <w:r>
+        <w:t>A feedforward neural network can be viewed as a function that tranforms an input feature vector \(x\) to a numerical prediction \(\hat{y}\), and is commonly used in regression and function approximation tasks (Minnett et al., 2011). In such models, the output is formed as an affine combination of hidden units with nonlinear activation functions, such as the hyperbolic tangent, which enables modeling of complex nonlinear relationships between inputs and outputs (Minnett et al., 2011).</w:t>
+      </w:r>
+    </w:p>
+  </w:comment>
+  <w:comment w:id="124" w:author="Deniss" w:date="2026-04-15T21:39:00Z" w:initials="D">
+    <w:p>
+      <w:pPr>
+        <w:pStyle w:val="CommentText"/>
+      </w:pPr>
+      <w:r>
+        <w:rPr>
+          <w:rStyle w:val="CommentReference"/>
+        </w:rPr>
+        <w:annotationRef/>
+      </w:r>
+      <w:r>
         <w:t>https://www.akadterm.lv/term.php?term=feedforward+neural+network&amp;list=feedforward+neural+network&amp;lang=EN</w:t>
+      </w:r>
+    </w:p>
+  </w:comment>
+  <w:comment w:id="125" w:author="Deniss" w:date="2026-04-15T22:12:00Z" w:initials="D">
+    <w:p>
+      <w:pPr>
+        <w:pStyle w:val="CommentText"/>
+      </w:pPr>
+      <w:r>
+        <w:rPr>
+          <w:rStyle w:val="CommentReference"/>
+        </w:rPr>
+        <w:annotationRef/>
+      </w:r>
+      <w:r>
+        <w:t>An artificial neuron in a fully connected layer computes a weighted sum of its inputs with an added bias term, followed by the application of a nonlinear activation function. This operation can be expressed as (Chiang &amp; Fu, 1992):</w:t>
+      </w:r>
+    </w:p>
+  </w:comment>
+  <w:comment w:id="126" w:author="Deniss" w:date="2026-04-15T22:30:00Z" w:initials="D">
+    <w:p>
+      <w:pPr>
+        <w:pStyle w:val="CommentText"/>
+      </w:pPr>
+      <w:r>
+        <w:rPr>
+          <w:rStyle w:val="CommentReference"/>
+        </w:rPr>
+        <w:annotationRef/>
+      </w:r>
+      <w:r>
+        <w:t>For a layer consisting of multiple neurons, this computation can be written in matrix form as:</w:t>
+      </w:r>
+    </w:p>
+  </w:comment>
+  <w:comment w:id="127" w:author="Deniss" w:date="2026-04-15T22:30:00Z" w:initials="D">
+    <w:p>
+      <w:pPr>
+        <w:pStyle w:val="CommentText"/>
+      </w:pPr>
+      <w:r>
+        <w:rPr>
+          <w:rStyle w:val="CommentReference"/>
+        </w:rPr>
+        <w:annotationRef/>
+      </w:r>
+      <w:r>
+        <w:t>In multilayer perceptrons, neurons are organized into input, hidden, and output layers, and the network learns by adjusting weights to minimize the error between predicted and desired outputs (Ramchoun et al., 2019). For regression tasks, the output layer is commonly defined as a linear transformation of the last hidden representation, allowing the network to produce continuous-valued predictions (Chiang &amp; Fu, 1992). In this case, the predicted output can be written as formula 3, where the network parameters are optimized to minimize the discrepancy between \( \hat{y} \) and the true target \( y \) (Ramchoun et al., 2019).:</w:t>
+      </w:r>
+    </w:p>
+  </w:comment>
+  <w:comment w:id="128" w:author="Deniss" w:date="2026-04-17T16:08:00Z" w:initials="D">
+    <w:p>
+      <w:pPr>
+        <w:pStyle w:val="CommentText"/>
+      </w:pPr>
+      <w:r>
+        <w:rPr>
+          <w:rStyle w:val="CommentReference"/>
+        </w:rPr>
+        <w:annotationRef/>
+      </w:r>
+      <w:r>
+        <w:rPr>
+          <w:noProof/>
+        </w:rPr>
+        <w:t>atrast v</w:t>
+      </w:r>
+      <w:r>
+        <w:rPr>
+          <w:noProof/>
+        </w:rPr>
+        <w:t xml:space="preserve">isus </w:t>
+      </w:r>
+      <w:r>
+        <w:rPr>
+          <w:noProof/>
+        </w:rPr>
+        <w:t>avotus, kur tie ir uzrakstīti ar v</w:t>
+      </w:r>
+      <w:r>
+        <w:rPr>
+          <w:noProof/>
+        </w:rPr>
+        <w:t xml:space="preserve">ārdiem, </w:t>
+      </w:r>
+      <w:r>
+        <w:rPr>
+          <w:noProof/>
+        </w:rPr>
+        <w:t xml:space="preserve">nevis kā </w:t>
+      </w:r>
+      <w:r>
+        <w:rPr>
+          <w:noProof/>
+        </w:rPr>
+        <w:t>insert</w:t>
+      </w:r>
+    </w:p>
+  </w:comment>
+  <w:comment w:id="129" w:author="Deniss" w:date="2026-04-17T16:11:00Z" w:initials="D">
+    <w:p>
+      <w:pPr>
+        <w:pStyle w:val="CommentText"/>
+      </w:pPr>
+      <w:r>
+        <w:rPr>
+          <w:rStyle w:val="CommentReference"/>
+        </w:rPr>
+        <w:annotationRef/>
+      </w:r>
+      <w:r>
+        <w:rPr>
+          <w:noProof/>
+        </w:rPr>
+        <w:t>pa</w:t>
+      </w:r>
+      <w:r>
+        <w:rPr>
+          <w:noProof/>
+        </w:rPr>
+        <w:t>zīmji -&gt; iezīmji visur pārba</w:t>
+      </w:r>
+      <w:r>
+        <w:rPr>
+          <w:noProof/>
+        </w:rPr>
+        <w:t>udīt</w:t>
       </w:r>
     </w:p>
   </w:comment>
@@ -22943,7 +26620,13 @@
   <w15:commentEx w15:paraId="104072A3" w15:done="0"/>
   <w15:commentEx w15:paraId="02ADCB51" w15:done="0"/>
   <w15:commentEx w15:paraId="20D1B378" w15:done="0"/>
+  <w15:commentEx w15:paraId="6FEE31EE" w15:done="0"/>
   <w15:commentEx w15:paraId="7518D5BB" w15:done="0"/>
+  <w15:commentEx w15:paraId="54041CE2" w15:done="0"/>
+  <w15:commentEx w15:paraId="5BB86212" w15:done="0"/>
+  <w15:commentEx w15:paraId="06196FAB" w15:done="0"/>
+  <w15:commentEx w15:paraId="11357A3C" w15:done="0"/>
+  <w15:commentEx w15:paraId="2C43CE4E" w15:done="0"/>
 </w15:commentsEx>
 </file>
 
@@ -23050,7 +26733,13 @@
   <w16cex:commentExtensible w16cex:durableId="4CF59650" w16cex:dateUtc="2026-04-13T13:18:00Z"/>
   <w16cex:commentExtensible w16cex:durableId="5AF05793" w16cex:dateUtc="2026-04-13T13:19:00Z"/>
   <w16cex:commentExtensible w16cex:durableId="2C82A7FC" w16cex:dateUtc="2026-04-10T14:12:00Z"/>
+  <w16cex:commentExtensible w16cex:durableId="1B512BEA" w16cex:dateUtc="2026-04-15T18:45:00Z"/>
   <w16cex:commentExtensible w16cex:durableId="563F4FA0" w16cex:dateUtc="2026-04-15T18:39:00Z"/>
+  <w16cex:commentExtensible w16cex:durableId="3CE4A1FC" w16cex:dateUtc="2026-04-15T19:12:00Z"/>
+  <w16cex:commentExtensible w16cex:durableId="52CF89F4" w16cex:dateUtc="2026-04-15T19:30:00Z"/>
+  <w16cex:commentExtensible w16cex:durableId="353F1965" w16cex:dateUtc="2026-04-15T19:30:00Z"/>
+  <w16cex:commentExtensible w16cex:durableId="03C60A12" w16cex:dateUtc="2026-04-17T13:08:00Z"/>
+  <w16cex:commentExtensible w16cex:durableId="03FF88AE" w16cex:dateUtc="2026-04-17T13:11:00Z"/>
 </w16cex:commentsExtensible>
 </file>
 
@@ -23157,7 +26846,13 @@
   <w16cid:commentId w16cid:paraId="104072A3" w16cid:durableId="4CF59650"/>
   <w16cid:commentId w16cid:paraId="02ADCB51" w16cid:durableId="5AF05793"/>
   <w16cid:commentId w16cid:paraId="20D1B378" w16cid:durableId="2C82A7FC"/>
+  <w16cid:commentId w16cid:paraId="6FEE31EE" w16cid:durableId="1B512BEA"/>
   <w16cid:commentId w16cid:paraId="7518D5BB" w16cid:durableId="563F4FA0"/>
+  <w16cid:commentId w16cid:paraId="54041CE2" w16cid:durableId="3CE4A1FC"/>
+  <w16cid:commentId w16cid:paraId="5BB86212" w16cid:durableId="52CF89F4"/>
+  <w16cid:commentId w16cid:paraId="06196FAB" w16cid:durableId="353F1965"/>
+  <w16cid:commentId w16cid:paraId="11357A3C" w16cid:durableId="03C60A12"/>
+  <w16cid:commentId w16cid:paraId="2C43CE4E" w16cid:durableId="03FF88AE"/>
 </w16cid:commentsIds>
 </file>
 
@@ -33311,7 +37006,6 @@
     <w:rsid w:val="005E78D3"/>
     <w:rsid w:val="0063583C"/>
     <w:rsid w:val="00687643"/>
-    <w:rsid w:val="006C4F64"/>
     <w:rsid w:val="006C7BD9"/>
     <w:rsid w:val="0070464B"/>
     <w:rsid w:val="007172EC"/>
@@ -33320,18 +37014,23 @@
     <w:rsid w:val="008A10C8"/>
     <w:rsid w:val="008C285C"/>
     <w:rsid w:val="00903C5C"/>
+    <w:rsid w:val="00942F17"/>
     <w:rsid w:val="00B003D8"/>
+    <w:rsid w:val="00B62A4C"/>
     <w:rsid w:val="00B83BC5"/>
     <w:rsid w:val="00BE55BF"/>
     <w:rsid w:val="00BF37F9"/>
     <w:rsid w:val="00C37405"/>
     <w:rsid w:val="00C448B1"/>
     <w:rsid w:val="00C63617"/>
+    <w:rsid w:val="00CA5316"/>
     <w:rsid w:val="00CB1DE6"/>
     <w:rsid w:val="00D05816"/>
     <w:rsid w:val="00D7095D"/>
     <w:rsid w:val="00D8221B"/>
+    <w:rsid w:val="00DE24C2"/>
     <w:rsid w:val="00E55A00"/>
+    <w:rsid w:val="00ED6C9D"/>
     <w:rsid w:val="00F425CE"/>
     <w:rsid w:val="00FD387C"/>
   </w:rsids>
@@ -33789,7 +37488,7 @@
     <w:basedOn w:val="DefaultParagraphFont"/>
     <w:uiPriority w:val="99"/>
     <w:semiHidden/>
-    <w:rsid w:val="008C285C"/>
+    <w:rsid w:val="00CA5316"/>
     <w:rPr>
       <w:color w:val="666666"/>
     </w:rPr>
@@ -34139,32 +37838,6 @@
     <b:RefOrder>1</b:RefOrder>
   </b:Source>
   <b:Source>
-    <b:Tag>SBS2023RetailSalesForecasting</b:Tag>
-    <b:SourceType>ConferenceProceedings</b:SourceType>
-    <b:Author>
-      <b:Author>
-        <b:NameList>
-          <b:Person>
-            <b:Last>B S</b:Last>
-            <b:First>S.</b:First>
-          </b:Person>
-          <b:Person>
-            <b:Last>Suresh</b:Last>
-            <b:First>M.</b:First>
-          </b:Person>
-        </b:NameList>
-      </b:Author>
-    </b:Author>
-    <b:Title>A Comprehensive Analysis of Retail Sales Forecasting Using Machine Learning and Deep Learning Methods</b:Title>
-    <b:BookTitle>2023 International Conference on Data Science and Network Security (ICDSNS)</b:BookTitle>
-    <b:City>Tiptur, India</b:City>
-    <b:Year>2023</b:Year>
-    <b:Pages>1-5</b:Pages>
-    <b:DOI>10.1109/ICDSNS58469.2023.10245887</b:DOI>
-    <b:URL>https://doi.org/10.1109/ICDSNS58469.2023.10245887</b:URL>
-    <b:RefOrder>5</b:RefOrder>
-  </b:Source>
-  <b:Source>
     <b:Tag>Bender2024AdvancesDemandForecasting</b:Tag>
     <b:SourceType>ElectronicSource</b:SourceType>
     <b:Author>
@@ -34305,7 +37978,7 @@
     <b:Year>2001</b:Year>
     <b:DOI>10.1016/S0925-5273(00)00109-2</b:DOI>
     <b:URL>https://doi.org/10.1016/S0925-5273(00)00109-2</b:URL>
-    <b:RefOrder>18</b:RefOrder>
+    <b:RefOrder>27</b:RefOrder>
   </b:Source>
   <b:Source>
     <b:Tag>Lee2012HybridAISalesForecasting</b:Tag>
@@ -34335,7 +38008,7 @@
     <b:Pages>188-196</b:Pages>
     <b:DOI>10.1002/hfm.20272</b:DOI>
     <b:URL>https://doi.org/10.1002/hfm.20272</b:URL>
-    <b:RefOrder>19</b:RefOrder>
+    <b:RefOrder>28</b:RefOrder>
   </b:Source>
   <b:Source>
     <b:Tag>MullerNavarra2015SalesForecastingPRNN</b:Tag>
@@ -34391,7 +38064,7 @@
     <b:Pages>1-7</b:Pages>
     <b:DOI>10.1109/IACIS65746.2025.11211065</b:DOI>
     <b:URL>https://doi.org/10.1109/IACIS65746.2025.11211065</b:URL>
-    <b:RefOrder>20</b:RefOrder>
+    <b:RefOrder>29</b:RefOrder>
   </b:Source>
   <b:Source>
     <b:Tag>Pongdatu2018SeasonalTimeSeries</b:Tag>
@@ -34483,7 +38156,7 @@
     <b:Pages>e14724</b:Pages>
     <b:DOI>10.1590/1806-9649-2025v32e14724</b:DOI>
     <b:URL>https://doi.org/10.1590/1806-9649-2025v32e14724</b:URL>
-    <b:RefOrder>21</b:RefOrder>
+    <b:RefOrder>30</b:RefOrder>
   </b:Source>
   <b:Source>
     <b:Tag>Sirisha2022ProfitPrediction</b:Tag>
@@ -34733,11 +38406,344 @@
     <b:URL>https://www.statsmodels.org/dev/generated/statsmodels.tsa.statespace.sarimax.SARIMAX.html#statsmodels.tsa.statespace.sarimax.SARIMAX</b:URL>
     <b:RefOrder>17</b:RefOrder>
   </b:Source>
+  <b:Source>
+    <b:Tag>Min11</b:Tag>
+    <b:SourceType>JournalArticle</b:SourceType>
+    <b:Guid>{4CAE69E9-6492-42A2-AFB3-C1988104BDC3}</b:Guid>
+    <b:Title>Neural network tomography: Network replication from output surface geometry</b:Title>
+    <b:Year>2011</b:Year>
+    <b:JournalName>Neural Networks</b:JournalName>
+    <b:Pages>484–492</b:Pages>
+    <b:Author>
+      <b:Author>
+        <b:NameList>
+          <b:Person>
+            <b:Last>Minnett</b:Last>
+            <b:First>R. C. J.</b:First>
+          </b:Person>
+          <b:Person>
+            <b:Last>Smith</b:Last>
+            <b:First>A. T.</b:First>
+          </b:Person>
+          <b:Person>
+            <b:Last>Lennon</b:Last>
+            <b:First>W. C.</b:First>
+          </b:Person>
+          <b:Person>
+            <b:Last>Hecht-Nielsen</b:Last>
+            <b:First>R.</b:First>
+          </b:Person>
+        </b:NameList>
+      </b:Author>
+    </b:Author>
+    <b:Volume>24</b:Volume>
+    <b:DOI>10.1016/j.neunet.2011.01.006</b:DOI>
+    <b:RefOrder>18</b:RefOrder>
+  </b:Source>
+  <b:Source>
+    <b:Tag>Chi92</b:Tag>
+    <b:SourceType>ConferenceProceedings</b:SourceType>
+    <b:Guid>{D9B2D718-BCB5-42EB-B0D9-A40C1E18A850}</b:Guid>
+    <b:Title>A Variant of Second-Order Multilayer Perceptron and Its Application to Function Approximations</b:Title>
+    <b:Year>1992</b:Year>
+    <b:Pages>III-887–III-892</b:Pages>
+    <b:ConferenceName>Proceedings of the IEEE Conference (leave generic if unsure)</b:ConferenceName>
+    <b:Publisher>IEEE</b:Publisher>
+    <b:Author>
+      <b:Author>
+        <b:NameList>
+          <b:Person>
+            <b:Last>Chiang</b:Last>
+            <b:First>C.-C</b:First>
+          </b:Person>
+          <b:Person>
+            <b:Last>Fu</b:Last>
+            <b:First>H.-C</b:First>
+          </b:Person>
+        </b:NameList>
+      </b:Author>
+    </b:Author>
+    <b:DOI>10.1109/IJCNN.1992.227087</b:DOI>
+    <b:RefOrder>19</b:RefOrder>
+  </b:Source>
+  <b:Source>
+    <b:Tag>Ram19</b:Tag>
+    <b:SourceType>JournalArticle</b:SourceType>
+    <b:Guid>{7AE7ECB6-2B53-4B0A-9C6E-73A2E03B1699}</b:Guid>
+    <b:Title>Multilayer Perceptron: Architecture Optimization and Training</b:Title>
+    <b:Pages>26–30</b:Pages>
+    <b:Year>2019</b:Year>
+    <b:JournalName>International Journal of Interactive Multimedia and Artificial Intelligence</b:JournalName>
+    <b:Author>
+      <b:Author>
+        <b:NameList>
+          <b:Person>
+            <b:Last>Ramchoun</b:Last>
+            <b:First>H.</b:First>
+          </b:Person>
+          <b:Person>
+            <b:Last>Idrissi</b:Last>
+            <b:First>M. A. J.</b:First>
+          </b:Person>
+          <b:Person>
+            <b:Last>Ghanou</b:Last>
+            <b:First>Y.</b:First>
+          </b:Person>
+          <b:Person>
+            <b:Last>Ettaouil</b:Last>
+            <b:First>M.</b:First>
+          </b:Person>
+        </b:NameList>
+      </b:Author>
+    </b:Author>
+    <b:Volume>5</b:Volume>
+    <b:Issue>1</b:Issue>
+    <b:DOI>10.9781/ijimai.2019.02.002</b:DOI>
+    <b:RefOrder>20</b:RefOrder>
+  </b:Source>
+  <b:Source>
+    <b:Tag>SBS2023RetailSalesForecasting</b:Tag>
+    <b:SourceType>ConferenceProceedings</b:SourceType>
+    <b:Author>
+      <b:Author>
+        <b:NameList>
+          <b:Person>
+            <b:Last>Suresh</b:Last>
+            <b:First>B.S.</b:First>
+          </b:Person>
+          <b:Person>
+            <b:Last>Suresh</b:Last>
+            <b:First>M.</b:First>
+          </b:Person>
+        </b:NameList>
+      </b:Author>
+    </b:Author>
+    <b:Title>A Comprehensive Analysis of Retail Sales Forecasting Using Machine Learning and Deep Learning Methods</b:Title>
+    <b:BookTitle>2023 International Conference on Data Science and Network Security (ICDSNS)</b:BookTitle>
+    <b:City>Tiptur, India</b:City>
+    <b:Year>2023</b:Year>
+    <b:Pages>1-5</b:Pages>
+    <b:DOI>10.1109/ICDSNS58469.2023.10245887</b:DOI>
+    <b:URL>https://doi.org/10.1109/ICDSNS58469.2023.10245887</b:URL>
+    <b:Guid>{002AABC9-64BE-4690-9E95-914DF2A77338}</b:Guid>
+    <b:RefOrder>5</b:RefOrder>
+  </b:Source>
+  <b:Source>
+    <b:Tag>JiC24</b:Tag>
+    <b:SourceType>ConferenceProceedings</b:SourceType>
+    <b:Guid>{270E2249-B568-476C-B805-8E155DD0BAD1}</b:Guid>
+    <b:Title>A Survey of Neural Network Optimization Algorithms</b:Title>
+    <b:Year>2024</b:Year>
+    <b:Pages>409–415</b:Pages>
+    <b:Author>
+      <b:Author>
+        <b:NameList>
+          <b:Person>
+            <b:Last>Ji</b:Last>
+            <b:First>Chengwei</b:First>
+          </b:Person>
+        </b:NameList>
+      </b:Author>
+    </b:Author>
+    <b:ConferenceName>2024 IEEE 4th International Conference on Data Science and Computer Application (ICDSCA)</b:ConferenceName>
+    <b:Publisher>IEEE</b:Publisher>
+    <b:DOI>10.1109/ICDSCA63855.2024.10859435</b:DOI>
+    <b:RefOrder>21</b:RefOrder>
+  </b:Source>
+  <b:Source>
+    <b:Tag>Bor25</b:Tag>
+    <b:SourceType>JournalArticle</b:SourceType>
+    <b:Guid>{B8C976B4-14FE-40A9-AC99-790A2D7CEE45}</b:Guid>
+    <b:Title>The role of data transformation in modern analytics: A comprehensive survey</b:Title>
+    <b:Pages>10.1016/j.cola.2025.101329</b:Pages>
+    <b:Year>2025</b:Year>
+    <b:Author>
+      <b:Author>
+        <b:NameList>
+          <b:Person>
+            <b:Last>Borrohou</b:Last>
+            <b:First>Sanae</b:First>
+          </b:Person>
+          <b:Person>
+            <b:Last>Fissoune</b:Last>
+            <b:First>Rachida</b:First>
+          </b:Person>
+          <b:Person>
+            <b:Last>Badir</b:Last>
+            <b:First>Hassan</b:First>
+          </b:Person>
+        </b:NameList>
+      </b:Author>
+    </b:Author>
+    <b:JournalName>Journal of Computer Languages</b:JournalName>
+    <b:RefOrder>22</b:RefOrder>
+  </b:Source>
+  <b:Source>
+    <b:Tag>Elm25</b:Tag>
+    <b:SourceType>JournalArticle</b:SourceType>
+    <b:Guid>{0A5E0BE6-324D-4A91-A77F-9A970C51A0D1}</b:Guid>
+    <b:Title>Advanced machine learning models for robust prediction of water quality index and classification</b:Title>
+    <b:JournalName>Journal of Hydroinformatics</b:JournalName>
+    <b:Year>2025</b:Year>
+    <b:Author>
+      <b:Author>
+        <b:NameList>
+          <b:Person>
+            <b:Last>Elmotawakkil</b:Last>
+            <b:First>Abdessamad </b:First>
+          </b:Person>
+          <b:Person>
+            <b:Last>Enneya</b:Last>
+            <b:First>Nourddine </b:First>
+          </b:Person>
+          <b:Person>
+            <b:Last>Bhagat</b:Last>
+            <b:Middle>Kumar </b:Middle>
+            <b:First>Suraj </b:First>
+          </b:Person>
+          <b:Person>
+            <b:Last>Ouda</b:Last>
+            <b:Middle>Mohamed </b:Middle>
+            <b:First>Mohamed </b:First>
+          </b:Person>
+          <b:Person>
+            <b:Last>Kumar</b:Last>
+            <b:First>Vikram </b:First>
+          </b:Person>
+        </b:NameList>
+      </b:Author>
+    </b:Author>
+    <b:Volume>27</b:Volume>
+    <b:Issue>2</b:Issue>
+    <b:DOI>0.2166/hydro.2025.290</b:DOI>
+    <b:RefOrder>23</b:RefOrder>
+  </b:Source>
+  <b:Source>
+    <b:Tag>Odu22</b:Tag>
+    <b:SourceType>JournalArticle</b:SourceType>
+    <b:Guid>{812A0E51-D8ED-4BB8-B60F-9F397EB7554E}</b:Guid>
+    <b:Title>Development and Comparison of Three Data Models for Predicting Diabetes Mellitus Using Risk Factors in a Nigerian Population</b:Title>
+    <b:JournalName>Healthc Inform Research</b:JournalName>
+    <b:Year>2022</b:Year>
+    <b:Pages>58-67</b:Pages>
+    <b:Author>
+      <b:Author>
+        <b:NameList>
+          <b:Person>
+            <b:Last>Odukoya</b:Last>
+            <b:First>Oluwakemi </b:First>
+          </b:Person>
+          <b:Person>
+            <b:Last>Nwaneri</b:Last>
+            <b:First>Solomon </b:First>
+          </b:Person>
+          <b:Person>
+            <b:Last>Odeniyi</b:Last>
+            <b:First>Ifedayo </b:First>
+          </b:Person>
+          <b:Person>
+            <b:Last>Akodu</b:Last>
+            <b:First>Babatunde </b:First>
+          </b:Person>
+          <b:Person>
+            <b:Last>Oluwole</b:Last>
+            <b:First>Esther </b:First>
+          </b:Person>
+          <b:Person>
+            <b:Last>Olorunfemi</b:Last>
+            <b:First>Gbenga </b:First>
+          </b:Person>
+          <b:Person>
+            <b:Last>Popoola</b:Last>
+            <b:First>Oluwatoyin </b:First>
+          </b:Person>
+          <b:Person>
+            <b:Last>Osuntoki</b:Last>
+            <b:First>Akinniyi </b:First>
+          </b:Person>
+        </b:NameList>
+      </b:Author>
+    </b:Author>
+    <b:DOI>10.4258/hir.2022.28.1.58</b:DOI>
+    <b:RefOrder>24</b:RefOrder>
+  </b:Source>
+  <b:Source>
+    <b:Tag>Raj25</b:Tag>
+    <b:SourceType>ConferenceProceedings</b:SourceType>
+    <b:Guid>{742856D7-1216-4FF1-A645-C47C8EB35B66}</b:Guid>
+    <b:Title>Enhancing Obesity Prediction: Evaluating the Role of Data Preprocessing in Machine Learning Models</b:Title>
+    <b:Year>2025</b:Year>
+    <b:Author>
+      <b:Author>
+        <b:NameList>
+          <b:Person>
+            <b:Last>Rajesh</b:Last>
+            <b:Middle>Dhayalan </b:Middle>
+            <b:First>Rohit </b:First>
+          </b:Person>
+          <b:Person>
+            <b:Last>Kuppuri</b:Last>
+            <b:Middle>Nanda Kumar </b:Middle>
+            <b:First>Yashwanth </b:First>
+          </b:Person>
+          <b:Person>
+            <b:Last>Peter</b:Last>
+            <b:Middle>Rhea </b:Middle>
+            <b:First>P. </b:First>
+          </b:Person>
+          <b:Person>
+            <b:Last>Reddy</b:Last>
+            <b:Middle>Soma Sekhar </b:Middle>
+            <b:First>A. </b:First>
+          </b:Person>
+          <b:Person>
+            <b:Last> Sonia</b:Last>
+            <b:Middle>Jeba</b:Middle>
+            <b:First>Dr.J.</b:First>
+          </b:Person>
+        </b:NameList>
+      </b:Author>
+    </b:Author>
+    <b:ConferenceName>International Conference on Computational Robotics, Testing and Engineering Evaluation</b:ConferenceName>
+    <b:DOI>10.1109/ICCRTEE64519.2025.11053002</b:DOI>
+    <b:RefOrder>25</b:RefOrder>
+  </b:Source>
+  <b:Source>
+    <b:Tag>Dic20</b:Tag>
+    <b:SourceType>JournalArticle</b:SourceType>
+    <b:Guid>{2C65EAD7-A88D-40DE-B250-DCF55B32D6C0}</b:Guid>
+    <b:Title>Feature Standardisation and Coefficient Optimisation for Effective Symbolic Regression</b:Title>
+    <b:Pages>306–314</b:Pages>
+    <b:Year>2020</b:Year>
+    <b:Publisher>ACM</b:Publisher>
+    <b:JournalName>Genetic and Evolutionary Computation Conference</b:JournalName>
+    <b:Author>
+      <b:Author>
+        <b:NameList>
+          <b:Person>
+            <b:Last>Dick</b:Last>
+            <b:First>Grant </b:First>
+          </b:Person>
+          <b:Person>
+            <b:Last>Owen</b:Last>
+            <b:First>Caitlin A. </b:First>
+          </b:Person>
+          <b:Person>
+            <b:Last> Whigham</b:Last>
+            <b:Middle>A.</b:Middle>
+            <b:First>Peter </b:First>
+          </b:Person>
+        </b:NameList>
+      </b:Author>
+    </b:Author>
+    <b:DOI>10.1145/3377930.3390237</b:DOI>
+    <b:RefOrder>26</b:RefOrder>
+  </b:Source>
 </b:Sources>
 </file>
 
 <file path=customXml/itemProps1.xml><?xml version="1.0" encoding="utf-8"?>
-<ds:datastoreItem xmlns:ds="http://schemas.openxmlformats.org/officeDocument/2006/customXml" ds:itemID="{9A5AF265-F193-4EBB-8371-203CAE05B550}">
+<ds:datastoreItem xmlns:ds="http://schemas.openxmlformats.org/officeDocument/2006/customXml" ds:itemID="{D18CBB63-CB7E-40E0-9D12-62AC6AB8878E}">
   <ds:schemaRefs>
     <ds:schemaRef ds:uri="http://schemas.openxmlformats.org/officeDocument/2006/bibliography"/>
   </ds:schemaRefs>

</xml_diff>

<commit_message>
75%: 18.04.2026 thesis backup
</commit_message>
<xml_diff>
--- a/Deniss Grabovskis 231RDB217.docx
+++ b/Deniss Grabovskis 231RDB217.docx
@@ -1305,6 +1305,7 @@
         <w:pStyle w:val="Teksts"/>
         <w:rPr>
           <w:strike/>
+          <w:lang w:val="en-GB"/>
         </w:rPr>
       </w:pPr>
     </w:p>
@@ -15726,9 +15727,6 @@
     <w:p>
       <w:pPr>
         <w:pStyle w:val="Teksts"/>
-        <w:rPr>
-          <w:lang w:val="ru-RU"/>
-        </w:rPr>
       </w:pPr>
       <w:r>
         <w:t xml:space="preserve">Rekurentās arhitektūrās (tostarp LSTM) nelinearitātes ir sastopamas šūnā (izmantojot sigmoīdu un (tanh)), bet regresijas izejā parasti tiek izmantota arī lineāra </w:t>
@@ -15982,8 +15980,6 @@
       </m:oMath>
       <w:r>
         <w:tab/>
-      </w:r>
-      <w:r>
         <w:t xml:space="preserve"> (</w:t>
       </w:r>
       <w:r>
@@ -16427,8 +16423,6 @@
       </m:oMath>
       <w:r>
         <w:tab/>
-      </w:r>
-      <w:r>
         <w:t xml:space="preserve"> (</w:t>
       </w:r>
       <w:r>
@@ -16897,7 +16891,7 @@
       <w:pPr>
         <w:pStyle w:val="Uzsk-aizzmes"/>
         <w:rPr>
-          <w:lang w:val="it-IT"/>
+          <w:lang w:val="ru-RU"/>
         </w:rPr>
       </w:pPr>
       <w:r>
@@ -16920,7 +16914,7 @@
       <w:pPr>
         <w:pStyle w:val="Uzsk-aizzmes"/>
         <w:rPr>
-          <w:lang w:val="it-IT"/>
+          <w:lang w:val="ru-RU"/>
         </w:rPr>
       </w:pPr>
       <w:r>
@@ -17173,8 +17167,6 @@
       </m:oMath>
       <w:r>
         <w:tab/>
-      </w:r>
-      <w:r>
         <w:t>(</w:t>
       </w:r>
       <w:r>
@@ -17489,16 +17481,7 @@
               <w:rPr>
                 <w:rFonts w:ascii="Cambria Math" w:hAnsi="Cambria Math"/>
               </w:rPr>
-              <m:t>-</m:t>
-            </m:r>
-            <m:r>
-              <m:rPr>
-                <m:sty m:val="p"/>
-              </m:rPr>
-              <w:rPr>
-                <w:rFonts w:ascii="Cambria Math" w:hAnsi="Cambria Math"/>
-              </w:rPr>
-              <m:t>μ</m:t>
+              <m:t>-μ</m:t>
             </m:r>
           </m:num>
           <m:den>
@@ -17638,9 +17621,6 @@
     <w:p>
       <w:pPr>
         <w:pStyle w:val="Teksts"/>
-        <w:rPr>
-          <w:lang w:val="ru-RU"/>
-        </w:rPr>
       </w:pPr>
       <w:r>
         <w:t xml:space="preserve">Standartnovirze </w:t>
@@ -17770,6 +17750,9 @@
       <w:pPr>
         <w:pStyle w:val="3-lm-virsraksts"/>
       </w:pPr>
+      <w:r>
+        <w:t xml:space="preserve">Standartizācija </w:t>
+      </w:r>
       <w:r>
         <w:t>LSTM realizācija</w:t>
       </w:r>
@@ -17836,13 +17819,7 @@
               <w:rPr>
                 <w:rFonts w:ascii="Cambria Math" w:hAnsi="Cambria Math"/>
               </w:rPr>
-              <m:t>x-</m:t>
-            </m:r>
-            <m:r>
-              <w:rPr>
-                <w:rFonts w:ascii="Cambria Math" w:hAnsi="Cambria Math"/>
-              </w:rPr>
-              <m:t>μ</m:t>
+              <m:t>x-μ</m:t>
             </m:r>
           </m:e>
         </m:d>
@@ -18035,31 +18012,189 @@
         <w:pStyle w:val="Teksts"/>
       </w:pPr>
       <w:r>
-        <w:t>Laika rindu literatūrā viena no sintētisko datu ģenerēšanas pieejām ietver trokšņa, piemēram, Gausa trokšņa, pievienošanu sākotnējam signālam, trokšņa skalu izvēloties, pamatojoties uz pazīmes/sērijas standartnovirzi (Hu et al., 2023). Šajā rakstā LSTM eksperimentā palielināšana netiek izmantota; iespējamos cauruļvada uzlabojumus, tostarp uzlabotu datu palielināšanu, var sīkāk apspriest 6. nodaļā (Hu et al., 2023).</w:t>
+        <w:t xml:space="preserve">Svarīgi piezīmēt, ka </w:t>
+      </w:r>
+      <w:r>
+        <w:t>l</w:t>
+      </w:r>
+      <w:r>
+        <w:t xml:space="preserve">aika rindu literatūrā viena no sintētisko datu ģenerēšanas pieejām ietver trokšņa, piemēram, Gausa trokšņa, pievienošanu sākotnējam </w:t>
+      </w:r>
+      <w:r>
+        <w:t>dat</w:t>
+      </w:r>
+      <w:r>
+        <w:t>ie</w:t>
+      </w:r>
+      <w:r>
+        <w:t>m</w:t>
+      </w:r>
+      <w:r>
+        <w:t xml:space="preserve">, trokšņa skalu izvēloties, pamatojoties </w:t>
+      </w:r>
+      <w:r>
+        <w:t xml:space="preserve">to pašu </w:t>
+      </w:r>
+      <w:r>
+        <w:t xml:space="preserve">standartnovirzi </w:t>
+      </w:r>
+      <w:sdt>
+        <w:sdtPr>
+          <w:id w:val="-693760068"/>
+          <w:citation/>
+        </w:sdtPr>
+        <w:sdtContent>
+          <w:r>
+            <w:fldChar w:fldCharType="begin"/>
+          </w:r>
+          <w:r>
+            <w:instrText xml:space="preserve"> CITATION Hu2023ContrastiveLearning \l 1062 </w:instrText>
+          </w:r>
+          <w:r>
+            <w:fldChar w:fldCharType="separate"/>
+          </w:r>
+          <w:r>
+            <w:rPr>
+              <w:noProof/>
+            </w:rPr>
+            <w:t>(Hu, Hu, Li, &amp; Du, 2023)</w:t>
+          </w:r>
+          <w:r>
+            <w:fldChar w:fldCharType="end"/>
+          </w:r>
+        </w:sdtContent>
+      </w:sdt>
+      <w:r>
+        <w:t xml:space="preserve">. </w:t>
+      </w:r>
+      <w:commentRangeStart w:id="130"/>
+      <w:r>
+        <w:t>To teorētiski varētu izmantot šī darba</w:t>
+      </w:r>
+      <w:commentRangeEnd w:id="130"/>
+      <w:r>
+        <w:rPr>
+          <w:rStyle w:val="CommentReference"/>
+          <w:sz w:val="24"/>
+          <w:szCs w:val="24"/>
+        </w:rPr>
+        <w:commentReference w:id="130"/>
+      </w:r>
+      <w:r>
+        <w:t>.</w:t>
+      </w:r>
+    </w:p>
+    <w:p>
+      <w:pPr>
+        <w:pStyle w:val="3-lm-virsraksts"/>
+        <w:rPr>
+          <w:lang w:val="ru-RU"/>
+        </w:rPr>
+      </w:pPr>
+      <w:commentRangeStart w:id="131"/>
+      <w:r>
+        <w:t xml:space="preserve">Rekurenti </w:t>
+      </w:r>
+      <w:commentRangeEnd w:id="131"/>
+      <w:r>
+        <w:rPr>
+          <w:rStyle w:val="CommentReference"/>
+          <w:sz w:val="24"/>
+          <w:szCs w:val="24"/>
+        </w:rPr>
+        <w:commentReference w:id="131"/>
+      </w:r>
+      <w:r>
+        <w:t>tīkli un LSTM atšķirība</w:t>
       </w:r>
     </w:p>
     <w:p>
       <w:pPr>
         <w:pStyle w:val="Teksts"/>
       </w:pPr>
-    </w:p>
-    <w:p>
-      <w:pPr>
-        <w:pStyle w:val="Teksts"/>
-      </w:pPr>
-    </w:p>
-    <w:p>
-      <w:pPr>
-        <w:pStyle w:val="Teksts"/>
-      </w:pPr>
-    </w:p>
-    <w:p>
-      <w:pPr>
-        <w:pStyle w:val="Teksts"/>
-        <w:tabs>
-          <w:tab w:val="left" w:pos="1134"/>
-        </w:tabs>
-      </w:pPr>
+      <w:r>
+        <w:t xml:space="preserve">Tipisks pilnībā savienots tīkls sagaida fiksētu ievades </w:t>
+      </w:r>
+      <w:r>
+        <w:t>ierzīmju</w:t>
+      </w:r>
+      <w:r>
+        <w:t xml:space="preserve"> skaitu. Rekurenti neironu tīkli (RNN) ievieš slēptu stāvokli </w:t>
+      </w:r>
+      <m:oMath>
+        <m:sSub>
+          <m:sSubPr>
+            <m:ctrlPr>
+              <w:rPr>
+                <w:rFonts w:ascii="Cambria Math" w:hAnsi="Cambria Math"/>
+              </w:rPr>
+            </m:ctrlPr>
+          </m:sSubPr>
+          <m:e>
+            <m:r>
+              <m:rPr>
+                <m:sty m:val="p"/>
+              </m:rPr>
+              <w:rPr>
+                <w:rFonts w:ascii="Cambria Math" w:hAnsi="Cambria Math"/>
+              </w:rPr>
+              <m:t>h</m:t>
+            </m:r>
+          </m:e>
+          <m:sub>
+            <m:r>
+              <m:rPr>
+                <m:sty m:val="p"/>
+              </m:rPr>
+              <w:rPr>
+                <w:rFonts w:ascii="Cambria Math" w:hAnsi="Cambria Math"/>
+              </w:rPr>
+              <m:t>t</m:t>
+            </m:r>
+          </m:sub>
+        </m:sSub>
+      </m:oMath>
+      <w:r>
+        <w:t xml:space="preserve">, kas tiek atjaunināts soli pa solim un pārnes informāciju no pagātnes uz nākotni. Tas ir </w:t>
+      </w:r>
+      <w:r>
+        <w:t>noderīgi izmantot priekš</w:t>
+      </w:r>
+      <w:r>
+        <w:t xml:space="preserve"> laika rindām, kur dati tiek parādīti kā secība laika gaitā</w:t>
+      </w:r>
+      <w:r>
+        <w:t xml:space="preserve"> </w:t>
+      </w:r>
+      <w:sdt>
+        <w:sdtPr>
+          <w:id w:val="176466709"/>
+          <w:citation/>
+        </w:sdtPr>
+        <w:sdtContent>
+          <w:r>
+            <w:fldChar w:fldCharType="begin"/>
+          </w:r>
+          <w:r>
+            <w:instrText xml:space="preserve"> CITATION Yunita2025NeuralNetworkArchitectures \l 1062 </w:instrText>
+          </w:r>
+          <w:r>
+            <w:fldChar w:fldCharType="separate"/>
+          </w:r>
+          <w:r>
+            <w:rPr>
+              <w:noProof/>
+            </w:rPr>
+            <w:t>(Yunita, u.c., 2025)</w:t>
+          </w:r>
+          <w:r>
+            <w:fldChar w:fldCharType="end"/>
+          </w:r>
+        </w:sdtContent>
+      </w:sdt>
+      <w:r>
+        <w:t xml:space="preserve">. </w:t>
+      </w:r>
     </w:p>
     <w:p>
       <w:pPr>
@@ -18070,16 +18205,957 @@
         </w:tabs>
         <w:ind w:firstLine="0"/>
       </w:pPr>
+      <w:r>
+        <w:tab/>
+      </w:r>
+      <m:oMath>
+        <m:sSub>
+          <m:sSubPr>
+            <m:ctrlPr>
+              <w:rPr>
+                <w:rFonts w:ascii="Cambria Math" w:hAnsi="Cambria Math"/>
+              </w:rPr>
+            </m:ctrlPr>
+          </m:sSubPr>
+          <m:e>
+            <m:r>
+              <w:rPr>
+                <w:rFonts w:ascii="Cambria Math" w:hAnsi="Cambria Math"/>
+              </w:rPr>
+              <m:t>h</m:t>
+            </m:r>
+          </m:e>
+          <m:sub>
+            <m:r>
+              <w:rPr>
+                <w:rFonts w:ascii="Cambria Math" w:hAnsi="Cambria Math"/>
+              </w:rPr>
+              <m:t>t</m:t>
+            </m:r>
+          </m:sub>
+        </m:sSub>
+        <m:r>
+          <m:rPr>
+            <m:sty m:val="p"/>
+          </m:rPr>
+          <w:rPr>
+            <w:rFonts w:ascii="Cambria Math" w:hAnsi="Cambria Math"/>
+          </w:rPr>
+          <m:t>=</m:t>
+        </m:r>
+        <m:r>
+          <w:rPr>
+            <w:rFonts w:ascii="Cambria Math" w:hAnsi="Cambria Math"/>
+          </w:rPr>
+          <m:t>f</m:t>
+        </m:r>
+        <m:d>
+          <m:dPr>
+            <m:ctrlPr>
+              <w:rPr>
+                <w:rFonts w:ascii="Cambria Math" w:hAnsi="Cambria Math"/>
+              </w:rPr>
+            </m:ctrlPr>
+          </m:dPr>
+          <m:e>
+            <m:sSub>
+              <m:sSubPr>
+                <m:ctrlPr>
+                  <w:rPr>
+                    <w:rFonts w:ascii="Cambria Math" w:hAnsi="Cambria Math"/>
+                  </w:rPr>
+                </m:ctrlPr>
+              </m:sSubPr>
+              <m:e>
+                <m:r>
+                  <w:rPr>
+                    <w:rFonts w:ascii="Cambria Math" w:hAnsi="Cambria Math"/>
+                  </w:rPr>
+                  <m:t>x</m:t>
+                </m:r>
+              </m:e>
+              <m:sub>
+                <m:r>
+                  <w:rPr>
+                    <w:rFonts w:ascii="Cambria Math" w:hAnsi="Cambria Math"/>
+                  </w:rPr>
+                  <m:t>t</m:t>
+                </m:r>
+              </m:sub>
+            </m:sSub>
+            <m:r>
+              <m:rPr>
+                <m:sty m:val="p"/>
+              </m:rPr>
+              <w:rPr>
+                <w:rFonts w:ascii="Cambria Math" w:hAnsi="Cambria Math"/>
+              </w:rPr>
+              <m:t>,</m:t>
+            </m:r>
+            <m:sSub>
+              <m:sSubPr>
+                <m:ctrlPr>
+                  <w:rPr>
+                    <w:rFonts w:ascii="Cambria Math" w:hAnsi="Cambria Math"/>
+                  </w:rPr>
+                </m:ctrlPr>
+              </m:sSubPr>
+              <m:e>
+                <m:r>
+                  <w:rPr>
+                    <w:rFonts w:ascii="Cambria Math" w:hAnsi="Cambria Math"/>
+                  </w:rPr>
+                  <m:t>h</m:t>
+                </m:r>
+              </m:e>
+              <m:sub>
+                <m:r>
+                  <w:rPr>
+                    <w:rFonts w:ascii="Cambria Math" w:hAnsi="Cambria Math"/>
+                  </w:rPr>
+                  <m:t>t</m:t>
+                </m:r>
+                <m:r>
+                  <m:rPr>
+                    <m:sty m:val="p"/>
+                  </m:rPr>
+                  <w:rPr>
+                    <w:rFonts w:ascii="Cambria Math" w:hAnsi="Cambria Math"/>
+                  </w:rPr>
+                  <m:t>-1</m:t>
+                </m:r>
+              </m:sub>
+            </m:sSub>
+          </m:e>
+        </m:d>
+        <m:r>
+          <m:rPr>
+            <m:sty m:val="p"/>
+          </m:rPr>
+          <w:rPr>
+            <w:rFonts w:ascii="Cambria Math" w:hAnsi="Cambria Math"/>
+          </w:rPr>
+          <m:t>,  </m:t>
+        </m:r>
+        <m:acc>
+          <m:accPr>
+            <m:ctrlPr>
+              <w:rPr>
+                <w:rFonts w:ascii="Cambria Math" w:hAnsi="Cambria Math"/>
+              </w:rPr>
+            </m:ctrlPr>
+          </m:accPr>
+          <m:e>
+            <m:sSub>
+              <m:sSubPr>
+                <m:ctrlPr>
+                  <w:rPr>
+                    <w:rFonts w:ascii="Cambria Math" w:hAnsi="Cambria Math"/>
+                  </w:rPr>
+                </m:ctrlPr>
+              </m:sSubPr>
+              <m:e>
+                <m:r>
+                  <w:rPr>
+                    <w:rFonts w:ascii="Cambria Math" w:hAnsi="Cambria Math"/>
+                  </w:rPr>
+                  <m:t>y</m:t>
+                </m:r>
+              </m:e>
+              <m:sub>
+                <m:r>
+                  <w:rPr>
+                    <w:rFonts w:ascii="Cambria Math" w:hAnsi="Cambria Math"/>
+                  </w:rPr>
+                  <m:t>t</m:t>
+                </m:r>
+              </m:sub>
+            </m:sSub>
+          </m:e>
+        </m:acc>
+        <m:r>
+          <m:rPr>
+            <m:sty m:val="p"/>
+          </m:rPr>
+          <w:rPr>
+            <w:rFonts w:ascii="Cambria Math" w:hAnsi="Cambria Math"/>
+          </w:rPr>
+          <m:t>=</m:t>
+        </m:r>
+        <m:r>
+          <w:rPr>
+            <w:rFonts w:ascii="Cambria Math" w:hAnsi="Cambria Math"/>
+          </w:rPr>
+          <m:t>g</m:t>
+        </m:r>
+        <m:d>
+          <m:dPr>
+            <m:ctrlPr>
+              <w:rPr>
+                <w:rFonts w:ascii="Cambria Math" w:hAnsi="Cambria Math"/>
+              </w:rPr>
+            </m:ctrlPr>
+          </m:dPr>
+          <m:e>
+            <m:sSub>
+              <m:sSubPr>
+                <m:ctrlPr>
+                  <w:rPr>
+                    <w:rFonts w:ascii="Cambria Math" w:hAnsi="Cambria Math"/>
+                  </w:rPr>
+                </m:ctrlPr>
+              </m:sSubPr>
+              <m:e>
+                <m:r>
+                  <w:rPr>
+                    <w:rFonts w:ascii="Cambria Math" w:hAnsi="Cambria Math"/>
+                  </w:rPr>
+                  <m:t>h</m:t>
+                </m:r>
+              </m:e>
+              <m:sub>
+                <m:r>
+                  <w:rPr>
+                    <w:rFonts w:ascii="Cambria Math" w:hAnsi="Cambria Math"/>
+                  </w:rPr>
+                  <m:t>t</m:t>
+                </m:r>
+              </m:sub>
+            </m:sSub>
+          </m:e>
+        </m:d>
+      </m:oMath>
+      <w:r>
+        <w:tab/>
+        <w:t>(</w:t>
+      </w:r>
+      <w:r>
+        <w:fldChar w:fldCharType="begin"/>
+      </w:r>
+      <w:r>
+        <w:instrText xml:space="preserve"> STYLEREF  \s 1-līm-numurēts-virsraksts </w:instrText>
+      </w:r>
+      <w:r>
+        <w:fldChar w:fldCharType="separate"/>
+      </w:r>
+      <w:r>
+        <w:rPr>
+          <w:noProof/>
+        </w:rPr>
+        <w:t>5</w:t>
+      </w:r>
+      <w:r>
+        <w:fldChar w:fldCharType="end"/>
+      </w:r>
+      <w:r>
+        <w:t>.</w:t>
+      </w:r>
+      <w:r>
+        <w:fldChar w:fldCharType="begin"/>
+      </w:r>
+      <w:r>
+        <w:instrText xml:space="preserve"> SEQ Vienādojums \* ARABIC \s 1 </w:instrText>
+      </w:r>
+      <w:r>
+        <w:fldChar w:fldCharType="separate"/>
+      </w:r>
+      <w:r>
+        <w:rPr>
+          <w:noProof/>
+        </w:rPr>
+        <w:t>10</w:t>
+      </w:r>
+      <w:r>
+        <w:fldChar w:fldCharType="end"/>
+      </w:r>
+      <w:r>
+        <w:t>)</w:t>
+      </w:r>
     </w:p>
     <w:p>
       <w:pPr>
         <w:pStyle w:val="Teksts"/>
       </w:pPr>
+      <w:r>
+        <w:t>Vienkāršu RNN trūkums ir tāds, ka tiem ir grūtības apgūt liela attāluma atkarības izzūdošo gradientu dēļ atpakaļizplatīšanās laikā (</w:t>
+      </w:r>
+      <w:r>
+        <w:rPr>
+          <w:i/>
+          <w:iCs/>
+        </w:rPr>
+        <w:t>backpropagation through time</w:t>
+      </w:r>
+      <w:r>
+        <w:t>)</w:t>
+      </w:r>
+      <w:r>
+        <w:t xml:space="preserve"> </w:t>
+      </w:r>
+      <w:sdt>
+        <w:sdtPr>
+          <w:id w:val="1162900398"/>
+          <w:citation/>
+        </w:sdtPr>
+        <w:sdtContent>
+          <w:r>
+            <w:fldChar w:fldCharType="begin"/>
+          </w:r>
+          <w:r>
+            <w:instrText xml:space="preserve"> CITATION Filali2022SupplyChainLSTM \l 1062 </w:instrText>
+          </w:r>
+          <w:r>
+            <w:fldChar w:fldCharType="separate"/>
+          </w:r>
+          <w:r>
+            <w:rPr>
+              <w:noProof/>
+            </w:rPr>
+            <w:t>(Filali, u.c., 2022)</w:t>
+          </w:r>
+          <w:r>
+            <w:fldChar w:fldCharType="end"/>
+          </w:r>
+        </w:sdtContent>
+      </w:sdt>
+      <w:r>
+        <w:t>.</w:t>
+      </w:r>
+      <w:r>
+        <w:t xml:space="preserve"> </w:t>
+      </w:r>
+      <w:r>
+        <w:t xml:space="preserve">Līdz ar to pastāv </w:t>
+      </w:r>
+      <w:r>
+        <w:t>RNN attīstība</w:t>
+      </w:r>
+      <w:r>
+        <w:t xml:space="preserve"> saukta par </w:t>
+      </w:r>
+      <w:r>
+        <w:t>LSTM (</w:t>
+      </w:r>
+      <w:r>
+        <w:rPr>
+          <w:i/>
+          <w:iCs/>
+        </w:rPr>
+        <w:t>Long Short-Term Memory</w:t>
+      </w:r>
+      <w:r>
+        <w:t xml:space="preserve"> jeb īstermiņa atmiņa), kur šūnā tiek ieviests atsevišķs "atmiņas stāvoklis" </w:t>
+      </w:r>
+      <m:oMath>
+        <m:sSub>
+          <m:sSubPr>
+            <m:ctrlPr>
+              <w:rPr>
+                <w:rFonts w:ascii="Cambria Math" w:hAnsi="Cambria Math"/>
+              </w:rPr>
+            </m:ctrlPr>
+          </m:sSubPr>
+          <m:e>
+            <m:r>
+              <w:rPr>
+                <w:rFonts w:ascii="Cambria Math" w:hAnsi="Cambria Math"/>
+              </w:rPr>
+              <m:t>c</m:t>
+            </m:r>
+          </m:e>
+          <m:sub>
+            <m:r>
+              <w:rPr>
+                <w:rFonts w:ascii="Cambria Math" w:hAnsi="Cambria Math"/>
+              </w:rPr>
+              <m:t>t</m:t>
+            </m:r>
+          </m:sub>
+        </m:sSub>
+      </m:oMath>
+      <w:r>
+        <w:t xml:space="preserve"> un "vārtu" (</w:t>
+      </w:r>
+      <w:r>
+        <w:rPr>
+          <w:i/>
+          <w:iCs/>
+        </w:rPr>
+        <w:t>gates</w:t>
+      </w:r>
+      <w:r>
+        <w:t xml:space="preserve">) kopums. Šie vārti kontrolē, kas tiek aizmirsts, kas tiek ierakstīts un kas tiek izvadīts </w:t>
+      </w:r>
+      <w:sdt>
+        <w:sdtPr>
+          <w:id w:val="-1421486689"/>
+          <w:citation/>
+        </w:sdtPr>
+        <w:sdtContent>
+          <w:r>
+            <w:fldChar w:fldCharType="begin"/>
+          </w:r>
+          <w:r>
+            <w:instrText xml:space="preserve"> CITATION Yunita2025NeuralNetworkArchitectures \l 1062 </w:instrText>
+          </w:r>
+          <w:r>
+            <w:fldChar w:fldCharType="separate"/>
+          </w:r>
+          <w:r>
+            <w:rPr>
+              <w:noProof/>
+            </w:rPr>
+            <w:t>(Yunita, u.c., 2025)</w:t>
+          </w:r>
+          <w:r>
+            <w:fldChar w:fldCharType="end"/>
+          </w:r>
+        </w:sdtContent>
+      </w:sdt>
+      <w:r>
+        <w:t xml:space="preserve"> </w:t>
+      </w:r>
+      <w:sdt>
+        <w:sdtPr>
+          <w:id w:val="481122510"/>
+          <w:citation/>
+        </w:sdtPr>
+        <w:sdtContent>
+          <w:r>
+            <w:fldChar w:fldCharType="begin"/>
+          </w:r>
+          <w:r>
+            <w:instrText xml:space="preserve"> CITATION Filali2022SupplyChainLSTM \l 1062 </w:instrText>
+          </w:r>
+          <w:r>
+            <w:fldChar w:fldCharType="separate"/>
+          </w:r>
+          <w:r>
+            <w:rPr>
+              <w:noProof/>
+            </w:rPr>
+            <w:t>(Filali, u.c., 2022)</w:t>
+          </w:r>
+          <w:r>
+            <w:fldChar w:fldCharType="end"/>
+          </w:r>
+        </w:sdtContent>
+      </w:sdt>
+      <w:r>
+        <w:t>.</w:t>
+      </w:r>
+      <w:r>
+        <w:t xml:space="preserve"> Līdz ar to LSTM ir raksturīga ar:</w:t>
+      </w:r>
     </w:p>
     <w:p>
       <w:pPr>
         <w:pStyle w:val="Teksts"/>
       </w:pPr>
+      <w:r>
+        <w:rPr>
+          <w:i/>
+          <w:iCs/>
+        </w:rPr>
+        <w:t>forget gate</w:t>
+      </w:r>
+      <w:r>
+        <w:t xml:space="preserve"> </w:t>
+      </w:r>
+      <m:oMath>
+        <m:sSub>
+          <m:sSubPr>
+            <m:ctrlPr>
+              <w:rPr>
+                <w:rFonts w:ascii="Cambria Math" w:hAnsi="Cambria Math"/>
+              </w:rPr>
+            </m:ctrlPr>
+          </m:sSubPr>
+          <m:e>
+            <m:r>
+              <m:rPr>
+                <m:sty m:val="p"/>
+              </m:rPr>
+              <w:rPr>
+                <w:rFonts w:ascii="Cambria Math" w:hAnsi="Cambria Math"/>
+              </w:rPr>
+              <m:t>f</m:t>
+            </m:r>
+          </m:e>
+          <m:sub>
+            <m:r>
+              <m:rPr>
+                <m:sty m:val="p"/>
+              </m:rPr>
+              <w:rPr>
+                <w:rFonts w:ascii="Cambria Math" w:hAnsi="Cambria Math"/>
+              </w:rPr>
+              <m:t>t</m:t>
+            </m:r>
+          </m:sub>
+        </m:sSub>
+      </m:oMath>
+      <w:r>
+        <w:t xml:space="preserve"> — cik daudz informācijas no </w:t>
+      </w:r>
+      <m:oMath>
+        <m:sSub>
+          <m:sSubPr>
+            <m:ctrlPr>
+              <w:rPr>
+                <w:rFonts w:ascii="Cambria Math" w:hAnsi="Cambria Math"/>
+              </w:rPr>
+            </m:ctrlPr>
+          </m:sSubPr>
+          <m:e>
+            <m:r>
+              <m:rPr>
+                <m:sty m:val="p"/>
+              </m:rPr>
+              <w:rPr>
+                <w:rFonts w:ascii="Cambria Math" w:hAnsi="Cambria Math"/>
+              </w:rPr>
+              <m:t>c</m:t>
+            </m:r>
+          </m:e>
+          <m:sub>
+            <m:r>
+              <m:rPr>
+                <m:sty m:val="p"/>
+              </m:rPr>
+              <w:rPr>
+                <w:rFonts w:ascii="Cambria Math" w:hAnsi="Cambria Math"/>
+              </w:rPr>
+              <m:t>t-1</m:t>
+            </m:r>
+          </m:sub>
+        </m:sSub>
+      </m:oMath>
+      <w:r>
+        <w:t xml:space="preserve"> paturēt, </w:t>
+      </w:r>
+    </w:p>
+    <w:p>
+      <w:pPr>
+        <w:pStyle w:val="Teksts"/>
+      </w:pPr>
+      <w:r>
+        <w:rPr>
+          <w:i/>
+          <w:iCs/>
+        </w:rPr>
+        <w:t>input gate</w:t>
+      </w:r>
+      <w:r>
+        <w:t xml:space="preserve"> </w:t>
+      </w:r>
+      <m:oMath>
+        <m:r>
+          <m:rPr>
+            <m:sty m:val="p"/>
+          </m:rPr>
+          <w:rPr>
+            <w:rFonts w:ascii="Cambria Math" w:hAnsi="Cambria Math"/>
+          </w:rPr>
+          <m:t>i_t</m:t>
+        </m:r>
+      </m:oMath>
+      <w:r>
+        <w:t xml:space="preserve"> — cik daudz jaunas informācijas ierakstīt, </w:t>
+      </w:r>
+    </w:p>
+    <w:p>
+      <w:pPr>
+        <w:pStyle w:val="Teksts"/>
+      </w:pPr>
+      <w:r>
+        <w:rPr>
+          <w:i/>
+          <w:iCs/>
+        </w:rPr>
+        <w:t>candidate</w:t>
+      </w:r>
+      <w:r>
+        <w:t xml:space="preserve"> </w:t>
+      </w:r>
+      <m:oMath>
+        <m:acc>
+          <m:accPr>
+            <m:chr m:val="̃"/>
+            <m:ctrlPr>
+              <w:rPr>
+                <w:rFonts w:ascii="Cambria Math" w:hAnsi="Cambria Math"/>
+              </w:rPr>
+            </m:ctrlPr>
+          </m:accPr>
+          <m:e>
+            <m:sSub>
+              <m:sSubPr>
+                <m:ctrlPr>
+                  <w:rPr>
+                    <w:rFonts w:ascii="Cambria Math" w:hAnsi="Cambria Math"/>
+                  </w:rPr>
+                </m:ctrlPr>
+              </m:sSubPr>
+              <m:e>
+                <m:r>
+                  <m:rPr>
+                    <m:sty m:val="p"/>
+                  </m:rPr>
+                  <w:rPr>
+                    <w:rFonts w:ascii="Cambria Math" w:hAnsi="Cambria Math"/>
+                  </w:rPr>
+                  <m:t>c</m:t>
+                </m:r>
+              </m:e>
+              <m:sub>
+                <m:r>
+                  <m:rPr>
+                    <m:sty m:val="p"/>
+                  </m:rPr>
+                  <w:rPr>
+                    <w:rFonts w:ascii="Cambria Math" w:hAnsi="Cambria Math"/>
+                  </w:rPr>
+                  <m:t>t</m:t>
+                </m:r>
+              </m:sub>
+            </m:sSub>
+          </m:e>
+        </m:acc>
+      </m:oMath>
+      <w:r>
+        <w:t xml:space="preserve"> — kandidāti ierakstīšanai atmiņā, </w:t>
+      </w:r>
+    </w:p>
+    <w:p>
+      <w:pPr>
+        <w:pStyle w:val="Teksts"/>
+      </w:pPr>
+      <w:r>
+        <w:rPr>
+          <w:i/>
+          <w:iCs/>
+        </w:rPr>
+        <w:t>output gate</w:t>
+      </w:r>
+      <w:r>
+        <w:t xml:space="preserve"> </w:t>
+      </w:r>
+      <m:oMath>
+        <m:sSub>
+          <m:sSubPr>
+            <m:ctrlPr>
+              <w:rPr>
+                <w:rFonts w:ascii="Cambria Math" w:hAnsi="Cambria Math"/>
+              </w:rPr>
+            </m:ctrlPr>
+          </m:sSubPr>
+          <m:e>
+            <m:r>
+              <m:rPr>
+                <m:sty m:val="p"/>
+              </m:rPr>
+              <w:rPr>
+                <w:rFonts w:ascii="Cambria Math" w:hAnsi="Cambria Math"/>
+              </w:rPr>
+              <m:t>o</m:t>
+            </m:r>
+          </m:e>
+          <m:sub>
+            <m:r>
+              <m:rPr>
+                <m:sty m:val="p"/>
+              </m:rPr>
+              <w:rPr>
+                <w:rFonts w:ascii="Cambria Math" w:hAnsi="Cambria Math"/>
+              </w:rPr>
+              <m:t>t</m:t>
+            </m:r>
+          </m:sub>
+        </m:sSub>
+      </m:oMath>
+      <w:r>
+        <w:t xml:space="preserve"> — kāda atmiņas stāvokļa daļa tiks izvadīta </w:t>
+      </w:r>
+      <m:oMath>
+        <m:r>
+          <m:rPr>
+            <m:sty m:val="p"/>
+          </m:rPr>
+          <w:rPr>
+            <w:rFonts w:ascii="Cambria Math" w:hAnsi="Cambria Math"/>
+          </w:rPr>
+          <m:t>h_t</m:t>
+        </m:r>
+      </m:oMath>
+      <w:r>
+        <w:t>.</w:t>
+      </w:r>
+    </w:p>
+    <w:p>
+      <w:pPr>
+        <w:pStyle w:val="Teksts"/>
+      </w:pPr>
+      <w:r>
+        <w:t>LSTM galvenā iezīme ir atmiņas pārvaldības mehānismu apmācība, kas var labāk apmācīt secību modelēšanu nekā RNN</w:t>
+      </w:r>
+      <w:r>
+        <w:t xml:space="preserve"> </w:t>
+      </w:r>
+      <w:sdt>
+        <w:sdtPr>
+          <w:id w:val="-1483689791"/>
+          <w:citation/>
+        </w:sdtPr>
+        <w:sdtContent>
+          <w:r>
+            <w:fldChar w:fldCharType="begin"/>
+          </w:r>
+          <w:r>
+            <w:instrText xml:space="preserve"> CITATION Filali2022SupplyChainLSTM \l 1062 </w:instrText>
+          </w:r>
+          <w:r>
+            <w:fldChar w:fldCharType="separate"/>
+          </w:r>
+          <w:r>
+            <w:rPr>
+              <w:noProof/>
+            </w:rPr>
+            <w:t>(Filali, u.c., 2022)</w:t>
+          </w:r>
+          <w:r>
+            <w:fldChar w:fldCharType="end"/>
+          </w:r>
+        </w:sdtContent>
+      </w:sdt>
+      <w:r>
+        <w:t>.</w:t>
+      </w:r>
+      <w:r>
+        <w:t xml:space="preserve"> </w:t>
+      </w:r>
+      <w:r>
+        <w:t xml:space="preserve">Prognozēšanas uzdevumā ikmēneša pārdošanas apjomus ietekmē nesenie novērojumi, nesenā dinamika (pieaugums/samazinājums) un produktu pieejamība (piegādes). Izmantojot LSTM, kā ievadi var ievadīt vērtību un pazīmju secību, kas ļauj modelim, prognozējot nākamo </w:t>
+      </w:r>
+      <w:r>
+        <w:lastRenderedPageBreak/>
+        <w:t>mēnešu, ņemt vērā vairāku iepriekšējo mēnešu kontekstu</w:t>
+      </w:r>
+      <w:r>
+        <w:t xml:space="preserve"> </w:t>
+      </w:r>
+      <w:sdt>
+        <w:sdtPr>
+          <w:id w:val="170764282"/>
+          <w:citation/>
+        </w:sdtPr>
+        <w:sdtContent>
+          <w:r>
+            <w:fldChar w:fldCharType="begin"/>
+          </w:r>
+          <w:r>
+            <w:instrText xml:space="preserve"> CITATION Yunita2025NeuralNetworkArchitectures \l 1062 </w:instrText>
+          </w:r>
+          <w:r>
+            <w:fldChar w:fldCharType="separate"/>
+          </w:r>
+          <w:r>
+            <w:rPr>
+              <w:noProof/>
+            </w:rPr>
+            <w:t>(Yunita, u.c., 2025)</w:t>
+          </w:r>
+          <w:r>
+            <w:fldChar w:fldCharType="end"/>
+          </w:r>
+        </w:sdtContent>
+      </w:sdt>
+      <w:r>
+        <w:t xml:space="preserve"> </w:t>
+      </w:r>
+      <w:sdt>
+        <w:sdtPr>
+          <w:id w:val="1968927123"/>
+          <w:citation/>
+        </w:sdtPr>
+        <w:sdtContent>
+          <w:r>
+            <w:fldChar w:fldCharType="begin"/>
+          </w:r>
+          <w:r>
+            <w:instrText xml:space="preserve"> CITATION Filali2022SupplyChainLSTM \l 1062 </w:instrText>
+          </w:r>
+          <w:r>
+            <w:fldChar w:fldCharType="separate"/>
+          </w:r>
+          <w:r>
+            <w:rPr>
+              <w:noProof/>
+            </w:rPr>
+            <w:t>(Filali, u.c., 2022)</w:t>
+          </w:r>
+          <w:r>
+            <w:fldChar w:fldCharType="end"/>
+          </w:r>
+        </w:sdtContent>
+      </w:sdt>
+      <w:r>
+        <w:t>.</w:t>
+      </w:r>
+    </w:p>
+    <w:p>
+      <w:pPr>
+        <w:pStyle w:val="3-lm-virsraksts"/>
+      </w:pPr>
+      <w:commentRangeStart w:id="132"/>
+      <w:commentRangeStart w:id="133"/>
+      <w:r>
+        <w:t xml:space="preserve">Datu </w:t>
+      </w:r>
+      <w:commentRangeEnd w:id="133"/>
+      <w:r>
+        <w:rPr>
+          <w:rStyle w:val="CommentReference"/>
+          <w:sz w:val="24"/>
+          <w:szCs w:val="24"/>
+        </w:rPr>
+        <w:commentReference w:id="133"/>
+      </w:r>
+      <w:r>
+        <w:t>sagatavošana</w:t>
+      </w:r>
+      <w:commentRangeEnd w:id="132"/>
+      <w:r>
+        <w:rPr>
+          <w:rStyle w:val="CommentReference"/>
+          <w:sz w:val="24"/>
+          <w:szCs w:val="24"/>
+        </w:rPr>
+        <w:commentReference w:id="132"/>
+      </w:r>
+    </w:p>
+    <w:p>
+      <w:pPr>
+        <w:pStyle w:val="Teksts"/>
+        <w:rPr>
+          <w:lang w:val="ru-RU"/>
+        </w:rPr>
+      </w:pPr>
+      <w:r>
+        <w:t>Lai izmantotu LSTM kā "nākamā mēneša prognozes" modeli, sākotnējā secība tiek pārveidota par (X, y) pāru kopu, izmantojot slīdošo logu</w:t>
+      </w:r>
+      <w:r>
+        <w:t xml:space="preserve"> </w:t>
+      </w:r>
+      <w:r>
+        <w:t>(</w:t>
+      </w:r>
+      <w:r>
+        <w:rPr>
+          <w:i/>
+          <w:iCs/>
+        </w:rPr>
+        <w:t>sliding window</w:t>
+      </w:r>
+      <w:r>
+        <w:t>)</w:t>
+      </w:r>
+      <w:r>
+        <w:t xml:space="preserve">. Kodā šī ir funkcija </w:t>
+      </w:r>
+      <w:r>
+        <w:rPr>
+          <w:i/>
+          <w:iCs/>
+        </w:rPr>
+        <w:t>build_samples</w:t>
+      </w:r>
+      <w:r>
+        <w:t xml:space="preserve">, kas: </w:t>
+      </w:r>
+    </w:p>
+    <w:p>
+      <w:pPr>
+        <w:pStyle w:val="Uzsk-cipars-ar-punktu"/>
+        <w:numPr>
+          <w:ilvl w:val="0"/>
+          <w:numId w:val="49"/>
+        </w:numPr>
+        <w:rPr>
+          <w:lang w:val="en-GB"/>
+        </w:rPr>
+      </w:pPr>
+      <w:r>
+        <w:t xml:space="preserve">katrai grupai ņem apmācības perioda </w:t>
+      </w:r>
+      <w:r>
+        <w:rPr>
+          <w:i/>
+          <w:iCs/>
+        </w:rPr>
+        <w:t>train_start:train_end</w:t>
+      </w:r>
+      <w:r>
+        <w:t xml:space="preserve"> segmentu, </w:t>
+      </w:r>
+    </w:p>
+    <w:p>
+      <w:pPr>
+        <w:pStyle w:val="Uzsk-cipars-ar-punktu"/>
+        <w:numPr>
+          <w:ilvl w:val="0"/>
+          <w:numId w:val="49"/>
+        </w:numPr>
+      </w:pPr>
+      <w:r>
+        <w:t xml:space="preserve">izveido logus ar garumu </w:t>
+      </w:r>
+      <w:r>
+        <w:rPr>
+          <w:i/>
+          <w:iCs/>
+        </w:rPr>
+        <w:t>TIMESTEP_COUNT</w:t>
+      </w:r>
+      <w:r>
+        <w:rPr>
+          <w:i/>
+          <w:iCs/>
+        </w:rPr>
+        <w:t>=3</w:t>
+      </w:r>
+      <w:r>
+        <w:t xml:space="preserve"> </w:t>
+      </w:r>
+      <w:r>
+        <w:t>(fiksēts realizācijā)</w:t>
+      </w:r>
+      <w:r>
+        <w:t xml:space="preserve">, </w:t>
+      </w:r>
+    </w:p>
+    <w:p>
+      <w:pPr>
+        <w:pStyle w:val="Uzsk-cipars-ar-punktu"/>
+        <w:numPr>
+          <w:ilvl w:val="0"/>
+          <w:numId w:val="49"/>
+        </w:numPr>
+      </w:pPr>
+      <w:r>
+        <w:t xml:space="preserve">katram logam piešķir mērķa vērtību — nākamā mēneša pārdošanas apjomus. </w:t>
+      </w:r>
+    </w:p>
+    <w:p>
+      <w:pPr>
+        <w:pStyle w:val="Teksts"/>
+        <w:rPr>
+          <w:lang w:val="ru-RU"/>
+        </w:rPr>
+      </w:pPr>
+      <w:r>
+        <w:t>Tas ir, ja loga garums ir 3 mēneši, tad apmācība tiek balstīta uz šādu shēmu:</w:t>
+      </w:r>
     </w:p>
     <w:p>
       <w:pPr>
@@ -18090,6 +19166,877 @@
         </w:tabs>
         <w:ind w:firstLine="0"/>
       </w:pPr>
+      <w:r>
+        <w:rPr>
+          <w:lang w:val="ru-RU"/>
+        </w:rPr>
+        <w:tab/>
+      </w:r>
+      <m:oMath>
+        <m:r>
+          <w:rPr>
+            <w:rFonts w:ascii="Cambria Math" w:hAnsi="Cambria Math"/>
+            <w:lang w:val="en-GB"/>
+          </w:rPr>
+          <m:t>X=</m:t>
+        </m:r>
+        <m:d>
+          <m:dPr>
+            <m:begChr m:val="["/>
+            <m:endChr m:val="]"/>
+            <m:ctrlPr>
+              <w:rPr>
+                <w:rFonts w:ascii="Cambria Math" w:hAnsi="Cambria Math"/>
+                <w:i/>
+                <w:lang w:val="en-GB"/>
+              </w:rPr>
+            </m:ctrlPr>
+          </m:dPr>
+          <m:e>
+            <m:r>
+              <w:rPr>
+                <w:rFonts w:ascii="Cambria Math" w:hAnsi="Cambria Math"/>
+                <w:lang w:val="en-GB"/>
+              </w:rPr>
+              <m:t>t-2,</m:t>
+            </m:r>
+            <m:r>
+              <w:rPr>
+                <w:rFonts w:ascii="Cambria Math" w:hAnsi="Cambria Math"/>
+                <w:lang w:val="en-GB"/>
+              </w:rPr>
+              <m:t xml:space="preserve">  </m:t>
+            </m:r>
+            <m:r>
+              <w:rPr>
+                <w:rFonts w:ascii="Cambria Math" w:hAnsi="Cambria Math"/>
+                <w:lang w:val="en-GB"/>
+              </w:rPr>
+              <m:t>t-1,</m:t>
+            </m:r>
+            <m:r>
+              <w:rPr>
+                <w:rFonts w:ascii="Cambria Math" w:hAnsi="Cambria Math"/>
+                <w:lang w:val="en-GB"/>
+              </w:rPr>
+              <m:t xml:space="preserve">  </m:t>
+            </m:r>
+            <m:r>
+              <w:rPr>
+                <w:rFonts w:ascii="Cambria Math" w:hAnsi="Cambria Math"/>
+                <w:lang w:val="en-GB"/>
+              </w:rPr>
+              <m:t>t</m:t>
+            </m:r>
+          </m:e>
+        </m:d>
+        <m:r>
+          <w:rPr>
+            <w:rFonts w:ascii="Cambria Math" w:hAnsi="Cambria Math"/>
+            <w:lang w:val="en-GB"/>
+          </w:rPr>
+          <m:t>,</m:t>
+        </m:r>
+        <m:r>
+          <m:rPr>
+            <m:sty m:val="p"/>
+          </m:rPr>
+          <w:rPr>
+            <w:rFonts w:ascii="Cambria Math" w:hAnsi="Cambria Math"/>
+            <w:lang w:val="en-GB"/>
+          </w:rPr>
+          <m:t> </m:t>
+        </m:r>
+        <m:r>
+          <w:rPr>
+            <w:rFonts w:ascii="Cambria Math" w:hAnsi="Cambria Math"/>
+            <w:lang w:val="en-GB"/>
+          </w:rPr>
+          <m:t>y=</m:t>
+        </m:r>
+        <m:d>
+          <m:dPr>
+            <m:begChr m:val="["/>
+            <m:endChr m:val="]"/>
+            <m:ctrlPr>
+              <w:rPr>
+                <w:rFonts w:ascii="Cambria Math" w:hAnsi="Cambria Math"/>
+                <w:i/>
+                <w:lang w:val="en-GB"/>
+              </w:rPr>
+            </m:ctrlPr>
+          </m:dPr>
+          <m:e>
+            <m:r>
+              <w:rPr>
+                <w:rFonts w:ascii="Cambria Math" w:hAnsi="Cambria Math"/>
+                <w:lang w:val="en-GB"/>
+              </w:rPr>
+              <m:t>t+1</m:t>
+            </m:r>
+          </m:e>
+        </m:d>
+      </m:oMath>
+      <w:r>
+        <w:tab/>
+        <w:t>(</w:t>
+      </w:r>
+      <w:r>
+        <w:fldChar w:fldCharType="begin"/>
+      </w:r>
+      <w:r>
+        <w:instrText xml:space="preserve"> STYLEREF  \s 1-līm-numurēts-virsraksts </w:instrText>
+      </w:r>
+      <w:r>
+        <w:fldChar w:fldCharType="separate"/>
+      </w:r>
+      <w:r>
+        <w:rPr>
+          <w:noProof/>
+        </w:rPr>
+        <w:t>5</w:t>
+      </w:r>
+      <w:r>
+        <w:fldChar w:fldCharType="end"/>
+      </w:r>
+      <w:r>
+        <w:t>.</w:t>
+      </w:r>
+      <w:r>
+        <w:fldChar w:fldCharType="begin"/>
+      </w:r>
+      <w:r>
+        <w:instrText xml:space="preserve"> SEQ Vienādojums \* ARABIC \s 1 </w:instrText>
+      </w:r>
+      <w:r>
+        <w:fldChar w:fldCharType="separate"/>
+      </w:r>
+      <w:r>
+        <w:rPr>
+          <w:noProof/>
+        </w:rPr>
+        <w:t>11</w:t>
+      </w:r>
+      <w:r>
+        <w:fldChar w:fldCharType="end"/>
+      </w:r>
+      <w:r>
+        <w:t>)</w:t>
+      </w:r>
+    </w:p>
+    <w:p>
+      <w:pPr>
+        <w:pStyle w:val="Teksts"/>
+      </w:pPr>
+      <w:r>
+        <w:t xml:space="preserve">LSTM ievade nav "trīs </w:t>
+      </w:r>
+      <w:r>
+        <w:t>ie</w:t>
+      </w:r>
+      <w:r>
+        <w:t xml:space="preserve">zīmes", bet gan "trīs laika soļi", un katrs solis satur skaitlisku </w:t>
+      </w:r>
+      <w:r>
+        <w:t>ie</w:t>
+      </w:r>
+      <w:r>
+        <w:t xml:space="preserve">zīmju kopu. </w:t>
+      </w:r>
+      <w:r>
+        <w:rPr>
+          <w:i/>
+          <w:iCs/>
+        </w:rPr>
+        <w:t>Tenzoru</w:t>
+      </w:r>
+      <w:r>
+        <w:t xml:space="preserve"> izteiksmē ievades dati</w:t>
+      </w:r>
+      <w:r>
+        <w:t xml:space="preserve"> </w:t>
+      </w:r>
+      <w:r>
+        <w:t>izskatās</w:t>
+      </w:r>
+      <w:r>
+        <w:t xml:space="preserve"> kā (batch, timestep, feature).</w:t>
+      </w:r>
+      <w:r>
+        <w:t xml:space="preserve"> </w:t>
+      </w:r>
+      <w:r>
+        <w:t xml:space="preserve">Tas ir tieši atspoguļots modeļa LSTM slāņa parametrā </w:t>
+      </w:r>
+      <w:r>
+        <w:rPr>
+          <w:i/>
+          <w:iCs/>
+        </w:rPr>
+        <w:t>batch_first=True</w:t>
+      </w:r>
+      <w:r>
+        <w:t>.</w:t>
+      </w:r>
+    </w:p>
+    <w:p>
+      <w:pPr>
+        <w:pStyle w:val="Teksts"/>
+      </w:pPr>
+      <w:r>
+        <w:t xml:space="preserve">Katrai izlases grupai tiek aprēķinātas šādas skaitliskās pazīmes (visas no tām ir iekļautas modelī kā ievades </w:t>
+      </w:r>
+      <w:r>
+        <w:t>ie</w:t>
+      </w:r>
+      <w:r>
+        <w:t>zīmes):</w:t>
+      </w:r>
+    </w:p>
+    <w:p>
+      <w:pPr>
+        <w:pStyle w:val="Uzsk-cipars-ar-punktu"/>
+        <w:numPr>
+          <w:ilvl w:val="0"/>
+          <w:numId w:val="48"/>
+        </w:numPr>
+      </w:pPr>
+      <w:r>
+        <w:rPr>
+          <w:i/>
+          <w:iCs/>
+        </w:rPr>
+        <w:t>sale_m3</w:t>
+      </w:r>
+      <w:r>
+        <w:t xml:space="preserve"> — mēneša pārdošanas apjoms (</w:t>
+      </w:r>
+      <w:r>
+        <w:t xml:space="preserve">arī </w:t>
+      </w:r>
+      <w:r>
+        <w:t xml:space="preserve">mērķa </w:t>
+      </w:r>
+      <w:r>
+        <w:t>atribūts</w:t>
+      </w:r>
+      <w:r>
+        <w:t xml:space="preserve">), </w:t>
+      </w:r>
+    </w:p>
+    <w:p>
+      <w:pPr>
+        <w:pStyle w:val="Uzsk-cipars-ar-punktu"/>
+        <w:numPr>
+          <w:ilvl w:val="0"/>
+          <w:numId w:val="48"/>
+        </w:numPr>
+      </w:pPr>
+      <w:r>
+        <w:rPr>
+          <w:i/>
+          <w:iCs/>
+        </w:rPr>
+        <w:t>received_m3</w:t>
+      </w:r>
+      <w:r>
+        <w:t xml:space="preserve"> — mēneša piegādes, </w:t>
+      </w:r>
+    </w:p>
+    <w:p>
+      <w:pPr>
+        <w:pStyle w:val="Uzsk-cipars-ar-punktu"/>
+      </w:pPr>
+      <w:r>
+        <w:rPr>
+          <w:i/>
+          <w:iCs/>
+        </w:rPr>
+        <w:t>delta_sale_m3</w:t>
+      </w:r>
+      <w:r>
+        <w:t xml:space="preserve"> — pārdošanas apjoma starpība salīdzinājumā ar iepriekšējo mēnesi, </w:t>
+      </w:r>
+    </w:p>
+    <w:p>
+      <w:pPr>
+        <w:pStyle w:val="Uzsk-cipars-ar-punktu"/>
+      </w:pPr>
+      <w:r>
+        <w:rPr>
+          <w:i/>
+          <w:iCs/>
+        </w:rPr>
+        <w:t>delta_received_m3</w:t>
+      </w:r>
+      <w:r>
+        <w:t xml:space="preserve"> — piegāžu apjoma starpība salīdzinājumā ar iepriekšējo mēnesi, </w:t>
+      </w:r>
+    </w:p>
+    <w:p>
+      <w:pPr>
+        <w:pStyle w:val="Uzsk-cipars-ar-punktu"/>
+      </w:pPr>
+      <w:r>
+        <w:rPr>
+          <w:i/>
+          <w:iCs/>
+        </w:rPr>
+        <w:t>rolling_sales_mean_2</w:t>
+      </w:r>
+      <w:r>
+        <w:t xml:space="preserve"> — divu mēnešu pārdošanas apjoma slīdošais vidējais rādītājs</w:t>
+      </w:r>
+      <w:r>
+        <w:t xml:space="preserve"> </w:t>
+      </w:r>
+      <w:r>
+        <w:t>(katram mēnesim aprēķināts kā pēdējo 2 mēnešu vidējais)</w:t>
+      </w:r>
+      <w:r>
+        <w:t xml:space="preserve">, </w:t>
+      </w:r>
+    </w:p>
+    <w:p>
+      <w:pPr>
+        <w:pStyle w:val="Uzsk-cipars-ar-punktu"/>
+      </w:pPr>
+      <w:r>
+        <w:rPr>
+          <w:i/>
+          <w:iCs/>
+        </w:rPr>
+        <w:t>rolling_sales_mean_3</w:t>
+      </w:r>
+      <w:r>
+        <w:t xml:space="preserve"> — trīs mēnešu pārdošanas apjoma slīdošais vidējais rādītājs.</w:t>
+      </w:r>
+    </w:p>
+    <w:p>
+      <w:pPr>
+        <w:pStyle w:val="Teksts"/>
+        <w:rPr>
+          <w:lang w:val="ru-RU"/>
+        </w:rPr>
+      </w:pPr>
+      <w:r>
+        <w:t>Atšķirības (delta_*) tiek pievienotas, lai palīdzētu modelim ņemt vērā izmaiņas sērijā laika gaitā, savukārt slīdošie vidējie sniedz izlīdzinātu tās līmeņa novērtējumu īsā laika periodā</w:t>
+      </w:r>
+      <w:r>
+        <w:t>.</w:t>
+      </w:r>
+    </w:p>
+    <w:p>
+      <w:pPr>
+        <w:pStyle w:val="Teksts"/>
+        <w:rPr>
+          <w:lang w:val="ru-RU"/>
+        </w:rPr>
+      </w:pPr>
+      <w:commentRangeStart w:id="134"/>
+      <w:r>
+        <w:t xml:space="preserve">Eksperimentā </w:t>
+      </w:r>
+      <w:commentRangeEnd w:id="134"/>
+      <w:r>
+        <w:rPr>
+          <w:rStyle w:val="CommentReference"/>
+          <w:sz w:val="24"/>
+          <w:szCs w:val="24"/>
+        </w:rPr>
+        <w:commentReference w:id="134"/>
+      </w:r>
+      <w:r>
+        <w:t xml:space="preserve">viens LSTM modelis tiek apmācīts uz kopīga logu kopas, kas savākta no visām grupām. To var redzēt </w:t>
+      </w:r>
+      <w:r>
+        <w:rPr>
+          <w:i/>
+          <w:iCs/>
+        </w:rPr>
+        <w:t>build_samples</w:t>
+      </w:r>
+      <w:r>
+        <w:t xml:space="preserve"> metodē, kas ģenerē </w:t>
+      </w:r>
+      <w:r>
+        <w:rPr>
+          <w:i/>
+          <w:iCs/>
+        </w:rPr>
+        <w:t>x</w:t>
+      </w:r>
+      <w:r>
+        <w:t xml:space="preserve"> un </w:t>
+      </w:r>
+      <w:r>
+        <w:rPr>
+          <w:i/>
+          <w:iCs/>
+        </w:rPr>
+        <w:t>y</w:t>
+      </w:r>
+      <w:r>
+        <w:t xml:space="preserve"> vērtības visām grupām vienlaikus, pēc kā </w:t>
+      </w:r>
+      <w:r>
+        <w:rPr>
+          <w:i/>
+          <w:iCs/>
+        </w:rPr>
+        <w:t>train_model</w:t>
+      </w:r>
+      <w:r>
+        <w:t xml:space="preserve"> funkcija apmāca vienu modeli </w:t>
+      </w:r>
+      <w:r>
+        <w:lastRenderedPageBreak/>
+        <w:t xml:space="preserve">uz šīs apvienotās kopas. Šīs pieejas ideja ir tāda, ka, ja atsevišķas laika rindas ir īsas, atsevišķa modeļa apmācība katrai grupai var novest pie nepietiekama apmācības piemēru skaita, savukārt apvienotā </w:t>
+      </w:r>
+      <w:r>
+        <w:t>(</w:t>
+      </w:r>
+      <w:r>
+        <w:rPr>
+          <w:i/>
+          <w:iCs/>
+        </w:rPr>
+        <w:t>pooled</w:t>
+      </w:r>
+      <w:r>
+        <w:t xml:space="preserve">) </w:t>
+      </w:r>
+      <w:r>
+        <w:t xml:space="preserve">pieeja ļauj izmantot informāciju no visām </w:t>
+      </w:r>
+      <w:r>
+        <w:t>rindām</w:t>
+      </w:r>
+      <w:r>
+        <w:t xml:space="preserve"> un </w:t>
+      </w:r>
+      <w:r>
+        <w:t>atrast</w:t>
+      </w:r>
+      <w:r>
+        <w:t xml:space="preserve"> </w:t>
+      </w:r>
+      <w:r>
+        <w:t>kopējas atkarības</w:t>
+      </w:r>
+      <w:r>
+        <w:t xml:space="preserve"> </w:t>
+      </w:r>
+      <w:sdt>
+        <w:sdtPr>
+          <w:id w:val="-1385642827"/>
+          <w:citation/>
+        </w:sdtPr>
+        <w:sdtContent>
+          <w:r>
+            <w:fldChar w:fldCharType="begin"/>
+          </w:r>
+          <w:r>
+            <w:instrText xml:space="preserve"> CITATION Ban20 \l 1049 </w:instrText>
+          </w:r>
+          <w:r>
+            <w:fldChar w:fldCharType="separate"/>
+          </w:r>
+          <w:r>
+            <w:rPr>
+              <w:noProof/>
+            </w:rPr>
+            <w:t>(Bandara, Bergmeir, &amp; Smyl, 2020)</w:t>
+          </w:r>
+          <w:r>
+            <w:fldChar w:fldCharType="end"/>
+          </w:r>
+        </w:sdtContent>
+      </w:sdt>
+      <w:r>
+        <w:t xml:space="preserve">. </w:t>
+      </w:r>
+      <w:r>
+        <w:t>Tomēr, izmantojot šo pieeju, modeli nevar atstāt pilnībā bez informācijas par to, kam pieder laika rinda.</w:t>
+      </w:r>
+      <w:r>
+        <w:t xml:space="preserve"> Apmācība uz </w:t>
+      </w:r>
+      <w:r>
+        <w:rPr>
+          <w:i/>
+          <w:iCs/>
+        </w:rPr>
+        <w:t>heterogēnu</w:t>
+      </w:r>
+      <w:r>
+        <w:t xml:space="preserve"> laika rindu kopas, kas apvienotas vienā kopā, var izraisīt precizitātes samazināšanos, jo modelis nespēs atšķirt šīs grupas un nebūs pietiekami pielāgots konkrētām </w:t>
+      </w:r>
+      <w:r>
+        <w:t>rindām</w:t>
+      </w:r>
+      <w:r>
+        <w:t xml:space="preserve"> </w:t>
+      </w:r>
+      <w:sdt>
+        <w:sdtPr>
+          <w:id w:val="1908797813"/>
+          <w:citation/>
+        </w:sdtPr>
+        <w:sdtContent>
+          <w:r>
+            <w:fldChar w:fldCharType="begin"/>
+          </w:r>
+          <w:r>
+            <w:instrText xml:space="preserve"> CITATION Ban20 \l 1049 </w:instrText>
+          </w:r>
+          <w:r>
+            <w:fldChar w:fldCharType="separate"/>
+          </w:r>
+          <w:r>
+            <w:rPr>
+              <w:noProof/>
+            </w:rPr>
+            <w:t>(Bandara, Bergmeir, &amp; Smyl, 2020)</w:t>
+          </w:r>
+          <w:r>
+            <w:fldChar w:fldCharType="end"/>
+          </w:r>
+        </w:sdtContent>
+      </w:sdt>
+      <w:sdt>
+        <w:sdtPr>
+          <w:id w:val="2073625071"/>
+          <w:citation/>
+        </w:sdtPr>
+        <w:sdtContent>
+          <w:r>
+            <w:fldChar w:fldCharType="begin"/>
+          </w:r>
+          <w:r>
+            <w:instrText xml:space="preserve"> CITATION Abb25 \l 1062 </w:instrText>
+          </w:r>
+          <w:r>
+            <w:fldChar w:fldCharType="separate"/>
+          </w:r>
+          <w:r>
+            <w:rPr>
+              <w:noProof/>
+            </w:rPr>
+            <w:t xml:space="preserve"> (Abbasimehr, Abri, Oskouei, &amp; Noshad, 2025)</w:t>
+          </w:r>
+          <w:r>
+            <w:fldChar w:fldCharType="end"/>
+          </w:r>
+        </w:sdtContent>
+      </w:sdt>
+      <w:r>
+        <w:t xml:space="preserve">. Un tad, tā vietā, lai identificētu individuālas attiecības, tas identificētu vidējās atkarības un kļūtu mazāk efektīvs atsevišķu grupu prognozēšanā. Lai atrisinātu šo problēmu, bija nepieciešams kaut kādā veidā iemācīt modelim atšķirt grupas, piemēram, izmantojot klasterizāciju vai papildu </w:t>
+      </w:r>
+      <w:r>
+        <w:t>ie</w:t>
+      </w:r>
+      <w:r>
+        <w:t xml:space="preserve">zīmes </w:t>
+      </w:r>
+      <w:r>
+        <w:rPr>
+          <w:noProof/>
+        </w:rPr>
+        <w:t>(Abbasimehr, Abri, Oskouei, &amp; Noshad, 2025)</w:t>
+      </w:r>
+      <w:r>
+        <w:t>.</w:t>
+      </w:r>
+    </w:p>
+    <w:p>
+      <w:pPr>
+        <w:pStyle w:val="Teksts"/>
+      </w:pPr>
+      <w:r>
+        <w:t xml:space="preserve">Šajā pētījumā mēs izvēlējāmies izmantot pieeju ar papildu </w:t>
+      </w:r>
+      <w:r>
+        <w:t>iezīmem</w:t>
+      </w:r>
+      <w:r>
+        <w:t>. Ir trīs iespējamās ieviešanas.</w:t>
+      </w:r>
+    </w:p>
+    <w:p>
+      <w:pPr>
+        <w:pStyle w:val="Uzsk-cipars-ar-punktu"/>
+        <w:numPr>
+          <w:ilvl w:val="0"/>
+          <w:numId w:val="51"/>
+        </w:numPr>
+      </w:pPr>
+      <w:r>
+        <w:t>Izmantojot kategoriju kodēšanu – grupām tiek piešķirts vesels skaitlis (0…G-1). Problēma ir tā, ka, ja šāds skaitlis tiek tieši ievadīts tīklā kā parasta skaitliska ievade, modelis to var interpretēt kā kārtas vērtību (7. grupa ir lielāka par 3. grupu), pat ja kategorijām nav dabiskas secības</w:t>
+      </w:r>
+      <w:sdt>
+        <w:sdtPr>
+          <w:id w:val="-986549914"/>
+          <w:citation/>
+        </w:sdtPr>
+        <w:sdtContent>
+          <w:r>
+            <w:fldChar w:fldCharType="begin"/>
+          </w:r>
+          <w:r>
+            <w:instrText xml:space="preserve"> CITATION Bor25 \l 1062 </w:instrText>
+          </w:r>
+          <w:r>
+            <w:fldChar w:fldCharType="separate"/>
+          </w:r>
+          <w:r>
+            <w:rPr>
+              <w:noProof/>
+            </w:rPr>
+            <w:t xml:space="preserve"> (Borrohou, Fissoune, &amp; Badir, 2025)</w:t>
+          </w:r>
+          <w:r>
+            <w:fldChar w:fldCharType="end"/>
+          </w:r>
+        </w:sdtContent>
+      </w:sdt>
+      <w:r>
+        <w:t>.</w:t>
+      </w:r>
+    </w:p>
+    <w:p>
+      <w:pPr>
+        <w:pStyle w:val="Uzsk-cipars-ar-punktu"/>
+        <w:numPr>
+          <w:ilvl w:val="0"/>
+          <w:numId w:val="51"/>
+        </w:numPr>
+      </w:pPr>
+      <w:r>
+        <w:t>Vienreizēja</w:t>
+      </w:r>
+      <w:r>
+        <w:t xml:space="preserve"> (</w:t>
+      </w:r>
+      <w:r>
+        <w:rPr>
+          <w:i/>
+          <w:iCs/>
+        </w:rPr>
+        <w:t>o</w:t>
+      </w:r>
+      <w:r>
+        <w:rPr>
+          <w:i/>
+          <w:iCs/>
+        </w:rPr>
+        <w:t>ne-hot</w:t>
+      </w:r>
+      <w:r>
+        <w:t>)</w:t>
+      </w:r>
+      <w:r>
+        <w:t xml:space="preserve"> kodēšana – katru grupu attēlo garuma vektors </w:t>
+      </w:r>
+      <w:r>
+        <w:rPr>
+          <w:i/>
+          <w:iCs/>
+        </w:rPr>
+        <w:t>G</w:t>
+      </w:r>
+      <w:r>
+        <w:t xml:space="preserve">, kur viens elements ir 1, bet pārējie ir 0. Tas novērš viltus "kārtas" īpašību, bet palielina dimensiju un padara ievadi retu </w:t>
+      </w:r>
+      <w:sdt>
+        <w:sdtPr>
+          <w:id w:val="1310285700"/>
+          <w:citation/>
+        </w:sdtPr>
+        <w:sdtContent>
+          <w:r>
+            <w:fldChar w:fldCharType="begin"/>
+          </w:r>
+          <w:r>
+            <w:instrText xml:space="preserve"> CITATION Bor25 \l 1062 </w:instrText>
+          </w:r>
+          <w:r>
+            <w:fldChar w:fldCharType="separate"/>
+          </w:r>
+          <w:r>
+            <w:rPr>
+              <w:noProof/>
+            </w:rPr>
+            <w:t xml:space="preserve"> (Borrohou, Fissoune, &amp; Badir, 2025)</w:t>
+          </w:r>
+          <w:r>
+            <w:fldChar w:fldCharType="end"/>
+          </w:r>
+        </w:sdtContent>
+      </w:sdt>
+      <w:r>
+        <w:t>.</w:t>
+      </w:r>
+    </w:p>
+    <w:p>
+      <w:pPr>
+        <w:pStyle w:val="Uzsk-cipars-ar-punktu"/>
+        <w:numPr>
+          <w:ilvl w:val="0"/>
+          <w:numId w:val="51"/>
+        </w:numPr>
+      </w:pPr>
+      <w:r>
+        <w:t>Izmantojot iegulšanas</w:t>
+      </w:r>
+      <w:r>
+        <w:t xml:space="preserve"> (</w:t>
+      </w:r>
+      <w:r>
+        <w:rPr>
+          <w:i/>
+          <w:iCs/>
+        </w:rPr>
+        <w:t>e</w:t>
+      </w:r>
+      <w:r>
+        <w:rPr>
+          <w:i/>
+          <w:iCs/>
+        </w:rPr>
+        <w:t>medding</w:t>
+      </w:r>
+      <w:r>
+        <w:t>)</w:t>
+      </w:r>
+      <w:r>
+        <w:t xml:space="preserve"> slāni, kurā tiek glabāta katras grupas parametru vai svaru tabula</w:t>
+      </w:r>
+      <w:r>
+        <w:t xml:space="preserve"> </w:t>
+      </w:r>
+      <w:sdt>
+        <w:sdtPr>
+          <w:id w:val="-687834502"/>
+          <w:citation/>
+        </w:sdtPr>
+        <w:sdtContent>
+          <w:r>
+            <w:fldChar w:fldCharType="begin"/>
+          </w:r>
+          <w:r>
+            <w:instrText xml:space="preserve"> CITATION San26 \l 1062 </w:instrText>
+          </w:r>
+          <w:r>
+            <w:fldChar w:fldCharType="separate"/>
+          </w:r>
+          <w:r>
+            <w:rPr>
+              <w:noProof/>
+            </w:rPr>
+            <w:t>(Santis, Giordano, &amp; Mellia, 2026)</w:t>
+          </w:r>
+          <w:r>
+            <w:fldChar w:fldCharType="end"/>
+          </w:r>
+        </w:sdtContent>
+      </w:sdt>
+      <w:r>
+        <w:t>.</w:t>
+      </w:r>
+    </w:p>
+    <w:p>
+      <w:pPr>
+        <w:pStyle w:val="Teksts"/>
+      </w:pPr>
+      <w:r>
+        <w:t>Tika izvēlēta trešā pieeja</w:t>
+      </w:r>
+      <w:r>
+        <w:t xml:space="preserve">. </w:t>
+      </w:r>
+      <w:r>
+        <w:t>Iegulšanas slānis pārveido kategoriskas vērtības vektor</w:t>
+      </w:r>
+      <w:r>
+        <w:t>os</w:t>
+      </w:r>
+      <w:r>
+        <w:t xml:space="preserve"> (tabula </w:t>
+      </w:r>
+      <w:r>
+        <w:rPr>
+          <w:i/>
+          <w:iCs/>
+        </w:rPr>
+        <w:t>Gx4</w:t>
+      </w:r>
+      <w:r>
+        <w:t xml:space="preserve">, jo realizācijā </w:t>
+      </w:r>
+      <w:r>
+        <w:rPr>
+          <w:i/>
+          <w:iCs/>
+        </w:rPr>
+        <w:t>GROUP_EMBEDDING_COUNT=4</w:t>
+      </w:r>
+      <w:r>
+        <w:rPr>
+          <w:i/>
+          <w:iCs/>
+        </w:rPr>
+        <w:t>)</w:t>
+      </w:r>
+      <w:r>
+        <w:t xml:space="preserve">, kuros katrai kategorijai atbilst apmācāms vektors ar mazāku dimensiju nekā </w:t>
+      </w:r>
+      <w:r>
+        <w:rPr>
+          <w:i/>
+          <w:iCs/>
+        </w:rPr>
+        <w:t>one-hot</w:t>
+      </w:r>
+      <w:r>
+        <w:t xml:space="preserve"> kodējumā. Šie vektori tiek iemācīti apmācības laikā kopā ar pārējiem tīkla parametriem un ļauj apstrādāt augstas kardinalitātes kategorijas. </w:t>
+      </w:r>
+      <w:r>
+        <w:t>Š</w:t>
+      </w:r>
+      <w:r>
+        <w:t xml:space="preserve">āda reprezentācija </w:t>
+      </w:r>
+      <w:r>
+        <w:t xml:space="preserve">arī </w:t>
+      </w:r>
+      <w:r>
+        <w:t xml:space="preserve">var atspoguļot līdzības starp kategorijām, jo līdzīgām kategorijām </w:t>
+      </w:r>
+      <w:r>
+        <w:t xml:space="preserve">ar laiku </w:t>
+      </w:r>
+      <w:r>
+        <w:t>veidojas līdzīgi vektori</w:t>
+      </w:r>
+      <w:r>
+        <w:t>.</w:t>
+      </w:r>
+    </w:p>
+    <w:p>
+      <w:pPr>
+        <w:pStyle w:val="Uzsk-cipars-ar-punktu"/>
+        <w:numPr>
+          <w:ilvl w:val="0"/>
+          <w:numId w:val="0"/>
+        </w:numPr>
+        <w:ind w:left="720" w:hanging="360"/>
+      </w:pPr>
+    </w:p>
+    <w:p>
+      <w:pPr>
+        <w:pStyle w:val="Teksts"/>
+      </w:pPr>
     </w:p>
     <w:p>
       <w:pPr>
@@ -18114,11 +20061,119 @@
     <w:p>
       <w:pPr>
         <w:pStyle w:val="Teksts"/>
+      </w:pPr>
+    </w:p>
+    <w:p>
+      <w:pPr>
+        <w:pStyle w:val="Teksts"/>
+      </w:pPr>
+    </w:p>
+    <w:p>
+      <w:pPr>
+        <w:pStyle w:val="Teksts"/>
         <w:tabs>
-          <w:tab w:val="center" w:pos="4253"/>
+          <w:tab w:val="center" w:pos="4395"/>
           <w:tab w:val="right" w:pos="8222"/>
         </w:tabs>
-        <w:jc w:val="right"/>
+        <w:ind w:firstLine="0"/>
+      </w:pPr>
+    </w:p>
+    <w:p>
+      <w:pPr>
+        <w:pStyle w:val="Teksts"/>
+        <w:tabs>
+          <w:tab w:val="center" w:pos="4395"/>
+          <w:tab w:val="right" w:pos="8222"/>
+        </w:tabs>
+        <w:ind w:firstLine="0"/>
+      </w:pPr>
+    </w:p>
+    <w:p>
+      <w:pPr>
+        <w:pStyle w:val="Teksts"/>
+      </w:pPr>
+    </w:p>
+    <w:p>
+      <w:pPr>
+        <w:pStyle w:val="Teksts"/>
+      </w:pPr>
+    </w:p>
+    <w:p>
+      <w:pPr>
+        <w:pStyle w:val="Teksts"/>
+      </w:pPr>
+    </w:p>
+    <w:p>
+      <w:pPr>
+        <w:pStyle w:val="Teksts"/>
+      </w:pPr>
+    </w:p>
+    <w:p>
+      <w:pPr>
+        <w:pStyle w:val="Teksts"/>
+      </w:pPr>
+    </w:p>
+    <w:p>
+      <w:pPr>
+        <w:pStyle w:val="Teksts"/>
+      </w:pPr>
+    </w:p>
+    <w:p>
+      <w:pPr>
+        <w:pStyle w:val="Teksts"/>
+        <w:tabs>
+          <w:tab w:val="left" w:pos="1134"/>
+        </w:tabs>
+      </w:pPr>
+    </w:p>
+    <w:p>
+      <w:pPr>
+        <w:pStyle w:val="Teksts"/>
+        <w:tabs>
+          <w:tab w:val="center" w:pos="4395"/>
+          <w:tab w:val="right" w:pos="8222"/>
+        </w:tabs>
+        <w:ind w:firstLine="0"/>
+      </w:pPr>
+    </w:p>
+    <w:p>
+      <w:pPr>
+        <w:pStyle w:val="Teksts"/>
+      </w:pPr>
+    </w:p>
+    <w:p>
+      <w:pPr>
+        <w:pStyle w:val="Teksts"/>
+      </w:pPr>
+    </w:p>
+    <w:p>
+      <w:pPr>
+        <w:pStyle w:val="Teksts"/>
+        <w:tabs>
+          <w:tab w:val="center" w:pos="4395"/>
+          <w:tab w:val="right" w:pos="8222"/>
+        </w:tabs>
+        <w:ind w:firstLine="0"/>
+      </w:pPr>
+    </w:p>
+    <w:p>
+      <w:pPr>
+        <w:pStyle w:val="Teksts"/>
+        <w:tabs>
+          <w:tab w:val="center" w:pos="4395"/>
+          <w:tab w:val="right" w:pos="8222"/>
+        </w:tabs>
+        <w:ind w:firstLine="0"/>
+      </w:pPr>
+    </w:p>
+    <w:p>
+      <w:pPr>
+        <w:pStyle w:val="Teksts"/>
+        <w:tabs>
+          <w:tab w:val="center" w:pos="4395"/>
+          <w:tab w:val="right" w:pos="8222"/>
+        </w:tabs>
+        <w:ind w:firstLine="0"/>
       </w:pPr>
     </w:p>
     <w:p>
@@ -18133,6 +20188,16 @@
     </w:p>
     <w:p>
       <w:pPr>
+        <w:pStyle w:val="Teksts"/>
+        <w:tabs>
+          <w:tab w:val="center" w:pos="4253"/>
+          <w:tab w:val="right" w:pos="8222"/>
+        </w:tabs>
+        <w:jc w:val="right"/>
+      </w:pPr>
+    </w:p>
+    <w:p>
+      <w:pPr>
         <w:pStyle w:val="Uzsk-aizzmes"/>
         <w:numPr>
           <w:ilvl w:val="0"/>
@@ -18169,12 +20234,12 @@
       <w:pPr>
         <w:pStyle w:val="1-lm-nenumurts-virsraksts"/>
       </w:pPr>
-      <w:bookmarkStart w:id="130" w:name="_Toc225535011"/>
+      <w:bookmarkStart w:id="135" w:name="_Toc225535011"/>
       <w:r>
         <w:lastRenderedPageBreak/>
         <w:t>Rezultāti un secinājumi</w:t>
       </w:r>
-      <w:bookmarkEnd w:id="130"/>
+      <w:bookmarkEnd w:id="135"/>
     </w:p>
     <w:p>
       <w:pPr>
@@ -18347,14 +20412,14 @@
       <w:pPr>
         <w:pStyle w:val="1-lm-nenumurts-virsraksts"/>
       </w:pPr>
-      <w:bookmarkStart w:id="131" w:name="_Toc88602609"/>
-      <w:bookmarkStart w:id="132" w:name="_Toc225535012"/>
+      <w:bookmarkStart w:id="136" w:name="_Toc88602609"/>
+      <w:bookmarkStart w:id="137" w:name="_Toc225535012"/>
       <w:r>
         <w:lastRenderedPageBreak/>
         <w:t>Izmantotie informācijas avoti</w:t>
       </w:r>
-      <w:bookmarkEnd w:id="131"/>
-      <w:bookmarkEnd w:id="132"/>
+      <w:bookmarkEnd w:id="136"/>
+      <w:bookmarkEnd w:id="137"/>
       <w:r>
         <w:fldChar w:fldCharType="begin"/>
       </w:r>
@@ -18911,13 +20976,13 @@
       <w:pPr>
         <w:pStyle w:val="Pielikumi-virsraksts"/>
       </w:pPr>
-      <w:bookmarkStart w:id="133" w:name="_Toc88602610"/>
-      <w:bookmarkStart w:id="134" w:name="_Toc225535013"/>
+      <w:bookmarkStart w:id="138" w:name="_Toc88602610"/>
+      <w:bookmarkStart w:id="139" w:name="_Toc225535013"/>
       <w:r>
         <w:t>Pielikumi</w:t>
       </w:r>
-      <w:bookmarkEnd w:id="133"/>
-      <w:bookmarkEnd w:id="134"/>
+      <w:bookmarkEnd w:id="138"/>
+      <w:bookmarkEnd w:id="139"/>
     </w:p>
     <w:p>
       <w:r>
@@ -26449,37 +28514,7 @@
         <w:rPr>
           <w:noProof/>
         </w:rPr>
-        <w:t>atrast v</w:t>
-      </w:r>
-      <w:r>
-        <w:rPr>
-          <w:noProof/>
-        </w:rPr>
-        <w:t xml:space="preserve">isus </w:t>
-      </w:r>
-      <w:r>
-        <w:rPr>
-          <w:noProof/>
-        </w:rPr>
-        <w:t>avotus, kur tie ir uzrakstīti ar v</w:t>
-      </w:r>
-      <w:r>
-        <w:rPr>
-          <w:noProof/>
-        </w:rPr>
-        <w:t xml:space="preserve">ārdiem, </w:t>
-      </w:r>
-      <w:r>
-        <w:rPr>
-          <w:noProof/>
-        </w:rPr>
-        <w:t xml:space="preserve">nevis kā </w:t>
-      </w:r>
-      <w:r>
-        <w:rPr>
-          <w:noProof/>
-        </w:rPr>
-        <w:t>insert</w:t>
+        <w:t>atrast visus avotus, kur tie ir uzrakstīti ar vārdiem, nevis kā insert</w:t>
       </w:r>
     </w:p>
   </w:comment>
@@ -26498,19 +28533,444 @@
         <w:rPr>
           <w:noProof/>
         </w:rPr>
-        <w:t>pa</w:t>
+        <w:t>pazīmji -&gt; iezīmji visur pārbaudīt</w:t>
+      </w:r>
+    </w:p>
+  </w:comment>
+  <w:comment w:id="130" w:author="Deniss" w:date="2026-04-17T16:44:00Z" w:initials="D">
+    <w:p>
+      <w:pPr>
+        <w:pStyle w:val="CommentText"/>
+      </w:pPr>
+      <w:r>
+        <w:rPr>
+          <w:rStyle w:val="CommentReference"/>
+        </w:rPr>
+        <w:annotationRef/>
       </w:r>
       <w:r>
         <w:rPr>
           <w:noProof/>
         </w:rPr>
-        <w:t>zīmji -&gt; iezīmji visur pārba</w:t>
-      </w:r>
-      <w:r>
+        <w:t xml:space="preserve">beigās replacot ar referenci uz sadaļu </w:t>
+      </w:r>
+    </w:p>
+  </w:comment>
+  <w:comment w:id="131" w:author="Deniss" w:date="2026-04-18T11:55:00Z" w:initials="D">
+    <w:p>
+      <w:pPr>
+        <w:pStyle w:val="CommentText"/>
+      </w:pPr>
+      <w:r>
+        <w:rPr>
+          <w:rStyle w:val="CommentReference"/>
+        </w:rPr>
+        <w:annotationRef/>
+      </w:r>
+      <w:r>
+        <w:t>Рекуррентные сети и отличие LSTM</w:t>
+      </w:r>
+    </w:p>
+    <w:p>
+      <w:pPr>
+        <w:pStyle w:val="CommentText"/>
+      </w:pPr>
+    </w:p>
+    <w:p>
+      <w:pPr>
+        <w:pStyle w:val="CommentText"/>
+      </w:pPr>
+      <w:r>
+        <w:t>Обычная полносвязная сеть ожидает фиксированное количество входных признаков. Рекуррентные нейронные сети (RNN) вводят скрытое состояние (h_t), которое обновляется шаг за шагом и переносит информацию из прошлого в будущее. Это удобно использовать для временных рядов, где данные выглядят как последовательность во времени.  (Yunita et al., 2025).</w:t>
+      </w:r>
+    </w:p>
+    <w:p>
+      <w:pPr>
+        <w:pStyle w:val="CommentText"/>
+      </w:pPr>
+    </w:p>
+    <w:p>
+      <w:pPr>
+        <w:pStyle w:val="CommentText"/>
+      </w:pPr>
+      <w:r>
+        <w:t>[ h_t = f(x_t, h_{t-1}), \qquad \hat{y}_t = g(h_t). ]</w:t>
+      </w:r>
+    </w:p>
+    <w:p>
+      <w:pPr>
+        <w:pStyle w:val="CommentText"/>
+      </w:pPr>
+    </w:p>
+    <w:p>
+      <w:pPr>
+        <w:pStyle w:val="CommentText"/>
+      </w:pPr>
+      <w:r>
+        <w:t>Недостаток простых RNN в том, что им сложнее запоминать дальние зависимости из-за затухающих градиентов при обратном распространении по времени (BPTT) (El Filali et al., 2022).</w:t>
+      </w:r>
+    </w:p>
+    <w:p>
+      <w:pPr>
+        <w:pStyle w:val="CommentText"/>
+      </w:pPr>
+    </w:p>
+    <w:p>
+      <w:pPr>
+        <w:pStyle w:val="CommentText"/>
+      </w:pPr>
+      <w:r>
+        <w:t>Идея LSTM</w:t>
+      </w:r>
+    </w:p>
+    <w:p>
+      <w:pPr>
+        <w:pStyle w:val="CommentText"/>
+      </w:pPr>
+    </w:p>
+    <w:p>
+      <w:pPr>
+        <w:pStyle w:val="CommentText"/>
+      </w:pPr>
+      <w:r>
+        <w:t>LSTM (Long Short-Term Memory) — развитие RNN, где внутри ячейки появляется отдельное «состояние памяти» (c_t) и набор «врат» (gates), которые управляют тем, что забывается, что записывается и что выдаётся наружу (Yunita et al., 2025; El Filali et al., 2022).</w:t>
+      </w:r>
+    </w:p>
+    <w:p>
+      <w:pPr>
+        <w:pStyle w:val="CommentText"/>
+      </w:pPr>
+    </w:p>
+    <w:p>
+      <w:pPr>
+        <w:pStyle w:val="CommentText"/>
+      </w:pPr>
+      <w:r>
+        <w:t>Типичная формулировка включает (El Filali et al., 2022):</w:t>
+      </w:r>
+    </w:p>
+    <w:p>
+      <w:pPr>
+        <w:pStyle w:val="CommentText"/>
+      </w:pPr>
+    </w:p>
+    <w:p>
+      <w:pPr>
+        <w:pStyle w:val="CommentText"/>
+      </w:pPr>
+      <w:r>
+        <w:t>forget gate (f_t) — сколько информации из (c_{t-1}) сохранить,</w:t>
+      </w:r>
+    </w:p>
+    <w:p>
+      <w:pPr>
+        <w:pStyle w:val="CommentText"/>
+      </w:pPr>
+      <w:r>
+        <w:t>input gate (i_t) — сколько новой информации записать,</w:t>
+      </w:r>
+    </w:p>
+    <w:p>
+      <w:pPr>
+        <w:pStyle w:val="CommentText"/>
+      </w:pPr>
+      <w:r>
+        <w:t>candidate (\tilde{c}_t) — кандидаты на запись в память,</w:t>
+      </w:r>
+    </w:p>
+    <w:p>
+      <w:pPr>
+        <w:pStyle w:val="CommentText"/>
+      </w:pPr>
+      <w:r>
+        <w:t>output gate (o_t) — какая часть состояния памяти попадёт в выход (h_t).</w:t>
+      </w:r>
+    </w:p>
+    <w:p>
+      <w:pPr>
+        <w:pStyle w:val="CommentText"/>
+      </w:pPr>
+    </w:p>
+    <w:p>
+      <w:pPr>
+        <w:pStyle w:val="CommentText"/>
+      </w:pPr>
+      <w:r>
+        <w:t>Смысл LSTM в том, что она обучает механизмы управления памятью, что может лучше обучить моделирование последовательностей по сравнению с RNN (El Filali et al., 2022). В задаче прогнозирования на месячные продажи влияют и последние наблюдения, и недавняя динамика (рост/падение), и доступность товара (поставки). С LSTM можно подавать на вход последовательность значений и признаков, поэтому модель может учитывать контекст нескольких прошлых месяцев при прогнозе следующего (El Filali et al., 2022; Yunita et al., 2025).</w:t>
+      </w:r>
+    </w:p>
+  </w:comment>
+  <w:comment w:id="133" w:author="Deniss" w:date="2026-04-18T12:47:00Z" w:initials="D">
+    <w:p>
+      <w:pPr>
+        <w:pStyle w:val="CommentText"/>
+      </w:pPr>
+      <w:r>
+        <w:rPr>
+          <w:rStyle w:val="CommentReference"/>
+        </w:rPr>
+        <w:annotationRef/>
+      </w:r>
+      <w:r>
+        <w:t>Преобразование временного ряда в обучающие примеры</w:t>
+      </w:r>
+    </w:p>
+    <w:p>
+      <w:pPr>
+        <w:pStyle w:val="CommentText"/>
+      </w:pPr>
+      <w:r>
+        <w:t>Чтобы применять LSTM как модель «прогноз следующего месяца», исходная последовательность преобразуется в набор пар ((X, y)) с помощью скользящего окна (sliding window). В коде это функция build_samples, которая:</w:t>
+      </w:r>
+    </w:p>
+    <w:p>
+      <w:pPr>
+        <w:pStyle w:val="CommentText"/>
+      </w:pPr>
+      <w:r>
+        <w:t>берёт для каждой группы отрезок обучающего периода train_start:train_end,</w:t>
+      </w:r>
+      <w:r>
+        <w:br/>
+        <w:t>формирует окна длины TIMESTEP_COUNT,</w:t>
+      </w:r>
+      <w:r>
+        <w:br/>
+        <w:t>ставит в соответствие каждому окну целевое значение — продажи следующего месяца.</w:t>
+      </w:r>
+    </w:p>
+    <w:p>
+      <w:pPr>
+        <w:pStyle w:val="CommentText"/>
+      </w:pPr>
+      <w:r>
+        <w:t>То есть, если окно длины 3 месяца, то обучение строится по схеме:</w:t>
+      </w:r>
+    </w:p>
+    <w:p>
+      <w:pPr>
+        <w:pStyle w:val="CommentText"/>
+      </w:pPr>
+      <w:r>
+        <w:t>[ X = [t-2,, t-1,, t] \quad \rightarrow \quad y = [t+1]. ]</w:t>
+      </w:r>
+    </w:p>
+    <w:p>
+      <w:pPr>
+        <w:pStyle w:val="CommentText"/>
+      </w:pPr>
+      <w:r>
+        <w:t>В реализации длина окна фиксирована: TIMESTEP_COUNT = 3.</w:t>
+      </w:r>
+    </w:p>
+    <w:p>
+      <w:pPr>
+        <w:pStyle w:val="CommentText"/>
+      </w:pPr>
+      <w:r>
+        <w:t>Здесь принципиально важно подчеркнуть: вход LSTM — это не «три признака», а «три временных шага», и на каждом шаге есть набор числовых признаков. В терминах тензоров вход имеет структуру:</w:t>
+      </w:r>
+    </w:p>
+    <w:p>
+      <w:pPr>
+        <w:pStyle w:val="CommentText"/>
+      </w:pPr>
+      <w:r>
+        <w:t>[ (\text{batch},, \text{timestep},, \text{feature}). ]</w:t>
+      </w:r>
+    </w:p>
+    <w:p>
+      <w:pPr>
+        <w:pStyle w:val="CommentText"/>
+      </w:pPr>
+      <w:r>
+        <w:t>Это прямо отражено в параметре batch_first=True у LSTM-слоя в модели.</w:t>
+      </w:r>
+    </w:p>
+    <w:p>
+      <w:pPr>
+        <w:pStyle w:val="CommentText"/>
+      </w:pPr>
+      <w:r>
+        <w:t>Используемые признаки</w:t>
+      </w:r>
+    </w:p>
+    <w:p>
+      <w:pPr>
+        <w:pStyle w:val="CommentText"/>
+      </w:pPr>
+      <w:r>
+        <w:t>В выборке для каждой группы рассчитываются следующие числовые признаки (все они попадают в модель как входные признаки):</w:t>
+      </w:r>
+    </w:p>
+    <w:p>
+      <w:pPr>
+        <w:pStyle w:val="CommentText"/>
+      </w:pPr>
+      <w:r>
+        <w:t>sale_m3 — продажи за месяц (целевой ряд),</w:t>
+      </w:r>
+      <w:r>
+        <w:br/>
+        <w:t>received_m3 — поставки за месяц,</w:t>
+      </w:r>
+      <w:r>
+        <w:br/>
+        <w:t>delta_sale_m3 — разность продаж с прошлым месяцем,</w:t>
+      </w:r>
+      <w:r>
+        <w:br/>
+        <w:t>delta_received_m3 — разность поставок с прошлым месяцем,</w:t>
+      </w:r>
+      <w:r>
+        <w:br/>
+        <w:t>rolling_sales_mean_2 — скользящее среднее продаж за 2 месяца,</w:t>
+      </w:r>
+      <w:r>
+        <w:br/>
+        <w:t>rolling_sales_mean_3 — скользящее среднее продаж за 3 месяца.</w:t>
+      </w:r>
+    </w:p>
+    <w:p>
+      <w:pPr>
+        <w:pStyle w:val="CommentText"/>
+      </w:pPr>
+      <w:r>
+        <w:t xml:space="preserve">Разности (delta_*) добавляются для того, чтобы модели было проще учитывать изменение ряда во времени, а скользящие средние дают сглаженную оценку его уровня на коротком горизонте (Sirisha et al., 2022; Suresh &amp; Suresh, 2023). </w:t>
+      </w:r>
+    </w:p>
+    <w:p>
+      <w:pPr>
+        <w:pStyle w:val="CommentText"/>
+      </w:pPr>
+    </w:p>
+  </w:comment>
+  <w:comment w:id="132" w:author="Deniss" w:date="2026-04-18T13:36:00Z" w:initials="D">
+    <w:p>
+      <w:pPr>
+        <w:pStyle w:val="CommentText"/>
         <w:rPr>
           <w:noProof/>
-        </w:rPr>
-        <w:t>udīt</w:t>
+          <w:lang w:val="en-GB"/>
+        </w:rPr>
+      </w:pPr>
+      <w:r>
+        <w:rPr>
+          <w:rStyle w:val="CommentReference"/>
+        </w:rPr>
+        <w:annotationRef/>
+      </w:r>
+      <w:r>
+        <w:rPr>
+          <w:noProof/>
+          <w:lang w:val="en-GB"/>
+        </w:rPr>
+        <w:t>e</w:t>
+      </w:r>
+      <w:r>
+        <w:rPr>
+          <w:noProof/>
+          <w:lang w:val="en-GB"/>
+        </w:rPr>
+        <w:t>nsure n</w:t>
+      </w:r>
+      <w:r>
+        <w:rPr>
+          <w:noProof/>
+          <w:lang w:val="en-GB"/>
+        </w:rPr>
+        <w:t>owhere in</w:t>
+      </w:r>
+      <w:r>
+        <w:rPr>
+          <w:noProof/>
+          <w:lang w:val="en-GB"/>
+        </w:rPr>
+        <w:t xml:space="preserve"> text does it say somet</w:t>
+      </w:r>
+      <w:r>
+        <w:rPr>
+          <w:noProof/>
+          <w:lang w:val="en-GB"/>
+        </w:rPr>
+        <w:t>h</w:t>
+      </w:r>
+      <w:r>
+        <w:rPr>
+          <w:noProof/>
+          <w:lang w:val="en-GB"/>
+        </w:rPr>
+        <w:t xml:space="preserve">ing similar to chatgpt talking to </w:t>
+      </w:r>
+      <w:r>
+        <w:rPr>
+          <w:noProof/>
+          <w:lang w:val="en-GB"/>
+        </w:rPr>
+        <w:t xml:space="preserve">the author </w:t>
+      </w:r>
+      <w:r>
+        <w:rPr>
+          <w:noProof/>
+          <w:lang w:val="en-GB"/>
+        </w:rPr>
+        <w:t>, like:</w:t>
+      </w:r>
+    </w:p>
+    <w:p>
+      <w:pPr>
+        <w:pStyle w:val="CommentText"/>
+        <w:rPr>
+          <w:lang w:val="ru-RU"/>
+        </w:rPr>
+      </w:pPr>
+      <w:r>
+        <w:rPr>
+          <w:noProof/>
+          <w:lang w:val="ru-RU"/>
+        </w:rPr>
+        <w:t xml:space="preserve">&gt; </w:t>
+      </w:r>
+      <w:r>
+        <w:rPr>
+          <w:noProof/>
+        </w:rPr>
+        <w:t>Твоя интуиция в вопросе «почему embeddings — это</w:t>
+      </w:r>
+      <w:r>
+        <w:rPr>
+          <w:noProof/>
+        </w:rPr>
+        <w:t>...</w:t>
+      </w:r>
+    </w:p>
+  </w:comment>
+  <w:comment w:id="134" w:author="Deniss" w:date="2026-04-18T13:32:00Z" w:initials="D">
+    <w:p>
+      <w:pPr>
+        <w:pStyle w:val="CommentText"/>
+      </w:pPr>
+      <w:r>
+        <w:rPr>
+          <w:rStyle w:val="CommentReference"/>
+        </w:rPr>
+        <w:annotationRef/>
+      </w:r>
+      <w:r>
+        <w:t>В эксперименте обучается одна LSTM-модель на общий набор окон, собранных из всех групп. Это можно наблюдать в методе build_samples, который формирует x и y сразу по всем группам, после чего функция train_model обучает одну модель на этом объединённом наборе. Идея такого подхода заключается в том, что при малой длине отдельных временных рядов обучение отдельной модели на каждую группу может привести к недостаточному количеству обучающих примеров, тогда как объединённый (pooled) подход позволяет использовать информацию всех рядов и выявлять общие закономерности (Bandara et al., 2020).</w:t>
+      </w:r>
+    </w:p>
+    <w:p>
+      <w:pPr>
+        <w:pStyle w:val="CommentText"/>
+      </w:pPr>
+    </w:p>
+    <w:p>
+      <w:pPr>
+        <w:pStyle w:val="CommentText"/>
+      </w:pPr>
+      <w:r>
+        <w:t>Однако при таком подходе модель нельзя оставлять полностью без информации о том, кому принадлежит временный ряд. При обучении на наборе разнородных временных рядов, объедененных в один сет, возможно снижение точности, поскольку модель не сможет различить эти группы - она окажется недостаточно адаптированной к конкретным сериям (Bandara et al., 2020; Abbasimehr et al., 2025). И тогда вместо отдельных, она выяви усреднённые зависимости и будет хуже прогнозировать отдельный группы. Чтобы решить эту проблему, нужно было как-то научить модель различать группы, например, через кластеризацию или через дополнительные признаки (Abbasimehr et al., 2025).</w:t>
       </w:r>
     </w:p>
   </w:comment>
@@ -26627,6 +29087,11 @@
   <w15:commentEx w15:paraId="06196FAB" w15:done="0"/>
   <w15:commentEx w15:paraId="11357A3C" w15:done="0"/>
   <w15:commentEx w15:paraId="2C43CE4E" w15:done="0"/>
+  <w15:commentEx w15:paraId="33DAD0EE" w15:done="0"/>
+  <w15:commentEx w15:paraId="77A9C5F6" w15:done="0"/>
+  <w15:commentEx w15:paraId="4D603B1C" w15:done="0"/>
+  <w15:commentEx w15:paraId="16AE505C" w15:done="0"/>
+  <w15:commentEx w15:paraId="20A3F0A7" w15:done="0"/>
 </w15:commentsEx>
 </file>
 
@@ -26740,6 +29205,11 @@
   <w16cex:commentExtensible w16cex:durableId="353F1965" w16cex:dateUtc="2026-04-15T19:30:00Z"/>
   <w16cex:commentExtensible w16cex:durableId="03C60A12" w16cex:dateUtc="2026-04-17T13:08:00Z"/>
   <w16cex:commentExtensible w16cex:durableId="03FF88AE" w16cex:dateUtc="2026-04-17T13:11:00Z"/>
+  <w16cex:commentExtensible w16cex:durableId="3A306151" w16cex:dateUtc="2026-04-17T13:44:00Z"/>
+  <w16cex:commentExtensible w16cex:durableId="161BD9B7" w16cex:dateUtc="2026-04-18T08:55:00Z"/>
+  <w16cex:commentExtensible w16cex:durableId="5A6B6D5D" w16cex:dateUtc="2026-04-18T09:47:00Z"/>
+  <w16cex:commentExtensible w16cex:durableId="5359CF5B" w16cex:dateUtc="2026-04-18T10:36:00Z"/>
+  <w16cex:commentExtensible w16cex:durableId="3845BB17" w16cex:dateUtc="2026-04-18T10:32:00Z"/>
 </w16cex:commentsExtensible>
 </file>
 
@@ -26853,6 +29323,11 @@
   <w16cid:commentId w16cid:paraId="06196FAB" w16cid:durableId="353F1965"/>
   <w16cid:commentId w16cid:paraId="11357A3C" w16cid:durableId="03C60A12"/>
   <w16cid:commentId w16cid:paraId="2C43CE4E" w16cid:durableId="03FF88AE"/>
+  <w16cid:commentId w16cid:paraId="33DAD0EE" w16cid:durableId="3A306151"/>
+  <w16cid:commentId w16cid:paraId="77A9C5F6" w16cid:durableId="161BD9B7"/>
+  <w16cid:commentId w16cid:paraId="4D603B1C" w16cid:durableId="5A6B6D5D"/>
+  <w16cid:commentId w16cid:paraId="16AE505C" w16cid:durableId="5359CF5B"/>
+  <w16cid:commentId w16cid:paraId="20A3F0A7" w16cid:durableId="3845BB17"/>
 </w16cid:commentsIds>
 </file>
 
@@ -30648,6 +33123,27 @@
   </w:num>
   <w:num w:numId="47" w16cid:durableId="535969338">
     <w:abstractNumId w:val="28"/>
+  </w:num>
+  <w:num w:numId="48" w16cid:durableId="1010451416">
+    <w:abstractNumId w:val="24"/>
+    <w:lvlOverride w:ilvl="0">
+      <w:startOverride w:val="1"/>
+    </w:lvlOverride>
+  </w:num>
+  <w:num w:numId="49" w16cid:durableId="143813488">
+    <w:abstractNumId w:val="24"/>
+    <w:lvlOverride w:ilvl="0">
+      <w:startOverride w:val="1"/>
+    </w:lvlOverride>
+  </w:num>
+  <w:num w:numId="50" w16cid:durableId="1745684788">
+    <w:abstractNumId w:val="24"/>
+  </w:num>
+  <w:num w:numId="51" w16cid:durableId="17393249">
+    <w:abstractNumId w:val="24"/>
+    <w:lvlOverride w:ilvl="0">
+      <w:startOverride w:val="1"/>
+    </w:lvlOverride>
   </w:num>
 </w:numbering>
 </file>
@@ -31805,7 +34301,6 @@
       <w:numPr>
         <w:numId w:val="6"/>
       </w:numPr>
-      <w:ind w:left="567"/>
       <w:contextualSpacing w:val="0"/>
     </w:pPr>
   </w:style>
@@ -36922,6 +39417,7 @@
     <w:sig w:usb0="00000287" w:usb1="00000800" w:usb2="00000000" w:usb3="00000000" w:csb0="0000009F" w:csb1="00000000"/>
   </w:font>
   <w:font w:name="MS Mincho">
+    <w:altName w:val="ＭＳ 明朝"/>
     <w:panose1 w:val="02020609040205080304"/>
     <w:charset w:val="80"/>
     <w:family w:val="modern"/>
@@ -36993,6 +39489,7 @@
     <w:rsid w:val="000D7113"/>
     <w:rsid w:val="001479B5"/>
     <w:rsid w:val="001548F8"/>
+    <w:rsid w:val="00172FB8"/>
     <w:rsid w:val="002203B8"/>
     <w:rsid w:val="00220E7B"/>
     <w:rsid w:val="00227D8C"/>
@@ -37009,6 +39506,7 @@
     <w:rsid w:val="006C7BD9"/>
     <w:rsid w:val="0070464B"/>
     <w:rsid w:val="007172EC"/>
+    <w:rsid w:val="0073281C"/>
     <w:rsid w:val="0080198C"/>
     <w:rsid w:val="008319B5"/>
     <w:rsid w:val="008A10C8"/>
@@ -37018,6 +39516,8 @@
     <w:rsid w:val="00B003D8"/>
     <w:rsid w:val="00B62A4C"/>
     <w:rsid w:val="00B83BC5"/>
+    <w:rsid w:val="00BA098C"/>
+    <w:rsid w:val="00BA442B"/>
     <w:rsid w:val="00BE55BF"/>
     <w:rsid w:val="00BF37F9"/>
     <w:rsid w:val="00C37405"/>
@@ -37028,7 +39528,6 @@
     <w:rsid w:val="00D05816"/>
     <w:rsid w:val="00D7095D"/>
     <w:rsid w:val="00D8221B"/>
-    <w:rsid w:val="00DE24C2"/>
     <w:rsid w:val="00E55A00"/>
     <w:rsid w:val="00ED6C9D"/>
     <w:rsid w:val="00F425CE"/>
@@ -37488,7 +39987,7 @@
     <w:basedOn w:val="DefaultParagraphFont"/>
     <w:uiPriority w:val="99"/>
     <w:semiHidden/>
-    <w:rsid w:val="00CA5316"/>
+    <w:rsid w:val="0073281C"/>
     <w:rPr>
       <w:color w:val="666666"/>
     </w:rPr>
@@ -37978,7 +40477,7 @@
     <b:Year>2001</b:Year>
     <b:DOI>10.1016/S0925-5273(00)00109-2</b:DOI>
     <b:URL>https://doi.org/10.1016/S0925-5273(00)00109-2</b:URL>
-    <b:RefOrder>27</b:RefOrder>
+    <b:RefOrder>30</b:RefOrder>
   </b:Source>
   <b:Source>
     <b:Tag>Lee2012HybridAISalesForecasting</b:Tag>
@@ -38008,7 +40507,7 @@
     <b:Pages>188-196</b:Pages>
     <b:DOI>10.1002/hfm.20272</b:DOI>
     <b:URL>https://doi.org/10.1002/hfm.20272</b:URL>
-    <b:RefOrder>28</b:RefOrder>
+    <b:RefOrder>31</b:RefOrder>
   </b:Source>
   <b:Source>
     <b:Tag>MullerNavarra2015SalesForecastingPRNN</b:Tag>
@@ -38064,7 +40563,7 @@
     <b:Pages>1-7</b:Pages>
     <b:DOI>10.1109/IACIS65746.2025.11211065</b:DOI>
     <b:URL>https://doi.org/10.1109/IACIS65746.2025.11211065</b:URL>
-    <b:RefOrder>29</b:RefOrder>
+    <b:RefOrder>32</b:RefOrder>
   </b:Source>
   <b:Source>
     <b:Tag>Pongdatu2018SeasonalTimeSeries</b:Tag>
@@ -38156,7 +40655,7 @@
     <b:Pages>e14724</b:Pages>
     <b:DOI>10.1590/1806-9649-2025v32e14724</b:DOI>
     <b:URL>https://doi.org/10.1590/1806-9649-2025v32e14724</b:URL>
-    <b:RefOrder>30</b:RefOrder>
+    <b:RefOrder>33</b:RefOrder>
   </b:Source>
   <b:Source>
     <b:Tag>Sirisha2022ProfitPrediction</b:Tag>
@@ -38739,11 +41238,104 @@
     <b:DOI>10.1145/3377930.3390237</b:DOI>
     <b:RefOrder>26</b:RefOrder>
   </b:Source>
+  <b:Source>
+    <b:Tag>Ban20</b:Tag>
+    <b:SourceType>JournalArticle</b:SourceType>
+    <b:Guid>{578300FC-AF68-4028-BCED-873687A7524F}</b:Guid>
+    <b:Title>Forecasting across time series databases using recurrent neural networks on groups of similar series: A clustering approach</b:Title>
+    <b:JournalName>Expert Systems With Applications</b:JournalName>
+    <b:Year>2020</b:Year>
+    <b:Author>
+      <b:Author>
+        <b:NameList>
+          <b:Person>
+            <b:Last>Bandara</b:Last>
+            <b:First>Kasun</b:First>
+          </b:Person>
+          <b:Person>
+            <b:Last>Bergmeir</b:Last>
+            <b:First>Christoph</b:First>
+          </b:Person>
+          <b:Person>
+            <b:Last>Smyl</b:Last>
+            <b:First>Slawek</b:First>
+          </b:Person>
+        </b:NameList>
+      </b:Author>
+    </b:Author>
+    <b:Volume>140</b:Volume>
+    <b:DOI>10.1016/j.eswa.2019.112896</b:DOI>
+    <b:RefOrder>27</b:RefOrder>
+  </b:Source>
+  <b:Source>
+    <b:Tag>Abb25</b:Tag>
+    <b:SourceType>JournalArticle</b:SourceType>
+    <b:Guid>{B3822E9B-35C8-4E65-9886-0688AF7C7AF6}</b:Guid>
+    <b:JournalName>Neurocomputing</b:JournalName>
+    <b:Year>2025</b:Year>
+    <b:Author>
+      <b:Author>
+        <b:NameList>
+          <b:Person>
+            <b:Last>Abbasimehr</b:Last>
+            <b:First>Hossein </b:First>
+          </b:Person>
+          <b:Person>
+            <b:Last>Abri</b:Last>
+            <b:First>Alireza </b:First>
+          </b:Person>
+          <b:Person>
+            <b:Last>Oskouei</b:Last>
+            <b:Middle>Golzari </b:Middle>
+            <b:First>Amin </b:First>
+          </b:Person>
+          <b:Person>
+            <b:Last>Noshad</b:Last>
+            <b:First>Ali </b:First>
+          </b:Person>
+        </b:NameList>
+      </b:Author>
+    </b:Author>
+    <b:Volume>653</b:Volume>
+    <b:DOI>10.1016/j.neucom.2025.131183</b:DOI>
+    <b:Title>Multi-view clustering for localized global time series forecasting</b:Title>
+    <b:RefOrder>28</b:RefOrder>
+  </b:Source>
+  <b:Source>
+    <b:Tag>San26</b:Tag>
+    <b:SourceType>JournalArticle</b:SourceType>
+    <b:Guid>{ACF58F86-6703-4649-AD42-BD7F0D1EE045}</b:Guid>
+    <b:Title>GLEm-Net: Unified framework for data reduction with categorical and numerical features</b:Title>
+    <b:JournalName>Knowledge-Based Systems</b:JournalName>
+    <b:Year>2026</b:Year>
+    <b:Author>
+      <b:Author>
+        <b:NameList>
+          <b:Person>
+            <b:Last>Santis</b:Last>
+            <b:Middle>De </b:Middle>
+            <b:First>Francesco </b:First>
+          </b:Person>
+          <b:Person>
+            <b:Last>Giordano</b:Last>
+            <b:First>Danilo </b:First>
+          </b:Person>
+          <b:Person>
+            <b:Last>Mellia</b:Last>
+            <b:First>Marco </b:First>
+          </b:Person>
+        </b:NameList>
+      </b:Author>
+    </b:Author>
+    <b:Volume>334</b:Volume>
+    <b:DOI>10.1016/j.knosys.2025.115049</b:DOI>
+    <b:RefOrder>29</b:RefOrder>
+  </b:Source>
 </b:Sources>
 </file>
 
 <file path=customXml/itemProps1.xml><?xml version="1.0" encoding="utf-8"?>
-<ds:datastoreItem xmlns:ds="http://schemas.openxmlformats.org/officeDocument/2006/customXml" ds:itemID="{D18CBB63-CB7E-40E0-9D12-62AC6AB8878E}">
+<ds:datastoreItem xmlns:ds="http://schemas.openxmlformats.org/officeDocument/2006/customXml" ds:itemID="{8209F098-B1EA-4CEE-83DC-3A0CED357C2D}">
   <ds:schemaRefs>
     <ds:schemaRef ds:uri="http://schemas.openxmlformats.org/officeDocument/2006/bibliography"/>
   </ds:schemaRefs>

</xml_diff>

<commit_message>
75%: 19.04.2026 thesis backup, 6.1 finished
</commit_message>
<xml_diff>
--- a/Deniss Grabovskis 231RDB217.docx
+++ b/Deniss Grabovskis 231RDB217.docx
@@ -13194,14 +13194,7 @@
             <w:rFonts w:ascii="Cambria Math" w:hAnsi="Cambria Math"/>
             <w:lang w:val="it-IT"/>
           </w:rPr>
-          <m:t>AIC</m:t>
-        </m:r>
-        <m:r>
-          <w:rPr>
-            <w:rFonts w:ascii="Cambria Math" w:hAnsi="Cambria Math"/>
-            <w:lang w:val="it-IT"/>
-          </w:rPr>
-          <m:t>=-2</m:t>
+          <m:t>AIC=-2</m:t>
         </m:r>
         <m:func>
           <m:funcPr>
@@ -13229,14 +13222,7 @@
                 <w:rFonts w:ascii="Cambria Math" w:hAnsi="Cambria Math"/>
                 <w:lang w:val="it-IT"/>
               </w:rPr>
-              <m:t>L</m:t>
-            </m:r>
-            <m:r>
-              <w:rPr>
-                <w:rFonts w:ascii="Cambria Math" w:hAnsi="Cambria Math"/>
-                <w:lang w:val="it-IT"/>
-              </w:rPr>
-              <m:t>(</m:t>
+              <m:t>L(</m:t>
             </m:r>
             <m:acc>
               <m:accPr>
@@ -13264,14 +13250,7 @@
                 <w:rFonts w:ascii="Cambria Math" w:hAnsi="Cambria Math"/>
                 <w:lang w:val="it-IT"/>
               </w:rPr>
-              <m:t>)+2</m:t>
-            </m:r>
-            <m:r>
-              <w:rPr>
-                <w:rFonts w:ascii="Cambria Math" w:hAnsi="Cambria Math"/>
-                <w:lang w:val="it-IT"/>
-              </w:rPr>
-              <m:t>K</m:t>
+              <m:t>)+2K</m:t>
             </m:r>
           </m:e>
         </m:func>
@@ -20614,9 +20593,6 @@
     <w:p>
       <w:pPr>
         <w:pStyle w:val="Teksts"/>
-        <w:rPr>
-          <w:lang w:val="ru-RU"/>
-        </w:rPr>
       </w:pPr>
       <w:r>
         <w:t>Tika izvēlēta trešā pieeja</w:t>
@@ -20809,7 +20785,7 @@
       <w:pPr>
         <w:pStyle w:val="Teksts"/>
         <w:rPr>
-          <w:lang w:val="ru-RU"/>
+          <w:lang w:val="en-GB"/>
         </w:rPr>
       </w:pPr>
       <w:r>
@@ -20875,10 +20851,7 @@
         <w:t>nn.LSTM(input_size=feature_count, hidden_size=16, batch_first=True)</w:t>
       </w:r>
       <w:r>
-        <w:t>. M</w:t>
-      </w:r>
-      <w:r>
-        <w:t>odelei ir</w:t>
+        <w:t>. Modelei ir</w:t>
       </w:r>
       <w:r>
         <w:t xml:space="preserve"> viens slānis. T</w:t>
@@ -20967,9 +20940,6 @@
     <w:p>
       <w:pPr>
         <w:pStyle w:val="Teksts"/>
-        <w:rPr>
-          <w:lang w:val="ru-RU"/>
-        </w:rPr>
       </w:pPr>
       <w:commentRangeStart w:id="135"/>
       <w:r>
@@ -21062,13 +21032,7 @@
         <w:t xml:space="preserve"> </w:t>
       </w:r>
       <w:r>
-        <w:t>Pēc tam</w:t>
-      </w:r>
-      <w:r>
-        <w:t xml:space="preserve"> </w:t>
-      </w:r>
-      <w:r>
-        <w:t>tiek inicializēts Adam optimizētājs (kas</w:t>
+        <w:t>Pēc tam tiek inicializēts Adam optimizētājs (kas</w:t>
       </w:r>
       <w:r>
         <w:t>, ka jau bija teikts,</w:t>
@@ -21161,9 +21125,6 @@
     <w:p>
       <w:pPr>
         <w:pStyle w:val="Teksts"/>
-        <w:rPr>
-          <w:lang w:val="ru-RU"/>
-        </w:rPr>
       </w:pPr>
       <w:r>
         <w:t xml:space="preserve">Pēc apmācības pabeigšanas tiek izpildīta funkcija </w:t>
@@ -22033,30 +21994,781 @@
       <w:pPr>
         <w:pStyle w:val="2-lm-virsraksts"/>
       </w:pPr>
+      <w:commentRangeStart w:id="136"/>
       <w:r>
         <w:t>Metožu salīdzinājums un starpsecinājumi</w:t>
       </w:r>
+      <w:commentRangeEnd w:id="136"/>
+      <w:r>
+        <w:rPr>
+          <w:rStyle w:val="CommentReference"/>
+          <w:sz w:val="28"/>
+          <w:szCs w:val="28"/>
+        </w:rPr>
+        <w:commentReference w:id="136"/>
+      </w:r>
     </w:p>
     <w:p>
       <w:pPr>
         <w:pStyle w:val="Teksts"/>
       </w:pPr>
+      <w:commentRangeStart w:id="137"/>
+      <w:r>
+        <w:t>1. lstm is NOT better, naive is the best</w:t>
+      </w:r>
+      <w:commentRangeEnd w:id="137"/>
+      <w:r>
+        <w:rPr>
+          <w:rStyle w:val="CommentReference"/>
+          <w:sz w:val="24"/>
+          <w:szCs w:val="24"/>
+        </w:rPr>
+        <w:commentReference w:id="137"/>
+      </w:r>
     </w:p>
     <w:p>
       <w:pPr>
         <w:pStyle w:val="Teksts"/>
       </w:pPr>
+      <w:r>
+        <w:t xml:space="preserve">  on this limited dataset, no stable superiority of LSTM over classical baselines was observed; </w:t>
+      </w:r>
+    </w:p>
+    <w:p>
+      <w:pPr>
+        <w:pStyle w:val="Teksts"/>
+      </w:pPr>
+      <w:r>
+        <w:t xml:space="preserve">  SES was more competitive than expected; </w:t>
+      </w:r>
+    </w:p>
+    <w:p>
+      <w:pPr>
+        <w:pStyle w:val="Teksts"/>
+      </w:pPr>
+      <w:r>
+        <w:t xml:space="preserve">  none of the tested methods showed a consistent practical advantage over the naive baseline; </w:t>
+      </w:r>
+    </w:p>
+    <w:p>
+      <w:pPr>
+        <w:pStyle w:val="Teksts"/>
+        <w:rPr>
+          <w:lang w:val="en-GB"/>
+        </w:rPr>
+      </w:pPr>
+      <w:r>
+        <w:t>  therefore, for the current company data, the hypothesis that LSTM gives a better monthly demand forecast is not confirmed</w:t>
+      </w:r>
+    </w:p>
+    <w:p>
+      <w:pPr>
+        <w:pStyle w:val="1-lm-numurts-virsraksts"/>
+        <w:rPr>
+          <w:lang w:val="en-GB"/>
+        </w:rPr>
+      </w:pPr>
+      <w:commentRangeStart w:id="138"/>
+      <w:r>
+        <w:rPr>
+          <w:lang w:val="en-GB"/>
+        </w:rPr>
+        <w:lastRenderedPageBreak/>
+        <w:t>Sintētisk</w:t>
+      </w:r>
+      <w:r>
+        <w:rPr>
+          <w:lang w:val="en-GB"/>
+        </w:rPr>
+        <w:t>ā</w:t>
+      </w:r>
+      <w:r>
+        <w:rPr>
+          <w:lang w:val="en-GB"/>
+        </w:rPr>
+        <w:t xml:space="preserve"> datu palielināšana</w:t>
+      </w:r>
+      <w:commentRangeEnd w:id="138"/>
+      <w:r>
+        <w:rPr>
+          <w:rStyle w:val="CommentReference"/>
+          <w:sz w:val="28"/>
+          <w:szCs w:val="28"/>
+          <w:lang w:val="en-GB"/>
+        </w:rPr>
+        <w:commentReference w:id="138"/>
+      </w:r>
+    </w:p>
+    <w:p>
+      <w:pPr>
+        <w:pStyle w:val="Teksts"/>
+      </w:pPr>
+      <w:r>
+        <w:t xml:space="preserve">Sākotnējais eksperiments, kas tika veikts 5. sadaļā, pilnībā neapstiprināja LSTM modeļa pārākumu. </w:t>
+      </w:r>
+      <w:r>
+        <w:t>Tas nav dēļ tā</w:t>
+      </w:r>
+      <w:r>
+        <w:t xml:space="preserve">, ka neironu pieeja nav piemērota pieprasījuma prognozēšanai, bet gan </w:t>
+      </w:r>
+      <w:r>
+        <w:t xml:space="preserve">dēļ tas, kas jau bija iepriekš teikts: </w:t>
+      </w:r>
+      <w:r>
+        <w:t xml:space="preserve">pašreizējais datu kopums ir pārāk nepilnīgs un vāji sezonāls, lai šāds modelis varētu pilnībā parādīt sevi. Citiem vārdiem sakot, tā neveiksme galvenokārt tiek attiecināta uz </w:t>
+      </w:r>
+      <w:r>
+        <w:t>datu</w:t>
+      </w:r>
+      <w:r>
+        <w:t xml:space="preserve"> specifiku. Laika rindu papildināšanas pētījumi norāda, ka dziļās mācīšanās metodes ir jutīgas pret apmācības kopas lielumu. Prognozēšanā papildināšana ir pierādījusi savu noderīgāku rezultātu, ja pieejamie dati ir ierobežoti. Tiek arī uzsvērts, ka laika rindu papildināšana nav universāls risinājums, jo katram datu kopumam ir sava struktūra, un papildināšanas metodes ir jāizvērtē, ņemot vērā konkrēto uzdevumu un datus</w:t>
+      </w:r>
+      <w:r>
+        <w:t xml:space="preserve"> </w:t>
+      </w:r>
+      <w:sdt>
+        <w:sdtPr>
+          <w:id w:val="-2102866279"/>
+          <w:citation/>
+        </w:sdtPr>
+        <w:sdtContent>
+          <w:r>
+            <w:fldChar w:fldCharType="begin"/>
+          </w:r>
+          <w:r>
+            <w:instrText xml:space="preserve"> CITATION Wen21 \l 1062 </w:instrText>
+          </w:r>
+          <w:r>
+            <w:fldChar w:fldCharType="separate"/>
+          </w:r>
+          <w:r>
+            <w:rPr>
+              <w:noProof/>
+            </w:rPr>
+            <w:t>(Wen, u.c., 2021)</w:t>
+          </w:r>
+          <w:r>
+            <w:fldChar w:fldCharType="end"/>
+          </w:r>
+        </w:sdtContent>
+      </w:sdt>
+      <w:r>
+        <w:t>. Tāpēc šajā nodaļā autors nemēģina pierādīt, ka sintētiskie dati kopumā uzlabo prognozēšanu, bet gan izvirza izaicinājumu uzlabot prognozēšanas kvalitāti, testējot dažādas izvēlētas papildināšanas procedūras pašreizējā datu kopā līdz šim veiktajā ieviešanā.</w:t>
+      </w:r>
+    </w:p>
+    <w:p>
+      <w:pPr>
+        <w:pStyle w:val="Teksts"/>
+      </w:pPr>
+      <w:r>
+        <w:t xml:space="preserve">Tas, ka naivā prognoze bija spēcīgākais etalons </w:t>
+      </w:r>
+      <w:r>
+        <w:t>šī</w:t>
+      </w:r>
+      <w:r>
+        <w:t xml:space="preserve"> eksperimentā, ir svarīgi </w:t>
+      </w:r>
+      <w:r>
+        <w:t>zināt, spriežot par pašreizējo</w:t>
+      </w:r>
+      <w:r>
+        <w:t xml:space="preserve"> datu kopum</w:t>
+      </w:r>
+      <w:r>
+        <w:t>u</w:t>
+      </w:r>
+      <w:r>
+        <w:t>, taču to nevajadzētu vispārināt pārāk plaši. Liela mēroga mazumtirdzniecības pierādījumi liecina, ka naivās metodes parasti nav spēcīgākais prognozēšanas risinājums: M5 mazumtirdzniecības prognozēšanas konkurencē naivās metodes bija ievērojami mazāk precīzākas nekā citas etalona metodes, un sezonalitāte tika atzīta par kritisku faktoru prognožu precizitātes uzlabošanā</w:t>
+      </w:r>
+      <w:r>
+        <w:t xml:space="preserve"> </w:t>
+      </w:r>
+      <w:sdt>
+        <w:sdtPr>
+          <w:id w:val="-1282715431"/>
+          <w:citation/>
+        </w:sdtPr>
+        <w:sdtContent>
+          <w:r>
+            <w:fldChar w:fldCharType="begin"/>
+          </w:r>
+          <w:r>
+            <w:instrText xml:space="preserve"> CITATION Mak22 \l 1062 </w:instrText>
+          </w:r>
+          <w:r>
+            <w:fldChar w:fldCharType="separate"/>
+          </w:r>
+          <w:r>
+            <w:rPr>
+              <w:noProof/>
+            </w:rPr>
+            <w:t>(Makridakis, Spiliotis, &amp; Vassilios Assimakopoulos, 2022)</w:t>
+          </w:r>
+          <w:r>
+            <w:fldChar w:fldCharType="end"/>
+          </w:r>
+        </w:sdtContent>
+      </w:sdt>
+      <w:r>
+        <w:t>. Citos pielietotajos pārdošanas prognozēšanas apstākļos mašīnmācīšanās metodes ir pārspējušas noteiktos etalonus, ja bija pieejami bagātīgāki pieprasījuma modeļi vai papildu skaidrojošie mainīgie (piemēram, daudzveidīgāka periodiska pieprasījuma vēsture)</w:t>
+      </w:r>
+      <w:r>
+        <w:t xml:space="preserve"> </w:t>
+      </w:r>
+      <w:sdt>
+        <w:sdtPr>
+          <w:id w:val="-1555774182"/>
+          <w:citation/>
+        </w:sdtPr>
+        <w:sdtContent>
+          <w:r>
+            <w:fldChar w:fldCharType="begin"/>
+          </w:r>
+          <w:r>
+            <w:instrText xml:space="preserve"> CITATION Rib22 \l 1062 </w:instrText>
+          </w:r>
+          <w:r>
+            <w:fldChar w:fldCharType="separate"/>
+          </w:r>
+          <w:r>
+            <w:rPr>
+              <w:noProof/>
+            </w:rPr>
+            <w:t>(Ribeiro &amp; de Castro, 2022)</w:t>
+          </w:r>
+          <w:r>
+            <w:fldChar w:fldCharType="end"/>
+          </w:r>
+        </w:sdtContent>
+      </w:sdt>
+      <w:r>
+        <w:t>. Tāpēc naivās metodes dominance šajā darbā tiek attiecināta uz pieejamo uzņēmumu datu ierobežojumiem.</w:t>
+      </w:r>
+    </w:p>
+    <w:p>
+      <w:pPr>
+        <w:pStyle w:val="2-lm-virsraksts"/>
+      </w:pPr>
+      <w:r>
+        <w:t>Iespējamās palielināšanas pieejas</w:t>
+      </w:r>
+    </w:p>
+    <w:p>
+      <w:pPr>
+        <w:pStyle w:val="Teksts"/>
+      </w:pPr>
+      <w:r>
+        <w:t xml:space="preserve">Vienkāršākā ideja ir ģenerēt papildu vērtības no novēroto datu empīriskā sadalījuma, piemēram, izmantojot vidējo vērtību un standartnovirzi. Lai gan šādu risinājumu ir viegli ieviest, tas ir vājš kā uz prognozēšanu orientēta papildināšanas stratēģija. Laikrindu papildināšanas aptaujas apraksta Gausa trokšņa </w:t>
+      </w:r>
+      <w:r>
+        <w:t>pieeju</w:t>
+      </w:r>
+      <w:r>
+        <w:t xml:space="preserve"> kā vienu no </w:t>
+      </w:r>
+      <w:r>
+        <w:lastRenderedPageBreak/>
+        <w:t>vienkāršākajām papildināšanas metodēm, taču tās arī atzīmē, ka tā var novest pie negatīvas mācīšanās, jo tā nesaglabā laika atkarību, tādējādi var ģenerēt nederīgus laika rindu paraugus. Un, tā kā prognozēšanas modelim ir jāapgūst šī laika nepārtrauktība, tās trūkums novedīs pie sliktākām prognozēm</w:t>
+      </w:r>
+      <w:r>
+        <w:t xml:space="preserve"> </w:t>
+      </w:r>
+      <w:sdt>
+        <w:sdtPr>
+          <w:id w:val="2058505883"/>
+          <w:citation/>
+        </w:sdtPr>
+        <w:sdtContent>
+          <w:r>
+            <w:fldChar w:fldCharType="begin"/>
+          </w:r>
+          <w:r>
+            <w:instrText xml:space="preserve"> CITATION Igl23 \l 1062 </w:instrText>
+          </w:r>
+          <w:r>
+            <w:fldChar w:fldCharType="separate"/>
+          </w:r>
+          <w:r>
+            <w:rPr>
+              <w:noProof/>
+            </w:rPr>
+            <w:t>(Iglesias, Talavera, González-Prieto, Mozo, &amp; Gómez-Canaval , 2023)</w:t>
+          </w:r>
+          <w:r>
+            <w:fldChar w:fldCharType="end"/>
+          </w:r>
+        </w:sdtContent>
+      </w:sdt>
+      <w:r>
+        <w:t>. Šī iemesla dēļ tieša Gausa populācija, netika izvēlēta kā papildināšanas metode.</w:t>
+      </w:r>
+      <w:r>
+        <w:tab/>
+      </w:r>
+    </w:p>
+    <w:p>
+      <w:pPr>
+        <w:pStyle w:val="Teksts"/>
+      </w:pPr>
+      <w:r>
+        <w:t>Cits prognozēšanas pētījums ir parādījis, ka papildināšana, apvienojot sākotnējās sērijas vai palielinot to daļu izlasi</w:t>
+      </w:r>
+      <w:r>
+        <w:t xml:space="preserve"> </w:t>
+      </w:r>
+      <w:sdt>
+        <w:sdtPr>
+          <w:id w:val="-747034100"/>
+          <w:citation/>
+        </w:sdtPr>
+        <w:sdtContent>
+          <w:r>
+            <w:fldChar w:fldCharType="begin"/>
+          </w:r>
+          <w:r>
+            <w:instrText xml:space="preserve"> CITATION Sem23 \l 1062 </w:instrText>
+          </w:r>
+          <w:r>
+            <w:fldChar w:fldCharType="separate"/>
+          </w:r>
+          <w:r>
+            <w:rPr>
+              <w:noProof/>
+            </w:rPr>
+            <w:t>(Semenoglou, Spiliotis, &amp; Assimakopoulos, 2023)</w:t>
+          </w:r>
+          <w:r>
+            <w:fldChar w:fldCharType="end"/>
+          </w:r>
+        </w:sdtContent>
+      </w:sdt>
+      <w:r>
+        <w:t>, var uzlabot neironu prognozēšanas veiktspēju. Pārveidojot jau novērotos logus, eksperiments var palielināt apmācības piemēru skaitu, saglabājot spēcīgāku saikni ar sākotnējiem datiem, nekā nodrošinātu tikai uz sadalījumu balstīts ģenerators</w:t>
+      </w:r>
+      <w:r>
+        <w:t xml:space="preserve"> </w:t>
+      </w:r>
+      <w:r>
+        <w:t xml:space="preserve"> </w:t>
+      </w:r>
+      <w:sdt>
+        <w:sdtPr>
+          <w:id w:val="55216775"/>
+          <w:citation/>
+        </w:sdtPr>
+        <w:sdtContent>
+          <w:r>
+            <w:fldChar w:fldCharType="begin"/>
+          </w:r>
+          <w:r>
+            <w:instrText xml:space="preserve"> CITATION Sem23 \l 1062 </w:instrText>
+          </w:r>
+          <w:r>
+            <w:fldChar w:fldCharType="separate"/>
+          </w:r>
+          <w:r>
+            <w:rPr>
+              <w:noProof/>
+            </w:rPr>
+            <w:t>(Semenoglou, Spiliotis, &amp; Assimakopoulos, 2023)</w:t>
+          </w:r>
+          <w:r>
+            <w:fldChar w:fldCharType="end"/>
+          </w:r>
+        </w:sdtContent>
+      </w:sdt>
+      <w:r>
+        <w:t xml:space="preserve"> </w:t>
+      </w:r>
+      <w:sdt>
+        <w:sdtPr>
+          <w:id w:val="-1845773404"/>
+          <w:citation/>
+        </w:sdtPr>
+        <w:sdtContent>
+          <w:r>
+            <w:fldChar w:fldCharType="begin"/>
+          </w:r>
+          <w:r>
+            <w:instrText xml:space="preserve"> CITATION Wen21 \l 1062 </w:instrText>
+          </w:r>
+          <w:r>
+            <w:fldChar w:fldCharType="separate"/>
+          </w:r>
+          <w:r>
+            <w:rPr>
+              <w:noProof/>
+            </w:rPr>
+            <w:t>(Wen, u.c., 2021)</w:t>
+          </w:r>
+          <w:r>
+            <w:fldChar w:fldCharType="end"/>
+          </w:r>
+        </w:sdtContent>
+      </w:sdt>
+      <w:r>
+        <w:t xml:space="preserve">. </w:t>
+      </w:r>
+    </w:p>
+    <w:p>
+      <w:pPr>
+        <w:pStyle w:val="Teksts"/>
+      </w:pPr>
+      <w:r>
+        <w:t>Tika atrastas divas vienkāršas papildināšanas stratēģijas, kas šķita piemērotas šim darbam. Pirmā ir logu apvienošana: divi novērotie apmācības logi tiek apvienoti vienā sintētiskā apmācības paraugā, izmantojot izliektu svērto vidējo vērtību. Otrā ir lokālā loga izlase: daļa no novērotā loga tiek saglabāta un pēc tam ar interpolācijas palīdzību tiek izstiepta atpakaļ līdz sākotnējam garumam, uzsverot lokāl</w:t>
+      </w:r>
+      <w:r>
+        <w:t>as atkarības</w:t>
+      </w:r>
+      <w:r>
+        <w:t>, kas citādi varētu palikt nepietiekami pārstāvēti</w:t>
+      </w:r>
+      <w:r>
+        <w:t xml:space="preserve"> ar sākotnējiem datiem</w:t>
+      </w:r>
+      <w:r>
+        <w:t xml:space="preserve"> </w:t>
+      </w:r>
+      <w:sdt>
+        <w:sdtPr>
+          <w:id w:val="-1936895464"/>
+          <w:citation/>
+        </w:sdtPr>
+        <w:sdtContent>
+          <w:r>
+            <w:fldChar w:fldCharType="begin"/>
+          </w:r>
+          <w:r>
+            <w:instrText xml:space="preserve"> CITATION Sem23 \l 1062 </w:instrText>
+          </w:r>
+          <w:r>
+            <w:fldChar w:fldCharType="separate"/>
+          </w:r>
+          <w:r>
+            <w:rPr>
+              <w:noProof/>
+            </w:rPr>
+            <w:t>(Semenoglou, Spiliotis, &amp; Assimakopoulos, 2023)</w:t>
+          </w:r>
+          <w:r>
+            <w:fldChar w:fldCharType="end"/>
+          </w:r>
+        </w:sdtContent>
+      </w:sdt>
+      <w:r>
+        <w:t xml:space="preserve">. Sarežģītākiem </w:t>
+      </w:r>
+      <w:r>
+        <w:t>ģeneratoriem</w:t>
+      </w:r>
+      <w:r>
+        <w:t xml:space="preserve"> (</w:t>
+      </w:r>
+      <w:r>
+        <w:t>VAE vai GAN balstītiem</w:t>
+      </w:r>
+      <w:r>
+        <w:t>)</w:t>
+      </w:r>
+      <w:r>
+        <w:t>, ir nepieciešama papildu ģeneratīvs modelis</w:t>
+      </w:r>
+      <w:r>
+        <w:t xml:space="preserve"> </w:t>
+      </w:r>
+      <w:sdt>
+        <w:sdtPr>
+          <w:id w:val="1879196572"/>
+          <w:citation/>
+        </w:sdtPr>
+        <w:sdtContent>
+          <w:r>
+            <w:fldChar w:fldCharType="begin"/>
+          </w:r>
+          <w:r>
+            <w:instrText xml:space="preserve"> CITATION Dat21 \l 1062 </w:instrText>
+          </w:r>
+          <w:r>
+            <w:fldChar w:fldCharType="separate"/>
+          </w:r>
+          <w:r>
+            <w:rPr>
+              <w:noProof/>
+            </w:rPr>
+            <w:t>(Demir, Mincev, Kok, &amp; Paterakis, 2021)</w:t>
+          </w:r>
+          <w:r>
+            <w:fldChar w:fldCharType="end"/>
+          </w:r>
+        </w:sdtContent>
+      </w:sdt>
+      <w:r>
+        <w:t>. Tāpēc šobrīd pēdējie divi modeļi ir labāk uzskatāmi par nākotnes darbu.</w:t>
+      </w:r>
+    </w:p>
+    <w:p>
+      <w:pPr>
+        <w:pStyle w:val="Teksts"/>
+      </w:pPr>
+      <w:r>
+        <w:t>Praktiskai salīdzināšanai papildināšana jāpiemēro tikai LSTM apmācības datiem. Naivās, SES un ARIMA prognozes paliek nemainīgas un turpina kalpot kā fiksētas bāzes līnijas no iepriekšējās nodaļas. Datu papildināšanas literatūrā prognozēšanā tiek aplūkota neironu modeļu apmācības kopas bagātināšanas problēma. Ja mēs tradicionālajos modeļos ievietotu sintētiskos mēnešus, tas aizmiglotu atšķirību starp etalonu un LSTM un apgrūtinātu salīdzinājuma interpretāciju</w:t>
+      </w:r>
+      <w:r>
+        <w:t xml:space="preserve"> </w:t>
+      </w:r>
+      <w:sdt>
+        <w:sdtPr>
+          <w:id w:val="536094436"/>
+          <w:citation/>
+        </w:sdtPr>
+        <w:sdtContent>
+          <w:r>
+            <w:fldChar w:fldCharType="begin"/>
+          </w:r>
+          <w:r>
+            <w:instrText xml:space="preserve"> CITATION Wen21 \l 1062 </w:instrText>
+          </w:r>
+          <w:r>
+            <w:fldChar w:fldCharType="separate"/>
+          </w:r>
+          <w:r>
+            <w:rPr>
+              <w:noProof/>
+            </w:rPr>
+            <w:t>(Wen, u.c., 2021)</w:t>
+          </w:r>
+          <w:r>
+            <w:fldChar w:fldCharType="end"/>
+          </w:r>
+        </w:sdtContent>
+      </w:sdt>
+      <w:r>
+        <w:t>. Tātad jautājums nav par to, vai visas metodes kļūst labākas ar sintētiskiem datiem, bet gan par to, vai neironu modelis gūst labumu, paplašinot tā apmācības kopu.</w:t>
+      </w:r>
+    </w:p>
+    <w:p>
+      <w:pPr>
+        <w:pStyle w:val="Teksts"/>
+      </w:pPr>
+      <w:commentRangeStart w:id="139"/>
+      <w:r>
+        <w:t xml:space="preserve">Novērtēšanas </w:t>
+      </w:r>
+      <w:commentRangeEnd w:id="139"/>
+      <w:r>
+        <w:rPr>
+          <w:rStyle w:val="CommentReference"/>
+          <w:sz w:val="24"/>
+          <w:szCs w:val="24"/>
+        </w:rPr>
+        <w:commentReference w:id="139"/>
+      </w:r>
+      <w:r>
+        <w:t xml:space="preserve">protokols atspoguļo iepriekšējo nodaļu. Tiek saglabāti tie paši slīdošie vienu soli uz priekšu sadalījumi, un tie paši reālie testa mēneši paliek neskarti. Papildināšana tiks veikta tikai apmācības datiem pēc tam, kad reālie dati ir ielādēti un pārveidoti modelim gatavos logos, bet pirms modeļa pielāgošanas. Papildināšana tiks piemērota tikai iegūtajiem un sagatavotajiem datiem. Citiem vārdiem sakot, tiks </w:t>
+      </w:r>
+      <w:r>
+        <w:lastRenderedPageBreak/>
+        <w:t>saglabāta sākotnējā datu kopas (</w:t>
+      </w:r>
+      <w:r>
+        <w:rPr>
+          <w:i/>
+          <w:iCs/>
+        </w:rPr>
+        <w:t>SQLite</w:t>
+      </w:r>
+      <w:r>
+        <w:t xml:space="preserve"> datubāzes veidā) integritāte: mēs izvairāmies no tā piesārņošanas ar sintētiskiem novērojumiem.</w:t>
+      </w:r>
+    </w:p>
+    <w:p>
+      <w:pPr>
+        <w:pStyle w:val="3-lm-virsraksts"/>
+      </w:pPr>
+      <w:r>
+        <w:t>Trūkstošo mēnešu problēma</w:t>
+      </w:r>
+    </w:p>
+    <w:p>
+      <w:pPr>
+        <w:pStyle w:val="Teksts"/>
+      </w:pPr>
+      <w:r>
+        <w:t>Pēc literatūras izpētes par trūkstošo datu tēmu sākotnēji tika apsvērta datu imputācijas</w:t>
+      </w:r>
+      <w:r>
+        <w:t xml:space="preserve"> (</w:t>
+      </w:r>
+      <w:r>
+        <w:rPr>
+          <w:i/>
+          <w:iCs/>
+        </w:rPr>
+        <w:t>imputation</w:t>
+      </w:r>
+      <w:r>
+        <w:t>)</w:t>
+      </w:r>
+      <w:r>
+        <w:t xml:space="preserve"> ideja kā iespējama pieeja, lai rekonstruētu nepieejamos aprīļa, maija un jūnija novērojumus, saskaņojot tos ar vēlākiem mēnešiem (attiecīgi oktobri, septembri un augustu). Tomēr literatūrā uzsvērts, ka imputācijas metodes izvēle galvenokārt ir atkarīga no datu kopas specifikas. Imputācija maina slēptās attiecības dotajos datos un tādējādi var mainīt prognozēšanas veiktspēju</w:t>
+      </w:r>
+      <w:r>
+        <w:t xml:space="preserve"> </w:t>
+      </w:r>
+      <w:sdt>
+        <w:sdtPr>
+          <w:id w:val="1297029484"/>
+          <w:citation/>
+        </w:sdtPr>
+        <w:sdtContent>
+          <w:r>
+            <w:fldChar w:fldCharType="begin"/>
+          </w:r>
+          <w:r>
+            <w:instrText xml:space="preserve"> CITATION Rib22 \l 1062 </w:instrText>
+          </w:r>
+          <w:r>
+            <w:fldChar w:fldCharType="separate"/>
+          </w:r>
+          <w:r>
+            <w:rPr>
+              <w:noProof/>
+            </w:rPr>
+            <w:t>(Ribeiro &amp; de Castro, 2022)</w:t>
+          </w:r>
+          <w:r>
+            <w:fldChar w:fldCharType="end"/>
+          </w:r>
+        </w:sdtContent>
+      </w:sdt>
+      <w:r>
+        <w:t xml:space="preserve">. </w:t>
+      </w:r>
+      <w:r>
+        <w:t>Plašākā nozīmē nav vienas universāli labākās prognozēšanas metodes katrai situācijai; vispiemērotākā metode ir atkarīga no datu sarežģītības un īpašībām</w:t>
+      </w:r>
+      <w:r>
+        <w:t xml:space="preserve"> </w:t>
+      </w:r>
+      <w:sdt>
+        <w:sdtPr>
+          <w:id w:val="-992489568"/>
+          <w:citation/>
+        </w:sdtPr>
+        <w:sdtContent>
+          <w:r>
+            <w:fldChar w:fldCharType="begin"/>
+          </w:r>
+          <w:r>
+            <w:instrText xml:space="preserve"> CITATION Zha03 \l 2057 </w:instrText>
+          </w:r>
+          <w:r>
+            <w:fldChar w:fldCharType="separate"/>
+          </w:r>
+          <w:r>
+            <w:rPr>
+              <w:noProof/>
+            </w:rPr>
+            <w:t>(Zhang, 2003)</w:t>
+          </w:r>
+          <w:r>
+            <w:fldChar w:fldCharType="end"/>
+          </w:r>
+        </w:sdtContent>
+      </w:sdt>
+      <w:r>
+        <w:t>.</w:t>
+      </w:r>
+    </w:p>
+    <w:p>
+      <w:pPr>
+        <w:pStyle w:val="Teksts"/>
+      </w:pPr>
+      <w:r>
+        <w:t xml:space="preserve">Pašreizējie dati ir sarežģītāki, un nepilnības ir lielākas. Nepieejamie mēneši nav vienkāršas trūkstošās vērtības, bet gan veseli trūkstošie novērojumu segmenti. Šādu periodu imputācija balstītos uz spēcīgiem pieņēmumiem, piemēram, labu izpratni par sērijas laika struktūru, īpaši iespējamo tendenci un sezonalitāti, jo šīs īpašības parasti ietekmē imputācijas metodes izvēli </w:t>
+      </w:r>
+      <w:sdt>
+        <w:sdtPr>
+          <w:id w:val="-1865749334"/>
+          <w:citation/>
+        </w:sdtPr>
+        <w:sdtContent>
+          <w:r>
+            <w:fldChar w:fldCharType="begin"/>
+          </w:r>
+          <w:r>
+            <w:instrText xml:space="preserve"> CITATION Rib22 \l 1062 </w:instrText>
+          </w:r>
+          <w:r>
+            <w:fldChar w:fldCharType="separate"/>
+          </w:r>
+          <w:r>
+            <w:rPr>
+              <w:noProof/>
+            </w:rPr>
+            <w:t>(Ribeiro &amp; de Castro, 2022)</w:t>
+          </w:r>
+          <w:r>
+            <w:fldChar w:fldCharType="end"/>
+          </w:r>
+        </w:sdtContent>
+      </w:sdt>
+      <w:r>
+        <w:t>. Tas prasītu arī papildu zināšanas par uzņēmumam raksturīgajiem pārdošanas faktoriem, kas šajā pētījumā nav pieejamas.</w:t>
+      </w:r>
+    </w:p>
+    <w:p>
+      <w:pPr>
+        <w:pStyle w:val="Teksts"/>
+      </w:pPr>
+      <w:r>
+        <w:t xml:space="preserve">Tātad, pat ja </w:t>
+      </w:r>
+      <w:commentRangeStart w:id="140"/>
+      <w:r>
+        <w:t xml:space="preserve">mēs </w:t>
+      </w:r>
+      <w:commentRangeEnd w:id="140"/>
+      <w:r>
+        <w:rPr>
+          <w:rStyle w:val="CommentReference"/>
+          <w:sz w:val="24"/>
+          <w:szCs w:val="24"/>
+        </w:rPr>
+        <w:commentReference w:id="140"/>
+      </w:r>
+      <w:r>
+        <w:t>to izlaistu un imputācijas veikšanai (jeb vienkāršāk sakot, mēnešu kopēšanai) paļautos tikai uz sezonalitāti, kokmateriālu literatūra joprojām liecina par pretējo — pat ja tā liek domāt, ka sezonālā dinamika pastāv, tā joprojām ir ļoti specifiska tirgum un var mainīties laika gaitā (svārstīties). Šo iemeslu dēļ imputācija šajā pētījumā netiek izmantota.</w:t>
+      </w:r>
+    </w:p>
+    <w:p>
+      <w:pPr>
+        <w:pStyle w:val="Teksts"/>
+      </w:pPr>
+      <w:r>
+        <w:t xml:space="preserve">Python </w:t>
+      </w:r>
+      <w:r>
+        <w:t>implementācija</w:t>
+      </w:r>
+    </w:p>
+    <w:p>
+      <w:pPr>
+        <w:pStyle w:val="Teksts"/>
+      </w:pPr>
     </w:p>
     <w:p>
       <w:pPr>
         <w:pStyle w:val="1-lm-nenumurts-virsraksts"/>
       </w:pPr>
-      <w:bookmarkStart w:id="136" w:name="_Toc225535011"/>
+      <w:bookmarkStart w:id="141" w:name="_Toc225535011"/>
       <w:r>
         <w:lastRenderedPageBreak/>
         <w:t>Rezultāti un secinājumi</w:t>
       </w:r>
-      <w:bookmarkEnd w:id="136"/>
+      <w:bookmarkEnd w:id="141"/>
     </w:p>
     <w:p>
       <w:pPr>
@@ -22229,14 +22941,14 @@
       <w:pPr>
         <w:pStyle w:val="1-lm-nenumurts-virsraksts"/>
       </w:pPr>
-      <w:bookmarkStart w:id="137" w:name="_Toc88602609"/>
-      <w:bookmarkStart w:id="138" w:name="_Toc225535012"/>
+      <w:bookmarkStart w:id="142" w:name="_Toc88602609"/>
+      <w:bookmarkStart w:id="143" w:name="_Toc225535012"/>
       <w:r>
         <w:lastRenderedPageBreak/>
         <w:t>Izmantotie informācijas avoti</w:t>
       </w:r>
-      <w:bookmarkEnd w:id="137"/>
-      <w:bookmarkEnd w:id="138"/>
+      <w:bookmarkEnd w:id="142"/>
+      <w:bookmarkEnd w:id="143"/>
       <w:r>
         <w:fldChar w:fldCharType="begin"/>
       </w:r>
@@ -22793,13 +23505,13 @@
       <w:pPr>
         <w:pStyle w:val="Pielikumi-virsraksts"/>
       </w:pPr>
-      <w:bookmarkStart w:id="139" w:name="_Toc88602610"/>
-      <w:bookmarkStart w:id="140" w:name="_Toc225535013"/>
+      <w:bookmarkStart w:id="144" w:name="_Toc88602610"/>
+      <w:bookmarkStart w:id="145" w:name="_Toc225535013"/>
       <w:r>
         <w:t>Pielikumi</w:t>
       </w:r>
-      <w:bookmarkEnd w:id="139"/>
-      <w:bookmarkEnd w:id="140"/>
+      <w:bookmarkEnd w:id="144"/>
+      <w:bookmarkEnd w:id="145"/>
     </w:p>
     <w:p>
       <w:r>
@@ -39088,6 +39800,110 @@
       </w:pPr>
       <w:r>
         <w:t>Наконец запускается цикл обучения на фиксированное число эпох EPOCHS. Обучение идёт в режиме регрессии: вся система возвращает прогноз продаж следующего месяца.</w:t>
+      </w:r>
+    </w:p>
+  </w:comment>
+  <w:comment w:id="136" w:author="Deniss" w:date="2026-04-19T14:23:00Z" w:initials="D">
+    <w:p>
+      <w:pPr>
+        <w:pStyle w:val="CommentText"/>
+      </w:pPr>
+      <w:r>
+        <w:rPr>
+          <w:rStyle w:val="CommentReference"/>
+        </w:rPr>
+        <w:annotationRef/>
+      </w:r>
+      <w:r>
+        <w:t>https://chatgpt.com/g/g-p-6913449e1e888191b077ff416b30dc37-bakalaurs/c/69e3bfc5-ae04-83eb-8846-cd0d006192c1?tab=sources</w:t>
+      </w:r>
+    </w:p>
+  </w:comment>
+  <w:comment w:id="137" w:author="Deniss" w:date="2026-04-19T14:24:00Z" w:initials="D">
+    <w:p>
+      <w:pPr>
+        <w:pStyle w:val="CommentText"/>
+      </w:pPr>
+      <w:r>
+        <w:rPr>
+          <w:rStyle w:val="CommentReference"/>
+        </w:rPr>
+        <w:annotationRef/>
+      </w:r>
+      <w:r>
+        <w:t>One might argue, the comparison should be interpreted carefully as the inputs are not identical across all methods: the traditional models were trained only on the sales, while the LSTM model was given a richer feature set with sales, deliveries, first differences, and rolling means. Hovewer, one of the main ideas of this thesis is to prove (or disprove) that LSTM is superior not only by evaluating the accuracy of its prediction, but also by initially showing that it accepts a wider input range unlike traditional methods. ......</w:t>
+      </w:r>
+    </w:p>
+  </w:comment>
+  <w:comment w:id="138" w:author="Deniss" w:date="2026-04-19T15:39:00Z" w:initials="D">
+    <w:p>
+      <w:pPr>
+        <w:pStyle w:val="CommentText"/>
+      </w:pPr>
+      <w:r>
+        <w:rPr>
+          <w:rStyle w:val="CommentReference"/>
+        </w:rPr>
+        <w:annotationRef/>
+      </w:r>
+      <w:r>
+        <w:rPr>
+          <w:noProof/>
+        </w:rPr>
+        <w:t>sint</w:t>
+      </w:r>
+      <w:r>
+        <w:rPr>
+          <w:noProof/>
+        </w:rPr>
+        <w:t>ētiskā vai s</w:t>
+      </w:r>
+      <w:r>
+        <w:rPr>
+          <w:noProof/>
+        </w:rPr>
+        <w:t>intētisko?</w:t>
+      </w:r>
+    </w:p>
+  </w:comment>
+  <w:comment w:id="139" w:author="Deniss" w:date="2026-04-19T17:53:00Z" w:initials="D">
+    <w:p>
+      <w:pPr>
+        <w:pStyle w:val="CommentText"/>
+      </w:pPr>
+      <w:r>
+        <w:rPr>
+          <w:rStyle w:val="CommentReference"/>
+        </w:rPr>
+        <w:annotationRef/>
+      </w:r>
+      <w:r>
+        <w:t>The evaluation protocol mirrors the previous chapter. The same rolling one-step-ahead splits are preserved, and the same real test months remain untouched. Augmentation is going to be performed on the training data only, after the real data have been loaded and transformed into model-ready windows, but before model fitting. The augmentation is going to be applied only onto extracted and prepared data. In other words, the integrity of the original dataset (in the form of an SQLite database) is going to be preserved: we avoid contaminating it with synthetic observations.</w:t>
+      </w:r>
+    </w:p>
+  </w:comment>
+  <w:comment w:id="140" w:author="Deniss" w:date="2026-04-19T19:12:00Z" w:initials="D">
+    <w:p>
+      <w:pPr>
+        <w:pStyle w:val="CommentText"/>
+      </w:pPr>
+      <w:r>
+        <w:rPr>
+          <w:rStyle w:val="CommentReference"/>
+        </w:rPr>
+        <w:annotationRef/>
+      </w:r>
+      <w:r>
+        <w:rPr>
+          <w:noProof/>
+        </w:rPr>
+        <w:t xml:space="preserve">tas nav </w:t>
+      </w:r>
+      <w:r>
+        <w:rPr>
+          <w:noProof/>
+        </w:rPr>
+        <w:t>"es", bet tas ir "mēs". Tā drīkst?</w:t>
       </w:r>
     </w:p>
   </w:comment>
@@ -39210,6 +40026,11 @@
   <w15:commentEx w15:paraId="16AE505C" w15:done="0"/>
   <w15:commentEx w15:paraId="20A3F0A7" w15:done="0"/>
   <w15:commentEx w15:paraId="17F7E3BD" w15:done="0"/>
+  <w15:commentEx w15:paraId="73F09D04" w15:done="0"/>
+  <w15:commentEx w15:paraId="7E2FD3BC" w15:done="0"/>
+  <w15:commentEx w15:paraId="7FF355F1" w15:done="0"/>
+  <w15:commentEx w15:paraId="28155693" w15:done="0"/>
+  <w15:commentEx w15:paraId="09B8B4D4" w15:done="0"/>
 </w15:commentsEx>
 </file>
 
@@ -39329,6 +40150,11 @@
   <w16cex:commentExtensible w16cex:durableId="5359CF5B" w16cex:dateUtc="2026-04-18T10:36:00Z"/>
   <w16cex:commentExtensible w16cex:durableId="3845BB17" w16cex:dateUtc="2026-04-18T10:32:00Z"/>
   <w16cex:commentExtensible w16cex:durableId="35359DC7" w16cex:dateUtc="2026-04-18T15:44:00Z"/>
+  <w16cex:commentExtensible w16cex:durableId="4E97BB2D" w16cex:dateUtc="2026-04-19T11:23:00Z"/>
+  <w16cex:commentExtensible w16cex:durableId="5640ED0A" w16cex:dateUtc="2026-04-19T11:24:00Z"/>
+  <w16cex:commentExtensible w16cex:durableId="27D5D4CD" w16cex:dateUtc="2026-04-19T12:39:00Z"/>
+  <w16cex:commentExtensible w16cex:durableId="2D6672EF" w16cex:dateUtc="2026-04-19T14:53:00Z"/>
+  <w16cex:commentExtensible w16cex:durableId="12759E43" w16cex:dateUtc="2026-04-19T16:12:00Z"/>
 </w16cex:commentsExtensible>
 </file>
 
@@ -39448,6 +40274,11 @@
   <w16cid:commentId w16cid:paraId="16AE505C" w16cid:durableId="5359CF5B"/>
   <w16cid:commentId w16cid:paraId="20A3F0A7" w16cid:durableId="3845BB17"/>
   <w16cid:commentId w16cid:paraId="17F7E3BD" w16cid:durableId="35359DC7"/>
+  <w16cid:commentId w16cid:paraId="73F09D04" w16cid:durableId="4E97BB2D"/>
+  <w16cid:commentId w16cid:paraId="7E2FD3BC" w16cid:durableId="5640ED0A"/>
+  <w16cid:commentId w16cid:paraId="7FF355F1" w16cid:durableId="27D5D4CD"/>
+  <w16cid:commentId w16cid:paraId="28155693" w16cid:durableId="2D6672EF"/>
+  <w16cid:commentId w16cid:paraId="09B8B4D4" w16cid:durableId="12759E43"/>
 </w16cid:commentsIds>
 </file>
 
@@ -49552,6 +50383,7 @@
     <w:sig w:usb0="00000287" w:usb1="00000800" w:usb2="00000000" w:usb3="00000000" w:csb0="0000009F" w:csb1="00000000"/>
   </w:font>
   <w:font w:name="MS Mincho">
+    <w:altName w:val="ＭＳ 明朝"/>
     <w:panose1 w:val="02020609040205080304"/>
     <w:charset w:val="80"/>
     <w:family w:val="modern"/>
@@ -49649,6 +50481,8 @@
     <w:rsid w:val="008C285C"/>
     <w:rsid w:val="00903C5C"/>
     <w:rsid w:val="00942F17"/>
+    <w:rsid w:val="00951289"/>
+    <w:rsid w:val="00984AC2"/>
     <w:rsid w:val="00B003D8"/>
     <w:rsid w:val="00B62A4C"/>
     <w:rsid w:val="00B83BC5"/>
@@ -50614,7 +51448,7 @@
     <b:Year>2001</b:Year>
     <b:DOI>10.1016/S0925-5273(00)00109-2</b:DOI>
     <b:URL>https://doi.org/10.1016/S0925-5273(00)00109-2</b:URL>
-    <b:RefOrder>30</b:RefOrder>
+    <b:RefOrder>36</b:RefOrder>
   </b:Source>
   <b:Source>
     <b:Tag>Lee2012HybridAISalesForecasting</b:Tag>
@@ -50644,7 +51478,7 @@
     <b:Pages>188-196</b:Pages>
     <b:DOI>10.1002/hfm.20272</b:DOI>
     <b:URL>https://doi.org/10.1002/hfm.20272</b:URL>
-    <b:RefOrder>31</b:RefOrder>
+    <b:RefOrder>37</b:RefOrder>
   </b:Source>
   <b:Source>
     <b:Tag>MullerNavarra2015SalesForecastingPRNN</b:Tag>
@@ -50700,7 +51534,7 @@
     <b:Pages>1-7</b:Pages>
     <b:DOI>10.1109/IACIS65746.2025.11211065</b:DOI>
     <b:URL>https://doi.org/10.1109/IACIS65746.2025.11211065</b:URL>
-    <b:RefOrder>32</b:RefOrder>
+    <b:RefOrder>38</b:RefOrder>
   </b:Source>
   <b:Source>
     <b:Tag>Pongdatu2018SeasonalTimeSeries</b:Tag>
@@ -50792,7 +51626,7 @@
     <b:Pages>e14724</b:Pages>
     <b:DOI>10.1590/1806-9649-2025v32e14724</b:DOI>
     <b:URL>https://doi.org/10.1590/1806-9649-2025v32e14724</b:URL>
-    <b:RefOrder>33</b:RefOrder>
+    <b:RefOrder>39</b:RefOrder>
   </b:Source>
   <b:Source>
     <b:Tag>Sirisha2022ProfitPrediction</b:Tag>
@@ -51468,11 +52302,217 @@
     <b:DOI>10.1016/j.knosys.2025.115049</b:DOI>
     <b:RefOrder>29</b:RefOrder>
   </b:Source>
+  <b:Source>
+    <b:Tag>Wen21</b:Tag>
+    <b:SourceType>ConferenceProceedings</b:SourceType>
+    <b:Guid>{ADB64B4C-F47C-4488-B05F-273CD594A6C1}</b:Guid>
+    <b:Title>Time Series Data Augmentation for Deep Learning: A Survey</b:Title>
+    <b:Year>2021</b:Year>
+    <b:Pages>4653-4660</b:Pages>
+    <b:ConferenceName>Proceedings of the Thirtieth International Joint Conference on Artificial Intelligence</b:ConferenceName>
+    <b:City>Hangzhou</b:City>
+    <b:Author>
+      <b:Author>
+        <b:NameList>
+          <b:Person>
+            <b:Last>Wen</b:Last>
+            <b:First>Qingsong </b:First>
+          </b:Person>
+          <b:Person>
+            <b:Last>Sun</b:Last>
+            <b:First>Liang </b:First>
+          </b:Person>
+          <b:Person>
+            <b:Last>Yang</b:Last>
+            <b:First>Fan </b:First>
+          </b:Person>
+          <b:Person>
+            <b:Last>Song</b:Last>
+            <b:First>Xiaomin </b:First>
+          </b:Person>
+          <b:Person>
+            <b:Last>Gao</b:Last>
+            <b:First>Jingkun </b:First>
+          </b:Person>
+          <b:Person>
+            <b:Last>Wang</b:Last>
+            <b:First>Xue </b:First>
+          </b:Person>
+          <b:Person>
+            <b:Last>Xu</b:Last>
+            <b:First>Huan </b:First>
+          </b:Person>
+        </b:NameList>
+      </b:Author>
+    </b:Author>
+    <b:DOI>10.24963/ijcai.2021/631 </b:DOI>
+    <b:RefOrder>30</b:RefOrder>
+  </b:Source>
+  <b:Source>
+    <b:Tag>Mak22</b:Tag>
+    <b:SourceType>JournalArticle</b:SourceType>
+    <b:Guid>{6AA4FA09-F78C-48D6-82A2-C78F4E967E90}</b:Guid>
+    <b:Title>M5 accuracy competition: Results, findings, and conclusions</b:Title>
+    <b:Pages>1346–1364</b:Pages>
+    <b:Year>2022</b:Year>
+    <b:JournalName>International Journal of Forecasting</b:JournalName>
+    <b:Author>
+      <b:Author>
+        <b:NameList>
+          <b:Person>
+            <b:Last>Makridakis</b:Last>
+            <b:First>Spyros </b:First>
+          </b:Person>
+          <b:Person>
+            <b:Last>Spiliotis</b:Last>
+            <b:First>Evangelos </b:First>
+          </b:Person>
+          <b:Person>
+            <b:Last>Vassilios Assimakopoulos</b:Last>
+          </b:Person>
+        </b:NameList>
+      </b:Author>
+    </b:Author>
+    <b:Volume>38</b:Volume>
+    <b:Issue>4</b:Issue>
+    <b:DOI>10.1016/j.ijforecast.2021.11.013 </b:DOI>
+    <b:RefOrder>31</b:RefOrder>
+  </b:Source>
+  <b:Source>
+    <b:Tag>Rib22</b:Tag>
+    <b:SourceType>JournalArticle</b:SourceType>
+    <b:Guid>{427B9899-1B9F-4F56-A1FD-EC32B7D91910}</b:Guid>
+    <b:Title>Missing Data in Time Series: A Review of Imputation Methods and Case Study</b:Title>
+    <b:JournalName>Learning and Nonlinear Models</b:JournalName>
+    <b:Year>2022</b:Year>
+    <b:Pages>31–46</b:Pages>
+    <b:Author>
+      <b:Author>
+        <b:NameList>
+          <b:Person>
+            <b:Last>Ribeiro</b:Last>
+            <b:Middle>Mara </b:Middle>
+            <b:First>Silvana </b:First>
+          </b:Person>
+          <b:Person>
+            <b:Last>de Castro</b:Last>
+            <b:Middle>Leite </b:Middle>
+            <b:First>Cristiano </b:First>
+          </b:Person>
+        </b:NameList>
+      </b:Author>
+    </b:Author>
+    <b:Volume>20</b:Volume>
+    <b:Issue>1</b:Issue>
+    <b:DOI>10.21528/lnlm-vol20-no1-art3 </b:DOI>
+    <b:RefOrder>32</b:RefOrder>
+  </b:Source>
+  <b:Source>
+    <b:Tag>Igl23</b:Tag>
+    <b:SourceType>JournalArticle</b:SourceType>
+    <b:Guid>{C1E11715-E0E9-4306-B117-66E5093D6DCE}</b:Guid>
+    <b:Title>Data Augmentation techniques in time series domain: a survey and taxonomy</b:Title>
+    <b:JournalName>Neural Computing and Applications</b:JournalName>
+    <b:Year>2023</b:Year>
+    <b:Pages>10123–10145</b:Pages>
+    <b:Author>
+      <b:Author>
+        <b:NameList>
+          <b:Person>
+            <b:Last>Iglesias</b:Last>
+            <b:First>Guillermo </b:First>
+          </b:Person>
+          <b:Person>
+            <b:Last>Talavera</b:Last>
+            <b:First>Edgar </b:First>
+          </b:Person>
+          <b:Person>
+            <b:Last> González-Prieto</b:Last>
+            <b:First>Ángel </b:First>
+          </b:Person>
+          <b:Person>
+            <b:Last>Mozo</b:Last>
+            <b:First>Alberto </b:First>
+          </b:Person>
+          <b:Person>
+            <b:Last>Gómez-Canaval </b:Last>
+            <b:First>Sandra </b:First>
+          </b:Person>
+        </b:NameList>
+      </b:Author>
+    </b:Author>
+    <b:Volume>35</b:Volume>
+    <b:DOI>10.1007/s00521-023-08459-3 </b:DOI>
+    <b:RefOrder>33</b:RefOrder>
+  </b:Source>
+  <b:Source>
+    <b:Tag>Sem23</b:Tag>
+    <b:SourceType>JournalArticle</b:SourceType>
+    <b:Guid>{A683F25A-ED25-49A1-A7EB-602E32FA2FA1}</b:Guid>
+    <b:Title>Data augmentation for univariate time series forecasting with neural networks</b:Title>
+    <b:JournalName>Pattern Recognition</b:JournalName>
+    <b:Year>2023</b:Year>
+    <b:Author>
+      <b:Author>
+        <b:NameList>
+          <b:Person>
+            <b:Last>Semenoglou</b:Last>
+            <b:First>Artemios-Anargyros </b:First>
+          </b:Person>
+          <b:Person>
+            <b:Last>Spiliotis</b:Last>
+            <b:First>Evangelos </b:First>
+          </b:Person>
+          <b:Person>
+            <b:Last>Assimakopoulos</b:Last>
+            <b:First>Vassilios </b:First>
+          </b:Person>
+        </b:NameList>
+      </b:Author>
+    </b:Author>
+    <b:Volume>134</b:Volume>
+    <b:DOI>10.1016/j.patcog.2022.109132 </b:DOI>
+    <b:RefOrder>34</b:RefOrder>
+  </b:Source>
+  <b:Source>
+    <b:Tag>Dat21</b:Tag>
+    <b:SourceType>JournalArticle</b:SourceType>
+    <b:Guid>{0F16D3F4-7C1A-497F-8A87-36AC18940D26}</b:Guid>
+    <b:Title>Data augmentation for time series regression: Applying transformations, autoencoders and adversarial networks to electricity price forecasting</b:Title>
+    <b:JournalName>Applied Energy</b:JournalName>
+    <b:Year>2021</b:Year>
+    <b:Volume>304</b:Volume>
+    <b:DOI>10.1016/j.apenergy.2021.117695 </b:DOI>
+    <b:Author>
+      <b:Author>
+        <b:NameList>
+          <b:Person>
+            <b:Last>Demir</b:Last>
+            <b:First>Sumeyra </b:First>
+          </b:Person>
+          <b:Person>
+            <b:Last>Mincev</b:Last>
+            <b:First>Krystof </b:First>
+          </b:Person>
+          <b:Person>
+            <b:Last>Kok</b:Last>
+            <b:First>Koen </b:First>
+          </b:Person>
+          <b:Person>
+            <b:Last> Paterakis</b:Last>
+            <b:Middle>G.</b:Middle>
+            <b:First>Nikolaos </b:First>
+          </b:Person>
+        </b:NameList>
+      </b:Author>
+    </b:Author>
+    <b:RefOrder>35</b:RefOrder>
+  </b:Source>
 </b:Sources>
 </file>
 
 <file path=customXml/itemProps1.xml><?xml version="1.0" encoding="utf-8"?>
-<ds:datastoreItem xmlns:ds="http://schemas.openxmlformats.org/officeDocument/2006/customXml" ds:itemID="{8209F098-B1EA-4CEE-83DC-3A0CED357C2D}">
+<ds:datastoreItem xmlns:ds="http://schemas.openxmlformats.org/officeDocument/2006/customXml" ds:itemID="{2EC43CCD-2D00-46E3-96B2-7C42C15FEFB3}">
   <ds:schemaRefs>
     <ds:schemaRef ds:uri="http://schemas.openxmlformats.org/officeDocument/2006/bibliography"/>
   </ds:schemaRefs>

</xml_diff>

<commit_message>
75%: thesis backup, practical part finished
</commit_message>
<xml_diff>
--- a/Deniss Grabovskis 231RDB217.docx
+++ b/Deniss Grabovskis 231RDB217.docx
@@ -13194,7 +13194,14 @@
             <w:rFonts w:ascii="Cambria Math" w:hAnsi="Cambria Math"/>
             <w:lang w:val="it-IT"/>
           </w:rPr>
-          <m:t>AIC=-2</m:t>
+          <m:t>AIC</m:t>
+        </m:r>
+        <m:r>
+          <w:rPr>
+            <w:rFonts w:ascii="Cambria Math" w:hAnsi="Cambria Math"/>
+            <w:lang w:val="en-GB"/>
+          </w:rPr>
+          <m:t>=-2</m:t>
         </m:r>
         <m:func>
           <m:funcPr>
@@ -13222,7 +13229,14 @@
                 <w:rFonts w:ascii="Cambria Math" w:hAnsi="Cambria Math"/>
                 <w:lang w:val="it-IT"/>
               </w:rPr>
-              <m:t>L(</m:t>
+              <m:t>L</m:t>
+            </m:r>
+            <m:r>
+              <w:rPr>
+                <w:rFonts w:ascii="Cambria Math" w:hAnsi="Cambria Math"/>
+                <w:lang w:val="en-GB"/>
+              </w:rPr>
+              <m:t>(</m:t>
             </m:r>
             <m:acc>
               <m:accPr>
@@ -13248,9 +13262,16 @@
             <m:r>
               <w:rPr>
                 <w:rFonts w:ascii="Cambria Math" w:hAnsi="Cambria Math"/>
+                <w:lang w:val="en-GB"/>
+              </w:rPr>
+              <m:t>)+2</m:t>
+            </m:r>
+            <m:r>
+              <w:rPr>
+                <w:rFonts w:ascii="Cambria Math" w:hAnsi="Cambria Math"/>
                 <w:lang w:val="it-IT"/>
               </w:rPr>
-              <m:t>)+2K</m:t>
+              <m:t>K</m:t>
             </m:r>
           </m:e>
         </m:func>
@@ -13259,19 +13280,19 @@
         <w:rPr>
           <w:i/>
           <w:iCs/>
-          <w:lang w:val="it-IT"/>
+          <w:lang w:val="en-GB"/>
         </w:rPr>
         <w:t>,</w:t>
       </w:r>
       <w:r>
         <w:rPr>
-          <w:lang w:val="it-IT"/>
+          <w:lang w:val="en-GB"/>
         </w:rPr>
         <w:tab/>
       </w:r>
       <w:r>
         <w:rPr>
-          <w:lang w:val="it-IT"/>
+          <w:lang w:val="en-GB"/>
         </w:rPr>
         <w:tab/>
       </w:r>
@@ -16073,7 +16094,13 @@
             <w:rPr>
               <w:noProof/>
             </w:rPr>
-            <w:t xml:space="preserve"> (Zhang, 2003)</w:t>
+            <w:t xml:space="preserve"> </w:t>
+          </w:r>
+          <w:r>
+            <w:rPr>
+              <w:noProof/>
+            </w:rPr>
+            <w:t>(Zhang, 2003)</w:t>
           </w:r>
           <w:r>
             <w:fldChar w:fldCharType="end"/>
@@ -16471,7 +16498,7 @@
             <w:rPr>
               <w:noProof/>
             </w:rPr>
-            <w:t xml:space="preserve"> (Sirisha, Belavagi, &amp; Attigeri, 2022)</w:t>
+            <w:t>(Sirisha, Belavagi, &amp; Attigeri, 2022)</w:t>
           </w:r>
           <w:r>
             <w:fldChar w:fldCharType="end"/>
@@ -19864,7 +19891,6 @@
         <m:r>
           <w:rPr>
             <w:rFonts w:ascii="Cambria Math" w:hAnsi="Cambria Math"/>
-            <w:lang w:val="en-GB"/>
           </w:rPr>
           <m:t>X=</m:t>
         </m:r>
@@ -19884,7 +19910,6 @@
             <m:r>
               <w:rPr>
                 <w:rFonts w:ascii="Cambria Math" w:hAnsi="Cambria Math"/>
-                <w:lang w:val="en-GB"/>
               </w:rPr>
               <m:t>t-2,  t-1,  t</m:t>
             </m:r>
@@ -19893,7 +19918,6 @@
         <m:r>
           <w:rPr>
             <w:rFonts w:ascii="Cambria Math" w:hAnsi="Cambria Math"/>
-            <w:lang w:val="en-GB"/>
           </w:rPr>
           <m:t>,</m:t>
         </m:r>
@@ -19910,7 +19934,6 @@
         <m:r>
           <w:rPr>
             <w:rFonts w:ascii="Cambria Math" w:hAnsi="Cambria Math"/>
-            <w:lang w:val="en-GB"/>
           </w:rPr>
           <m:t>y=</m:t>
         </m:r>
@@ -19930,7 +19953,6 @@
             <m:r>
               <w:rPr>
                 <w:rFonts w:ascii="Cambria Math" w:hAnsi="Cambria Math"/>
-                <w:lang w:val="en-GB"/>
               </w:rPr>
               <m:t>t+1</m:t>
             </m:r>
@@ -20519,7 +20541,7 @@
             <w:rPr>
               <w:noProof/>
             </w:rPr>
-            <w:t xml:space="preserve"> (Borrohou, Fissoune, &amp; Badir, 2025)</w:t>
+            <w:t>(Borrohou, Fissoune, &amp; Badir, 2025)</w:t>
           </w:r>
           <w:r>
             <w:fldChar w:fldCharType="end"/>
@@ -22417,7 +22439,7 @@
         <w:pStyle w:val="Teksts"/>
       </w:pPr>
       <w:r>
-        <w:t>Tika atrastas divas vienkāršas papildināšanas stratēģijas, kas šķita piemērotas šim darbam. Pirmā ir logu apvienošana: divi novērotie apmācības logi tiek apvienoti vienā sintētiskā apmācības paraugā, izmantojot izliektu svērto vidējo vērtību. Otrā ir lokālā loga izlase: daļa no novērotā loga tiek saglabāta un pēc tam ar interpolācijas palīdzību tiek izstiepta atpakaļ līdz sākotnējam garumam, uzsverot lokāl</w:t>
+        <w:t>Tika atrastas divas vienkāršas papildināšanas stratēģijas. Pirmā ir logu apvienošana: divi novērotie apmācības logi tiek apvienoti vienā sintētiskā apmācības paraugā, izmantojot izliektu svērto vidējo vērtību. Otrā ir lokālā loga izlase: daļa no novērotā loga tiek saglabāta un pēc tam ar interpolācijas palīdzību tiek izstiepta atpakaļ līdz sākotnējam garumam, uzsverot lokāl</w:t>
       </w:r>
       <w:r>
         <w:t>as atkarības</w:t>
@@ -22458,6 +22480,18 @@
         </w:sdtContent>
       </w:sdt>
       <w:r>
+        <w:t xml:space="preserve">. </w:t>
+      </w:r>
+      <w:r>
+        <w:t xml:space="preserve">Diemžēl, tā kā logi ir tikai 3 mēnešus gari, </w:t>
+      </w:r>
+      <w:r>
+        <w:t>iz</w:t>
+      </w:r>
+      <w:r>
+        <w:t>stiepšana ir gandrīz bezjēdzīga, jo nav iekšējas laika struktūras, ko varētu stiept. Tādējādi otrā metode šim darbam nav piemērota, atšķirībā no pirmās</w:t>
+      </w:r>
+      <w:r>
         <w:t xml:space="preserve">. Sarežģītākiem </w:t>
       </w:r>
       <w:r>
@@ -22566,11 +22600,11 @@
         <w:commentReference w:id="139"/>
       </w:r>
       <w:r>
-        <w:t xml:space="preserve">protokols atspoguļo iepriekšējo nodaļu. Tiek saglabāti tie paši slīdošie vienu soli uz priekšu sadalījumi, un tie paši reālie testa mēneši paliek neskarti. Papildināšana tiks veikta tikai apmācības datiem pēc tam, kad reālie dati ir ielādēti un pārveidoti modelim gatavos logos, bet pirms modeļa pielāgošanas. Papildināšana tiks piemērota tikai iegūtajiem un sagatavotajiem datiem. Citiem vārdiem sakot, tiks </w:t>
+        <w:t xml:space="preserve">protokols atspoguļo iepriekšējo nodaļu. Tiek saglabāti tie paši slīdošie vienu soli uz priekšu sadalījumi, un tie paši reālie testa mēneši paliek neskarti. </w:t>
       </w:r>
       <w:r>
         <w:lastRenderedPageBreak/>
-        <w:t>saglabāta sākotnējā datu kopas (</w:t>
+        <w:t>Papildināšana tiks veikta tikai apmācības datiem pēc tam, kad reālie dati ir ielādēti un pārveidoti modelim gatavos logos, bet pirms modeļa pielāgošanas. Papildināšana tiks piemērota tikai iegūtajiem un sagatavotajiem datiem. Citiem vārdiem sakot, tiks saglabāta sākotnējā datu kopas (</w:t>
       </w:r>
       <w:r>
         <w:rPr>
@@ -22745,30 +22779,1065 @@
     </w:p>
     <w:p>
       <w:pPr>
+        <w:pStyle w:val="2-lm-virsraksts"/>
+      </w:pPr>
+      <w:r>
+        <w:t xml:space="preserve">Python </w:t>
+      </w:r>
+      <w:r>
+        <w:t>implementācija</w:t>
+      </w:r>
+    </w:p>
+    <w:p>
+      <w:pPr>
         <w:pStyle w:val="Teksts"/>
       </w:pPr>
-      <w:r>
-        <w:t xml:space="preserve">Python </w:t>
+      <w:commentRangeStart w:id="141"/>
+      <w:r>
+        <w:t xml:space="preserve">Papildināšanas </w:t>
+      </w:r>
+      <w:commentRangeEnd w:id="141"/>
+      <w:r>
+        <w:rPr>
+          <w:rStyle w:val="CommentReference"/>
+          <w:sz w:val="24"/>
+          <w:szCs w:val="24"/>
+        </w:rPr>
+        <w:commentReference w:id="141"/>
+      </w:r>
+      <w:r>
+        <w:t xml:space="preserve">eksperiments tika </w:t>
+      </w:r>
+      <w:r>
+        <w:t>realizēts</w:t>
+      </w:r>
+      <w:r>
+        <w:t xml:space="preserve"> tieši esošajā LSTM prognozēšanas skriptā. Sākotnējā LSTM </w:t>
+      </w:r>
+      <w:r>
+        <w:t>implementācij</w:t>
+      </w:r>
+      <w:r>
+        <w:t>a</w:t>
+      </w:r>
+      <w:r>
+        <w:t xml:space="preserve"> vispirms ģenerēja slīdošos logus no grupētajām laika rindām, pēc tam standartizēja iegūtos </w:t>
+      </w:r>
+      <w:r>
+        <w:t>objektus</w:t>
+      </w:r>
+      <w:r>
+        <w:t xml:space="preserve">, apmācīja vienu </w:t>
+      </w:r>
+      <w:r>
+        <w:lastRenderedPageBreak/>
+        <w:t xml:space="preserve">apkopotu modeli visās grupās un </w:t>
+      </w:r>
+      <w:r>
+        <w:t xml:space="preserve">tad </w:t>
+      </w:r>
+      <w:r>
+        <w:t xml:space="preserve">prognozēja nākamo mēnesi katrai materiālu grupai. Modificētā </w:t>
       </w:r>
       <w:r>
         <w:t>implementācija</w:t>
       </w:r>
+      <w:r>
+        <w:t xml:space="preserve"> saglabā šo struktūru un maina tikai logu ģenerēšanas posmu — kad </w:t>
+      </w:r>
+      <w:r>
+        <w:t xml:space="preserve">datu </w:t>
+      </w:r>
+      <w:r>
+        <w:t>sintētik</w:t>
+      </w:r>
+      <w:r>
+        <w:t>a</w:t>
+      </w:r>
+      <w:r>
+        <w:t xml:space="preserve"> ir iespējota, katrs jaunizveidotais reālais logs tiek apvienots ar iepriekšējo tās pašas materiālu grupas reālo logu. Sintētiskais logs un mērķis tiek konstruēti kā divu blakus esošo logu un mērķu aritmētiskais vidējais. Tādējādi, ja divi secīgi apmācības paraugi tiek apzīmēti kā </w:t>
+      </w:r>
+      <w:r>
+        <w:rPr>
+          <w:i/>
+          <w:iCs/>
+        </w:rPr>
+        <w:t>(X</w:t>
+      </w:r>
+      <w:r>
+        <w:rPr>
+          <w:i/>
+          <w:iCs/>
+          <w:vertAlign w:val="subscript"/>
+        </w:rPr>
+        <w:t>1</w:t>
+      </w:r>
+      <w:r>
+        <w:rPr>
+          <w:i/>
+          <w:iCs/>
+        </w:rPr>
+        <w:t>, y</w:t>
+      </w:r>
+      <w:r>
+        <w:rPr>
+          <w:i/>
+          <w:iCs/>
+          <w:vertAlign w:val="subscript"/>
+        </w:rPr>
+        <w:t>1</w:t>
+      </w:r>
+      <w:r>
+        <w:rPr>
+          <w:i/>
+          <w:iCs/>
+        </w:rPr>
+        <w:t>)</w:t>
+      </w:r>
+      <w:r>
+        <w:t xml:space="preserve"> un </w:t>
+      </w:r>
+      <w:r>
+        <w:rPr>
+          <w:i/>
+          <w:iCs/>
+        </w:rPr>
+        <w:t>(X</w:t>
+      </w:r>
+      <w:r>
+        <w:rPr>
+          <w:i/>
+          <w:iCs/>
+          <w:vertAlign w:val="subscript"/>
+        </w:rPr>
+        <w:t>2</w:t>
+      </w:r>
+      <w:r>
+        <w:rPr>
+          <w:i/>
+          <w:iCs/>
+        </w:rPr>
+        <w:t>, y</w:t>
+      </w:r>
+      <w:r>
+        <w:rPr>
+          <w:i/>
+          <w:iCs/>
+          <w:vertAlign w:val="subscript"/>
+        </w:rPr>
+        <w:t>2</w:t>
+      </w:r>
+      <w:r>
+        <w:rPr>
+          <w:i/>
+          <w:iCs/>
+        </w:rPr>
+        <w:t>)</w:t>
+      </w:r>
+      <w:r>
+        <w:t xml:space="preserve">, tad papildu sintētiskais paraugs tiek definēts kā </w:t>
+      </w:r>
+      <w:r>
+        <w:rPr>
+          <w:i/>
+          <w:iCs/>
+        </w:rPr>
+        <w:t>((X</w:t>
+      </w:r>
+      <w:r>
+        <w:rPr>
+          <w:i/>
+          <w:iCs/>
+          <w:vertAlign w:val="subscript"/>
+        </w:rPr>
+        <w:t>1</w:t>
+      </w:r>
+      <w:r>
+        <w:rPr>
+          <w:i/>
+          <w:iCs/>
+        </w:rPr>
+        <w:t xml:space="preserve"> + X</w:t>
+      </w:r>
+      <w:r>
+        <w:rPr>
+          <w:i/>
+          <w:iCs/>
+          <w:vertAlign w:val="subscript"/>
+        </w:rPr>
+        <w:t>2</w:t>
+      </w:r>
+      <w:r>
+        <w:rPr>
+          <w:i/>
+          <w:iCs/>
+        </w:rPr>
+        <w:t>)/2, (y</w:t>
+      </w:r>
+      <w:r>
+        <w:rPr>
+          <w:i/>
+          <w:iCs/>
+          <w:vertAlign w:val="subscript"/>
+        </w:rPr>
+        <w:t>1</w:t>
+      </w:r>
+      <w:r>
+        <w:rPr>
+          <w:i/>
+          <w:iCs/>
+        </w:rPr>
+        <w:t xml:space="preserve"> + y</w:t>
+      </w:r>
+      <w:r>
+        <w:rPr>
+          <w:i/>
+          <w:iCs/>
+          <w:vertAlign w:val="subscript"/>
+        </w:rPr>
+        <w:t>2</w:t>
+      </w:r>
+      <w:r>
+        <w:rPr>
+          <w:i/>
+          <w:iCs/>
+        </w:rPr>
+        <w:t>)/2)</w:t>
+      </w:r>
+      <w:r>
+        <w:t>. Papildināšana</w:t>
+      </w:r>
+      <w:r>
+        <w:t xml:space="preserve"> </w:t>
+      </w:r>
+      <w:r>
+        <w:t>izolē vienu konkrētu izmaiņu — apmācības logu skaita palielināšanu —, nemainot modeli.</w:t>
+      </w:r>
+      <w:r>
+        <w:t xml:space="preserve"> </w:t>
+      </w:r>
+      <w:r>
+        <w:t>Vizuāli izmaiņas ir redzamas zemāk.</w:t>
+      </w:r>
+    </w:p>
+    <w:p>
+      <w:pPr>
+        <w:pStyle w:val="Attls"/>
+      </w:pPr>
+      <w:r>
+        <w:drawing>
+          <wp:inline distT="0" distB="0" distL="0" distR="0" wp14:anchorId="196D70F3" wp14:editId="7E364252">
+            <wp:extent cx="5271135" cy="2251710"/>
+            <wp:effectExtent l="0" t="0" r="5715" b="0"/>
+            <wp:docPr id="575649938" name="Picture 1"/>
+            <wp:cNvGraphicFramePr>
+              <a:graphicFrameLocks xmlns:a="http://schemas.openxmlformats.org/drawingml/2006/main" noChangeAspect="1"/>
+            </wp:cNvGraphicFramePr>
+            <a:graphic xmlns:a="http://schemas.openxmlformats.org/drawingml/2006/main">
+              <a:graphicData uri="http://schemas.openxmlformats.org/drawingml/2006/picture">
+                <pic:pic xmlns:pic="http://schemas.openxmlformats.org/drawingml/2006/picture">
+                  <pic:nvPicPr>
+                    <pic:cNvPr id="575649938" name=""/>
+                    <pic:cNvPicPr/>
+                  </pic:nvPicPr>
+                  <pic:blipFill>
+                    <a:blip r:embed="rId22"/>
+                    <a:stretch>
+                      <a:fillRect/>
+                    </a:stretch>
+                  </pic:blipFill>
+                  <pic:spPr>
+                    <a:xfrm>
+                      <a:off x="0" y="0"/>
+                      <a:ext cx="5271135" cy="2251710"/>
+                    </a:xfrm>
+                    <a:prstGeom prst="rect">
+                      <a:avLst/>
+                    </a:prstGeom>
+                  </pic:spPr>
+                </pic:pic>
+              </a:graphicData>
+            </a:graphic>
+          </wp:inline>
+        </w:drawing>
+      </w:r>
+    </w:p>
+    <w:p>
+      <w:pPr>
+        <w:pStyle w:val="Att-nos-ar-skaidrojumiem"/>
+      </w:pPr>
+      <w:r>
+        <w:fldChar w:fldCharType="begin"/>
+      </w:r>
+      <w:r>
+        <w:instrText xml:space="preserve"> STYLEREF  \s 1-līm-numurēts-virsraksts </w:instrText>
+      </w:r>
+      <w:r>
+        <w:fldChar w:fldCharType="separate"/>
+      </w:r>
+      <w:r>
+        <w:rPr>
+          <w:noProof/>
+        </w:rPr>
+        <w:t>6</w:t>
+      </w:r>
+      <w:r>
+        <w:fldChar w:fldCharType="end"/>
+      </w:r>
+      <w:r>
+        <w:t>.</w:t>
+      </w:r>
+      <w:r>
+        <w:fldChar w:fldCharType="begin"/>
+      </w:r>
+      <w:r>
+        <w:instrText xml:space="preserve"> SEQ ._att. \* ARABIC \s 1 </w:instrText>
+      </w:r>
+      <w:r>
+        <w:fldChar w:fldCharType="separate"/>
+      </w:r>
+      <w:r>
+        <w:rPr>
+          <w:noProof/>
+        </w:rPr>
+        <w:t>6</w:t>
+      </w:r>
+      <w:r>
+        <w:fldChar w:fldCharType="end"/>
+      </w:r>
+      <w:r>
+        <w:t xml:space="preserve">. att. </w:t>
+      </w:r>
+      <w:r>
+        <w:t>Izmaiņas, kas pievieno datu papildināšanu esošajai ieviešanai</w:t>
+      </w:r>
     </w:p>
     <w:p>
       <w:pPr>
         <w:pStyle w:val="Teksts"/>
       </w:pPr>
+      <w:r>
+        <w:t xml:space="preserve">Rezultāta piemēru var redzēt zemāk. Pilnu rezultātu var atrast </w:t>
+      </w:r>
+      <w:r>
+        <w:t>6</w:t>
+      </w:r>
+      <w:r>
+        <w:t>. pielikumā.</w:t>
+      </w:r>
+    </w:p>
+    <w:p>
+      <w:pPr>
+        <w:pStyle w:val="Tab-numurs"/>
+        <w:rPr>
+          <w:noProof/>
+        </w:rPr>
+      </w:pPr>
+      <w:r>
+        <w:tab/>
+      </w:r>
+      <w:r>
+        <w:rPr>
+          <w:noProof/>
+        </w:rPr>
+        <w:fldChar w:fldCharType="begin"/>
+      </w:r>
+      <w:r>
+        <w:rPr>
+          <w:noProof/>
+        </w:rPr>
+        <w:instrText xml:space="preserve"> STYLEREF  \s 1-līm-numurēts-virsraksts </w:instrText>
+      </w:r>
+      <w:r>
+        <w:rPr>
+          <w:noProof/>
+        </w:rPr>
+        <w:fldChar w:fldCharType="separate"/>
+      </w:r>
+      <w:r>
+        <w:rPr>
+          <w:noProof/>
+        </w:rPr>
+        <w:t>5</w:t>
+      </w:r>
+      <w:r>
+        <w:rPr>
+          <w:noProof/>
+        </w:rPr>
+        <w:fldChar w:fldCharType="end"/>
+      </w:r>
+      <w:r>
+        <w:rPr>
+          <w:noProof/>
+        </w:rPr>
+        <w:t>.</w:t>
+      </w:r>
+      <w:r>
+        <w:rPr>
+          <w:noProof/>
+        </w:rPr>
+        <w:fldChar w:fldCharType="begin"/>
+      </w:r>
+      <w:r>
+        <w:rPr>
+          <w:noProof/>
+        </w:rPr>
+        <w:instrText xml:space="preserve"> SEQ Tabula \* ARABIC \s 1 </w:instrText>
+      </w:r>
+      <w:r>
+        <w:rPr>
+          <w:noProof/>
+        </w:rPr>
+        <w:fldChar w:fldCharType="separate"/>
+      </w:r>
+      <w:r>
+        <w:rPr>
+          <w:noProof/>
+        </w:rPr>
+        <w:t>5</w:t>
+      </w:r>
+      <w:r>
+        <w:rPr>
+          <w:noProof/>
+        </w:rPr>
+        <w:fldChar w:fldCharType="end"/>
+      </w:r>
+      <w:r>
+        <w:rPr>
+          <w:noProof/>
+        </w:rPr>
+        <w:t>. tabula</w:t>
+      </w:r>
+    </w:p>
+    <w:p>
+      <w:pPr>
+        <w:pStyle w:val="Tab-virsraksts"/>
+      </w:pPr>
+      <w:r>
+        <w:t xml:space="preserve">LSTM </w:t>
+      </w:r>
+      <w:r>
+        <w:t xml:space="preserve">ar papildinātiem datiem </w:t>
+      </w:r>
+      <w:r>
+        <w:t>rezultāt</w:t>
+      </w:r>
+      <w:r>
+        <w:t>a piemērs</w:t>
+      </w:r>
+    </w:p>
+    <w:tbl>
+      <w:tblPr>
+        <w:tblStyle w:val="TableGrid"/>
+        <w:tblW w:w="8291" w:type="dxa"/>
+        <w:tblLook w:val="04A0" w:firstRow="1" w:lastRow="0" w:firstColumn="1" w:lastColumn="0" w:noHBand="0" w:noVBand="1"/>
+      </w:tblPr>
+      <w:tblGrid>
+        <w:gridCol w:w="1796"/>
+        <w:gridCol w:w="1319"/>
+        <w:gridCol w:w="841"/>
+        <w:gridCol w:w="1244"/>
+        <w:gridCol w:w="1145"/>
+        <w:gridCol w:w="1035"/>
+        <w:gridCol w:w="911"/>
+      </w:tblGrid>
+      <w:tr>
+        <w:trPr>
+          <w:trHeight w:val="300"/>
+        </w:trPr>
+        <w:tc>
+          <w:tcPr>
+            <w:tcW w:w="1798" w:type="dxa"/>
+            <w:noWrap/>
+            <w:hideMark/>
+          </w:tcPr>
+          <w:p>
+            <w:pPr>
+              <w:pStyle w:val="Tab-kolonnas-nosaukums"/>
+            </w:pPr>
+            <w:r>
+              <w:t>material_group</w:t>
+            </w:r>
+          </w:p>
+        </w:tc>
+        <w:tc>
+          <w:tcPr>
+            <w:tcW w:w="1320" w:type="dxa"/>
+            <w:noWrap/>
+            <w:hideMark/>
+          </w:tcPr>
+          <w:p>
+            <w:pPr>
+              <w:pStyle w:val="Tab-kolonnas-nosaukums"/>
+            </w:pPr>
+            <w:r>
+              <w:t>test_month</w:t>
+            </w:r>
+          </w:p>
+        </w:tc>
+        <w:tc>
+          <w:tcPr>
+            <w:tcW w:w="841" w:type="dxa"/>
+            <w:noWrap/>
+            <w:hideMark/>
+          </w:tcPr>
+          <w:p>
+            <w:pPr>
+              <w:pStyle w:val="Tab-kolonnas-nosaukums"/>
+            </w:pPr>
+            <w:r>
+              <w:t>actual</w:t>
+            </w:r>
+          </w:p>
+        </w:tc>
+        <w:tc>
+          <w:tcPr>
+            <w:tcW w:w="1244" w:type="dxa"/>
+            <w:noWrap/>
+            <w:hideMark/>
+          </w:tcPr>
+          <w:p>
+            <w:pPr>
+              <w:pStyle w:val="Tab-kolonnas-nosaukums"/>
+            </w:pPr>
+            <w:r>
+              <w:t>prediction</w:t>
+            </w:r>
+          </w:p>
+        </w:tc>
+        <w:tc>
+          <w:tcPr>
+            <w:tcW w:w="1143" w:type="dxa"/>
+            <w:noWrap/>
+            <w:hideMark/>
+          </w:tcPr>
+          <w:p>
+            <w:pPr>
+              <w:pStyle w:val="Tab-kolonnas-nosaukums"/>
+            </w:pPr>
+            <w:r>
+              <w:t>abs_error</w:t>
+            </w:r>
+          </w:p>
+        </w:tc>
+        <w:tc>
+          <w:tcPr>
+            <w:tcW w:w="1034" w:type="dxa"/>
+            <w:noWrap/>
+            <w:hideMark/>
+          </w:tcPr>
+          <w:p>
+            <w:pPr>
+              <w:pStyle w:val="Tab-kolonnas-nosaukums"/>
+            </w:pPr>
+            <w:r>
+              <w:t>sq_error</w:t>
+            </w:r>
+          </w:p>
+        </w:tc>
+        <w:tc>
+          <w:tcPr>
+            <w:tcW w:w="911" w:type="dxa"/>
+            <w:noWrap/>
+            <w:hideMark/>
+          </w:tcPr>
+          <w:p>
+            <w:pPr>
+              <w:pStyle w:val="Tab-kolonnas-nosaukums"/>
+            </w:pPr>
+            <w:r>
+              <w:t>ape</w:t>
+            </w:r>
+          </w:p>
+        </w:tc>
+      </w:tr>
+      <w:tr>
+        <w:trPr>
+          <w:trHeight w:val="300"/>
+        </w:trPr>
+        <w:tc>
+          <w:tcPr>
+            <w:tcW w:w="1798" w:type="dxa"/>
+            <w:noWrap/>
+            <w:hideMark/>
+          </w:tcPr>
+          <w:p>
+            <w:pPr>
+              <w:pStyle w:val="Tab-saturs"/>
+            </w:pPr>
+            <w:r>
+              <w:t>BUVNIEKS: NEĒVELĒTI</w:t>
+            </w:r>
+          </w:p>
+        </w:tc>
+        <w:tc>
+          <w:tcPr>
+            <w:tcW w:w="1320" w:type="dxa"/>
+            <w:noWrap/>
+            <w:hideMark/>
+          </w:tcPr>
+          <w:p>
+            <w:pPr>
+              <w:pStyle w:val="Tab-saturs"/>
+            </w:pPr>
+            <w:r>
+              <w:t>2026-01</w:t>
+            </w:r>
+          </w:p>
+        </w:tc>
+        <w:tc>
+          <w:tcPr>
+            <w:tcW w:w="841" w:type="dxa"/>
+            <w:noWrap/>
+            <w:hideMark/>
+          </w:tcPr>
+          <w:p>
+            <w:pPr>
+              <w:pStyle w:val="Tab-saturs"/>
+            </w:pPr>
+            <w:r>
+              <w:t>2.411</w:t>
+            </w:r>
+          </w:p>
+        </w:tc>
+        <w:tc>
+          <w:tcPr>
+            <w:tcW w:w="1244" w:type="dxa"/>
+            <w:noWrap/>
+            <w:hideMark/>
+          </w:tcPr>
+          <w:p>
+            <w:pPr>
+              <w:pStyle w:val="Tab-saturs"/>
+            </w:pPr>
+            <w:r>
+              <w:t>6.603</w:t>
+            </w:r>
+          </w:p>
+        </w:tc>
+        <w:tc>
+          <w:tcPr>
+            <w:tcW w:w="1143" w:type="dxa"/>
+            <w:noWrap/>
+            <w:hideMark/>
+          </w:tcPr>
+          <w:p>
+            <w:pPr>
+              <w:pStyle w:val="Tab-saturs"/>
+            </w:pPr>
+            <w:r>
+              <w:t>4.191</w:t>
+            </w:r>
+          </w:p>
+        </w:tc>
+        <w:tc>
+          <w:tcPr>
+            <w:tcW w:w="1034" w:type="dxa"/>
+            <w:noWrap/>
+            <w:hideMark/>
+          </w:tcPr>
+          <w:p>
+            <w:pPr>
+              <w:pStyle w:val="Tab-saturs"/>
+            </w:pPr>
+            <w:r>
+              <w:t>17.568</w:t>
+            </w:r>
+          </w:p>
+        </w:tc>
+        <w:tc>
+          <w:tcPr>
+            <w:tcW w:w="911" w:type="dxa"/>
+            <w:noWrap/>
+            <w:hideMark/>
+          </w:tcPr>
+          <w:p>
+            <w:pPr>
+              <w:pStyle w:val="Tab-saturs"/>
+            </w:pPr>
+            <w:r>
+              <w:t>1.738</w:t>
+            </w:r>
+          </w:p>
+        </w:tc>
+      </w:tr>
+      <w:tr>
+        <w:trPr>
+          <w:trHeight w:val="300"/>
+        </w:trPr>
+        <w:tc>
+          <w:tcPr>
+            <w:tcW w:w="1798" w:type="dxa"/>
+            <w:noWrap/>
+            <w:hideMark/>
+          </w:tcPr>
+          <w:p>
+            <w:pPr>
+              <w:pStyle w:val="Tab-saturs"/>
+            </w:pPr>
+            <w:r>
+              <w:t>BUVNIEKS: ĒVELĒTI</w:t>
+            </w:r>
+          </w:p>
+        </w:tc>
+        <w:tc>
+          <w:tcPr>
+            <w:tcW w:w="1320" w:type="dxa"/>
+            <w:noWrap/>
+            <w:hideMark/>
+          </w:tcPr>
+          <w:p>
+            <w:pPr>
+              <w:pStyle w:val="Tab-saturs"/>
+            </w:pPr>
+            <w:r>
+              <w:t>2026-01</w:t>
+            </w:r>
+          </w:p>
+        </w:tc>
+        <w:tc>
+          <w:tcPr>
+            <w:tcW w:w="841" w:type="dxa"/>
+            <w:noWrap/>
+            <w:hideMark/>
+          </w:tcPr>
+          <w:p>
+            <w:pPr>
+              <w:pStyle w:val="Tab-saturs"/>
+            </w:pPr>
+            <w:r>
+              <w:t>0.878</w:t>
+            </w:r>
+          </w:p>
+        </w:tc>
+        <w:tc>
+          <w:tcPr>
+            <w:tcW w:w="1244" w:type="dxa"/>
+            <w:noWrap/>
+            <w:hideMark/>
+          </w:tcPr>
+          <w:p>
+            <w:pPr>
+              <w:pStyle w:val="Tab-saturs"/>
+            </w:pPr>
+            <w:r>
+              <w:t>4.473</w:t>
+            </w:r>
+          </w:p>
+        </w:tc>
+        <w:tc>
+          <w:tcPr>
+            <w:tcW w:w="1143" w:type="dxa"/>
+            <w:noWrap/>
+            <w:hideMark/>
+          </w:tcPr>
+          <w:p>
+            <w:pPr>
+              <w:pStyle w:val="Tab-saturs"/>
+            </w:pPr>
+            <w:r>
+              <w:t>3.596</w:t>
+            </w:r>
+          </w:p>
+        </w:tc>
+        <w:tc>
+          <w:tcPr>
+            <w:tcW w:w="1034" w:type="dxa"/>
+            <w:noWrap/>
+            <w:hideMark/>
+          </w:tcPr>
+          <w:p>
+            <w:pPr>
+              <w:pStyle w:val="Tab-saturs"/>
+            </w:pPr>
+            <w:r>
+              <w:t>12.931</w:t>
+            </w:r>
+          </w:p>
+        </w:tc>
+        <w:tc>
+          <w:tcPr>
+            <w:tcW w:w="911" w:type="dxa"/>
+            <w:noWrap/>
+            <w:hideMark/>
+          </w:tcPr>
+          <w:p>
+            <w:pPr>
+              <w:pStyle w:val="Tab-saturs"/>
+            </w:pPr>
+            <w:r>
+              <w:t>4.098</w:t>
+            </w:r>
+          </w:p>
+        </w:tc>
+      </w:tr>
+      <w:tr>
+        <w:trPr>
+          <w:trHeight w:val="300"/>
+        </w:trPr>
+        <w:tc>
+          <w:tcPr>
+            <w:tcW w:w="8291" w:type="dxa"/>
+            <w:gridSpan w:val="7"/>
+            <w:noWrap/>
+            <w:hideMark/>
+          </w:tcPr>
+          <w:p>
+            <w:pPr>
+              <w:pStyle w:val="Tab-saturs"/>
+            </w:pPr>
+            <w:r>
+              <w:t>…</w:t>
+            </w:r>
+          </w:p>
+        </w:tc>
+      </w:tr>
+      <w:tr>
+        <w:trPr>
+          <w:trHeight w:val="300"/>
+        </w:trPr>
+        <w:tc>
+          <w:tcPr>
+            <w:tcW w:w="1798" w:type="dxa"/>
+            <w:noWrap/>
+            <w:hideMark/>
+          </w:tcPr>
+          <w:p>
+            <w:pPr>
+              <w:pStyle w:val="Tab-saturs"/>
+            </w:pPr>
+            <w:r>
+              <w:t>KARTEX: TERASES DĒĻI</w:t>
+            </w:r>
+          </w:p>
+        </w:tc>
+        <w:tc>
+          <w:tcPr>
+            <w:tcW w:w="1320" w:type="dxa"/>
+            <w:noWrap/>
+            <w:hideMark/>
+          </w:tcPr>
+          <w:p>
+            <w:pPr>
+              <w:pStyle w:val="Tab-saturs"/>
+            </w:pPr>
+            <w:r>
+              <w:t>2026-03</w:t>
+            </w:r>
+          </w:p>
+        </w:tc>
+        <w:tc>
+          <w:tcPr>
+            <w:tcW w:w="841" w:type="dxa"/>
+            <w:noWrap/>
+            <w:hideMark/>
+          </w:tcPr>
+          <w:p>
+            <w:pPr>
+              <w:pStyle w:val="Tab-saturs"/>
+            </w:pPr>
+            <w:r>
+              <w:t>1.579</w:t>
+            </w:r>
+          </w:p>
+        </w:tc>
+        <w:tc>
+          <w:tcPr>
+            <w:tcW w:w="1244" w:type="dxa"/>
+            <w:noWrap/>
+            <w:hideMark/>
+          </w:tcPr>
+          <w:p>
+            <w:pPr>
+              <w:pStyle w:val="Tab-saturs"/>
+            </w:pPr>
+            <w:r>
+              <w:t>4.202</w:t>
+            </w:r>
+          </w:p>
+        </w:tc>
+        <w:tc>
+          <w:tcPr>
+            <w:tcW w:w="1143" w:type="dxa"/>
+            <w:noWrap/>
+            <w:hideMark/>
+          </w:tcPr>
+          <w:p>
+            <w:pPr>
+              <w:pStyle w:val="Tab-saturs"/>
+            </w:pPr>
+            <w:r>
+              <w:t>2.624</w:t>
+            </w:r>
+          </w:p>
+        </w:tc>
+        <w:tc>
+          <w:tcPr>
+            <w:tcW w:w="1034" w:type="dxa"/>
+            <w:noWrap/>
+            <w:hideMark/>
+          </w:tcPr>
+          <w:p>
+            <w:pPr>
+              <w:pStyle w:val="Tab-saturs"/>
+            </w:pPr>
+            <w:r>
+              <w:t>6.885</w:t>
+            </w:r>
+          </w:p>
+        </w:tc>
+        <w:tc>
+          <w:tcPr>
+            <w:tcW w:w="911" w:type="dxa"/>
+            <w:noWrap/>
+            <w:hideMark/>
+          </w:tcPr>
+          <w:p>
+            <w:pPr>
+              <w:pStyle w:val="Tab-saturs"/>
+            </w:pPr>
+            <w:r>
+              <w:t>1.662</w:t>
+            </w:r>
+          </w:p>
+        </w:tc>
+      </w:tr>
+      <w:tr>
+        <w:trPr>
+          <w:trHeight w:val="300"/>
+        </w:trPr>
+        <w:tc>
+          <w:tcPr>
+            <w:tcW w:w="1798" w:type="dxa"/>
+            <w:noWrap/>
+            <w:hideMark/>
+          </w:tcPr>
+          <w:p>
+            <w:pPr>
+              <w:pStyle w:val="Tab-saturs"/>
+            </w:pPr>
+            <w:r>
+              <w:t>KARTEX: ŽOGA DĒĻI</w:t>
+            </w:r>
+          </w:p>
+        </w:tc>
+        <w:tc>
+          <w:tcPr>
+            <w:tcW w:w="1320" w:type="dxa"/>
+            <w:noWrap/>
+            <w:hideMark/>
+          </w:tcPr>
+          <w:p>
+            <w:pPr>
+              <w:pStyle w:val="Tab-saturs"/>
+            </w:pPr>
+            <w:r>
+              <w:t>2026-03</w:t>
+            </w:r>
+          </w:p>
+        </w:tc>
+        <w:tc>
+          <w:tcPr>
+            <w:tcW w:w="841" w:type="dxa"/>
+            <w:noWrap/>
+            <w:hideMark/>
+          </w:tcPr>
+          <w:p>
+            <w:pPr>
+              <w:pStyle w:val="Tab-saturs"/>
+            </w:pPr>
+            <w:r>
+              <w:t>1.27</w:t>
+            </w:r>
+          </w:p>
+        </w:tc>
+        <w:tc>
+          <w:tcPr>
+            <w:tcW w:w="1244" w:type="dxa"/>
+            <w:noWrap/>
+            <w:hideMark/>
+          </w:tcPr>
+          <w:p>
+            <w:pPr>
+              <w:pStyle w:val="Tab-saturs"/>
+            </w:pPr>
+            <w:r>
+              <w:t>0.091</w:t>
+            </w:r>
+          </w:p>
+        </w:tc>
+        <w:tc>
+          <w:tcPr>
+            <w:tcW w:w="1143" w:type="dxa"/>
+            <w:noWrap/>
+            <w:hideMark/>
+          </w:tcPr>
+          <w:p>
+            <w:pPr>
+              <w:pStyle w:val="Tab-saturs"/>
+            </w:pPr>
+            <w:r>
+              <w:t>1.179</w:t>
+            </w:r>
+          </w:p>
+        </w:tc>
+        <w:tc>
+          <w:tcPr>
+            <w:tcW w:w="1034" w:type="dxa"/>
+            <w:noWrap/>
+            <w:hideMark/>
+          </w:tcPr>
+          <w:p>
+            <w:pPr>
+              <w:pStyle w:val="Tab-saturs"/>
+            </w:pPr>
+            <w:r>
+              <w:t>1.39</w:t>
+            </w:r>
+          </w:p>
+        </w:tc>
+        <w:tc>
+          <w:tcPr>
+            <w:tcW w:w="911" w:type="dxa"/>
+            <w:noWrap/>
+            <w:hideMark/>
+          </w:tcPr>
+          <w:p>
+            <w:pPr>
+              <w:pStyle w:val="Tab-saturs"/>
+            </w:pPr>
+            <w:r>
+              <w:t>0.928</w:t>
+            </w:r>
+          </w:p>
+        </w:tc>
+      </w:tr>
+    </w:tbl>
+    <w:p>
+      <w:pPr>
+        <w:pStyle w:val="Teksts"/>
+      </w:pPr>
+    </w:p>
+    <w:p>
+      <w:pPr>
+        <w:pStyle w:val="Att-nos-bez-skaidrojumiem"/>
+      </w:pPr>
+    </w:p>
+    <w:p>
+      <w:pPr>
+        <w:pStyle w:val="Teksts"/>
+      </w:pPr>
     </w:p>
     <w:p>
       <w:pPr>
         <w:pStyle w:val="1-lm-nenumurts-virsraksts"/>
       </w:pPr>
-      <w:bookmarkStart w:id="141" w:name="_Toc225535011"/>
+      <w:bookmarkStart w:id="142" w:name="_Toc225535011"/>
       <w:r>
         <w:lastRenderedPageBreak/>
         <w:t>Rezultāti un secinājumi</w:t>
       </w:r>
-      <w:bookmarkEnd w:id="141"/>
+      <w:bookmarkEnd w:id="142"/>
     </w:p>
     <w:p>
       <w:pPr>
@@ -22929,7 +23998,7 @@
       <w:pPr>
         <w:pStyle w:val="Teksts"/>
         <w:sectPr>
-          <w:footerReference w:type="default" r:id="rId22"/>
+          <w:footerReference w:type="default" r:id="rId23"/>
           <w:pgSz w:w="11907" w:h="16840" w:code="9"/>
           <w:pgMar w:top="1440" w:right="1803" w:bottom="1440" w:left="1803" w:header="709" w:footer="709" w:gutter="0"/>
           <w:cols w:space="708"/>
@@ -22941,14 +24010,14 @@
       <w:pPr>
         <w:pStyle w:val="1-lm-nenumurts-virsraksts"/>
       </w:pPr>
-      <w:bookmarkStart w:id="142" w:name="_Toc88602609"/>
-      <w:bookmarkStart w:id="143" w:name="_Toc225535012"/>
+      <w:bookmarkStart w:id="143" w:name="_Toc88602609"/>
+      <w:bookmarkStart w:id="144" w:name="_Toc225535012"/>
       <w:r>
         <w:lastRenderedPageBreak/>
         <w:t>Izmantotie informācijas avoti</w:t>
       </w:r>
-      <w:bookmarkEnd w:id="142"/>
       <w:bookmarkEnd w:id="143"/>
+      <w:bookmarkEnd w:id="144"/>
       <w:r>
         <w:fldChar w:fldCharType="begin"/>
       </w:r>
@@ -23011,6 +24080,35 @@
               <w:r>
                 <w:fldChar w:fldCharType="separate"/>
               </w:r>
+              <w:r>
+                <w:rPr>
+                  <w:noProof/>
+                </w:rPr>
+                <w:t xml:space="preserve">Abbasimehr, H., Abri, A., Oskouei, A. G., &amp; Noshad, A. (2025). Multi-view clustering for localized global time series forecasting. </w:t>
+              </w:r>
+              <w:r>
+                <w:rPr>
+                  <w:i/>
+                  <w:iCs/>
+                  <w:noProof/>
+                </w:rPr>
+                <w:t>Neurocomputing, 653</w:t>
+              </w:r>
+              <w:r>
+                <w:rPr>
+                  <w:noProof/>
+                </w:rPr>
+                <w:t>. doi:10.1016/j.neucom.2025.131183</w:t>
+              </w:r>
+            </w:p>
+            <w:p>
+              <w:pPr>
+                <w:pStyle w:val="Bibliography"/>
+                <w:ind w:left="720" w:hanging="720"/>
+                <w:rPr>
+                  <w:noProof/>
+                </w:rPr>
+              </w:pPr>
               <w:r>
                 <w:rPr>
                   <w:noProof/>
@@ -23059,7 +24157,21 @@
                 <w:rPr>
                   <w:noProof/>
                 </w:rPr>
-                <w:t>B S, S., &amp; Suresh, M. (2023). A Comprehensive Analysis of Retail Sales Forecasting Using Machine Learning and Deep Learning Methods., (lpp. 1-5). Tiptur, India. doi:10.1109/ICDSNS58469.2023.10245887</w:t>
+                <w:t xml:space="preserve">Bandara, K., Bergmeir, C., &amp; Smyl, S. (2020). Forecasting across time series databases using recurrent neural networks on groups of similar series: A clustering approach. </w:t>
+              </w:r>
+              <w:r>
+                <w:rPr>
+                  <w:i/>
+                  <w:iCs/>
+                  <w:noProof/>
+                </w:rPr>
+                <w:t>Expert Systems With Applications, 140</w:t>
+              </w:r>
+              <w:r>
+                <w:rPr>
+                  <w:noProof/>
+                </w:rPr>
+                <w:t>. doi:10.1016/j.eswa.2019.112896</w:t>
               </w:r>
             </w:p>
             <w:p>
@@ -23089,6 +24201,152 @@
                 <w:rPr>
                   <w:noProof/>
                 </w:rPr>
+                <w:t xml:space="preserve">Borrohou, S., Fissoune, R., &amp; Badir, H. (2025). The role of data transformation in modern analytics: A comprehensive survey. </w:t>
+              </w:r>
+              <w:r>
+                <w:rPr>
+                  <w:i/>
+                  <w:iCs/>
+                  <w:noProof/>
+                </w:rPr>
+                <w:t>Journal of Computer Languages</w:t>
+              </w:r>
+              <w:r>
+                <w:rPr>
+                  <w:noProof/>
+                </w:rPr>
+                <w:t>, 10.1016/j.cola.2025.101329.</w:t>
+              </w:r>
+            </w:p>
+            <w:p>
+              <w:pPr>
+                <w:pStyle w:val="Bibliography"/>
+                <w:ind w:left="720" w:hanging="720"/>
+                <w:rPr>
+                  <w:noProof/>
+                </w:rPr>
+              </w:pPr>
+              <w:r>
+                <w:rPr>
+                  <w:noProof/>
+                </w:rPr>
+                <w:t xml:space="preserve">Chiang, C.-C., &amp; Fu, H.-C. (1992). A Variant of Second-Order Multilayer Perceptron and Its Application to Function Approximations. </w:t>
+              </w:r>
+              <w:r>
+                <w:rPr>
+                  <w:i/>
+                  <w:iCs/>
+                  <w:noProof/>
+                </w:rPr>
+                <w:t>Proceedings of the IEEE Conference (leave generic if unsure)</w:t>
+              </w:r>
+              <w:r>
+                <w:rPr>
+                  <w:noProof/>
+                </w:rPr>
+                <w:t xml:space="preserve"> (lpp. III-887–III-892). IEEE. doi:10.1109/IJCNN.1992.227087</w:t>
+              </w:r>
+            </w:p>
+            <w:p>
+              <w:pPr>
+                <w:pStyle w:val="Bibliography"/>
+                <w:ind w:left="720" w:hanging="720"/>
+                <w:rPr>
+                  <w:noProof/>
+                </w:rPr>
+              </w:pPr>
+              <w:r>
+                <w:rPr>
+                  <w:noProof/>
+                </w:rPr>
+                <w:t xml:space="preserve">Demir, S., Mincev, K., Kok, K., &amp; Paterakis, N. G. (2021). Data augmentation for time series regression: Applying transformations, autoencoders and adversarial networks to electricity price forecasting. </w:t>
+              </w:r>
+              <w:r>
+                <w:rPr>
+                  <w:i/>
+                  <w:iCs/>
+                  <w:noProof/>
+                </w:rPr>
+                <w:t>Applied Energy, 304</w:t>
+              </w:r>
+              <w:r>
+                <w:rPr>
+                  <w:noProof/>
+                </w:rPr>
+                <w:t xml:space="preserve">. doi:10.1016/j.apenergy.2021.117695 </w:t>
+              </w:r>
+            </w:p>
+            <w:p>
+              <w:pPr>
+                <w:pStyle w:val="Bibliography"/>
+                <w:ind w:left="720" w:hanging="720"/>
+                <w:rPr>
+                  <w:noProof/>
+                </w:rPr>
+              </w:pPr>
+              <w:r>
+                <w:rPr>
+                  <w:noProof/>
+                </w:rPr>
+                <w:lastRenderedPageBreak/>
+                <w:t xml:space="preserve">Deniss, G. (2026). </w:t>
+              </w:r>
+              <w:r>
+                <w:rPr>
+                  <w:i/>
+                  <w:iCs/>
+                  <w:noProof/>
+                </w:rPr>
+                <w:t>denissgrabovskis/bachelor</w:t>
+              </w:r>
+              <w:r>
+                <w:rPr>
+                  <w:noProof/>
+                </w:rPr>
+                <w:t>. Ielādēts no GitHub: https://github.com/denissgrabovskis/bachelor</w:t>
+              </w:r>
+            </w:p>
+            <w:p>
+              <w:pPr>
+                <w:pStyle w:val="Bibliography"/>
+                <w:ind w:left="720" w:hanging="720"/>
+                <w:rPr>
+                  <w:noProof/>
+                </w:rPr>
+              </w:pPr>
+              <w:r>
+                <w:rPr>
+                  <w:noProof/>
+                </w:rPr>
+                <w:t xml:space="preserve">Dick, G., Owen, C., &amp; Whigham, P. A. (2020). Feature Standardisation and Coefficient Optimisation for Effective Symbolic Regression. </w:t>
+              </w:r>
+              <w:r>
+                <w:rPr>
+                  <w:i/>
+                  <w:iCs/>
+                  <w:noProof/>
+                </w:rPr>
+                <w:t>Genetic and Evolutionary Computation Conference</w:t>
+              </w:r>
+              <w:r>
+                <w:rPr>
+                  <w:noProof/>
+                </w:rPr>
+                <w:t>, 306–314. doi:10.1145/3377930.3390237</w:t>
+              </w:r>
+            </w:p>
+            <w:p>
+              <w:pPr>
+                <w:pStyle w:val="Bibliography"/>
+                <w:ind w:left="720" w:hanging="720"/>
+                <w:rPr>
+                  <w:noProof/>
+                </w:rPr>
+              </w:pPr>
+              <w:r>
+                <w:rPr>
+                  <w:noProof/>
+                </w:rPr>
                 <w:t xml:space="preserve">Eglite, L., &amp; Birzniece, I. (2022). Retail Sales Forecasting Using Deep Learning: Systematic Literature Review. </w:t>
               </w:r>
               <w:r>
@@ -23104,6 +24362,35 @@
                   <w:noProof/>
                 </w:rPr>
                 <w:t>, 53-62. doi:10.7250/csimq.2022-30.03</w:t>
+              </w:r>
+            </w:p>
+            <w:p>
+              <w:pPr>
+                <w:pStyle w:val="Bibliography"/>
+                <w:ind w:left="720" w:hanging="720"/>
+                <w:rPr>
+                  <w:noProof/>
+                </w:rPr>
+              </w:pPr>
+              <w:r>
+                <w:rPr>
+                  <w:noProof/>
+                </w:rPr>
+                <w:t xml:space="preserve">Elmotawakkil, A., Enneya, N., Bhagat, S. K., Ouda, M. M., &amp; Kumar, V. (2025). Advanced machine learning models for robust prediction of water quality index and classification. </w:t>
+              </w:r>
+              <w:r>
+                <w:rPr>
+                  <w:i/>
+                  <w:iCs/>
+                  <w:noProof/>
+                </w:rPr>
+                <w:t>Journal of Hydroinformatics, 27</w:t>
+              </w:r>
+              <w:r>
+                <w:rPr>
+                  <w:noProof/>
+                </w:rPr>
+                <w:t>(2). doi:0.2166/hydro.2025.290</w:t>
               </w:r>
             </w:p>
             <w:p>
@@ -23177,7 +24464,6 @@
                 <w:rPr>
                   <w:noProof/>
                 </w:rPr>
-                <w:lastRenderedPageBreak/>
                 <w:t>Hu, J., Hu, Z., Li, T., &amp; Du, S. (2023). A contrastive learning based universal representation for time series forecasting. 86-98. doi:10.1016/j.ins.2023.03.143</w:t>
               </w:r>
             </w:p>
@@ -23193,6 +24479,65 @@
                 <w:rPr>
                   <w:noProof/>
                 </w:rPr>
+                <w:t xml:space="preserve">Iglesias, G., Talavera, E., González-Prieto, Á., Mozo, A., &amp; Gómez-Canaval , S. (2023). Data Augmentation techniques in time series domain: a survey and taxonomy. </w:t>
+              </w:r>
+              <w:r>
+                <w:rPr>
+                  <w:i/>
+                  <w:iCs/>
+                  <w:noProof/>
+                </w:rPr>
+                <w:t>Neural Computing and Applications, 35</w:t>
+              </w:r>
+              <w:r>
+                <w:rPr>
+                  <w:noProof/>
+                </w:rPr>
+                <w:t xml:space="preserve">, 10123–10145. doi:10.1007/s00521-023-08459-3 </w:t>
+              </w:r>
+            </w:p>
+            <w:p>
+              <w:pPr>
+                <w:pStyle w:val="Bibliography"/>
+                <w:ind w:left="720" w:hanging="720"/>
+                <w:rPr>
+                  <w:noProof/>
+                </w:rPr>
+              </w:pPr>
+              <w:r>
+                <w:rPr>
+                  <w:noProof/>
+                </w:rPr>
+                <w:t xml:space="preserve">Ji, C. (2024). A Survey of Neural Network Optimization Algorithms. </w:t>
+              </w:r>
+              <w:r>
+                <w:rPr>
+                  <w:i/>
+                  <w:iCs/>
+                  <w:noProof/>
+                </w:rPr>
+                <w:t>2024 IEEE 4th International Conference on Data Science and Computer Application (ICDSCA)</w:t>
+              </w:r>
+              <w:r>
+                <w:rPr>
+                  <w:noProof/>
+                </w:rPr>
+                <w:t xml:space="preserve"> (lpp. 409–415). IEEE. doi:10.1109/ICDSCA63855.2024.10859435</w:t>
+              </w:r>
+            </w:p>
+            <w:p>
+              <w:pPr>
+                <w:pStyle w:val="Bibliography"/>
+                <w:ind w:left="720" w:hanging="720"/>
+                <w:rPr>
+                  <w:noProof/>
+                </w:rPr>
+              </w:pPr>
+              <w:r>
+                <w:rPr>
+                  <w:noProof/>
+                </w:rPr>
+                <w:lastRenderedPageBreak/>
                 <w:t xml:space="preserve">Lee, W.-I., Shih, B.-Y., &amp; Chen, C.-Y. (2012). Retracted: A hybrid artificial intelligence sales-forecasting system in the convenience store industry. </w:t>
               </w:r>
               <w:r>
@@ -23251,6 +24596,64 @@
                 <w:rPr>
                   <w:noProof/>
                 </w:rPr>
+                <w:t xml:space="preserve">Makridakis, S., Spiliotis, E., &amp; Vassilios Assimakopoulos. (2022). M5 accuracy competition: Results, findings, and conclusions. </w:t>
+              </w:r>
+              <w:r>
+                <w:rPr>
+                  <w:i/>
+                  <w:iCs/>
+                  <w:noProof/>
+                </w:rPr>
+                <w:t>International Journal of Forecasting, 38</w:t>
+              </w:r>
+              <w:r>
+                <w:rPr>
+                  <w:noProof/>
+                </w:rPr>
+                <w:t xml:space="preserve">(4), 1346–1364. doi:10.1016/j.ijforecast.2021.11.013 </w:t>
+              </w:r>
+            </w:p>
+            <w:p>
+              <w:pPr>
+                <w:pStyle w:val="Bibliography"/>
+                <w:ind w:left="720" w:hanging="720"/>
+                <w:rPr>
+                  <w:noProof/>
+                </w:rPr>
+              </w:pPr>
+              <w:r>
+                <w:rPr>
+                  <w:noProof/>
+                </w:rPr>
+                <w:t xml:space="preserve">Minnett, R., Smith, A., Lennon, W., &amp; Hecht-Nielsen, R. (2011). Neural network tomography: Network replication from output surface geometry. </w:t>
+              </w:r>
+              <w:r>
+                <w:rPr>
+                  <w:i/>
+                  <w:iCs/>
+                  <w:noProof/>
+                </w:rPr>
+                <w:t>Neural Networks, 24</w:t>
+              </w:r>
+              <w:r>
+                <w:rPr>
+                  <w:noProof/>
+                </w:rPr>
+                <w:t>, 484–492. doi:10.1016/j.neunet.2011.01.006</w:t>
+              </w:r>
+            </w:p>
+            <w:p>
+              <w:pPr>
+                <w:pStyle w:val="Bibliography"/>
+                <w:ind w:left="720" w:hanging="720"/>
+                <w:rPr>
+                  <w:noProof/>
+                </w:rPr>
+              </w:pPr>
+              <w:r>
+                <w:rPr>
+                  <w:noProof/>
+                </w:rPr>
                 <w:t>Müller-Navarra, M., Lessmann, S., &amp; Voß, S. (2015). Sales Forecasting with Partial Recurrent Neural Networks: Empirical Insights and Benchmarking Results., (lpp. 1108-1116). Kauai, HI, USA. doi:10.1109/HICSS.2015.135</w:t>
               </w:r>
             </w:p>
@@ -23267,6 +24670,35 @@
                   <w:noProof/>
                 </w:rPr>
                 <w:t>Narayan, V., &amp; R, S. (2025). A Study on Supply Chain Management Prediction Based on Machine Learning and Deep Learning Approach., (lpp. 1-7). Hassan, India. doi:10.1109/IACIS65746.2025.11211065</w:t>
+              </w:r>
+            </w:p>
+            <w:p>
+              <w:pPr>
+                <w:pStyle w:val="Bibliography"/>
+                <w:ind w:left="720" w:hanging="720"/>
+                <w:rPr>
+                  <w:noProof/>
+                </w:rPr>
+              </w:pPr>
+              <w:r>
+                <w:rPr>
+                  <w:noProof/>
+                </w:rPr>
+                <w:t xml:space="preserve">Odukoya, O., Nwaneri, S., Odeniyi, I., Akodu, B., Oluwole, E., Olorunfemi, G., . . . Osuntoki, A. (2022). Development and Comparison of Three Data Models for Predicting Diabetes Mellitus Using Risk Factors in a Nigerian Population. </w:t>
+              </w:r>
+              <w:r>
+                <w:rPr>
+                  <w:i/>
+                  <w:iCs/>
+                  <w:noProof/>
+                </w:rPr>
+                <w:t>Healthc Inform Research</w:t>
+              </w:r>
+              <w:r>
+                <w:rPr>
+                  <w:noProof/>
+                </w:rPr>
+                <w:t>, 58-67. doi:10.4258/hir.2022.28.1.58</w:t>
               </w:r>
             </w:p>
             <w:p>
@@ -23325,6 +24757,102 @@
                 <w:rPr>
                   <w:noProof/>
                 </w:rPr>
+                <w:t xml:space="preserve">Rajesh, R. D., Kuppuri, Y. N., Peter, P. R., Reddy, A. S., &amp; Sonia, D. J. (2025). Enhancing Obesity Prediction: Evaluating the Role of Data Preprocessing in Machine Learning Models. </w:t>
+              </w:r>
+              <w:r>
+                <w:rPr>
+                  <w:i/>
+                  <w:iCs/>
+                  <w:noProof/>
+                </w:rPr>
+                <w:t xml:space="preserve">International Conference on Computational </w:t>
+              </w:r>
+              <w:r>
+                <w:rPr>
+                  <w:i/>
+                  <w:iCs/>
+                  <w:noProof/>
+                </w:rPr>
+                <w:lastRenderedPageBreak/>
+                <w:t>Robotics, Testing and Engineering Evaluation.</w:t>
+              </w:r>
+              <w:r>
+                <w:rPr>
+                  <w:noProof/>
+                </w:rPr>
+                <w:t xml:space="preserve"> doi:10.1109/ICCRTEE64519.2025.11053002</w:t>
+              </w:r>
+            </w:p>
+            <w:p>
+              <w:pPr>
+                <w:pStyle w:val="Bibliography"/>
+                <w:ind w:left="720" w:hanging="720"/>
+                <w:rPr>
+                  <w:noProof/>
+                </w:rPr>
+              </w:pPr>
+              <w:r>
+                <w:rPr>
+                  <w:noProof/>
+                </w:rPr>
+                <w:t xml:space="preserve">Ramchoun, H., Idrissi, M., Ghanou, Y., &amp; Ettaouil, M. (2019). Multilayer Perceptron: Architecture Optimization and Training. </w:t>
+              </w:r>
+              <w:r>
+                <w:rPr>
+                  <w:i/>
+                  <w:iCs/>
+                  <w:noProof/>
+                </w:rPr>
+                <w:t>International Journal of Interactive Multimedia and Artificial Intelligence, 5</w:t>
+              </w:r>
+              <w:r>
+                <w:rPr>
+                  <w:noProof/>
+                </w:rPr>
+                <w:t>(1), 26–30. doi:10.9781/ijimai.2019.02.002</w:t>
+              </w:r>
+            </w:p>
+            <w:p>
+              <w:pPr>
+                <w:pStyle w:val="Bibliography"/>
+                <w:ind w:left="720" w:hanging="720"/>
+                <w:rPr>
+                  <w:noProof/>
+                </w:rPr>
+              </w:pPr>
+              <w:r>
+                <w:rPr>
+                  <w:noProof/>
+                </w:rPr>
+                <w:t xml:space="preserve">Ribeiro, S. M., &amp; de Castro, C. L. (2022). Missing Data in Time Series: A Review of Imputation Methods and Case Study. </w:t>
+              </w:r>
+              <w:r>
+                <w:rPr>
+                  <w:i/>
+                  <w:iCs/>
+                  <w:noProof/>
+                </w:rPr>
+                <w:t>Learning and Nonlinear Models, 20</w:t>
+              </w:r>
+              <w:r>
+                <w:rPr>
+                  <w:noProof/>
+                </w:rPr>
+                <w:t xml:space="preserve">(1), 31–46. doi:10.21528/lnlm-vol20-no1-art3 </w:t>
+              </w:r>
+            </w:p>
+            <w:p>
+              <w:pPr>
+                <w:pStyle w:val="Bibliography"/>
+                <w:ind w:left="720" w:hanging="720"/>
+                <w:rPr>
+                  <w:noProof/>
+                </w:rPr>
+              </w:pPr>
+              <w:r>
+                <w:rPr>
+                  <w:noProof/>
+                </w:rPr>
                 <w:t xml:space="preserve">Rosenblad, A. (2021). Accuracy of automatic forecasting methods for univariate time series data: A case study predicting the results of the 2018 Swedish general election using decades-long data series. </w:t>
               </w:r>
               <w:r>
@@ -23340,6 +24868,64 @@
                   <w:noProof/>
                 </w:rPr>
                 <w:t>(3), 475-493. doi:10.1080/23737484.2021.1964407</w:t>
+              </w:r>
+            </w:p>
+            <w:p>
+              <w:pPr>
+                <w:pStyle w:val="Bibliography"/>
+                <w:ind w:left="720" w:hanging="720"/>
+                <w:rPr>
+                  <w:noProof/>
+                </w:rPr>
+              </w:pPr>
+              <w:r>
+                <w:rPr>
+                  <w:noProof/>
+                </w:rPr>
+                <w:t xml:space="preserve">Santis, F. D., Giordano, D., &amp; Mellia, M. (2026). GLEm-Net: Unified framework for data reduction with categorical and numerical features. </w:t>
+              </w:r>
+              <w:r>
+                <w:rPr>
+                  <w:i/>
+                  <w:iCs/>
+                  <w:noProof/>
+                </w:rPr>
+                <w:t>Knowledge-Based Systems, 334</w:t>
+              </w:r>
+              <w:r>
+                <w:rPr>
+                  <w:noProof/>
+                </w:rPr>
+                <w:t>. doi:10.1016/j.knosys.2025.115049</w:t>
+              </w:r>
+            </w:p>
+            <w:p>
+              <w:pPr>
+                <w:pStyle w:val="Bibliography"/>
+                <w:ind w:left="720" w:hanging="720"/>
+                <w:rPr>
+                  <w:noProof/>
+                </w:rPr>
+              </w:pPr>
+              <w:r>
+                <w:rPr>
+                  <w:noProof/>
+                </w:rPr>
+                <w:t xml:space="preserve">Semenoglou, A.-A., Spiliotis, E., &amp; Assimakopoulos, V. (2023). Data augmentation for univariate time series forecasting with neural networks. </w:t>
+              </w:r>
+              <w:r>
+                <w:rPr>
+                  <w:i/>
+                  <w:iCs/>
+                  <w:noProof/>
+                </w:rPr>
+                <w:t>Pattern Recognition, 134</w:t>
+              </w:r>
+              <w:r>
+                <w:rPr>
+                  <w:noProof/>
+                </w:rPr>
+                <w:t xml:space="preserve">. doi:10.1016/j.patcog.2022.109132 </w:t>
               </w:r>
             </w:p>
             <w:p>
@@ -23383,7 +24969,6 @@
                 <w:rPr>
                   <w:noProof/>
                 </w:rPr>
-                <w:lastRenderedPageBreak/>
                 <w:t xml:space="preserve">Sirisha, U., Belavagi, M., &amp; Attigeri, G. (2022). Profit Prediction Using ARIMA, SARIMA and LSTM Models in Time Series Forecasting: A Comparison. </w:t>
               </w:r>
               <w:r>
@@ -23428,6 +25013,51 @@
                   <w:noProof/>
                 </w:rPr>
                 <w:t>. Ielādēts no https://www.statsmodels.org: https://www.statsmodels.org/dev/generated/statsmodels.tsa.statespace.sarimax.SARIMAX.html#statsmodels.tsa.statespace.sarimax.SARIMAX</w:t>
+              </w:r>
+            </w:p>
+            <w:p>
+              <w:pPr>
+                <w:pStyle w:val="Bibliography"/>
+                <w:ind w:left="720" w:hanging="720"/>
+                <w:rPr>
+                  <w:noProof/>
+                </w:rPr>
+              </w:pPr>
+              <w:r>
+                <w:rPr>
+                  <w:noProof/>
+                </w:rPr>
+                <w:t>Suresh, B., &amp; Suresh, M. (2023). A Comprehensive Analysis of Retail Sales Forecasting Using Machine Learning and Deep Learning Methods., (lpp. 1-5). Tiptur, India. doi:10.1109/ICDSNS58469.2023.10245887</w:t>
+              </w:r>
+            </w:p>
+            <w:p>
+              <w:pPr>
+                <w:pStyle w:val="Bibliography"/>
+                <w:ind w:left="720" w:hanging="720"/>
+                <w:rPr>
+                  <w:noProof/>
+                </w:rPr>
+              </w:pPr>
+              <w:r>
+                <w:rPr>
+                  <w:noProof/>
+                </w:rPr>
+                <w:lastRenderedPageBreak/>
+                <w:t xml:space="preserve">Wen, Q., Sun, L., Yang, F., Song, X., Gao, J., Wang, X., &amp; Xu, H. (2021). Time Series Data Augmentation for Deep Learning: A Survey. </w:t>
+              </w:r>
+              <w:r>
+                <w:rPr>
+                  <w:i/>
+                  <w:iCs/>
+                  <w:noProof/>
+                </w:rPr>
+                <w:t>Proceedings of the Thirtieth International Joint Conference on Artificial Intelligence</w:t>
+              </w:r>
+              <w:r>
+                <w:rPr>
+                  <w:noProof/>
+                </w:rPr>
+                <w:t xml:space="preserve">, (lpp. 4653-4660). Hangzhou. doi:10.24963/ijcai.2021/631 </w:t>
               </w:r>
             </w:p>
             <w:p>
@@ -23505,13 +25135,13 @@
       <w:pPr>
         <w:pStyle w:val="Pielikumi-virsraksts"/>
       </w:pPr>
-      <w:bookmarkStart w:id="144" w:name="_Toc88602610"/>
-      <w:bookmarkStart w:id="145" w:name="_Toc225535013"/>
+      <w:bookmarkStart w:id="145" w:name="_Toc88602610"/>
+      <w:bookmarkStart w:id="146" w:name="_Toc225535013"/>
       <w:r>
         <w:t>Pielikumi</w:t>
       </w:r>
-      <w:bookmarkEnd w:id="144"/>
       <w:bookmarkEnd w:id="145"/>
+      <w:bookmarkEnd w:id="146"/>
     </w:p>
     <w:p>
       <w:r>
@@ -23563,7 +25193,7 @@
                     <pic:cNvPicPr/>
                   </pic:nvPicPr>
                   <pic:blipFill>
-                    <a:blip r:embed="rId23"/>
+                    <a:blip r:embed="rId24"/>
                     <a:stretch>
                       <a:fillRect/>
                     </a:stretch>
@@ -34679,17 +36309,2430 @@
         <w:pStyle w:val="Pielik-nosaukums"/>
       </w:pPr>
       <w:r>
-        <w:t>Pielikuma nosaukums</w:t>
-      </w:r>
-    </w:p>
-    <w:p>
-      <w:pPr>
-        <w:pStyle w:val="Teksts"/>
-      </w:pPr>
-      <w:r>
-        <w:t>Qwerty qwerty qwerty qwerty qwerty.  Asdfg asdfg asdfg asdfg asdfg asdfg. Qwerty qwerty qwerty qwerty qwerty.  Asdfg asdfg asdfg asdfg asdfg asdfg. Qwerty qwerty qwerty qwerty qwerty.</w:t>
-      </w:r>
-    </w:p>
+        <w:t>LSTM</w:t>
+      </w:r>
+      <w:r>
+        <w:t xml:space="preserve"> ar datu sintētiku</w:t>
+      </w:r>
+      <w:r>
+        <w:t xml:space="preserve"> rezultāt</w:t>
+      </w:r>
+      <w:r>
+        <w:t>s</w:t>
+      </w:r>
+    </w:p>
+    <w:tbl>
+      <w:tblPr>
+        <w:tblStyle w:val="TableGrid"/>
+        <w:tblW w:w="8291" w:type="dxa"/>
+        <w:tblLook w:val="04A0" w:firstRow="1" w:lastRow="0" w:firstColumn="1" w:lastColumn="0" w:noHBand="0" w:noVBand="1"/>
+      </w:tblPr>
+      <w:tblGrid>
+        <w:gridCol w:w="1935"/>
+        <w:gridCol w:w="1241"/>
+        <w:gridCol w:w="843"/>
+        <w:gridCol w:w="1300"/>
+        <w:gridCol w:w="1121"/>
+        <w:gridCol w:w="1014"/>
+        <w:gridCol w:w="837"/>
+      </w:tblGrid>
+      <w:tr>
+        <w:trPr>
+          <w:trHeight w:val="300"/>
+        </w:trPr>
+        <w:tc>
+          <w:tcPr>
+            <w:tcW w:w="1980" w:type="dxa"/>
+            <w:noWrap/>
+            <w:hideMark/>
+          </w:tcPr>
+          <w:p>
+            <w:pPr>
+              <w:pStyle w:val="Tab-kolonnas-nosaukums"/>
+            </w:pPr>
+            <w:r>
+              <w:t>material_group</w:t>
+            </w:r>
+          </w:p>
+        </w:tc>
+        <w:tc>
+          <w:tcPr>
+            <w:tcW w:w="1130" w:type="dxa"/>
+            <w:noWrap/>
+            <w:hideMark/>
+          </w:tcPr>
+          <w:p>
+            <w:pPr>
+              <w:pStyle w:val="Tab-kolonnas-nosaukums"/>
+            </w:pPr>
+            <w:r>
+              <w:t>test_month</w:t>
+            </w:r>
+          </w:p>
+        </w:tc>
+        <w:tc>
+          <w:tcPr>
+            <w:tcW w:w="859" w:type="dxa"/>
+            <w:noWrap/>
+            <w:hideMark/>
+          </w:tcPr>
+          <w:p>
+            <w:pPr>
+              <w:pStyle w:val="Tab-kolonnas-nosaukums"/>
+            </w:pPr>
+            <w:r>
+              <w:t>actual</w:t>
+            </w:r>
+          </w:p>
+        </w:tc>
+        <w:tc>
+          <w:tcPr>
+            <w:tcW w:w="1328" w:type="dxa"/>
+            <w:noWrap/>
+            <w:hideMark/>
+          </w:tcPr>
+          <w:p>
+            <w:pPr>
+              <w:pStyle w:val="Tab-kolonnas-nosaukums"/>
+            </w:pPr>
+            <w:r>
+              <w:t>prediction</w:t>
+            </w:r>
+          </w:p>
+        </w:tc>
+        <w:tc>
+          <w:tcPr>
+            <w:tcW w:w="1124" w:type="dxa"/>
+            <w:noWrap/>
+            <w:hideMark/>
+          </w:tcPr>
+          <w:p>
+            <w:pPr>
+              <w:pStyle w:val="Tab-kolonnas-nosaukums"/>
+            </w:pPr>
+            <w:r>
+              <w:t>abs_error</w:t>
+            </w:r>
+          </w:p>
+        </w:tc>
+        <w:tc>
+          <w:tcPr>
+            <w:tcW w:w="1017" w:type="dxa"/>
+            <w:noWrap/>
+            <w:hideMark/>
+          </w:tcPr>
+          <w:p>
+            <w:pPr>
+              <w:pStyle w:val="Tab-kolonnas-nosaukums"/>
+            </w:pPr>
+            <w:r>
+              <w:t>sq_error</w:t>
+            </w:r>
+          </w:p>
+        </w:tc>
+        <w:tc>
+          <w:tcPr>
+            <w:tcW w:w="853" w:type="dxa"/>
+            <w:noWrap/>
+            <w:hideMark/>
+          </w:tcPr>
+          <w:p>
+            <w:pPr>
+              <w:pStyle w:val="Tab-kolonnas-nosaukums"/>
+            </w:pPr>
+            <w:r>
+              <w:t>ape</w:t>
+            </w:r>
+          </w:p>
+        </w:tc>
+      </w:tr>
+      <w:tr>
+        <w:trPr>
+          <w:trHeight w:val="300"/>
+        </w:trPr>
+        <w:tc>
+          <w:tcPr>
+            <w:tcW w:w="1980" w:type="dxa"/>
+            <w:noWrap/>
+            <w:hideMark/>
+          </w:tcPr>
+          <w:p>
+            <w:pPr>
+              <w:pStyle w:val="Tab-saturs"/>
+            </w:pPr>
+            <w:r>
+              <w:t>BUVNIEKS: NEĒVELĒTI</w:t>
+            </w:r>
+          </w:p>
+        </w:tc>
+        <w:tc>
+          <w:tcPr>
+            <w:tcW w:w="1130" w:type="dxa"/>
+            <w:noWrap/>
+            <w:hideMark/>
+          </w:tcPr>
+          <w:p>
+            <w:pPr>
+              <w:pStyle w:val="Tab-saturs"/>
+            </w:pPr>
+            <w:r>
+              <w:t>2026-01</w:t>
+            </w:r>
+          </w:p>
+        </w:tc>
+        <w:tc>
+          <w:tcPr>
+            <w:tcW w:w="859" w:type="dxa"/>
+            <w:noWrap/>
+            <w:hideMark/>
+          </w:tcPr>
+          <w:p>
+            <w:pPr>
+              <w:pStyle w:val="Tab-saturs"/>
+            </w:pPr>
+            <w:r>
+              <w:t>2.411</w:t>
+            </w:r>
+          </w:p>
+        </w:tc>
+        <w:tc>
+          <w:tcPr>
+            <w:tcW w:w="1328" w:type="dxa"/>
+            <w:noWrap/>
+            <w:hideMark/>
+          </w:tcPr>
+          <w:p>
+            <w:pPr>
+              <w:pStyle w:val="Tab-saturs"/>
+            </w:pPr>
+            <w:r>
+              <w:t>6.603</w:t>
+            </w:r>
+          </w:p>
+        </w:tc>
+        <w:tc>
+          <w:tcPr>
+            <w:tcW w:w="1124" w:type="dxa"/>
+            <w:noWrap/>
+            <w:hideMark/>
+          </w:tcPr>
+          <w:p>
+            <w:pPr>
+              <w:pStyle w:val="Tab-saturs"/>
+            </w:pPr>
+            <w:r>
+              <w:t>4.191</w:t>
+            </w:r>
+          </w:p>
+        </w:tc>
+        <w:tc>
+          <w:tcPr>
+            <w:tcW w:w="1017" w:type="dxa"/>
+            <w:noWrap/>
+            <w:hideMark/>
+          </w:tcPr>
+          <w:p>
+            <w:pPr>
+              <w:pStyle w:val="Tab-saturs"/>
+            </w:pPr>
+            <w:r>
+              <w:t>17.568</w:t>
+            </w:r>
+          </w:p>
+        </w:tc>
+        <w:tc>
+          <w:tcPr>
+            <w:tcW w:w="853" w:type="dxa"/>
+            <w:noWrap/>
+            <w:hideMark/>
+          </w:tcPr>
+          <w:p>
+            <w:pPr>
+              <w:pStyle w:val="Tab-saturs"/>
+            </w:pPr>
+            <w:r>
+              <w:t>1.738</w:t>
+            </w:r>
+          </w:p>
+        </w:tc>
+      </w:tr>
+      <w:tr>
+        <w:trPr>
+          <w:trHeight w:val="300"/>
+        </w:trPr>
+        <w:tc>
+          <w:tcPr>
+            <w:tcW w:w="1980" w:type="dxa"/>
+            <w:noWrap/>
+            <w:hideMark/>
+          </w:tcPr>
+          <w:p>
+            <w:pPr>
+              <w:pStyle w:val="Tab-saturs"/>
+            </w:pPr>
+            <w:r>
+              <w:t>BUVNIEKS: ĒVELĒTI</w:t>
+            </w:r>
+          </w:p>
+        </w:tc>
+        <w:tc>
+          <w:tcPr>
+            <w:tcW w:w="1130" w:type="dxa"/>
+            <w:noWrap/>
+            <w:hideMark/>
+          </w:tcPr>
+          <w:p>
+            <w:pPr>
+              <w:pStyle w:val="Tab-saturs"/>
+            </w:pPr>
+            <w:r>
+              <w:t>2026-01</w:t>
+            </w:r>
+          </w:p>
+        </w:tc>
+        <w:tc>
+          <w:tcPr>
+            <w:tcW w:w="859" w:type="dxa"/>
+            <w:noWrap/>
+            <w:hideMark/>
+          </w:tcPr>
+          <w:p>
+            <w:pPr>
+              <w:pStyle w:val="Tab-saturs"/>
+            </w:pPr>
+            <w:r>
+              <w:t>0.878</w:t>
+            </w:r>
+          </w:p>
+        </w:tc>
+        <w:tc>
+          <w:tcPr>
+            <w:tcW w:w="1328" w:type="dxa"/>
+            <w:noWrap/>
+            <w:hideMark/>
+          </w:tcPr>
+          <w:p>
+            <w:pPr>
+              <w:pStyle w:val="Tab-saturs"/>
+            </w:pPr>
+            <w:r>
+              <w:t>4.473</w:t>
+            </w:r>
+          </w:p>
+        </w:tc>
+        <w:tc>
+          <w:tcPr>
+            <w:tcW w:w="1124" w:type="dxa"/>
+            <w:noWrap/>
+            <w:hideMark/>
+          </w:tcPr>
+          <w:p>
+            <w:pPr>
+              <w:pStyle w:val="Tab-saturs"/>
+            </w:pPr>
+            <w:r>
+              <w:t>3.596</w:t>
+            </w:r>
+          </w:p>
+        </w:tc>
+        <w:tc>
+          <w:tcPr>
+            <w:tcW w:w="1017" w:type="dxa"/>
+            <w:noWrap/>
+            <w:hideMark/>
+          </w:tcPr>
+          <w:p>
+            <w:pPr>
+              <w:pStyle w:val="Tab-saturs"/>
+            </w:pPr>
+            <w:r>
+              <w:t>12.931</w:t>
+            </w:r>
+          </w:p>
+        </w:tc>
+        <w:tc>
+          <w:tcPr>
+            <w:tcW w:w="853" w:type="dxa"/>
+            <w:noWrap/>
+            <w:hideMark/>
+          </w:tcPr>
+          <w:p>
+            <w:pPr>
+              <w:pStyle w:val="Tab-saturs"/>
+            </w:pPr>
+            <w:r>
+              <w:t>4.098</w:t>
+            </w:r>
+          </w:p>
+        </w:tc>
+      </w:tr>
+      <w:tr>
+        <w:trPr>
+          <w:trHeight w:val="300"/>
+        </w:trPr>
+        <w:tc>
+          <w:tcPr>
+            <w:tcW w:w="1980" w:type="dxa"/>
+            <w:noWrap/>
+            <w:hideMark/>
+          </w:tcPr>
+          <w:p>
+            <w:pPr>
+              <w:pStyle w:val="Tab-saturs"/>
+            </w:pPr>
+            <w:r>
+              <w:t>KARTEX: APDARES DĒĻI</w:t>
+            </w:r>
+          </w:p>
+        </w:tc>
+        <w:tc>
+          <w:tcPr>
+            <w:tcW w:w="1130" w:type="dxa"/>
+            <w:noWrap/>
+            <w:hideMark/>
+          </w:tcPr>
+          <w:p>
+            <w:pPr>
+              <w:pStyle w:val="Tab-saturs"/>
+            </w:pPr>
+            <w:r>
+              <w:t>2026-01</w:t>
+            </w:r>
+          </w:p>
+        </w:tc>
+        <w:tc>
+          <w:tcPr>
+            <w:tcW w:w="859" w:type="dxa"/>
+            <w:noWrap/>
+            <w:hideMark/>
+          </w:tcPr>
+          <w:p>
+            <w:pPr>
+              <w:pStyle w:val="Tab-saturs"/>
+            </w:pPr>
+            <w:r>
+              <w:t>1.953</w:t>
+            </w:r>
+          </w:p>
+        </w:tc>
+        <w:tc>
+          <w:tcPr>
+            <w:tcW w:w="1328" w:type="dxa"/>
+            <w:noWrap/>
+            <w:hideMark/>
+          </w:tcPr>
+          <w:p>
+            <w:pPr>
+              <w:pStyle w:val="Tab-saturs"/>
+            </w:pPr>
+            <w:r>
+              <w:t>7.575</w:t>
+            </w:r>
+          </w:p>
+        </w:tc>
+        <w:tc>
+          <w:tcPr>
+            <w:tcW w:w="1124" w:type="dxa"/>
+            <w:noWrap/>
+            <w:hideMark/>
+          </w:tcPr>
+          <w:p>
+            <w:pPr>
+              <w:pStyle w:val="Tab-saturs"/>
+            </w:pPr>
+            <w:r>
+              <w:t>5.622</w:t>
+            </w:r>
+          </w:p>
+        </w:tc>
+        <w:tc>
+          <w:tcPr>
+            <w:tcW w:w="1017" w:type="dxa"/>
+            <w:noWrap/>
+            <w:hideMark/>
+          </w:tcPr>
+          <w:p>
+            <w:pPr>
+              <w:pStyle w:val="Tab-saturs"/>
+            </w:pPr>
+            <w:r>
+              <w:t>31.608</w:t>
+            </w:r>
+          </w:p>
+        </w:tc>
+        <w:tc>
+          <w:tcPr>
+            <w:tcW w:w="853" w:type="dxa"/>
+            <w:noWrap/>
+            <w:hideMark/>
+          </w:tcPr>
+          <w:p>
+            <w:pPr>
+              <w:pStyle w:val="Tab-saturs"/>
+            </w:pPr>
+            <w:r>
+              <w:t>2.879</w:t>
+            </w:r>
+          </w:p>
+        </w:tc>
+      </w:tr>
+      <w:tr>
+        <w:trPr>
+          <w:trHeight w:val="300"/>
+        </w:trPr>
+        <w:tc>
+          <w:tcPr>
+            <w:tcW w:w="1980" w:type="dxa"/>
+            <w:noWrap/>
+            <w:hideMark/>
+          </w:tcPr>
+          <w:p>
+            <w:pPr>
+              <w:pStyle w:val="Tab-saturs"/>
+            </w:pPr>
+            <w:r>
+              <w:t>KARTEX: KARKASS</w:t>
+            </w:r>
+          </w:p>
+        </w:tc>
+        <w:tc>
+          <w:tcPr>
+            <w:tcW w:w="1130" w:type="dxa"/>
+            <w:noWrap/>
+            <w:hideMark/>
+          </w:tcPr>
+          <w:p>
+            <w:pPr>
+              <w:pStyle w:val="Tab-saturs"/>
+            </w:pPr>
+            <w:r>
+              <w:t>2026-01</w:t>
+            </w:r>
+          </w:p>
+        </w:tc>
+        <w:tc>
+          <w:tcPr>
+            <w:tcW w:w="859" w:type="dxa"/>
+            <w:noWrap/>
+            <w:hideMark/>
+          </w:tcPr>
+          <w:p>
+            <w:pPr>
+              <w:pStyle w:val="Tab-saturs"/>
+            </w:pPr>
+            <w:r>
+              <w:t>0</w:t>
+            </w:r>
+          </w:p>
+        </w:tc>
+        <w:tc>
+          <w:tcPr>
+            <w:tcW w:w="1328" w:type="dxa"/>
+            <w:noWrap/>
+            <w:hideMark/>
+          </w:tcPr>
+          <w:p>
+            <w:pPr>
+              <w:pStyle w:val="Tab-saturs"/>
+            </w:pPr>
+            <w:r>
+              <w:t>0</w:t>
+            </w:r>
+          </w:p>
+        </w:tc>
+        <w:tc>
+          <w:tcPr>
+            <w:tcW w:w="1124" w:type="dxa"/>
+            <w:noWrap/>
+            <w:hideMark/>
+          </w:tcPr>
+          <w:p>
+            <w:pPr>
+              <w:pStyle w:val="Tab-saturs"/>
+            </w:pPr>
+            <w:r>
+              <w:t>0</w:t>
+            </w:r>
+          </w:p>
+        </w:tc>
+        <w:tc>
+          <w:tcPr>
+            <w:tcW w:w="1017" w:type="dxa"/>
+            <w:noWrap/>
+            <w:hideMark/>
+          </w:tcPr>
+          <w:p>
+            <w:pPr>
+              <w:pStyle w:val="Tab-saturs"/>
+            </w:pPr>
+            <w:r>
+              <w:t>0</w:t>
+            </w:r>
+          </w:p>
+        </w:tc>
+        <w:tc>
+          <w:tcPr>
+            <w:tcW w:w="853" w:type="dxa"/>
+            <w:noWrap/>
+            <w:hideMark/>
+          </w:tcPr>
+          <w:p>
+            <w:pPr>
+              <w:pStyle w:val="Tab-saturs"/>
+            </w:pPr>
+          </w:p>
+        </w:tc>
+      </w:tr>
+      <w:tr>
+        <w:trPr>
+          <w:trHeight w:val="300"/>
+        </w:trPr>
+        <w:tc>
+          <w:tcPr>
+            <w:tcW w:w="1980" w:type="dxa"/>
+            <w:noWrap/>
+            <w:hideMark/>
+          </w:tcPr>
+          <w:p>
+            <w:pPr>
+              <w:pStyle w:val="Tab-saturs"/>
+            </w:pPr>
+            <w:r>
+              <w:t>KARTEX: KOKMATERIĀLI</w:t>
+            </w:r>
+          </w:p>
+        </w:tc>
+        <w:tc>
+          <w:tcPr>
+            <w:tcW w:w="1130" w:type="dxa"/>
+            <w:noWrap/>
+            <w:hideMark/>
+          </w:tcPr>
+          <w:p>
+            <w:pPr>
+              <w:pStyle w:val="Tab-saturs"/>
+            </w:pPr>
+            <w:r>
+              <w:t>2026-01</w:t>
+            </w:r>
+          </w:p>
+        </w:tc>
+        <w:tc>
+          <w:tcPr>
+            <w:tcW w:w="859" w:type="dxa"/>
+            <w:noWrap/>
+            <w:hideMark/>
+          </w:tcPr>
+          <w:p>
+            <w:pPr>
+              <w:pStyle w:val="Tab-saturs"/>
+            </w:pPr>
+            <w:r>
+              <w:t>0</w:t>
+            </w:r>
+          </w:p>
+        </w:tc>
+        <w:tc>
+          <w:tcPr>
+            <w:tcW w:w="1328" w:type="dxa"/>
+            <w:noWrap/>
+            <w:hideMark/>
+          </w:tcPr>
+          <w:p>
+            <w:pPr>
+              <w:pStyle w:val="Tab-saturs"/>
+            </w:pPr>
+            <w:r>
+              <w:t>4.118</w:t>
+            </w:r>
+          </w:p>
+        </w:tc>
+        <w:tc>
+          <w:tcPr>
+            <w:tcW w:w="1124" w:type="dxa"/>
+            <w:noWrap/>
+            <w:hideMark/>
+          </w:tcPr>
+          <w:p>
+            <w:pPr>
+              <w:pStyle w:val="Tab-saturs"/>
+            </w:pPr>
+            <w:r>
+              <w:t>4.118</w:t>
+            </w:r>
+          </w:p>
+        </w:tc>
+        <w:tc>
+          <w:tcPr>
+            <w:tcW w:w="1017" w:type="dxa"/>
+            <w:noWrap/>
+            <w:hideMark/>
+          </w:tcPr>
+          <w:p>
+            <w:pPr>
+              <w:pStyle w:val="Tab-saturs"/>
+            </w:pPr>
+            <w:r>
+              <w:t>16.957</w:t>
+            </w:r>
+          </w:p>
+        </w:tc>
+        <w:tc>
+          <w:tcPr>
+            <w:tcW w:w="853" w:type="dxa"/>
+            <w:noWrap/>
+            <w:hideMark/>
+          </w:tcPr>
+          <w:p>
+            <w:pPr>
+              <w:pStyle w:val="Tab-saturs"/>
+            </w:pPr>
+          </w:p>
+        </w:tc>
+      </w:tr>
+      <w:tr>
+        <w:trPr>
+          <w:trHeight w:val="300"/>
+        </w:trPr>
+        <w:tc>
+          <w:tcPr>
+            <w:tcW w:w="1980" w:type="dxa"/>
+            <w:noWrap/>
+            <w:hideMark/>
+          </w:tcPr>
+          <w:p>
+            <w:pPr>
+              <w:pStyle w:val="Tab-saturs"/>
+            </w:pPr>
+            <w:r>
+              <w:t>KARTEX: TERASES DĒĻI</w:t>
+            </w:r>
+          </w:p>
+        </w:tc>
+        <w:tc>
+          <w:tcPr>
+            <w:tcW w:w="1130" w:type="dxa"/>
+            <w:noWrap/>
+            <w:hideMark/>
+          </w:tcPr>
+          <w:p>
+            <w:pPr>
+              <w:pStyle w:val="Tab-saturs"/>
+            </w:pPr>
+            <w:r>
+              <w:t>2026-01</w:t>
+            </w:r>
+          </w:p>
+        </w:tc>
+        <w:tc>
+          <w:tcPr>
+            <w:tcW w:w="859" w:type="dxa"/>
+            <w:noWrap/>
+            <w:hideMark/>
+          </w:tcPr>
+          <w:p>
+            <w:pPr>
+              <w:pStyle w:val="Tab-saturs"/>
+            </w:pPr>
+            <w:r>
+              <w:t>0</w:t>
+            </w:r>
+          </w:p>
+        </w:tc>
+        <w:tc>
+          <w:tcPr>
+            <w:tcW w:w="1328" w:type="dxa"/>
+            <w:noWrap/>
+            <w:hideMark/>
+          </w:tcPr>
+          <w:p>
+            <w:pPr>
+              <w:pStyle w:val="Tab-saturs"/>
+            </w:pPr>
+            <w:r>
+              <w:t>1.518</w:t>
+            </w:r>
+          </w:p>
+        </w:tc>
+        <w:tc>
+          <w:tcPr>
+            <w:tcW w:w="1124" w:type="dxa"/>
+            <w:noWrap/>
+            <w:hideMark/>
+          </w:tcPr>
+          <w:p>
+            <w:pPr>
+              <w:pStyle w:val="Tab-saturs"/>
+            </w:pPr>
+            <w:r>
+              <w:t>1.518</w:t>
+            </w:r>
+          </w:p>
+        </w:tc>
+        <w:tc>
+          <w:tcPr>
+            <w:tcW w:w="1017" w:type="dxa"/>
+            <w:noWrap/>
+            <w:hideMark/>
+          </w:tcPr>
+          <w:p>
+            <w:pPr>
+              <w:pStyle w:val="Tab-saturs"/>
+            </w:pPr>
+            <w:r>
+              <w:t>2.305</w:t>
+            </w:r>
+          </w:p>
+        </w:tc>
+        <w:tc>
+          <w:tcPr>
+            <w:tcW w:w="853" w:type="dxa"/>
+            <w:noWrap/>
+            <w:hideMark/>
+          </w:tcPr>
+          <w:p>
+            <w:pPr>
+              <w:pStyle w:val="Tab-saturs"/>
+            </w:pPr>
+          </w:p>
+        </w:tc>
+      </w:tr>
+      <w:tr>
+        <w:trPr>
+          <w:trHeight w:val="300"/>
+        </w:trPr>
+        <w:tc>
+          <w:tcPr>
+            <w:tcW w:w="1980" w:type="dxa"/>
+            <w:noWrap/>
+            <w:hideMark/>
+          </w:tcPr>
+          <w:p>
+            <w:pPr>
+              <w:pStyle w:val="Tab-saturs"/>
+            </w:pPr>
+            <w:r>
+              <w:t>KARTEX: ŽOGA DĒĻI</w:t>
+            </w:r>
+          </w:p>
+        </w:tc>
+        <w:tc>
+          <w:tcPr>
+            <w:tcW w:w="1130" w:type="dxa"/>
+            <w:noWrap/>
+            <w:hideMark/>
+          </w:tcPr>
+          <w:p>
+            <w:pPr>
+              <w:pStyle w:val="Tab-saturs"/>
+            </w:pPr>
+            <w:r>
+              <w:t>2026-01</w:t>
+            </w:r>
+          </w:p>
+        </w:tc>
+        <w:tc>
+          <w:tcPr>
+            <w:tcW w:w="859" w:type="dxa"/>
+            <w:noWrap/>
+            <w:hideMark/>
+          </w:tcPr>
+          <w:p>
+            <w:pPr>
+              <w:pStyle w:val="Tab-saturs"/>
+            </w:pPr>
+            <w:r>
+              <w:t>0</w:t>
+            </w:r>
+          </w:p>
+        </w:tc>
+        <w:tc>
+          <w:tcPr>
+            <w:tcW w:w="1328" w:type="dxa"/>
+            <w:noWrap/>
+            <w:hideMark/>
+          </w:tcPr>
+          <w:p>
+            <w:pPr>
+              <w:pStyle w:val="Tab-saturs"/>
+            </w:pPr>
+            <w:r>
+              <w:t>0</w:t>
+            </w:r>
+          </w:p>
+        </w:tc>
+        <w:tc>
+          <w:tcPr>
+            <w:tcW w:w="1124" w:type="dxa"/>
+            <w:noWrap/>
+            <w:hideMark/>
+          </w:tcPr>
+          <w:p>
+            <w:pPr>
+              <w:pStyle w:val="Tab-saturs"/>
+            </w:pPr>
+            <w:r>
+              <w:t>0</w:t>
+            </w:r>
+          </w:p>
+        </w:tc>
+        <w:tc>
+          <w:tcPr>
+            <w:tcW w:w="1017" w:type="dxa"/>
+            <w:noWrap/>
+            <w:hideMark/>
+          </w:tcPr>
+          <w:p>
+            <w:pPr>
+              <w:pStyle w:val="Tab-saturs"/>
+            </w:pPr>
+            <w:r>
+              <w:t>0</w:t>
+            </w:r>
+          </w:p>
+        </w:tc>
+        <w:tc>
+          <w:tcPr>
+            <w:tcW w:w="853" w:type="dxa"/>
+            <w:noWrap/>
+            <w:hideMark/>
+          </w:tcPr>
+          <w:p>
+            <w:pPr>
+              <w:pStyle w:val="Tab-saturs"/>
+            </w:pPr>
+          </w:p>
+        </w:tc>
+      </w:tr>
+      <w:tr>
+        <w:trPr>
+          <w:trHeight w:val="300"/>
+        </w:trPr>
+        <w:tc>
+          <w:tcPr>
+            <w:tcW w:w="1980" w:type="dxa"/>
+            <w:noWrap/>
+            <w:hideMark/>
+          </w:tcPr>
+          <w:p>
+            <w:pPr>
+              <w:pStyle w:val="Tab-saturs"/>
+            </w:pPr>
+            <w:r>
+              <w:t>BUVNIEKS: NEĒVELĒTI</w:t>
+            </w:r>
+          </w:p>
+        </w:tc>
+        <w:tc>
+          <w:tcPr>
+            <w:tcW w:w="1130" w:type="dxa"/>
+            <w:noWrap/>
+            <w:hideMark/>
+          </w:tcPr>
+          <w:p>
+            <w:pPr>
+              <w:pStyle w:val="Tab-saturs"/>
+            </w:pPr>
+            <w:r>
+              <w:t>2026-02</w:t>
+            </w:r>
+          </w:p>
+        </w:tc>
+        <w:tc>
+          <w:tcPr>
+            <w:tcW w:w="859" w:type="dxa"/>
+            <w:noWrap/>
+            <w:hideMark/>
+          </w:tcPr>
+          <w:p>
+            <w:pPr>
+              <w:pStyle w:val="Tab-saturs"/>
+            </w:pPr>
+            <w:r>
+              <w:t>4.166</w:t>
+            </w:r>
+          </w:p>
+        </w:tc>
+        <w:tc>
+          <w:tcPr>
+            <w:tcW w:w="1328" w:type="dxa"/>
+            <w:noWrap/>
+            <w:hideMark/>
+          </w:tcPr>
+          <w:p>
+            <w:pPr>
+              <w:pStyle w:val="Tab-saturs"/>
+            </w:pPr>
+            <w:r>
+              <w:t>0</w:t>
+            </w:r>
+          </w:p>
+        </w:tc>
+        <w:tc>
+          <w:tcPr>
+            <w:tcW w:w="1124" w:type="dxa"/>
+            <w:noWrap/>
+            <w:hideMark/>
+          </w:tcPr>
+          <w:p>
+            <w:pPr>
+              <w:pStyle w:val="Tab-saturs"/>
+            </w:pPr>
+            <w:r>
+              <w:t>4.166</w:t>
+            </w:r>
+          </w:p>
+        </w:tc>
+        <w:tc>
+          <w:tcPr>
+            <w:tcW w:w="1017" w:type="dxa"/>
+            <w:noWrap/>
+            <w:hideMark/>
+          </w:tcPr>
+          <w:p>
+            <w:pPr>
+              <w:pStyle w:val="Tab-saturs"/>
+            </w:pPr>
+            <w:r>
+              <w:t>17.352</w:t>
+            </w:r>
+          </w:p>
+        </w:tc>
+        <w:tc>
+          <w:tcPr>
+            <w:tcW w:w="853" w:type="dxa"/>
+            <w:noWrap/>
+            <w:hideMark/>
+          </w:tcPr>
+          <w:p>
+            <w:pPr>
+              <w:pStyle w:val="Tab-saturs"/>
+            </w:pPr>
+            <w:r>
+              <w:t>1</w:t>
+            </w:r>
+          </w:p>
+        </w:tc>
+      </w:tr>
+      <w:tr>
+        <w:trPr>
+          <w:trHeight w:val="300"/>
+        </w:trPr>
+        <w:tc>
+          <w:tcPr>
+            <w:tcW w:w="1980" w:type="dxa"/>
+            <w:noWrap/>
+            <w:hideMark/>
+          </w:tcPr>
+          <w:p>
+            <w:pPr>
+              <w:pStyle w:val="Tab-saturs"/>
+            </w:pPr>
+            <w:r>
+              <w:t>BUVNIEKS: ĒVELĒTI</w:t>
+            </w:r>
+          </w:p>
+        </w:tc>
+        <w:tc>
+          <w:tcPr>
+            <w:tcW w:w="1130" w:type="dxa"/>
+            <w:noWrap/>
+            <w:hideMark/>
+          </w:tcPr>
+          <w:p>
+            <w:pPr>
+              <w:pStyle w:val="Tab-saturs"/>
+            </w:pPr>
+            <w:r>
+              <w:t>2026-02</w:t>
+            </w:r>
+          </w:p>
+        </w:tc>
+        <w:tc>
+          <w:tcPr>
+            <w:tcW w:w="859" w:type="dxa"/>
+            <w:noWrap/>
+            <w:hideMark/>
+          </w:tcPr>
+          <w:p>
+            <w:pPr>
+              <w:pStyle w:val="Tab-saturs"/>
+            </w:pPr>
+            <w:r>
+              <w:t>0</w:t>
+            </w:r>
+          </w:p>
+        </w:tc>
+        <w:tc>
+          <w:tcPr>
+            <w:tcW w:w="1328" w:type="dxa"/>
+            <w:noWrap/>
+            <w:hideMark/>
+          </w:tcPr>
+          <w:p>
+            <w:pPr>
+              <w:pStyle w:val="Tab-saturs"/>
+            </w:pPr>
+            <w:r>
+              <w:t>4.608</w:t>
+            </w:r>
+          </w:p>
+        </w:tc>
+        <w:tc>
+          <w:tcPr>
+            <w:tcW w:w="1124" w:type="dxa"/>
+            <w:noWrap/>
+            <w:hideMark/>
+          </w:tcPr>
+          <w:p>
+            <w:pPr>
+              <w:pStyle w:val="Tab-saturs"/>
+            </w:pPr>
+            <w:r>
+              <w:t>4.608</w:t>
+            </w:r>
+          </w:p>
+        </w:tc>
+        <w:tc>
+          <w:tcPr>
+            <w:tcW w:w="1017" w:type="dxa"/>
+            <w:noWrap/>
+            <w:hideMark/>
+          </w:tcPr>
+          <w:p>
+            <w:pPr>
+              <w:pStyle w:val="Tab-saturs"/>
+            </w:pPr>
+            <w:r>
+              <w:t>21.235</w:t>
+            </w:r>
+          </w:p>
+        </w:tc>
+        <w:tc>
+          <w:tcPr>
+            <w:tcW w:w="853" w:type="dxa"/>
+            <w:noWrap/>
+            <w:hideMark/>
+          </w:tcPr>
+          <w:p>
+            <w:pPr>
+              <w:pStyle w:val="Tab-saturs"/>
+            </w:pPr>
+          </w:p>
+        </w:tc>
+      </w:tr>
+      <w:tr>
+        <w:trPr>
+          <w:trHeight w:val="300"/>
+        </w:trPr>
+        <w:tc>
+          <w:tcPr>
+            <w:tcW w:w="1980" w:type="dxa"/>
+            <w:noWrap/>
+            <w:hideMark/>
+          </w:tcPr>
+          <w:p>
+            <w:pPr>
+              <w:pStyle w:val="Tab-saturs"/>
+            </w:pPr>
+            <w:r>
+              <w:t>KARTEX: APDARES DĒĻI</w:t>
+            </w:r>
+          </w:p>
+        </w:tc>
+        <w:tc>
+          <w:tcPr>
+            <w:tcW w:w="1130" w:type="dxa"/>
+            <w:noWrap/>
+            <w:hideMark/>
+          </w:tcPr>
+          <w:p>
+            <w:pPr>
+              <w:pStyle w:val="Tab-saturs"/>
+            </w:pPr>
+            <w:r>
+              <w:t>2026-02</w:t>
+            </w:r>
+          </w:p>
+        </w:tc>
+        <w:tc>
+          <w:tcPr>
+            <w:tcW w:w="859" w:type="dxa"/>
+            <w:noWrap/>
+            <w:hideMark/>
+          </w:tcPr>
+          <w:p>
+            <w:pPr>
+              <w:pStyle w:val="Tab-saturs"/>
+            </w:pPr>
+            <w:r>
+              <w:t>0</w:t>
+            </w:r>
+          </w:p>
+        </w:tc>
+        <w:tc>
+          <w:tcPr>
+            <w:tcW w:w="1328" w:type="dxa"/>
+            <w:noWrap/>
+            <w:hideMark/>
+          </w:tcPr>
+          <w:p>
+            <w:pPr>
+              <w:pStyle w:val="Tab-saturs"/>
+            </w:pPr>
+            <w:r>
+              <w:t>8.251</w:t>
+            </w:r>
+          </w:p>
+        </w:tc>
+        <w:tc>
+          <w:tcPr>
+            <w:tcW w:w="1124" w:type="dxa"/>
+            <w:noWrap/>
+            <w:hideMark/>
+          </w:tcPr>
+          <w:p>
+            <w:pPr>
+              <w:pStyle w:val="Tab-saturs"/>
+            </w:pPr>
+            <w:r>
+              <w:t>8.251</w:t>
+            </w:r>
+          </w:p>
+        </w:tc>
+        <w:tc>
+          <w:tcPr>
+            <w:tcW w:w="1017" w:type="dxa"/>
+            <w:noWrap/>
+            <w:hideMark/>
+          </w:tcPr>
+          <w:p>
+            <w:pPr>
+              <w:pStyle w:val="Tab-saturs"/>
+            </w:pPr>
+            <w:r>
+              <w:t>68.077</w:t>
+            </w:r>
+          </w:p>
+        </w:tc>
+        <w:tc>
+          <w:tcPr>
+            <w:tcW w:w="853" w:type="dxa"/>
+            <w:noWrap/>
+            <w:hideMark/>
+          </w:tcPr>
+          <w:p>
+            <w:pPr>
+              <w:pStyle w:val="Tab-saturs"/>
+            </w:pPr>
+          </w:p>
+        </w:tc>
+      </w:tr>
+      <w:tr>
+        <w:trPr>
+          <w:trHeight w:val="300"/>
+        </w:trPr>
+        <w:tc>
+          <w:tcPr>
+            <w:tcW w:w="1980" w:type="dxa"/>
+            <w:noWrap/>
+            <w:hideMark/>
+          </w:tcPr>
+          <w:p>
+            <w:pPr>
+              <w:pStyle w:val="Tab-saturs"/>
+            </w:pPr>
+            <w:r>
+              <w:t>KARTEX: KARKASS</w:t>
+            </w:r>
+          </w:p>
+        </w:tc>
+        <w:tc>
+          <w:tcPr>
+            <w:tcW w:w="1130" w:type="dxa"/>
+            <w:noWrap/>
+            <w:hideMark/>
+          </w:tcPr>
+          <w:p>
+            <w:pPr>
+              <w:pStyle w:val="Tab-saturs"/>
+            </w:pPr>
+            <w:r>
+              <w:t>2026-02</w:t>
+            </w:r>
+          </w:p>
+        </w:tc>
+        <w:tc>
+          <w:tcPr>
+            <w:tcW w:w="859" w:type="dxa"/>
+            <w:noWrap/>
+            <w:hideMark/>
+          </w:tcPr>
+          <w:p>
+            <w:pPr>
+              <w:pStyle w:val="Tab-saturs"/>
+            </w:pPr>
+            <w:r>
+              <w:t>0.486</w:t>
+            </w:r>
+          </w:p>
+        </w:tc>
+        <w:tc>
+          <w:tcPr>
+            <w:tcW w:w="1328" w:type="dxa"/>
+            <w:noWrap/>
+            <w:hideMark/>
+          </w:tcPr>
+          <w:p>
+            <w:pPr>
+              <w:pStyle w:val="Tab-saturs"/>
+            </w:pPr>
+            <w:r>
+              <w:t>0.128</w:t>
+            </w:r>
+          </w:p>
+        </w:tc>
+        <w:tc>
+          <w:tcPr>
+            <w:tcW w:w="1124" w:type="dxa"/>
+            <w:noWrap/>
+            <w:hideMark/>
+          </w:tcPr>
+          <w:p>
+            <w:pPr>
+              <w:pStyle w:val="Tab-saturs"/>
+            </w:pPr>
+            <w:r>
+              <w:t>0.358</w:t>
+            </w:r>
+          </w:p>
+        </w:tc>
+        <w:tc>
+          <w:tcPr>
+            <w:tcW w:w="1017" w:type="dxa"/>
+            <w:noWrap/>
+            <w:hideMark/>
+          </w:tcPr>
+          <w:p>
+            <w:pPr>
+              <w:pStyle w:val="Tab-saturs"/>
+            </w:pPr>
+            <w:r>
+              <w:t>0.128</w:t>
+            </w:r>
+          </w:p>
+        </w:tc>
+        <w:tc>
+          <w:tcPr>
+            <w:tcW w:w="853" w:type="dxa"/>
+            <w:noWrap/>
+            <w:hideMark/>
+          </w:tcPr>
+          <w:p>
+            <w:pPr>
+              <w:pStyle w:val="Tab-saturs"/>
+            </w:pPr>
+            <w:r>
+              <w:t>0.737</w:t>
+            </w:r>
+          </w:p>
+        </w:tc>
+      </w:tr>
+      <w:tr>
+        <w:trPr>
+          <w:trHeight w:val="300"/>
+        </w:trPr>
+        <w:tc>
+          <w:tcPr>
+            <w:tcW w:w="1980" w:type="dxa"/>
+            <w:noWrap/>
+            <w:hideMark/>
+          </w:tcPr>
+          <w:p>
+            <w:pPr>
+              <w:pStyle w:val="Tab-saturs"/>
+            </w:pPr>
+            <w:r>
+              <w:t>KARTEX: KOKMATERIĀLI</w:t>
+            </w:r>
+          </w:p>
+        </w:tc>
+        <w:tc>
+          <w:tcPr>
+            <w:tcW w:w="1130" w:type="dxa"/>
+            <w:noWrap/>
+            <w:hideMark/>
+          </w:tcPr>
+          <w:p>
+            <w:pPr>
+              <w:pStyle w:val="Tab-saturs"/>
+            </w:pPr>
+            <w:r>
+              <w:t>2026-02</w:t>
+            </w:r>
+          </w:p>
+        </w:tc>
+        <w:tc>
+          <w:tcPr>
+            <w:tcW w:w="859" w:type="dxa"/>
+            <w:noWrap/>
+            <w:hideMark/>
+          </w:tcPr>
+          <w:p>
+            <w:pPr>
+              <w:pStyle w:val="Tab-saturs"/>
+            </w:pPr>
+            <w:r>
+              <w:t>0</w:t>
+            </w:r>
+          </w:p>
+        </w:tc>
+        <w:tc>
+          <w:tcPr>
+            <w:tcW w:w="1328" w:type="dxa"/>
+            <w:noWrap/>
+            <w:hideMark/>
+          </w:tcPr>
+          <w:p>
+            <w:pPr>
+              <w:pStyle w:val="Tab-saturs"/>
+            </w:pPr>
+            <w:r>
+              <w:t>0.618</w:t>
+            </w:r>
+          </w:p>
+        </w:tc>
+        <w:tc>
+          <w:tcPr>
+            <w:tcW w:w="1124" w:type="dxa"/>
+            <w:noWrap/>
+            <w:hideMark/>
+          </w:tcPr>
+          <w:p>
+            <w:pPr>
+              <w:pStyle w:val="Tab-saturs"/>
+            </w:pPr>
+            <w:r>
+              <w:t>0.618</w:t>
+            </w:r>
+          </w:p>
+        </w:tc>
+        <w:tc>
+          <w:tcPr>
+            <w:tcW w:w="1017" w:type="dxa"/>
+            <w:noWrap/>
+            <w:hideMark/>
+          </w:tcPr>
+          <w:p>
+            <w:pPr>
+              <w:pStyle w:val="Tab-saturs"/>
+            </w:pPr>
+            <w:r>
+              <w:t>0.382</w:t>
+            </w:r>
+          </w:p>
+        </w:tc>
+        <w:tc>
+          <w:tcPr>
+            <w:tcW w:w="853" w:type="dxa"/>
+            <w:noWrap/>
+            <w:hideMark/>
+          </w:tcPr>
+          <w:p>
+            <w:pPr>
+              <w:pStyle w:val="Tab-saturs"/>
+            </w:pPr>
+          </w:p>
+        </w:tc>
+      </w:tr>
+      <w:tr>
+        <w:trPr>
+          <w:trHeight w:val="300"/>
+        </w:trPr>
+        <w:tc>
+          <w:tcPr>
+            <w:tcW w:w="1980" w:type="dxa"/>
+            <w:noWrap/>
+            <w:hideMark/>
+          </w:tcPr>
+          <w:p>
+            <w:pPr>
+              <w:pStyle w:val="Tab-saturs"/>
+            </w:pPr>
+            <w:r>
+              <w:t>KARTEX: TERASES DĒĻI</w:t>
+            </w:r>
+          </w:p>
+        </w:tc>
+        <w:tc>
+          <w:tcPr>
+            <w:tcW w:w="1130" w:type="dxa"/>
+            <w:noWrap/>
+            <w:hideMark/>
+          </w:tcPr>
+          <w:p>
+            <w:pPr>
+              <w:pStyle w:val="Tab-saturs"/>
+            </w:pPr>
+            <w:r>
+              <w:t>2026-02</w:t>
+            </w:r>
+          </w:p>
+        </w:tc>
+        <w:tc>
+          <w:tcPr>
+            <w:tcW w:w="859" w:type="dxa"/>
+            <w:noWrap/>
+            <w:hideMark/>
+          </w:tcPr>
+          <w:p>
+            <w:pPr>
+              <w:pStyle w:val="Tab-saturs"/>
+            </w:pPr>
+            <w:r>
+              <w:t>0</w:t>
+            </w:r>
+          </w:p>
+        </w:tc>
+        <w:tc>
+          <w:tcPr>
+            <w:tcW w:w="1328" w:type="dxa"/>
+            <w:noWrap/>
+            <w:hideMark/>
+          </w:tcPr>
+          <w:p>
+            <w:pPr>
+              <w:pStyle w:val="Tab-saturs"/>
+            </w:pPr>
+            <w:r>
+              <w:t>3.883</w:t>
+            </w:r>
+          </w:p>
+        </w:tc>
+        <w:tc>
+          <w:tcPr>
+            <w:tcW w:w="1124" w:type="dxa"/>
+            <w:noWrap/>
+            <w:hideMark/>
+          </w:tcPr>
+          <w:p>
+            <w:pPr>
+              <w:pStyle w:val="Tab-saturs"/>
+            </w:pPr>
+            <w:r>
+              <w:t>3.883</w:t>
+            </w:r>
+          </w:p>
+        </w:tc>
+        <w:tc>
+          <w:tcPr>
+            <w:tcW w:w="1017" w:type="dxa"/>
+            <w:noWrap/>
+            <w:hideMark/>
+          </w:tcPr>
+          <w:p>
+            <w:pPr>
+              <w:pStyle w:val="Tab-saturs"/>
+            </w:pPr>
+            <w:r>
+              <w:t>15.081</w:t>
+            </w:r>
+          </w:p>
+        </w:tc>
+        <w:tc>
+          <w:tcPr>
+            <w:tcW w:w="853" w:type="dxa"/>
+            <w:noWrap/>
+            <w:hideMark/>
+          </w:tcPr>
+          <w:p>
+            <w:pPr>
+              <w:pStyle w:val="Tab-saturs"/>
+            </w:pPr>
+          </w:p>
+        </w:tc>
+      </w:tr>
+      <w:tr>
+        <w:trPr>
+          <w:trHeight w:val="300"/>
+        </w:trPr>
+        <w:tc>
+          <w:tcPr>
+            <w:tcW w:w="1980" w:type="dxa"/>
+            <w:noWrap/>
+            <w:hideMark/>
+          </w:tcPr>
+          <w:p>
+            <w:pPr>
+              <w:pStyle w:val="Tab-saturs"/>
+            </w:pPr>
+            <w:r>
+              <w:t>KARTEX: ŽOGA DĒĻI</w:t>
+            </w:r>
+          </w:p>
+        </w:tc>
+        <w:tc>
+          <w:tcPr>
+            <w:tcW w:w="1130" w:type="dxa"/>
+            <w:noWrap/>
+            <w:hideMark/>
+          </w:tcPr>
+          <w:p>
+            <w:pPr>
+              <w:pStyle w:val="Tab-saturs"/>
+            </w:pPr>
+            <w:r>
+              <w:t>2026-02</w:t>
+            </w:r>
+          </w:p>
+        </w:tc>
+        <w:tc>
+          <w:tcPr>
+            <w:tcW w:w="859" w:type="dxa"/>
+            <w:noWrap/>
+            <w:hideMark/>
+          </w:tcPr>
+          <w:p>
+            <w:pPr>
+              <w:pStyle w:val="Tab-saturs"/>
+            </w:pPr>
+            <w:r>
+              <w:t>0.054</w:t>
+            </w:r>
+          </w:p>
+        </w:tc>
+        <w:tc>
+          <w:tcPr>
+            <w:tcW w:w="1328" w:type="dxa"/>
+            <w:noWrap/>
+            <w:hideMark/>
+          </w:tcPr>
+          <w:p>
+            <w:pPr>
+              <w:pStyle w:val="Tab-saturs"/>
+            </w:pPr>
+            <w:r>
+              <w:t>0.071</w:t>
+            </w:r>
+          </w:p>
+        </w:tc>
+        <w:tc>
+          <w:tcPr>
+            <w:tcW w:w="1124" w:type="dxa"/>
+            <w:noWrap/>
+            <w:hideMark/>
+          </w:tcPr>
+          <w:p>
+            <w:pPr>
+              <w:pStyle w:val="Tab-saturs"/>
+            </w:pPr>
+            <w:r>
+              <w:t>0.017</w:t>
+            </w:r>
+          </w:p>
+        </w:tc>
+        <w:tc>
+          <w:tcPr>
+            <w:tcW w:w="1017" w:type="dxa"/>
+            <w:noWrap/>
+            <w:hideMark/>
+          </w:tcPr>
+          <w:p>
+            <w:pPr>
+              <w:pStyle w:val="Tab-saturs"/>
+            </w:pPr>
+            <w:r>
+              <w:t>0</w:t>
+            </w:r>
+          </w:p>
+        </w:tc>
+        <w:tc>
+          <w:tcPr>
+            <w:tcW w:w="853" w:type="dxa"/>
+            <w:noWrap/>
+            <w:hideMark/>
+          </w:tcPr>
+          <w:p>
+            <w:pPr>
+              <w:pStyle w:val="Tab-saturs"/>
+            </w:pPr>
+            <w:r>
+              <w:t>0.31</w:t>
+            </w:r>
+          </w:p>
+        </w:tc>
+      </w:tr>
+      <w:tr>
+        <w:trPr>
+          <w:trHeight w:val="300"/>
+        </w:trPr>
+        <w:tc>
+          <w:tcPr>
+            <w:tcW w:w="1980" w:type="dxa"/>
+            <w:noWrap/>
+            <w:hideMark/>
+          </w:tcPr>
+          <w:p>
+            <w:pPr>
+              <w:pStyle w:val="Tab-saturs"/>
+            </w:pPr>
+            <w:r>
+              <w:t>BUVNIEKS: NEĒVELĒTI</w:t>
+            </w:r>
+          </w:p>
+        </w:tc>
+        <w:tc>
+          <w:tcPr>
+            <w:tcW w:w="1130" w:type="dxa"/>
+            <w:noWrap/>
+            <w:hideMark/>
+          </w:tcPr>
+          <w:p>
+            <w:pPr>
+              <w:pStyle w:val="Tab-saturs"/>
+            </w:pPr>
+            <w:r>
+              <w:t>2026-03</w:t>
+            </w:r>
+          </w:p>
+        </w:tc>
+        <w:tc>
+          <w:tcPr>
+            <w:tcW w:w="859" w:type="dxa"/>
+            <w:noWrap/>
+            <w:hideMark/>
+          </w:tcPr>
+          <w:p>
+            <w:pPr>
+              <w:pStyle w:val="Tab-saturs"/>
+            </w:pPr>
+            <w:r>
+              <w:t>12.333</w:t>
+            </w:r>
+          </w:p>
+        </w:tc>
+        <w:tc>
+          <w:tcPr>
+            <w:tcW w:w="1328" w:type="dxa"/>
+            <w:noWrap/>
+            <w:hideMark/>
+          </w:tcPr>
+          <w:p>
+            <w:pPr>
+              <w:pStyle w:val="Tab-saturs"/>
+            </w:pPr>
+            <w:r>
+              <w:t>0</w:t>
+            </w:r>
+          </w:p>
+        </w:tc>
+        <w:tc>
+          <w:tcPr>
+            <w:tcW w:w="1124" w:type="dxa"/>
+            <w:noWrap/>
+            <w:hideMark/>
+          </w:tcPr>
+          <w:p>
+            <w:pPr>
+              <w:pStyle w:val="Tab-saturs"/>
+            </w:pPr>
+            <w:r>
+              <w:t>12.333</w:t>
+            </w:r>
+          </w:p>
+        </w:tc>
+        <w:tc>
+          <w:tcPr>
+            <w:tcW w:w="1017" w:type="dxa"/>
+            <w:noWrap/>
+            <w:hideMark/>
+          </w:tcPr>
+          <w:p>
+            <w:pPr>
+              <w:pStyle w:val="Tab-saturs"/>
+            </w:pPr>
+            <w:r>
+              <w:t>152.105</w:t>
+            </w:r>
+          </w:p>
+        </w:tc>
+        <w:tc>
+          <w:tcPr>
+            <w:tcW w:w="853" w:type="dxa"/>
+            <w:noWrap/>
+            <w:hideMark/>
+          </w:tcPr>
+          <w:p>
+            <w:pPr>
+              <w:pStyle w:val="Tab-saturs"/>
+            </w:pPr>
+            <w:r>
+              <w:t>1</w:t>
+            </w:r>
+          </w:p>
+        </w:tc>
+      </w:tr>
+      <w:tr>
+        <w:trPr>
+          <w:trHeight w:val="300"/>
+        </w:trPr>
+        <w:tc>
+          <w:tcPr>
+            <w:tcW w:w="1980" w:type="dxa"/>
+            <w:noWrap/>
+            <w:hideMark/>
+          </w:tcPr>
+          <w:p>
+            <w:pPr>
+              <w:pStyle w:val="Tab-saturs"/>
+            </w:pPr>
+            <w:r>
+              <w:t>BUVNIEKS: ĒVELĒTI</w:t>
+            </w:r>
+          </w:p>
+        </w:tc>
+        <w:tc>
+          <w:tcPr>
+            <w:tcW w:w="1130" w:type="dxa"/>
+            <w:noWrap/>
+            <w:hideMark/>
+          </w:tcPr>
+          <w:p>
+            <w:pPr>
+              <w:pStyle w:val="Tab-saturs"/>
+            </w:pPr>
+            <w:r>
+              <w:t>2026-03</w:t>
+            </w:r>
+          </w:p>
+        </w:tc>
+        <w:tc>
+          <w:tcPr>
+            <w:tcW w:w="859" w:type="dxa"/>
+            <w:noWrap/>
+            <w:hideMark/>
+          </w:tcPr>
+          <w:p>
+            <w:pPr>
+              <w:pStyle w:val="Tab-saturs"/>
+            </w:pPr>
+            <w:r>
+              <w:t>0.092</w:t>
+            </w:r>
+          </w:p>
+        </w:tc>
+        <w:tc>
+          <w:tcPr>
+            <w:tcW w:w="1328" w:type="dxa"/>
+            <w:noWrap/>
+            <w:hideMark/>
+          </w:tcPr>
+          <w:p>
+            <w:pPr>
+              <w:pStyle w:val="Tab-saturs"/>
+            </w:pPr>
+            <w:r>
+              <w:t>6.92</w:t>
+            </w:r>
+          </w:p>
+        </w:tc>
+        <w:tc>
+          <w:tcPr>
+            <w:tcW w:w="1124" w:type="dxa"/>
+            <w:noWrap/>
+            <w:hideMark/>
+          </w:tcPr>
+          <w:p>
+            <w:pPr>
+              <w:pStyle w:val="Tab-saturs"/>
+            </w:pPr>
+            <w:r>
+              <w:t>6.828</w:t>
+            </w:r>
+          </w:p>
+        </w:tc>
+        <w:tc>
+          <w:tcPr>
+            <w:tcW w:w="1017" w:type="dxa"/>
+            <w:noWrap/>
+            <w:hideMark/>
+          </w:tcPr>
+          <w:p>
+            <w:pPr>
+              <w:pStyle w:val="Tab-saturs"/>
+            </w:pPr>
+            <w:r>
+              <w:t>46.618</w:t>
+            </w:r>
+          </w:p>
+        </w:tc>
+        <w:tc>
+          <w:tcPr>
+            <w:tcW w:w="853" w:type="dxa"/>
+            <w:noWrap/>
+            <w:hideMark/>
+          </w:tcPr>
+          <w:p>
+            <w:pPr>
+              <w:pStyle w:val="Tab-saturs"/>
+            </w:pPr>
+            <w:r>
+              <w:t>74.23</w:t>
+            </w:r>
+          </w:p>
+        </w:tc>
+      </w:tr>
+      <w:tr>
+        <w:trPr>
+          <w:trHeight w:val="300"/>
+        </w:trPr>
+        <w:tc>
+          <w:tcPr>
+            <w:tcW w:w="1980" w:type="dxa"/>
+            <w:noWrap/>
+            <w:hideMark/>
+          </w:tcPr>
+          <w:p>
+            <w:pPr>
+              <w:pStyle w:val="Tab-saturs"/>
+            </w:pPr>
+            <w:r>
+              <w:t>KARTEX: APDARES DĒĻI</w:t>
+            </w:r>
+          </w:p>
+        </w:tc>
+        <w:tc>
+          <w:tcPr>
+            <w:tcW w:w="1130" w:type="dxa"/>
+            <w:noWrap/>
+            <w:hideMark/>
+          </w:tcPr>
+          <w:p>
+            <w:pPr>
+              <w:pStyle w:val="Tab-saturs"/>
+            </w:pPr>
+            <w:r>
+              <w:t>2026-03</w:t>
+            </w:r>
+          </w:p>
+        </w:tc>
+        <w:tc>
+          <w:tcPr>
+            <w:tcW w:w="859" w:type="dxa"/>
+            <w:noWrap/>
+            <w:hideMark/>
+          </w:tcPr>
+          <w:p>
+            <w:pPr>
+              <w:pStyle w:val="Tab-saturs"/>
+            </w:pPr>
+            <w:r>
+              <w:t>1.365</w:t>
+            </w:r>
+          </w:p>
+        </w:tc>
+        <w:tc>
+          <w:tcPr>
+            <w:tcW w:w="1328" w:type="dxa"/>
+            <w:noWrap/>
+            <w:hideMark/>
+          </w:tcPr>
+          <w:p>
+            <w:pPr>
+              <w:pStyle w:val="Tab-saturs"/>
+            </w:pPr>
+            <w:r>
+              <w:t>9.374</w:t>
+            </w:r>
+          </w:p>
+        </w:tc>
+        <w:tc>
+          <w:tcPr>
+            <w:tcW w:w="1124" w:type="dxa"/>
+            <w:noWrap/>
+            <w:hideMark/>
+          </w:tcPr>
+          <w:p>
+            <w:pPr>
+              <w:pStyle w:val="Tab-saturs"/>
+            </w:pPr>
+            <w:r>
+              <w:t>8.009</w:t>
+            </w:r>
+          </w:p>
+        </w:tc>
+        <w:tc>
+          <w:tcPr>
+            <w:tcW w:w="1017" w:type="dxa"/>
+            <w:noWrap/>
+            <w:hideMark/>
+          </w:tcPr>
+          <w:p>
+            <w:pPr>
+              <w:pStyle w:val="Tab-saturs"/>
+            </w:pPr>
+            <w:r>
+              <w:t>64.141</w:t>
+            </w:r>
+          </w:p>
+        </w:tc>
+        <w:tc>
+          <w:tcPr>
+            <w:tcW w:w="853" w:type="dxa"/>
+            <w:noWrap/>
+            <w:hideMark/>
+          </w:tcPr>
+          <w:p>
+            <w:pPr>
+              <w:pStyle w:val="Tab-saturs"/>
+            </w:pPr>
+            <w:r>
+              <w:t>5.866</w:t>
+            </w:r>
+          </w:p>
+        </w:tc>
+      </w:tr>
+      <w:tr>
+        <w:trPr>
+          <w:trHeight w:val="300"/>
+        </w:trPr>
+        <w:tc>
+          <w:tcPr>
+            <w:tcW w:w="1980" w:type="dxa"/>
+            <w:noWrap/>
+            <w:hideMark/>
+          </w:tcPr>
+          <w:p>
+            <w:pPr>
+              <w:pStyle w:val="Tab-saturs"/>
+            </w:pPr>
+            <w:r>
+              <w:t>KARTEX: KARKASS</w:t>
+            </w:r>
+          </w:p>
+        </w:tc>
+        <w:tc>
+          <w:tcPr>
+            <w:tcW w:w="1130" w:type="dxa"/>
+            <w:noWrap/>
+            <w:hideMark/>
+          </w:tcPr>
+          <w:p>
+            <w:pPr>
+              <w:pStyle w:val="Tab-saturs"/>
+            </w:pPr>
+            <w:r>
+              <w:t>2026-03</w:t>
+            </w:r>
+          </w:p>
+        </w:tc>
+        <w:tc>
+          <w:tcPr>
+            <w:tcW w:w="859" w:type="dxa"/>
+            <w:noWrap/>
+            <w:hideMark/>
+          </w:tcPr>
+          <w:p>
+            <w:pPr>
+              <w:pStyle w:val="Tab-saturs"/>
+            </w:pPr>
+            <w:r>
+              <w:t>0.975</w:t>
+            </w:r>
+          </w:p>
+        </w:tc>
+        <w:tc>
+          <w:tcPr>
+            <w:tcW w:w="1328" w:type="dxa"/>
+            <w:noWrap/>
+            <w:hideMark/>
+          </w:tcPr>
+          <w:p>
+            <w:pPr>
+              <w:pStyle w:val="Tab-saturs"/>
+            </w:pPr>
+            <w:r>
+              <w:t>0.105</w:t>
+            </w:r>
+          </w:p>
+        </w:tc>
+        <w:tc>
+          <w:tcPr>
+            <w:tcW w:w="1124" w:type="dxa"/>
+            <w:noWrap/>
+            <w:hideMark/>
+          </w:tcPr>
+          <w:p>
+            <w:pPr>
+              <w:pStyle w:val="Tab-saturs"/>
+            </w:pPr>
+            <w:r>
+              <w:t>0.869</w:t>
+            </w:r>
+          </w:p>
+        </w:tc>
+        <w:tc>
+          <w:tcPr>
+            <w:tcW w:w="1017" w:type="dxa"/>
+            <w:noWrap/>
+            <w:hideMark/>
+          </w:tcPr>
+          <w:p>
+            <w:pPr>
+              <w:pStyle w:val="Tab-saturs"/>
+            </w:pPr>
+            <w:r>
+              <w:t>0.756</w:t>
+            </w:r>
+          </w:p>
+        </w:tc>
+        <w:tc>
+          <w:tcPr>
+            <w:tcW w:w="853" w:type="dxa"/>
+            <w:noWrap/>
+            <w:hideMark/>
+          </w:tcPr>
+          <w:p>
+            <w:pPr>
+              <w:pStyle w:val="Tab-saturs"/>
+            </w:pPr>
+            <w:r>
+              <w:t>0.892</w:t>
+            </w:r>
+          </w:p>
+        </w:tc>
+      </w:tr>
+      <w:tr>
+        <w:trPr>
+          <w:trHeight w:val="300"/>
+        </w:trPr>
+        <w:tc>
+          <w:tcPr>
+            <w:tcW w:w="1980" w:type="dxa"/>
+            <w:noWrap/>
+            <w:hideMark/>
+          </w:tcPr>
+          <w:p>
+            <w:pPr>
+              <w:pStyle w:val="Tab-saturs"/>
+            </w:pPr>
+            <w:r>
+              <w:t>KARTEX: KOKMATERIĀLI</w:t>
+            </w:r>
+          </w:p>
+        </w:tc>
+        <w:tc>
+          <w:tcPr>
+            <w:tcW w:w="1130" w:type="dxa"/>
+            <w:noWrap/>
+            <w:hideMark/>
+          </w:tcPr>
+          <w:p>
+            <w:pPr>
+              <w:pStyle w:val="Tab-saturs"/>
+            </w:pPr>
+            <w:r>
+              <w:t>2026-03</w:t>
+            </w:r>
+          </w:p>
+        </w:tc>
+        <w:tc>
+          <w:tcPr>
+            <w:tcW w:w="859" w:type="dxa"/>
+            <w:noWrap/>
+            <w:hideMark/>
+          </w:tcPr>
+          <w:p>
+            <w:pPr>
+              <w:pStyle w:val="Tab-saturs"/>
+            </w:pPr>
+            <w:r>
+              <w:t>0.112</w:t>
+            </w:r>
+          </w:p>
+        </w:tc>
+        <w:tc>
+          <w:tcPr>
+            <w:tcW w:w="1328" w:type="dxa"/>
+            <w:noWrap/>
+            <w:hideMark/>
+          </w:tcPr>
+          <w:p>
+            <w:pPr>
+              <w:pStyle w:val="Tab-saturs"/>
+            </w:pPr>
+            <w:r>
+              <w:t>0</w:t>
+            </w:r>
+          </w:p>
+        </w:tc>
+        <w:tc>
+          <w:tcPr>
+            <w:tcW w:w="1124" w:type="dxa"/>
+            <w:noWrap/>
+            <w:hideMark/>
+          </w:tcPr>
+          <w:p>
+            <w:pPr>
+              <w:pStyle w:val="Tab-saturs"/>
+            </w:pPr>
+            <w:r>
+              <w:t>0.112</w:t>
+            </w:r>
+          </w:p>
+        </w:tc>
+        <w:tc>
+          <w:tcPr>
+            <w:tcW w:w="1017" w:type="dxa"/>
+            <w:noWrap/>
+            <w:hideMark/>
+          </w:tcPr>
+          <w:p>
+            <w:pPr>
+              <w:pStyle w:val="Tab-saturs"/>
+            </w:pPr>
+            <w:r>
+              <w:t>0.012</w:t>
+            </w:r>
+          </w:p>
+        </w:tc>
+        <w:tc>
+          <w:tcPr>
+            <w:tcW w:w="853" w:type="dxa"/>
+            <w:noWrap/>
+            <w:hideMark/>
+          </w:tcPr>
+          <w:p>
+            <w:pPr>
+              <w:pStyle w:val="Tab-saturs"/>
+            </w:pPr>
+            <w:r>
+              <w:t>1</w:t>
+            </w:r>
+          </w:p>
+        </w:tc>
+      </w:tr>
+      <w:tr>
+        <w:trPr>
+          <w:trHeight w:val="300"/>
+        </w:trPr>
+        <w:tc>
+          <w:tcPr>
+            <w:tcW w:w="1980" w:type="dxa"/>
+            <w:noWrap/>
+            <w:hideMark/>
+          </w:tcPr>
+          <w:p>
+            <w:pPr>
+              <w:pStyle w:val="Tab-saturs"/>
+            </w:pPr>
+            <w:r>
+              <w:t>KARTEX: TERASES DĒĻI</w:t>
+            </w:r>
+          </w:p>
+        </w:tc>
+        <w:tc>
+          <w:tcPr>
+            <w:tcW w:w="1130" w:type="dxa"/>
+            <w:noWrap/>
+            <w:hideMark/>
+          </w:tcPr>
+          <w:p>
+            <w:pPr>
+              <w:pStyle w:val="Tab-saturs"/>
+            </w:pPr>
+            <w:r>
+              <w:t>2026-03</w:t>
+            </w:r>
+          </w:p>
+        </w:tc>
+        <w:tc>
+          <w:tcPr>
+            <w:tcW w:w="859" w:type="dxa"/>
+            <w:noWrap/>
+            <w:hideMark/>
+          </w:tcPr>
+          <w:p>
+            <w:pPr>
+              <w:pStyle w:val="Tab-saturs"/>
+            </w:pPr>
+            <w:r>
+              <w:t>1.579</w:t>
+            </w:r>
+          </w:p>
+        </w:tc>
+        <w:tc>
+          <w:tcPr>
+            <w:tcW w:w="1328" w:type="dxa"/>
+            <w:noWrap/>
+            <w:hideMark/>
+          </w:tcPr>
+          <w:p>
+            <w:pPr>
+              <w:pStyle w:val="Tab-saturs"/>
+            </w:pPr>
+            <w:r>
+              <w:t>4.202</w:t>
+            </w:r>
+          </w:p>
+        </w:tc>
+        <w:tc>
+          <w:tcPr>
+            <w:tcW w:w="1124" w:type="dxa"/>
+            <w:noWrap/>
+            <w:hideMark/>
+          </w:tcPr>
+          <w:p>
+            <w:pPr>
+              <w:pStyle w:val="Tab-saturs"/>
+            </w:pPr>
+            <w:r>
+              <w:t>2.624</w:t>
+            </w:r>
+          </w:p>
+        </w:tc>
+        <w:tc>
+          <w:tcPr>
+            <w:tcW w:w="1017" w:type="dxa"/>
+            <w:noWrap/>
+            <w:hideMark/>
+          </w:tcPr>
+          <w:p>
+            <w:pPr>
+              <w:pStyle w:val="Tab-saturs"/>
+            </w:pPr>
+            <w:r>
+              <w:t>6.885</w:t>
+            </w:r>
+          </w:p>
+        </w:tc>
+        <w:tc>
+          <w:tcPr>
+            <w:tcW w:w="853" w:type="dxa"/>
+            <w:noWrap/>
+            <w:hideMark/>
+          </w:tcPr>
+          <w:p>
+            <w:pPr>
+              <w:pStyle w:val="Tab-saturs"/>
+            </w:pPr>
+            <w:r>
+              <w:t>1.662</w:t>
+            </w:r>
+          </w:p>
+        </w:tc>
+      </w:tr>
+      <w:tr>
+        <w:trPr>
+          <w:trHeight w:val="300"/>
+        </w:trPr>
+        <w:tc>
+          <w:tcPr>
+            <w:tcW w:w="1980" w:type="dxa"/>
+            <w:noWrap/>
+            <w:hideMark/>
+          </w:tcPr>
+          <w:p>
+            <w:pPr>
+              <w:pStyle w:val="Tab-saturs"/>
+            </w:pPr>
+            <w:r>
+              <w:t>KARTEX: ŽOGA DĒĻI</w:t>
+            </w:r>
+          </w:p>
+        </w:tc>
+        <w:tc>
+          <w:tcPr>
+            <w:tcW w:w="1130" w:type="dxa"/>
+            <w:noWrap/>
+            <w:hideMark/>
+          </w:tcPr>
+          <w:p>
+            <w:pPr>
+              <w:pStyle w:val="Tab-saturs"/>
+            </w:pPr>
+            <w:r>
+              <w:t>2026-03</w:t>
+            </w:r>
+          </w:p>
+        </w:tc>
+        <w:tc>
+          <w:tcPr>
+            <w:tcW w:w="859" w:type="dxa"/>
+            <w:noWrap/>
+            <w:hideMark/>
+          </w:tcPr>
+          <w:p>
+            <w:pPr>
+              <w:pStyle w:val="Tab-saturs"/>
+            </w:pPr>
+            <w:r>
+              <w:t>1.27</w:t>
+            </w:r>
+          </w:p>
+        </w:tc>
+        <w:tc>
+          <w:tcPr>
+            <w:tcW w:w="1328" w:type="dxa"/>
+            <w:noWrap/>
+            <w:hideMark/>
+          </w:tcPr>
+          <w:p>
+            <w:pPr>
+              <w:pStyle w:val="Tab-saturs"/>
+            </w:pPr>
+            <w:r>
+              <w:t>0.091</w:t>
+            </w:r>
+          </w:p>
+        </w:tc>
+        <w:tc>
+          <w:tcPr>
+            <w:tcW w:w="1124" w:type="dxa"/>
+            <w:noWrap/>
+            <w:hideMark/>
+          </w:tcPr>
+          <w:p>
+            <w:pPr>
+              <w:pStyle w:val="Tab-saturs"/>
+            </w:pPr>
+            <w:r>
+              <w:t>1.179</w:t>
+            </w:r>
+          </w:p>
+        </w:tc>
+        <w:tc>
+          <w:tcPr>
+            <w:tcW w:w="1017" w:type="dxa"/>
+            <w:noWrap/>
+            <w:hideMark/>
+          </w:tcPr>
+          <w:p>
+            <w:pPr>
+              <w:pStyle w:val="Tab-saturs"/>
+            </w:pPr>
+            <w:r>
+              <w:t>1.39</w:t>
+            </w:r>
+          </w:p>
+        </w:tc>
+        <w:tc>
+          <w:tcPr>
+            <w:tcW w:w="853" w:type="dxa"/>
+            <w:noWrap/>
+            <w:hideMark/>
+          </w:tcPr>
+          <w:p>
+            <w:pPr>
+              <w:pStyle w:val="Tab-saturs"/>
+            </w:pPr>
+            <w:r>
+              <w:t>0.928</w:t>
+            </w:r>
+          </w:p>
+        </w:tc>
+      </w:tr>
+    </w:tbl>
     <w:p>
       <w:pPr>
         <w:spacing w:after="160" w:line="259" w:lineRule="auto"/>
@@ -34697,7 +38740,7 @@
       </w:pPr>
     </w:p>
     <w:sectPr>
-      <w:footerReference w:type="default" r:id="rId24"/>
+      <w:footerReference w:type="default" r:id="rId25"/>
       <w:pgSz w:w="11907" w:h="16840" w:code="9"/>
       <w:pgMar w:top="1440" w:right="1803" w:bottom="1440" w:left="1803" w:header="709" w:footer="709" w:gutter="0"/>
       <w:cols w:space="708"/>
@@ -39904,6 +43947,22 @@
           <w:noProof/>
         </w:rPr>
         <w:t>"es", bet tas ir "mēs". Tā drīkst?</w:t>
+      </w:r>
+    </w:p>
+  </w:comment>
+  <w:comment w:id="141" w:author="Deniss" w:date="2026-04-19T20:47:00Z" w:initials="D">
+    <w:p>
+      <w:pPr>
+        <w:pStyle w:val="CommentText"/>
+      </w:pPr>
+      <w:r>
+        <w:rPr>
+          <w:rStyle w:val="CommentReference"/>
+        </w:rPr>
+        <w:annotationRef/>
+      </w:r>
+      <w:r>
+        <w:t>The augmentation experiment was implemented directly in the existing LSTM forecasting script. In the original implementation, the LSTM pipeline first generated sliding windows from the grouped time series, then standardized the resulting tensors, trained one pooled model on all groups, and finally predicted the next month for each material group. The modified implementation preserves this structure and changes only the window-generation stage - when augmentation is enabled, each newly created real window is combined with the previous real window of the same material group. The synthetic window and target are constructed as the arithmetic mean of the two neighboring windows and targets, respecitvely. Thus, if two consecutive training samples are denoted as (X₁, y₁) and (X₂, y₂), then the additional synthetic sample is defined as ((X₁ + X₂) / 2, (y₁ + y₂) / 2). Augmentation experiment isolates one specific change — increasing the number of training windows — without altering the model. Visually changes are visible below</w:t>
       </w:r>
     </w:p>
   </w:comment>
@@ -40031,6 +44090,7 @@
   <w15:commentEx w15:paraId="7FF355F1" w15:done="0"/>
   <w15:commentEx w15:paraId="28155693" w15:done="0"/>
   <w15:commentEx w15:paraId="09B8B4D4" w15:done="0"/>
+  <w15:commentEx w15:paraId="0D80B923" w15:done="0"/>
 </w15:commentsEx>
 </file>
 
@@ -40155,6 +44215,7 @@
   <w16cex:commentExtensible w16cex:durableId="27D5D4CD" w16cex:dateUtc="2026-04-19T12:39:00Z"/>
   <w16cex:commentExtensible w16cex:durableId="2D6672EF" w16cex:dateUtc="2026-04-19T14:53:00Z"/>
   <w16cex:commentExtensible w16cex:durableId="12759E43" w16cex:dateUtc="2026-04-19T16:12:00Z"/>
+  <w16cex:commentExtensible w16cex:durableId="4F15859F" w16cex:dateUtc="2026-04-19T17:47:00Z"/>
 </w16cex:commentsExtensible>
 </file>
 
@@ -40279,6 +44340,7 @@
   <w16cid:commentId w16cid:paraId="7FF355F1" w16cid:durableId="27D5D4CD"/>
   <w16cid:commentId w16cid:paraId="28155693" w16cid:durableId="2D6672EF"/>
   <w16cid:commentId w16cid:paraId="09B8B4D4" w16cid:durableId="12759E43"/>
+  <w16cid:commentId w16cid:paraId="0D80B923" w16cid:durableId="4F15859F"/>
 </w16cid:commentsIds>
 </file>
 
@@ -50383,7 +54445,6 @@
     <w:sig w:usb0="00000287" w:usb1="00000800" w:usb2="00000000" w:usb3="00000000" w:csb0="0000009F" w:csb1="00000000"/>
   </w:font>
   <w:font w:name="MS Mincho">
-    <w:altName w:val="ＭＳ 明朝"/>
     <w:panose1 w:val="02020609040205080304"/>
     <w:charset w:val="80"/>
     <w:family w:val="modern"/>
@@ -50481,7 +54542,6 @@
     <w:rsid w:val="008C285C"/>
     <w:rsid w:val="00903C5C"/>
     <w:rsid w:val="00942F17"/>
-    <w:rsid w:val="00951289"/>
     <w:rsid w:val="00984AC2"/>
     <w:rsid w:val="00B003D8"/>
     <w:rsid w:val="00B62A4C"/>
@@ -50499,6 +54559,7 @@
     <w:rsid w:val="00D7095D"/>
     <w:rsid w:val="00D8221B"/>
     <w:rsid w:val="00E55A00"/>
+    <w:rsid w:val="00E662F7"/>
     <w:rsid w:val="00ED6C9D"/>
     <w:rsid w:val="00F425CE"/>
     <w:rsid w:val="00FD387C"/>
@@ -52508,11 +56569,31 @@
     </b:Author>
     <b:RefOrder>35</b:RefOrder>
   </b:Source>
+  <b:Source>
+    <b:Tag>Den26</b:Tag>
+    <b:SourceType>InternetSite</b:SourceType>
+    <b:Guid>{9BC29AE2-2331-4643-89C3-4A9018A4631D}</b:Guid>
+    <b:Title>denissgrabovskis/bachelor</b:Title>
+    <b:Year>2026</b:Year>
+    <b:InternetSiteTitle>GitHub</b:InternetSiteTitle>
+    <b:URL>https://github.com/denissgrabovskis/bachelor</b:URL>
+    <b:Author>
+      <b:Author>
+        <b:NameList>
+          <b:Person>
+            <b:Last>Deniss</b:Last>
+            <b:First>Grabovskis</b:First>
+          </b:Person>
+        </b:NameList>
+      </b:Author>
+    </b:Author>
+    <b:RefOrder>40</b:RefOrder>
+  </b:Source>
 </b:Sources>
 </file>
 
 <file path=customXml/itemProps1.xml><?xml version="1.0" encoding="utf-8"?>
-<ds:datastoreItem xmlns:ds="http://schemas.openxmlformats.org/officeDocument/2006/customXml" ds:itemID="{2EC43CCD-2D00-46E3-96B2-7C42C15FEFB3}">
+<ds:datastoreItem xmlns:ds="http://schemas.openxmlformats.org/officeDocument/2006/customXml" ds:itemID="{11CB80AD-3BEB-4538-A155-00CFCB068597}">
   <ds:schemaRefs>
     <ds:schemaRef ds:uri="http://schemas.openxmlformats.org/officeDocument/2006/bibliography"/>
   </ds:schemaRefs>

</xml_diff>